<commit_message>
Proposal: white background, Arial black text, no dark boxes
Co-authored-by: fullstackwebdeveloper1000-coder <fullstackwebdeveloper1000-coder@users.noreply.github.com>
</commit_message>
<xml_diff>
--- a/CoLab_Space_Point_Digital_Agency_Proposal.docx
+++ b/CoLab_Space_Point_Digital_Agency_Proposal.docx
@@ -1,6 +1,7 @@
 
 <file path=word/document.xml><?xml version="1.0" encoding="utf-8"?>
 <w:document xmlns:wpc="http://schemas.microsoft.com/office/word/2010/wordprocessingCanvas" xmlns:mo="http://schemas.microsoft.com/office/mac/office/2008/main" xmlns:mc="http://schemas.openxmlformats.org/markup-compatibility/2006" xmlns:mv="urn:schemas-microsoft-com:mac:vml" xmlns:o="urn:schemas-microsoft-com:office:office" xmlns:r="http://schemas.openxmlformats.org/officeDocument/2006/relationships" xmlns:m="http://schemas.openxmlformats.org/officeDocument/2006/math" xmlns:v="urn:schemas-microsoft-com:vml" xmlns:wp14="http://schemas.microsoft.com/office/word/2010/wordprocessingDrawing" xmlns:wp="http://schemas.openxmlformats.org/drawingml/2006/wordprocessingDrawing" xmlns:w10="urn:schemas-microsoft-com:office:word" xmlns:w="http://schemas.openxmlformats.org/wordprocessingml/2006/main" xmlns:w14="http://schemas.microsoft.com/office/word/2010/wordml" xmlns:wpg="http://schemas.microsoft.com/office/word/2010/wordprocessingGroup" xmlns:wpi="http://schemas.microsoft.com/office/word/2010/wordprocessingInk" xmlns:wne="http://schemas.microsoft.com/office/word/2006/wordml" xmlns:wps="http://schemas.microsoft.com/office/word/2010/wordprocessingShape" mc:Ignorable="w14 wp14">
+  <w:background w:color="FFFFFF"/>
   <w:body>
     <w:p>
       <w:pPr>
@@ -9,7 +10,7 @@
       <w:r>
         <w:drawing>
           <wp:inline xmlns:a="http://schemas.openxmlformats.org/drawingml/2006/main" xmlns:pic="http://schemas.openxmlformats.org/drawingml/2006/picture">
-            <wp:extent cx="1371600" cy="1325880"/>
+            <wp:extent cx="1463040" cy="1414272"/>
             <wp:docPr id="1" name="Picture 1"/>
             <wp:cNvGraphicFramePr>
               <a:graphicFrameLocks noChangeAspect="1"/>
@@ -22,7 +23,7 @@
                     <pic:cNvPicPr/>
                   </pic:nvPicPr>
                   <pic:blipFill>
-                    <a:blip r:embed="rId10"/>
+                    <a:blip r:embed="rId9"/>
                     <a:stretch>
                       <a:fillRect/>
                     </a:stretch>
@@ -30,7 +31,7 @@
                   <pic:spPr>
                     <a:xfrm>
                       <a:off x="0" y="0"/>
-                      <a:ext cx="1371600" cy="1325880"/>
+                      <a:ext cx="1463040" cy="1414272"/>
                     </a:xfrm>
                     <a:prstGeom prst="rect"/>
                   </pic:spPr>
@@ -43,15 +44,14 @@
     </w:p>
     <w:p>
       <w:pPr>
-        <w:spacing w:after="120" w:before="60"/>
+        <w:spacing w:after="160" w:before="80"/>
         <w:jc w:val="center"/>
       </w:pPr>
       <w:r>
         <w:rPr>
-          <w:rFonts w:ascii="Calibri" w:hAnsi="Calibri"/>
           <w:b/>
-          <w:sz w:val="28"/>
-          <w:rFonts w:ascii="Calibri" w:hAnsi="Calibri" w:cs="Calibri"/>
+          <w:sz w:val="32"/>
+          <w:rFonts w:ascii="Arial" w:hAnsi="Arial" w:cs="Arial"/>
           <w:color w:val="06ACBA"/>
         </w:rPr>
         <w:t>CoLab Point</w:t>
@@ -59,15 +59,14 @@
     </w:p>
     <w:p>
       <w:pPr>
-        <w:spacing w:after="120" w:before="60"/>
+        <w:spacing w:after="160" w:before="80"/>
         <w:jc w:val="center"/>
       </w:pPr>
       <w:r>
         <w:rPr>
-          <w:rFonts w:ascii="Calibri" w:hAnsi="Calibri"/>
           <w:b/>
-          <w:sz w:val="52"/>
-          <w:rFonts w:ascii="Calibri" w:hAnsi="Calibri" w:cs="Calibri"/>
+          <w:sz w:val="64"/>
+          <w:rFonts w:ascii="Arial" w:hAnsi="Arial" w:cs="Arial"/>
           <w:color w:val="000000"/>
         </w:rPr>
         <w:t>CoLab Space Point</w:t>
@@ -75,32 +74,29 @@
     </w:p>
     <w:p>
       <w:pPr>
-        <w:spacing w:after="120" w:before="60"/>
+        <w:spacing w:after="320" w:before="80"/>
         <w:jc w:val="center"/>
       </w:pPr>
       <w:r>
         <w:rPr>
-          <w:rFonts w:ascii="Calibri" w:hAnsi="Calibri"/>
           <w:b/>
-          <w:sz w:val="32"/>
-          <w:rFonts w:ascii="Calibri" w:hAnsi="Calibri" w:cs="Calibri"/>
+          <w:sz w:val="40"/>
+          <w:rFonts w:ascii="Arial" w:hAnsi="Arial" w:cs="Arial"/>
           <w:color w:val="000000"/>
         </w:rPr>
         <w:t>Digital Agency Proposal</w:t>
       </w:r>
     </w:p>
-    <w:p/>
     <w:p>
       <w:pPr>
-        <w:spacing w:after="120" w:before="60"/>
+        <w:spacing w:after="120" w:before="80"/>
         <w:jc w:val="center"/>
       </w:pPr>
       <w:r>
         <w:rPr>
-          <w:rFonts w:ascii="Calibri" w:hAnsi="Calibri"/>
           <w:b w:val="0"/>
-          <w:sz w:val="26"/>
-          <w:rFonts w:ascii="Calibri" w:hAnsi="Calibri" w:cs="Calibri"/>
+          <w:sz w:val="30"/>
+          <w:rFonts w:ascii="Arial" w:hAnsi="Arial" w:cs="Arial"/>
           <w:color w:val="000000"/>
         </w:rPr>
         <w:t>Website Designing &amp; Development</w:t>
@@ -108,15 +104,14 @@
     </w:p>
     <w:p>
       <w:pPr>
-        <w:spacing w:after="120" w:before="60"/>
+        <w:spacing w:after="120" w:before="80"/>
         <w:jc w:val="center"/>
       </w:pPr>
       <w:r>
         <w:rPr>
-          <w:rFonts w:ascii="Calibri" w:hAnsi="Calibri"/>
           <w:b w:val="0"/>
-          <w:sz w:val="26"/>
-          <w:rFonts w:ascii="Calibri" w:hAnsi="Calibri" w:cs="Calibri"/>
+          <w:sz w:val="30"/>
+          <w:rFonts w:ascii="Arial" w:hAnsi="Arial" w:cs="Arial"/>
           <w:color w:val="000000"/>
         </w:rPr>
         <w:t>Social Media Management</w:t>
@@ -124,15 +119,14 @@
     </w:p>
     <w:p>
       <w:pPr>
-        <w:spacing w:after="120" w:before="60"/>
+        <w:spacing w:after="120" w:before="80"/>
         <w:jc w:val="center"/>
       </w:pPr>
       <w:r>
         <w:rPr>
-          <w:rFonts w:ascii="Calibri" w:hAnsi="Calibri"/>
           <w:b w:val="0"/>
-          <w:sz w:val="26"/>
-          <w:rFonts w:ascii="Calibri" w:hAnsi="Calibri" w:cs="Calibri"/>
+          <w:sz w:val="30"/>
+          <w:rFonts w:ascii="Arial" w:hAnsi="Arial" w:cs="Arial"/>
           <w:color w:val="000000"/>
         </w:rPr>
         <w:t>Digital Marketing</w:t>
@@ -140,15 +134,14 @@
     </w:p>
     <w:p>
       <w:pPr>
-        <w:spacing w:after="120" w:before="60"/>
+        <w:spacing w:after="240" w:before="80"/>
         <w:jc w:val="center"/>
       </w:pPr>
       <w:r>
         <w:rPr>
-          <w:rFonts w:ascii="Calibri" w:hAnsi="Calibri"/>
           <w:b/>
-          <w:sz w:val="24"/>
-          <w:rFonts w:ascii="Calibri" w:hAnsi="Calibri" w:cs="Calibri"/>
+          <w:sz w:val="30"/>
+          <w:rFonts w:ascii="Arial" w:hAnsi="Arial" w:cs="Arial"/>
           <w:color w:val="04243C"/>
         </w:rPr>
         <w:t>www.colabpoint.com</w:t>
@@ -156,15 +149,14 @@
     </w:p>
     <w:p>
       <w:pPr>
-        <w:spacing w:after="120" w:before="60"/>
+        <w:spacing w:after="80" w:before="80"/>
         <w:jc w:val="center"/>
       </w:pPr>
       <w:r>
         <w:rPr>
-          <w:rFonts w:ascii="Calibri" w:hAnsi="Calibri"/>
           <w:b w:val="0"/>
-          <w:sz w:val="22"/>
-          <w:rFonts w:ascii="Calibri" w:hAnsi="Calibri" w:cs="Calibri"/>
+          <w:sz w:val="28"/>
+          <w:rFonts w:ascii="Arial" w:hAnsi="Arial" w:cs="Arial"/>
           <w:color w:val="000000"/>
         </w:rPr>
         <w:t>2nd Floor Anwar Center, Madina Road Near Gymkhana, Gujrat, Pakistan</w:t>
@@ -172,15 +164,14 @@
     </w:p>
     <w:p>
       <w:pPr>
-        <w:spacing w:after="120" w:before="60"/>
+        <w:spacing w:after="80" w:before="80"/>
         <w:jc w:val="center"/>
       </w:pPr>
       <w:r>
         <w:rPr>
-          <w:rFonts w:ascii="Calibri" w:hAnsi="Calibri"/>
           <w:b w:val="0"/>
-          <w:sz w:val="22"/>
-          <w:rFonts w:ascii="Calibri" w:hAnsi="Calibri" w:cs="Calibri"/>
+          <w:sz w:val="28"/>
+          <w:rFonts w:ascii="Arial" w:hAnsi="Arial" w:cs="Arial"/>
           <w:color w:val="000000"/>
         </w:rPr>
         <w:t>+92 349 7684322  |  +92 332 4384322</w:t>
@@ -188,15 +179,14 @@
     </w:p>
     <w:p>
       <w:pPr>
-        <w:spacing w:after="120" w:before="60"/>
+        <w:spacing w:after="80" w:before="80"/>
         <w:jc w:val="center"/>
       </w:pPr>
       <w:r>
         <w:rPr>
-          <w:rFonts w:ascii="Calibri" w:hAnsi="Calibri"/>
           <w:b w:val="0"/>
-          <w:sz w:val="22"/>
-          <w:rFonts w:ascii="Calibri" w:hAnsi="Calibri" w:cs="Calibri"/>
+          <w:sz w:val="28"/>
+          <w:rFonts w:ascii="Arial" w:hAnsi="Arial" w:cs="Arial"/>
           <w:color w:val="000000"/>
         </w:rPr>
         <w:t>colabpoint@gmail.com  |  hello@colabpoint.com</w:t>
@@ -207,236 +197,80 @@
         <w:br w:type="page"/>
       </w:r>
     </w:p>
-    <w:p/>
-    <w:tbl>
-      <w:tblPr>
-        <w:tblW w:type="auto" w:w="0"/>
-        <w:jc w:val="center"/>
-        <w:tblLook w:firstColumn="1" w:firstRow="1" w:lastColumn="0" w:lastRow="0" w:noHBand="0" w:noVBand="1" w:val="04A0"/>
-      </w:tblPr>
-      <w:tblGrid>
-        <w:gridCol w:w="9972"/>
-      </w:tblGrid>
-      <w:tr>
-        <w:tc>
-          <w:tcPr>
-            <w:tcW w:type="dxa" w:w="9972"/>
-            <w:shd w:val="clear" w:fill="04243C"/>
-            <w:tcBorders>
-              <w:top w:val="single" w:sz="12" w:color="06ACBA"/>
-              <w:left w:val="single" w:sz="12" w:color="06ACBA"/>
-              <w:bottom w:val="single" w:sz="12" w:color="06ACBA"/>
-              <w:right w:val="single" w:sz="12" w:color="06ACBA"/>
-            </w:tcBorders>
-            <w:tcBorders>
-              <w:top w:val="single" w:sz="8" w:color="04243C"/>
-              <w:left w:val="single" w:sz="8" w:color="04243C"/>
-              <w:bottom w:val="single" w:sz="8" w:color="04243C"/>
-              <w:right w:val="single" w:sz="8" w:color="04243C"/>
-            </w:tcBorders>
-          </w:tcPr>
-          <w:p>
-            <w:pPr>
-              <w:jc w:val="left"/>
-            </w:pPr>
-            <w:r>
-              <w:rPr>
-                <w:rFonts w:ascii="Calibri" w:hAnsi="Calibri"/>
-                <w:b/>
-                <w:sz w:val="36"/>
-                <w:rFonts w:ascii="Calibri" w:hAnsi="Calibri" w:cs="Calibri"/>
-                <w:color w:val="FFFFFF"/>
-              </w:rPr>
-              <w:t>Company Profile</w:t>
-            </w:r>
-          </w:p>
-          <w:p>
-            <w:r>
-              <w:rPr>
-                <w:rFonts w:ascii="Calibri" w:hAnsi="Calibri"/>
-                <w:b w:val="0"/>
-                <w:sz w:val="24"/>
-                <w:rFonts w:ascii="Calibri" w:hAnsi="Calibri" w:cs="Calibri"/>
-                <w:color w:val="FFFFFF"/>
-              </w:rPr>
-              <w:t>CoLab Point — Gujrat</w:t>
-            </w:r>
-          </w:p>
-        </w:tc>
-      </w:tr>
-    </w:tbl>
-    <w:p/>
     <w:p>
       <w:pPr>
-        <w:spacing w:after="120" w:before="60"/>
+        <w:spacing w:before="320" w:after="160"/>
+        <w:pBdr>
+          <w:left w:val="single" w:sz="24" w:space="8" w:color="06ACBA"/>
+        </w:pBdr>
       </w:pPr>
       <w:r>
         <w:rPr>
-          <w:rFonts w:ascii="Calibri" w:hAnsi="Calibri"/>
-          <w:b w:val="0"/>
-          <w:sz w:val="24"/>
-          <w:rFonts w:ascii="Calibri" w:hAnsi="Calibri" w:cs="Calibri"/>
+          <w:b/>
+          <w:sz w:val="40"/>
+          <w:rFonts w:ascii="Arial" w:hAnsi="Arial" w:cs="Arial"/>
           <w:color w:val="000000"/>
         </w:rPr>
-        <w:t>CoLab Space Point aap ko website design, WordPress, e-commerce, branding, social media, SEO, Google Ads, Meta Ads aur business growth ki complete services deta hai.</w:t>
+        <w:t>Company Profile</w:t>
       </w:r>
     </w:p>
     <w:p>
       <w:pPr>
-        <w:spacing w:after="120" w:before="60"/>
+        <w:spacing w:after="200" w:before="80"/>
       </w:pPr>
       <w:r>
         <w:rPr>
-          <w:rFonts w:ascii="Calibri" w:hAnsi="Calibri"/>
-          <w:b/>
-          <w:sz w:val="24"/>
-          <w:rFonts w:ascii="Calibri" w:hAnsi="Calibri" w:cs="Calibri"/>
+          <w:b w:val="0"/>
+          <w:sz w:val="28"/>
+          <w:rFonts w:ascii="Arial" w:hAnsi="Arial" w:cs="Arial"/>
           <w:color w:val="000000"/>
         </w:rPr>
-        <w:t>Har section me pehle PACKAGE PRICE likhi hai, phir detail me bataya gaya hai ke is price me kya kya shamil hoga.</w:t>
-      </w:r>
-    </w:p>
-    <w:p/>
-    <w:tbl>
-      <w:tblPr>
-        <w:tblW w:type="auto" w:w="0"/>
-        <w:jc w:val="center"/>
-        <w:tblLook w:firstColumn="1" w:firstRow="1" w:lastColumn="0" w:lastRow="0" w:noHBand="0" w:noVBand="1" w:val="04A0"/>
-      </w:tblPr>
-      <w:tblGrid>
-        <w:gridCol w:w="9972"/>
-      </w:tblGrid>
-      <w:tr>
-        <w:tc>
-          <w:tcPr>
-            <w:tcW w:type="dxa" w:w="9972"/>
-            <w:shd w:val="clear" w:fill="04243C"/>
-            <w:tcBorders>
-              <w:top w:val="single" w:sz="12" w:color="06ACBA"/>
-              <w:left w:val="single" w:sz="12" w:color="06ACBA"/>
-              <w:bottom w:val="single" w:sz="12" w:color="06ACBA"/>
-              <w:right w:val="single" w:sz="12" w:color="06ACBA"/>
-            </w:tcBorders>
-            <w:tcBorders>
-              <w:top w:val="single" w:sz="8" w:color="04243C"/>
-              <w:left w:val="single" w:sz="8" w:color="04243C"/>
-              <w:bottom w:val="single" w:sz="8" w:color="04243C"/>
-              <w:right w:val="single" w:sz="8" w:color="04243C"/>
-            </w:tcBorders>
-          </w:tcPr>
-          <w:p>
-            <w:pPr>
-              <w:jc w:val="left"/>
-            </w:pPr>
-            <w:r>
-              <w:rPr>
-                <w:rFonts w:ascii="Calibri" w:hAnsi="Calibri"/>
-                <w:b/>
-                <w:sz w:val="36"/>
-                <w:rFonts w:ascii="Calibri" w:hAnsi="Calibri" w:cs="Calibri"/>
-                <w:color w:val="FFFFFF"/>
-              </w:rPr>
-              <w:t>Why Choose Us</w:t>
-            </w:r>
-          </w:p>
-        </w:tc>
-      </w:tr>
-    </w:tbl>
-    <w:p/>
-    <w:p>
-      <w:r>
-        <w:rPr>
-          <w:rFonts w:ascii="Calibri" w:hAnsi="Calibri"/>
-          <w:b w:val="0"/>
-          <w:sz w:val="24"/>
-          <w:rFonts w:ascii="Calibri" w:hAnsi="Calibri" w:cs="Calibri"/>
-          <w:color w:val="000000"/>
-        </w:rPr>
-        <w:t>• Experienced team</w:t>
+        <w:t>CoLab Space Point website, WordPress, e-commerce, branding, social media, SEO, Google Ads, Meta Ads aur business growth ki services deta hai.</w:t>
       </w:r>
     </w:p>
     <w:p>
+      <w:pPr>
+        <w:spacing w:after="240" w:before="80"/>
+      </w:pPr>
       <w:r>
         <w:rPr>
-          <w:rFonts w:ascii="Calibri" w:hAnsi="Calibri"/>
-          <w:b w:val="0"/>
-          <w:sz w:val="24"/>
-          <w:rFonts w:ascii="Calibri" w:hAnsi="Calibri" w:cs="Calibri"/>
+          <w:b/>
+          <w:sz w:val="28"/>
+          <w:rFonts w:ascii="Arial" w:hAnsi="Arial" w:cs="Arial"/>
           <w:color w:val="000000"/>
         </w:rPr>
-        <w:t>• Professional support</w:t>
+        <w:t>Har package ki PRICE neeche bold hai — aur usi ke neeche likha hai is price me kya shamil hoga.</w:t>
       </w:r>
     </w:p>
     <w:p>
+      <w:pPr>
+        <w:spacing w:before="320" w:after="160"/>
+        <w:pBdr>
+          <w:left w:val="single" w:sz="24" w:space="8" w:color="06ACBA"/>
+        </w:pBdr>
+      </w:pPr>
       <w:r>
         <w:rPr>
-          <w:rFonts w:ascii="Calibri" w:hAnsi="Calibri"/>
-          <w:b w:val="0"/>
-          <w:sz w:val="24"/>
-          <w:rFonts w:ascii="Calibri" w:hAnsi="Calibri" w:cs="Calibri"/>
+          <w:b/>
+          <w:sz w:val="40"/>
+          <w:rFonts w:ascii="Arial" w:hAnsi="Arial" w:cs="Arial"/>
           <w:color w:val="000000"/>
         </w:rPr>
-        <w:t>• Business focused solutions</w:t>
+        <w:t>Website Designing &amp; Development</w:t>
       </w:r>
     </w:p>
     <w:p>
+      <w:pPr>
+        <w:spacing w:after="200" w:before="80"/>
+      </w:pPr>
       <w:r>
         <w:rPr>
-          <w:rFonts w:ascii="Calibri" w:hAnsi="Calibri"/>
           <w:b w:val="0"/>
-          <w:sz w:val="24"/>
-          <w:rFonts w:ascii="Calibri" w:hAnsi="Calibri" w:cs="Calibri"/>
+          <w:sz w:val="28"/>
+          <w:rFonts w:ascii="Arial" w:hAnsi="Arial" w:cs="Arial"/>
           <w:color w:val="000000"/>
         </w:rPr>
-        <w:t>• Modern technology</w:t>
-      </w:r>
-    </w:p>
-    <w:p>
-      <w:r>
-        <w:rPr>
-          <w:rFonts w:ascii="Calibri" w:hAnsi="Calibri"/>
-          <w:b w:val="0"/>
-          <w:sz w:val="24"/>
-          <w:rFonts w:ascii="Calibri" w:hAnsi="Calibri" w:cs="Calibri"/>
-          <w:color w:val="000000"/>
-        </w:rPr>
-        <w:t>• Creative design</w:t>
-      </w:r>
-    </w:p>
-    <w:p>
-      <w:r>
-        <w:rPr>
-          <w:rFonts w:ascii="Calibri" w:hAnsi="Calibri"/>
-          <w:b w:val="0"/>
-          <w:sz w:val="24"/>
-          <w:rFonts w:ascii="Calibri" w:hAnsi="Calibri" w:cs="Calibri"/>
-          <w:color w:val="000000"/>
-        </w:rPr>
-        <w:t>• Performance marketing</w:t>
-      </w:r>
-    </w:p>
-    <w:p>
-      <w:r>
-        <w:rPr>
-          <w:rFonts w:ascii="Calibri" w:hAnsi="Calibri"/>
-          <w:b w:val="0"/>
-          <w:sz w:val="24"/>
-          <w:rFonts w:ascii="Calibri" w:hAnsi="Calibri" w:cs="Calibri"/>
-          <w:color w:val="000000"/>
-        </w:rPr>
-        <w:t>• Transparent communication</w:t>
-      </w:r>
-    </w:p>
-    <w:p>
-      <w:r>
-        <w:rPr>
-          <w:rFonts w:ascii="Calibri" w:hAnsi="Calibri"/>
-          <w:b w:val="0"/>
-          <w:sz w:val="24"/>
-          <w:rFonts w:ascii="Calibri" w:hAnsi="Calibri" w:cs="Calibri"/>
-          <w:color w:val="000000"/>
-        </w:rPr>
-        <w:t>• Long term partnership</w:t>
+        <w:t>WordPress hamari main platform hai. Custom development bhi available hai.</w:t>
       </w:r>
     </w:p>
     <w:p>
@@ -444,377 +278,287 @@
         <w:br w:type="page"/>
       </w:r>
     </w:p>
-    <w:p/>
-    <w:tbl>
-      <w:tblPr>
-        <w:tblW w:type="auto" w:w="0"/>
-        <w:jc w:val="center"/>
-        <w:tblLook w:firstColumn="1" w:firstRow="1" w:lastColumn="0" w:lastRow="0" w:noHBand="0" w:noVBand="1" w:val="04A0"/>
-      </w:tblPr>
-      <w:tblGrid>
-        <w:gridCol w:w="9972"/>
-      </w:tblGrid>
-      <w:tr>
-        <w:tc>
-          <w:tcPr>
-            <w:tcW w:type="dxa" w:w="9972"/>
-            <w:shd w:val="clear" w:fill="04243C"/>
-            <w:tcBorders>
-              <w:top w:val="single" w:sz="12" w:color="06ACBA"/>
-              <w:left w:val="single" w:sz="12" w:color="06ACBA"/>
-              <w:bottom w:val="single" w:sz="12" w:color="06ACBA"/>
-              <w:right w:val="single" w:sz="12" w:color="06ACBA"/>
-            </w:tcBorders>
-            <w:tcBorders>
-              <w:top w:val="single" w:sz="8" w:color="04243C"/>
-              <w:left w:val="single" w:sz="8" w:color="04243C"/>
-              <w:bottom w:val="single" w:sz="8" w:color="04243C"/>
-              <w:right w:val="single" w:sz="8" w:color="04243C"/>
-            </w:tcBorders>
-          </w:tcPr>
-          <w:p>
-            <w:pPr>
-              <w:jc w:val="left"/>
-            </w:pPr>
-            <w:r>
-              <w:rPr>
-                <w:rFonts w:ascii="Calibri" w:hAnsi="Calibri"/>
-                <w:b/>
-                <w:sz w:val="36"/>
-                <w:rFonts w:ascii="Calibri" w:hAnsi="Calibri" w:cs="Calibri"/>
-                <w:color w:val="FFFFFF"/>
-              </w:rPr>
-              <w:t>Website Designing &amp; Development</w:t>
-            </w:r>
-          </w:p>
-          <w:p>
-            <w:r>
-              <w:rPr>
-                <w:rFonts w:ascii="Calibri" w:hAnsi="Calibri"/>
-                <w:b w:val="0"/>
-                <w:sz w:val="24"/>
-                <w:rFonts w:ascii="Calibri" w:hAnsi="Calibri" w:cs="Calibri"/>
-                <w:color w:val="FFFFFF"/>
-              </w:rPr>
-              <w:t>WordPress primary — custom development available</w:t>
-            </w:r>
-          </w:p>
-        </w:tc>
-      </w:tr>
-    </w:tbl>
-    <w:p/>
     <w:p>
+      <w:pPr>
+        <w:spacing w:before="320" w:after="160"/>
+        <w:pBdr>
+          <w:left w:val="single" w:sz="24" w:space="8" w:color="06ACBA"/>
+        </w:pBdr>
+      </w:pPr>
       <w:r>
-        <w:br w:type="page"/>
+        <w:rPr>
+          <w:b/>
+          <w:sz w:val="40"/>
+          <w:rFonts w:ascii="Arial" w:hAnsi="Arial" w:cs="Arial"/>
+          <w:color w:val="000000"/>
+        </w:rPr>
+        <w:t>BASIC WEBSITE</w:t>
       </w:r>
     </w:p>
-    <w:p/>
-    <w:tbl>
-      <w:tblPr>
-        <w:tblW w:type="auto" w:w="0"/>
-        <w:jc w:val="center"/>
-        <w:tblLook w:firstColumn="1" w:firstRow="1" w:lastColumn="0" w:lastRow="0" w:noHBand="0" w:noVBand="1" w:val="04A0"/>
-      </w:tblPr>
-      <w:tblGrid>
-        <w:gridCol w:w="9972"/>
-      </w:tblGrid>
-      <w:tr>
-        <w:tc>
-          <w:tcPr>
-            <w:tcW w:type="dxa" w:w="9972"/>
-            <w:shd w:val="clear" w:fill="04243C"/>
-            <w:tcBorders>
-              <w:top w:val="single" w:sz="12" w:color="06ACBA"/>
-              <w:left w:val="single" w:sz="12" w:color="06ACBA"/>
-              <w:bottom w:val="single" w:sz="12" w:color="06ACBA"/>
-              <w:right w:val="single" w:sz="12" w:color="06ACBA"/>
-            </w:tcBorders>
-            <w:tcBorders>
-              <w:top w:val="single" w:sz="8" w:color="04243C"/>
-              <w:left w:val="single" w:sz="8" w:color="04243C"/>
-              <w:bottom w:val="single" w:sz="8" w:color="04243C"/>
-              <w:right w:val="single" w:sz="8" w:color="04243C"/>
-            </w:tcBorders>
-          </w:tcPr>
-          <w:p>
-            <w:pPr>
-              <w:jc w:val="left"/>
-            </w:pPr>
-            <w:r>
-              <w:rPr>
-                <w:rFonts w:ascii="Calibri" w:hAnsi="Calibri"/>
-                <w:b/>
-                <w:sz w:val="36"/>
-                <w:rFonts w:ascii="Calibri" w:hAnsi="Calibri" w:cs="Calibri"/>
-                <w:color w:val="FFFFFF"/>
-              </w:rPr>
-              <w:t>BASIC WEBSITE — PKR 60,000</w:t>
-            </w:r>
-          </w:p>
-          <w:p>
-            <w:r>
-              <w:rPr>
-                <w:rFonts w:ascii="Calibri" w:hAnsi="Calibri"/>
-                <w:b w:val="0"/>
-                <w:sz w:val="24"/>
-                <w:rFonts w:ascii="Calibri" w:hAnsi="Calibri" w:cs="Calibri"/>
-                <w:color w:val="FFFFFF"/>
-              </w:rPr>
-              <w:t>Package Price: PKR 60,000  |  Small business &amp; startups</w:t>
-            </w:r>
-          </w:p>
-        </w:tc>
-      </w:tr>
-    </w:tbl>
-    <w:p/>
     <w:p>
+      <w:pPr>
+        <w:spacing w:after="120" w:before="80"/>
+      </w:pPr>
       <w:r>
         <w:rPr>
-          <w:rFonts w:ascii="Calibri" w:hAnsi="Calibri"/>
           <w:b/>
+          <w:sz w:val="36"/>
+          <w:rFonts w:ascii="Arial" w:hAnsi="Arial" w:cs="Arial"/>
+          <w:color w:val="04243C"/>
+        </w:rPr>
+        <w:t>Package Price: PKR 60,000</w:t>
+      </w:r>
+    </w:p>
+    <w:p>
+      <w:pPr>
+        <w:spacing w:after="240" w:before="80"/>
+      </w:pPr>
+      <w:r>
+        <w:rPr>
+          <w:b w:val="0"/>
           <w:sz w:val="28"/>
-          <w:rFonts w:ascii="Calibri" w:hAnsi="Calibri" w:cs="Calibri"/>
-          <w:color w:val="04243C"/>
+          <w:rFonts w:ascii="Arial" w:hAnsi="Arial" w:cs="Arial"/>
+          <w:color w:val="000000"/>
+        </w:rPr>
+        <w:t>Best for: Small business aur startups</w:t>
+      </w:r>
+    </w:p>
+    <w:p>
+      <w:pPr>
+        <w:spacing w:after="160" w:before="80"/>
+      </w:pPr>
+      <w:r>
+        <w:rPr>
+          <w:b/>
+          <w:sz w:val="32"/>
+          <w:rFonts w:ascii="Arial" w:hAnsi="Arial" w:cs="Arial"/>
+          <w:color w:val="06ACBA"/>
         </w:rPr>
         <w:t>IS PRICE ME YE SHAMIL HOGA:</w:t>
       </w:r>
     </w:p>
     <w:p>
       <w:pPr>
-        <w:ind w:left="283"/>
+        <w:spacing w:after="80" w:before="80"/>
       </w:pPr>
       <w:r>
         <w:rPr>
-          <w:rFonts w:ascii="Calibri" w:hAnsi="Calibri"/>
           <w:b w:val="0"/>
-          <w:sz w:val="24"/>
-          <w:rFonts w:ascii="Calibri" w:hAnsi="Calibri" w:cs="Calibri"/>
+          <w:sz w:val="28"/>
+          <w:rFonts w:ascii="Arial" w:hAnsi="Arial" w:cs="Arial"/>
           <w:color w:val="000000"/>
         </w:rPr>
-        <w:t>• Professional business website</w:t>
+        <w:t xml:space="preserve">  •  Professional business website</w:t>
       </w:r>
     </w:p>
     <w:p>
       <w:pPr>
-        <w:ind w:left="283"/>
+        <w:spacing w:after="80" w:before="80"/>
       </w:pPr>
       <w:r>
         <w:rPr>
-          <w:rFonts w:ascii="Calibri" w:hAnsi="Calibri"/>
           <w:b w:val="0"/>
-          <w:sz w:val="24"/>
-          <w:rFonts w:ascii="Calibri" w:hAnsi="Calibri" w:cs="Calibri"/>
+          <w:sz w:val="28"/>
+          <w:rFonts w:ascii="Arial" w:hAnsi="Arial" w:cs="Arial"/>
           <w:color w:val="000000"/>
         </w:rPr>
-        <w:t>• Up to 5 pages</w:t>
+        <w:t xml:space="preserve">  •  Up to 5 pages</w:t>
       </w:r>
     </w:p>
     <w:p>
       <w:pPr>
-        <w:ind w:left="283"/>
+        <w:spacing w:after="80" w:before="80"/>
       </w:pPr>
       <w:r>
         <w:rPr>
-          <w:rFonts w:ascii="Calibri" w:hAnsi="Calibri"/>
           <w:b w:val="0"/>
-          <w:sz w:val="24"/>
-          <w:rFonts w:ascii="Calibri" w:hAnsi="Calibri" w:cs="Calibri"/>
+          <w:sz w:val="28"/>
+          <w:rFonts w:ascii="Arial" w:hAnsi="Arial" w:cs="Arial"/>
           <w:color w:val="000000"/>
         </w:rPr>
-        <w:t>• Responsive mobile design</w:t>
+        <w:t xml:space="preserve">  •  Responsive design</w:t>
       </w:r>
     </w:p>
     <w:p>
       <w:pPr>
-        <w:ind w:left="283"/>
+        <w:spacing w:after="80" w:before="80"/>
       </w:pPr>
       <w:r>
         <w:rPr>
-          <w:rFonts w:ascii="Calibri" w:hAnsi="Calibri"/>
           <w:b w:val="0"/>
-          <w:sz w:val="24"/>
-          <w:rFonts w:ascii="Calibri" w:hAnsi="Calibri" w:cs="Calibri"/>
+          <w:sz w:val="28"/>
+          <w:rFonts w:ascii="Arial" w:hAnsi="Arial" w:cs="Arial"/>
           <w:color w:val="000000"/>
         </w:rPr>
-        <w:t>• WordPress CMS</w:t>
+        <w:t xml:space="preserve">  •  WordPress CMS</w:t>
       </w:r>
     </w:p>
     <w:p>
       <w:pPr>
-        <w:ind w:left="283"/>
+        <w:spacing w:after="80" w:before="80"/>
       </w:pPr>
       <w:r>
         <w:rPr>
-          <w:rFonts w:ascii="Calibri" w:hAnsi="Calibri"/>
           <w:b w:val="0"/>
-          <w:sz w:val="24"/>
-          <w:rFonts w:ascii="Calibri" w:hAnsi="Calibri" w:cs="Calibri"/>
+          <w:sz w:val="28"/>
+          <w:rFonts w:ascii="Arial" w:hAnsi="Arial" w:cs="Arial"/>
           <w:color w:val="000000"/>
         </w:rPr>
-        <w:t>• Custom UI</w:t>
+        <w:t xml:space="preserve">  •  Custom UI</w:t>
       </w:r>
     </w:p>
     <w:p>
       <w:pPr>
-        <w:ind w:left="283"/>
+        <w:spacing w:after="80" w:before="80"/>
       </w:pPr>
       <w:r>
         <w:rPr>
-          <w:rFonts w:ascii="Calibri" w:hAnsi="Calibri"/>
           <w:b w:val="0"/>
-          <w:sz w:val="24"/>
-          <w:rFonts w:ascii="Calibri" w:hAnsi="Calibri" w:cs="Calibri"/>
+          <w:sz w:val="28"/>
+          <w:rFonts w:ascii="Arial" w:hAnsi="Arial" w:cs="Arial"/>
           <w:color w:val="000000"/>
         </w:rPr>
-        <w:t>• Contact form</w:t>
+        <w:t xml:space="preserve">  •  Contact form</w:t>
       </w:r>
     </w:p>
     <w:p>
       <w:pPr>
-        <w:ind w:left="283"/>
+        <w:spacing w:after="80" w:before="80"/>
       </w:pPr>
       <w:r>
         <w:rPr>
-          <w:rFonts w:ascii="Calibri" w:hAnsi="Calibri"/>
           <w:b w:val="0"/>
-          <w:sz w:val="24"/>
-          <w:rFonts w:ascii="Calibri" w:hAnsi="Calibri" w:cs="Calibri"/>
+          <w:sz w:val="28"/>
+          <w:rFonts w:ascii="Arial" w:hAnsi="Arial" w:cs="Arial"/>
           <w:color w:val="000000"/>
         </w:rPr>
-        <w:t>• WhatsApp integration</w:t>
+        <w:t xml:space="preserve">  •  WhatsApp integration</w:t>
       </w:r>
     </w:p>
     <w:p>
       <w:pPr>
-        <w:ind w:left="283"/>
+        <w:spacing w:after="80" w:before="80"/>
       </w:pPr>
       <w:r>
         <w:rPr>
-          <w:rFonts w:ascii="Calibri" w:hAnsi="Calibri"/>
           <w:b w:val="0"/>
-          <w:sz w:val="24"/>
-          <w:rFonts w:ascii="Calibri" w:hAnsi="Calibri" w:cs="Calibri"/>
+          <w:sz w:val="28"/>
+          <w:rFonts w:ascii="Arial" w:hAnsi="Arial" w:cs="Arial"/>
           <w:color w:val="000000"/>
         </w:rPr>
-        <w:t>• Social media integration</w:t>
+        <w:t xml:space="preserve">  •  Social media integration</w:t>
       </w:r>
     </w:p>
     <w:p>
       <w:pPr>
-        <w:ind w:left="283"/>
+        <w:spacing w:after="80" w:before="80"/>
       </w:pPr>
       <w:r>
         <w:rPr>
-          <w:rFonts w:ascii="Calibri" w:hAnsi="Calibri"/>
           <w:b w:val="0"/>
-          <w:sz w:val="24"/>
-          <w:rFonts w:ascii="Calibri" w:hAnsi="Calibri" w:cs="Calibri"/>
+          <w:sz w:val="28"/>
+          <w:rFonts w:ascii="Arial" w:hAnsi="Arial" w:cs="Arial"/>
           <w:color w:val="000000"/>
         </w:rPr>
-        <w:t>• Basic SEO</w:t>
+        <w:t xml:space="preserve">  •  Basic SEO</w:t>
       </w:r>
     </w:p>
     <w:p>
       <w:pPr>
-        <w:ind w:left="283"/>
+        <w:spacing w:after="80" w:before="80"/>
       </w:pPr>
       <w:r>
         <w:rPr>
-          <w:rFonts w:ascii="Calibri" w:hAnsi="Calibri"/>
           <w:b w:val="0"/>
-          <w:sz w:val="24"/>
-          <w:rFonts w:ascii="Calibri" w:hAnsi="Calibri" w:cs="Calibri"/>
+          <w:sz w:val="28"/>
+          <w:rFonts w:ascii="Arial" w:hAnsi="Arial" w:cs="Arial"/>
           <w:color w:val="000000"/>
         </w:rPr>
-        <w:t>• Google Analytics</w:t>
+        <w:t xml:space="preserve">  •  Google Analytics</w:t>
       </w:r>
     </w:p>
     <w:p>
       <w:pPr>
-        <w:ind w:left="283"/>
+        <w:spacing w:after="80" w:before="80"/>
       </w:pPr>
       <w:r>
         <w:rPr>
-          <w:rFonts w:ascii="Calibri" w:hAnsi="Calibri"/>
           <w:b w:val="0"/>
-          <w:sz w:val="24"/>
-          <w:rFonts w:ascii="Calibri" w:hAnsi="Calibri" w:cs="Calibri"/>
+          <w:sz w:val="28"/>
+          <w:rFonts w:ascii="Arial" w:hAnsi="Arial" w:cs="Arial"/>
           <w:color w:val="000000"/>
         </w:rPr>
-        <w:t>• Speed optimization</w:t>
+        <w:t xml:space="preserve">  •  Speed optimization</w:t>
       </w:r>
     </w:p>
     <w:p>
       <w:pPr>
-        <w:ind w:left="283"/>
+        <w:spacing w:after="80" w:before="80"/>
       </w:pPr>
       <w:r>
         <w:rPr>
-          <w:rFonts w:ascii="Calibri" w:hAnsi="Calibri"/>
           <w:b w:val="0"/>
-          <w:sz w:val="24"/>
-          <w:rFonts w:ascii="Calibri" w:hAnsi="Calibri" w:cs="Calibri"/>
+          <w:sz w:val="28"/>
+          <w:rFonts w:ascii="Arial" w:hAnsi="Arial" w:cs="Arial"/>
           <w:color w:val="000000"/>
         </w:rPr>
-        <w:t>• SSL configuration</w:t>
+        <w:t xml:space="preserve">  •  SSL configuration</w:t>
       </w:r>
     </w:p>
     <w:p>
       <w:pPr>
-        <w:ind w:left="283"/>
+        <w:spacing w:after="80" w:before="80"/>
       </w:pPr>
       <w:r>
         <w:rPr>
-          <w:rFonts w:ascii="Calibri" w:hAnsi="Calibri"/>
           <w:b w:val="0"/>
-          <w:sz w:val="24"/>
-          <w:rFonts w:ascii="Calibri" w:hAnsi="Calibri" w:cs="Calibri"/>
+          <w:sz w:val="28"/>
+          <w:rFonts w:ascii="Arial" w:hAnsi="Arial" w:cs="Arial"/>
           <w:color w:val="000000"/>
         </w:rPr>
-        <w:t>• Security setup</w:t>
+        <w:t xml:space="preserve">  •  Security setup</w:t>
       </w:r>
     </w:p>
     <w:p>
       <w:pPr>
-        <w:ind w:left="283"/>
+        <w:spacing w:after="80" w:before="80"/>
       </w:pPr>
       <w:r>
         <w:rPr>
-          <w:rFonts w:ascii="Calibri" w:hAnsi="Calibri"/>
           <w:b w:val="0"/>
-          <w:sz w:val="24"/>
-          <w:rFonts w:ascii="Calibri" w:hAnsi="Calibri" w:cs="Calibri"/>
+          <w:sz w:val="28"/>
+          <w:rFonts w:ascii="Arial" w:hAnsi="Arial" w:cs="Arial"/>
           <w:color w:val="000000"/>
         </w:rPr>
-        <w:t>• Training</w:t>
+        <w:t xml:space="preserve">  •  Training</w:t>
       </w:r>
     </w:p>
     <w:p>
       <w:pPr>
-        <w:ind w:left="283"/>
+        <w:spacing w:after="80" w:before="80"/>
       </w:pPr>
       <w:r>
         <w:rPr>
-          <w:rFonts w:ascii="Calibri" w:hAnsi="Calibri"/>
           <w:b w:val="0"/>
-          <w:sz w:val="24"/>
-          <w:rFonts w:ascii="Calibri" w:hAnsi="Calibri" w:cs="Calibri"/>
+          <w:sz w:val="28"/>
+          <w:rFonts w:ascii="Arial" w:hAnsi="Arial" w:cs="Arial"/>
           <w:color w:val="000000"/>
         </w:rPr>
-        <w:t>• 30 days support</w:t>
+        <w:t xml:space="preserve">  •  30 days support</w:t>
       </w:r>
     </w:p>
-    <w:p/>
     <w:p>
+      <w:pPr>
+        <w:spacing w:after="240" w:before="80"/>
+      </w:pPr>
       <w:r>
         <w:rPr>
-          <w:rFonts w:ascii="Calibri" w:hAnsi="Calibri"/>
           <w:b/>
-          <w:sz w:val="24"/>
-          <w:rFonts w:ascii="Calibri" w:hAnsi="Calibri" w:cs="Calibri"/>
+          <w:sz w:val="28"/>
+          <w:rFonts w:ascii="Arial" w:hAnsi="Arial" w:cs="Arial"/>
           <w:color w:val="04243C"/>
         </w:rPr>
-        <w:t>IMPORTANT: E-Commerce is package me shamil NAHI hai.</w:t>
+        <w:t>IMPORTANT: Is package me E-Commerce NAHI hai.</w:t>
       </w:r>
     </w:p>
     <w:p>
@@ -822,240 +566,217 @@
         <w:br w:type="page"/>
       </w:r>
     </w:p>
-    <w:p/>
-    <w:tbl>
-      <w:tblPr>
-        <w:tblW w:type="auto" w:w="0"/>
-        <w:jc w:val="center"/>
-        <w:tblLook w:firstColumn="1" w:firstRow="1" w:lastColumn="0" w:lastRow="0" w:noHBand="0" w:noVBand="1" w:val="04A0"/>
-      </w:tblPr>
-      <w:tblGrid>
-        <w:gridCol w:w="9972"/>
-      </w:tblGrid>
-      <w:tr>
-        <w:tc>
-          <w:tcPr>
-            <w:tcW w:type="dxa" w:w="9972"/>
-            <w:shd w:val="clear" w:fill="04243C"/>
-            <w:tcBorders>
-              <w:top w:val="single" w:sz="12" w:color="06ACBA"/>
-              <w:left w:val="single" w:sz="12" w:color="06ACBA"/>
-              <w:bottom w:val="single" w:sz="12" w:color="06ACBA"/>
-              <w:right w:val="single" w:sz="12" w:color="06ACBA"/>
-            </w:tcBorders>
-            <w:tcBorders>
-              <w:top w:val="single" w:sz="8" w:color="04243C"/>
-              <w:left w:val="single" w:sz="8" w:color="04243C"/>
-              <w:bottom w:val="single" w:sz="8" w:color="04243C"/>
-              <w:right w:val="single" w:sz="8" w:color="04243C"/>
-            </w:tcBorders>
-          </w:tcPr>
-          <w:p>
-            <w:pPr>
-              <w:jc w:val="left"/>
-            </w:pPr>
-            <w:r>
-              <w:rPr>
-                <w:rFonts w:ascii="Calibri" w:hAnsi="Calibri"/>
-                <w:b/>
-                <w:sz w:val="36"/>
-                <w:rFonts w:ascii="Calibri" w:hAnsi="Calibri" w:cs="Calibri"/>
-                <w:color w:val="FFFFFF"/>
-              </w:rPr>
-              <w:t>STANDARD WEBSITE — PKR 120,000</w:t>
-            </w:r>
-          </w:p>
-          <w:p>
-            <w:r>
-              <w:rPr>
-                <w:rFonts w:ascii="Calibri" w:hAnsi="Calibri"/>
-                <w:b w:val="0"/>
-                <w:sz w:val="24"/>
-                <w:rFonts w:ascii="Calibri" w:hAnsi="Calibri" w:cs="Calibri"/>
-                <w:color w:val="FFFFFF"/>
-              </w:rPr>
-              <w:t>Package Price: PKR 120,000  |  Growing brands</w:t>
-            </w:r>
-          </w:p>
-        </w:tc>
-      </w:tr>
-    </w:tbl>
-    <w:p/>
     <w:p>
+      <w:pPr>
+        <w:spacing w:before="320" w:after="160"/>
+        <w:pBdr>
+          <w:left w:val="single" w:sz="24" w:space="8" w:color="06ACBA"/>
+        </w:pBdr>
+      </w:pPr>
       <w:r>
         <w:rPr>
-          <w:rFonts w:ascii="Calibri" w:hAnsi="Calibri"/>
           <w:b/>
+          <w:sz w:val="40"/>
+          <w:rFonts w:ascii="Arial" w:hAnsi="Arial" w:cs="Arial"/>
+          <w:color w:val="000000"/>
+        </w:rPr>
+        <w:t>STANDARD WEBSITE</w:t>
+      </w:r>
+    </w:p>
+    <w:p>
+      <w:pPr>
+        <w:spacing w:after="120" w:before="80"/>
+      </w:pPr>
+      <w:r>
+        <w:rPr>
+          <w:b/>
+          <w:sz w:val="36"/>
+          <w:rFonts w:ascii="Arial" w:hAnsi="Arial" w:cs="Arial"/>
+          <w:color w:val="04243C"/>
+        </w:rPr>
+        <w:t>Package Price: PKR 120,000</w:t>
+      </w:r>
+    </w:p>
+    <w:p>
+      <w:pPr>
+        <w:spacing w:after="240" w:before="80"/>
+      </w:pPr>
+      <w:r>
+        <w:rPr>
+          <w:b w:val="0"/>
           <w:sz w:val="28"/>
-          <w:rFonts w:ascii="Calibri" w:hAnsi="Calibri" w:cs="Calibri"/>
-          <w:color w:val="04243C"/>
+          <w:rFonts w:ascii="Arial" w:hAnsi="Arial" w:cs="Arial"/>
+          <w:color w:val="000000"/>
+        </w:rPr>
+        <w:t>Best for: Growing brands</w:t>
+      </w:r>
+    </w:p>
+    <w:p>
+      <w:pPr>
+        <w:spacing w:after="160" w:before="80"/>
+      </w:pPr>
+      <w:r>
+        <w:rPr>
+          <w:b/>
+          <w:sz w:val="32"/>
+          <w:rFonts w:ascii="Arial" w:hAnsi="Arial" w:cs="Arial"/>
+          <w:color w:val="06ACBA"/>
         </w:rPr>
         <w:t>IS PRICE ME YE SHAMIL HOGA:</w:t>
       </w:r>
     </w:p>
     <w:p>
       <w:pPr>
-        <w:ind w:left="283"/>
+        <w:spacing w:after="80" w:before="80"/>
       </w:pPr>
       <w:r>
         <w:rPr>
-          <w:rFonts w:ascii="Calibri" w:hAnsi="Calibri"/>
           <w:b w:val="0"/>
-          <w:sz w:val="24"/>
-          <w:rFonts w:ascii="Calibri" w:hAnsi="Calibri" w:cs="Calibri"/>
+          <w:sz w:val="28"/>
+          <w:rFonts w:ascii="Arial" w:hAnsi="Arial" w:cs="Arial"/>
           <w:color w:val="000000"/>
         </w:rPr>
-        <w:t>• Up to 10 pages</w:t>
+        <w:t xml:space="preserve">  •  Up to 10 pages</w:t>
       </w:r>
     </w:p>
     <w:p>
       <w:pPr>
-        <w:ind w:left="283"/>
+        <w:spacing w:after="80" w:before="80"/>
       </w:pPr>
       <w:r>
         <w:rPr>
-          <w:rFonts w:ascii="Calibri" w:hAnsi="Calibri"/>
           <w:b w:val="0"/>
-          <w:sz w:val="24"/>
-          <w:rFonts w:ascii="Calibri" w:hAnsi="Calibri" w:cs="Calibri"/>
+          <w:sz w:val="28"/>
+          <w:rFonts w:ascii="Arial" w:hAnsi="Arial" w:cs="Arial"/>
           <w:color w:val="000000"/>
         </w:rPr>
-        <w:t>• Premium UI/UX</w:t>
+        <w:t xml:space="preserve">  •  Premium UI/UX</w:t>
       </w:r>
     </w:p>
     <w:p>
       <w:pPr>
-        <w:ind w:left="283"/>
+        <w:spacing w:after="80" w:before="80"/>
       </w:pPr>
       <w:r>
         <w:rPr>
-          <w:rFonts w:ascii="Calibri" w:hAnsi="Calibri"/>
           <w:b w:val="0"/>
-          <w:sz w:val="24"/>
-          <w:rFonts w:ascii="Calibri" w:hAnsi="Calibri" w:cs="Calibri"/>
+          <w:sz w:val="28"/>
+          <w:rFonts w:ascii="Arial" w:hAnsi="Arial" w:cs="Arial"/>
           <w:color w:val="000000"/>
         </w:rPr>
-        <w:t>• Blog</w:t>
+        <w:t xml:space="preserve">  •  Blog</w:t>
       </w:r>
     </w:p>
     <w:p>
       <w:pPr>
-        <w:ind w:left="283"/>
+        <w:spacing w:after="80" w:before="80"/>
       </w:pPr>
       <w:r>
         <w:rPr>
-          <w:rFonts w:ascii="Calibri" w:hAnsi="Calibri"/>
           <w:b w:val="0"/>
-          <w:sz w:val="24"/>
-          <w:rFonts w:ascii="Calibri" w:hAnsi="Calibri" w:cs="Calibri"/>
+          <w:sz w:val="28"/>
+          <w:rFonts w:ascii="Arial" w:hAnsi="Arial" w:cs="Arial"/>
           <w:color w:val="000000"/>
         </w:rPr>
-        <w:t>• WooCommerce store</w:t>
+        <w:t xml:space="preserve">  •  WooCommerce store</w:t>
       </w:r>
     </w:p>
     <w:p>
       <w:pPr>
-        <w:ind w:left="283"/>
+        <w:spacing w:after="80" w:before="80"/>
       </w:pPr>
       <w:r>
         <w:rPr>
-          <w:rFonts w:ascii="Calibri" w:hAnsi="Calibri"/>
           <w:b w:val="0"/>
-          <w:sz w:val="24"/>
-          <w:rFonts w:ascii="Calibri" w:hAnsi="Calibri" w:cs="Calibri"/>
+          <w:sz w:val="28"/>
+          <w:rFonts w:ascii="Arial" w:hAnsi="Arial" w:cs="Arial"/>
           <w:color w:val="000000"/>
         </w:rPr>
-        <w:t>• Product upload</w:t>
+        <w:t xml:space="preserve">  •  Product upload</w:t>
       </w:r>
     </w:p>
     <w:p>
       <w:pPr>
-        <w:ind w:left="283"/>
+        <w:spacing w:after="80" w:before="80"/>
       </w:pPr>
       <w:r>
         <w:rPr>
-          <w:rFonts w:ascii="Calibri" w:hAnsi="Calibri"/>
           <w:b w:val="0"/>
-          <w:sz w:val="24"/>
-          <w:rFonts w:ascii="Calibri" w:hAnsi="Calibri" w:cs="Calibri"/>
+          <w:sz w:val="28"/>
+          <w:rFonts w:ascii="Arial" w:hAnsi="Arial" w:cs="Arial"/>
           <w:color w:val="000000"/>
         </w:rPr>
-        <w:t>• Payment gateway</w:t>
+        <w:t xml:space="preserve">  •  Payment gateway</w:t>
       </w:r>
     </w:p>
     <w:p>
       <w:pPr>
-        <w:ind w:left="283"/>
+        <w:spacing w:after="80" w:before="80"/>
       </w:pPr>
       <w:r>
         <w:rPr>
-          <w:rFonts w:ascii="Calibri" w:hAnsi="Calibri"/>
           <w:b w:val="0"/>
-          <w:sz w:val="24"/>
-          <w:rFonts w:ascii="Calibri" w:hAnsi="Calibri" w:cs="Calibri"/>
+          <w:sz w:val="28"/>
+          <w:rFonts w:ascii="Arial" w:hAnsi="Arial" w:cs="Arial"/>
           <w:color w:val="000000"/>
         </w:rPr>
-        <w:t>• Google Search Console</w:t>
+        <w:t xml:space="preserve">  •  Google Search Console</w:t>
       </w:r>
     </w:p>
     <w:p>
       <w:pPr>
-        <w:ind w:left="283"/>
+        <w:spacing w:after="80" w:before="80"/>
       </w:pPr>
       <w:r>
         <w:rPr>
-          <w:rFonts w:ascii="Calibri" w:hAnsi="Calibri"/>
           <w:b w:val="0"/>
-          <w:sz w:val="24"/>
-          <w:rFonts w:ascii="Calibri" w:hAnsi="Calibri" w:cs="Calibri"/>
+          <w:sz w:val="28"/>
+          <w:rFonts w:ascii="Arial" w:hAnsi="Arial" w:cs="Arial"/>
           <w:color w:val="000000"/>
         </w:rPr>
-        <w:t>• Facebook Pixel</w:t>
+        <w:t xml:space="preserve">  •  Facebook Pixel</w:t>
       </w:r>
     </w:p>
     <w:p>
       <w:pPr>
-        <w:ind w:left="283"/>
+        <w:spacing w:after="80" w:before="80"/>
       </w:pPr>
       <w:r>
         <w:rPr>
-          <w:rFonts w:ascii="Calibri" w:hAnsi="Calibri"/>
           <w:b w:val="0"/>
-          <w:sz w:val="24"/>
-          <w:rFonts w:ascii="Calibri" w:hAnsi="Calibri" w:cs="Calibri"/>
+          <w:sz w:val="28"/>
+          <w:rFonts w:ascii="Arial" w:hAnsi="Arial" w:cs="Arial"/>
           <w:color w:val="000000"/>
         </w:rPr>
-        <w:t>• Advanced SEO</w:t>
+        <w:t xml:space="preserve">  •  Advanced SEO</w:t>
       </w:r>
     </w:p>
     <w:p>
       <w:pPr>
-        <w:ind w:left="283"/>
+        <w:spacing w:after="80" w:before="80"/>
       </w:pPr>
       <w:r>
         <w:rPr>
-          <w:rFonts w:ascii="Calibri" w:hAnsi="Calibri"/>
           <w:b w:val="0"/>
-          <w:sz w:val="24"/>
-          <w:rFonts w:ascii="Calibri" w:hAnsi="Calibri" w:cs="Calibri"/>
+          <w:sz w:val="28"/>
+          <w:rFonts w:ascii="Arial" w:hAnsi="Arial" w:cs="Arial"/>
           <w:color w:val="000000"/>
         </w:rPr>
-        <w:t>• Speed optimization</w:t>
+        <w:t xml:space="preserve">  •  Speed optimization</w:t>
       </w:r>
     </w:p>
     <w:p>
       <w:pPr>
-        <w:ind w:left="283"/>
+        <w:spacing w:after="80" w:before="80"/>
       </w:pPr>
       <w:r>
         <w:rPr>
-          <w:rFonts w:ascii="Calibri" w:hAnsi="Calibri"/>
           <w:b w:val="0"/>
-          <w:sz w:val="24"/>
-          <w:rFonts w:ascii="Calibri" w:hAnsi="Calibri" w:cs="Calibri"/>
+          <w:sz w:val="28"/>
+          <w:rFonts w:ascii="Arial" w:hAnsi="Arial" w:cs="Arial"/>
           <w:color w:val="000000"/>
         </w:rPr>
-        <w:t>• 60 days support</w:t>
+        <w:t xml:space="preserve">  •  60 days support</w:t>
       </w:r>
     </w:p>
     <w:p>
@@ -1063,270 +784,245 @@
         <w:br w:type="page"/>
       </w:r>
     </w:p>
-    <w:p/>
-    <w:tbl>
-      <w:tblPr>
-        <w:tblW w:type="auto" w:w="0"/>
-        <w:jc w:val="center"/>
-        <w:tblLook w:firstColumn="1" w:firstRow="1" w:lastColumn="0" w:lastRow="0" w:noHBand="0" w:noVBand="1" w:val="04A0"/>
-      </w:tblPr>
-      <w:tblGrid>
-        <w:gridCol w:w="9972"/>
-      </w:tblGrid>
-      <w:tr>
-        <w:tc>
-          <w:tcPr>
-            <w:tcW w:type="dxa" w:w="9972"/>
-            <w:shd w:val="clear" w:fill="04243C"/>
-            <w:tcBorders>
-              <w:top w:val="single" w:sz="12" w:color="06ACBA"/>
-              <w:left w:val="single" w:sz="12" w:color="06ACBA"/>
-              <w:bottom w:val="single" w:sz="12" w:color="06ACBA"/>
-              <w:right w:val="single" w:sz="12" w:color="06ACBA"/>
-            </w:tcBorders>
-            <w:tcBorders>
-              <w:top w:val="single" w:sz="8" w:color="04243C"/>
-              <w:left w:val="single" w:sz="8" w:color="04243C"/>
-              <w:bottom w:val="single" w:sz="8" w:color="04243C"/>
-              <w:right w:val="single" w:sz="8" w:color="04243C"/>
-            </w:tcBorders>
-          </w:tcPr>
-          <w:p>
-            <w:pPr>
-              <w:jc w:val="left"/>
-            </w:pPr>
-            <w:r>
-              <w:rPr>
-                <w:rFonts w:ascii="Calibri" w:hAnsi="Calibri"/>
-                <w:b/>
-                <w:sz w:val="36"/>
-                <w:rFonts w:ascii="Calibri" w:hAnsi="Calibri" w:cs="Calibri"/>
-                <w:color w:val="FFFFFF"/>
-              </w:rPr>
-              <w:t>PREMIUM WEBSITE — PKR 250,000</w:t>
-            </w:r>
-          </w:p>
-          <w:p>
-            <w:r>
-              <w:rPr>
-                <w:rFonts w:ascii="Calibri" w:hAnsi="Calibri"/>
-                <w:b w:val="0"/>
-                <w:sz w:val="24"/>
-                <w:rFonts w:ascii="Calibri" w:hAnsi="Calibri" w:cs="Calibri"/>
-                <w:color w:val="FFFFFF"/>
-              </w:rPr>
-              <w:t>Package Price: PKR 250,000  |  Enterprise clients</w:t>
-            </w:r>
-          </w:p>
-        </w:tc>
-      </w:tr>
-    </w:tbl>
-    <w:p/>
     <w:p>
+      <w:pPr>
+        <w:spacing w:before="320" w:after="160"/>
+        <w:pBdr>
+          <w:left w:val="single" w:sz="24" w:space="8" w:color="06ACBA"/>
+        </w:pBdr>
+      </w:pPr>
       <w:r>
         <w:rPr>
-          <w:rFonts w:ascii="Calibri" w:hAnsi="Calibri"/>
           <w:b/>
+          <w:sz w:val="40"/>
+          <w:rFonts w:ascii="Arial" w:hAnsi="Arial" w:cs="Arial"/>
+          <w:color w:val="000000"/>
+        </w:rPr>
+        <w:t>PREMIUM WEBSITE</w:t>
+      </w:r>
+    </w:p>
+    <w:p>
+      <w:pPr>
+        <w:spacing w:after="120" w:before="80"/>
+      </w:pPr>
+      <w:r>
+        <w:rPr>
+          <w:b/>
+          <w:sz w:val="36"/>
+          <w:rFonts w:ascii="Arial" w:hAnsi="Arial" w:cs="Arial"/>
+          <w:color w:val="04243C"/>
+        </w:rPr>
+        <w:t>Package Price: PKR 250,000</w:t>
+      </w:r>
+    </w:p>
+    <w:p>
+      <w:pPr>
+        <w:spacing w:after="240" w:before="80"/>
+      </w:pPr>
+      <w:r>
+        <w:rPr>
+          <w:b w:val="0"/>
           <w:sz w:val="28"/>
-          <w:rFonts w:ascii="Calibri" w:hAnsi="Calibri" w:cs="Calibri"/>
-          <w:color w:val="04243C"/>
+          <w:rFonts w:ascii="Arial" w:hAnsi="Arial" w:cs="Arial"/>
+          <w:color w:val="000000"/>
+        </w:rPr>
+        <w:t>Best for: Enterprise clients</w:t>
+      </w:r>
+    </w:p>
+    <w:p>
+      <w:pPr>
+        <w:spacing w:after="160" w:before="80"/>
+      </w:pPr>
+      <w:r>
+        <w:rPr>
+          <w:b/>
+          <w:sz w:val="32"/>
+          <w:rFonts w:ascii="Arial" w:hAnsi="Arial" w:cs="Arial"/>
+          <w:color w:val="06ACBA"/>
         </w:rPr>
         <w:t>IS PRICE ME YE SHAMIL HOGA:</w:t>
       </w:r>
     </w:p>
     <w:p>
       <w:pPr>
-        <w:ind w:left="283"/>
+        <w:spacing w:after="80" w:before="80"/>
       </w:pPr>
       <w:r>
         <w:rPr>
-          <w:rFonts w:ascii="Calibri" w:hAnsi="Calibri"/>
           <w:b w:val="0"/>
-          <w:sz w:val="24"/>
-          <w:rFonts w:ascii="Calibri" w:hAnsi="Calibri" w:cs="Calibri"/>
+          <w:sz w:val="28"/>
+          <w:rFonts w:ascii="Arial" w:hAnsi="Arial" w:cs="Arial"/>
           <w:color w:val="000000"/>
         </w:rPr>
-        <w:t>• Unlimited pages (scope ke andar)</w:t>
+        <w:t xml:space="preserve">  •  Unlimited pages (agreed scope)</w:t>
       </w:r>
     </w:p>
     <w:p>
       <w:pPr>
-        <w:ind w:left="283"/>
+        <w:spacing w:after="80" w:before="80"/>
       </w:pPr>
       <w:r>
         <w:rPr>
-          <w:rFonts w:ascii="Calibri" w:hAnsi="Calibri"/>
           <w:b w:val="0"/>
-          <w:sz w:val="24"/>
-          <w:rFonts w:ascii="Calibri" w:hAnsi="Calibri" w:cs="Calibri"/>
+          <w:sz w:val="28"/>
+          <w:rFonts w:ascii="Arial" w:hAnsi="Arial" w:cs="Arial"/>
           <w:color w:val="000000"/>
         </w:rPr>
-        <w:t>• Fully custom design</w:t>
+        <w:t xml:space="preserve">  •  Fully custom design</w:t>
       </w:r>
     </w:p>
     <w:p>
       <w:pPr>
-        <w:ind w:left="283"/>
+        <w:spacing w:after="80" w:before="80"/>
       </w:pPr>
       <w:r>
         <w:rPr>
-          <w:rFonts w:ascii="Calibri" w:hAnsi="Calibri"/>
           <w:b w:val="0"/>
-          <w:sz w:val="24"/>
-          <w:rFonts w:ascii="Calibri" w:hAnsi="Calibri" w:cs="Calibri"/>
+          <w:sz w:val="28"/>
+          <w:rFonts w:ascii="Arial" w:hAnsi="Arial" w:cs="Arial"/>
           <w:color w:val="000000"/>
         </w:rPr>
-        <w:t>• Advanced WooCommerce</w:t>
+        <w:t xml:space="preserve">  •  Advanced WooCommerce</w:t>
       </w:r>
     </w:p>
     <w:p>
       <w:pPr>
-        <w:ind w:left="283"/>
+        <w:spacing w:after="80" w:before="80"/>
       </w:pPr>
       <w:r>
         <w:rPr>
-          <w:rFonts w:ascii="Calibri" w:hAnsi="Calibri"/>
           <w:b w:val="0"/>
-          <w:sz w:val="24"/>
-          <w:rFonts w:ascii="Calibri" w:hAnsi="Calibri" w:cs="Calibri"/>
+          <w:sz w:val="28"/>
+          <w:rFonts w:ascii="Arial" w:hAnsi="Arial" w:cs="Arial"/>
           <w:color w:val="000000"/>
         </w:rPr>
-        <w:t>• Unlimited products</w:t>
+        <w:t xml:space="preserve">  •  Unlimited products</w:t>
       </w:r>
     </w:p>
     <w:p>
       <w:pPr>
-        <w:ind w:left="283"/>
+        <w:spacing w:after="80" w:before="80"/>
       </w:pPr>
       <w:r>
         <w:rPr>
-          <w:rFonts w:ascii="Calibri" w:hAnsi="Calibri"/>
           <w:b w:val="0"/>
-          <w:sz w:val="24"/>
-          <w:rFonts w:ascii="Calibri" w:hAnsi="Calibri" w:cs="Calibri"/>
+          <w:sz w:val="28"/>
+          <w:rFonts w:ascii="Arial" w:hAnsi="Arial" w:cs="Arial"/>
           <w:color w:val="000000"/>
         </w:rPr>
-        <w:t>• Payment gateway</w:t>
+        <w:t xml:space="preserve">  •  Payment gateway</w:t>
       </w:r>
     </w:p>
     <w:p>
       <w:pPr>
-        <w:ind w:left="283"/>
+        <w:spacing w:after="80" w:before="80"/>
       </w:pPr>
       <w:r>
         <w:rPr>
-          <w:rFonts w:ascii="Calibri" w:hAnsi="Calibri"/>
           <w:b w:val="0"/>
-          <w:sz w:val="24"/>
-          <w:rFonts w:ascii="Calibri" w:hAnsi="Calibri" w:cs="Calibri"/>
+          <w:sz w:val="28"/>
+          <w:rFonts w:ascii="Arial" w:hAnsi="Arial" w:cs="Arial"/>
           <w:color w:val="000000"/>
         </w:rPr>
-        <w:t>• CRM integration</w:t>
+        <w:t xml:space="preserve">  •  CRM integration</w:t>
       </w:r>
     </w:p>
     <w:p>
       <w:pPr>
-        <w:ind w:left="283"/>
+        <w:spacing w:after="80" w:before="80"/>
       </w:pPr>
       <w:r>
         <w:rPr>
-          <w:rFonts w:ascii="Calibri" w:hAnsi="Calibri"/>
           <w:b w:val="0"/>
-          <w:sz w:val="24"/>
-          <w:rFonts w:ascii="Calibri" w:hAnsi="Calibri" w:cs="Calibri"/>
+          <w:sz w:val="28"/>
+          <w:rFonts w:ascii="Arial" w:hAnsi="Arial" w:cs="Arial"/>
           <w:color w:val="000000"/>
         </w:rPr>
-        <w:t>• Booking system</w:t>
+        <w:t xml:space="preserve">  •  Booking system</w:t>
       </w:r>
     </w:p>
     <w:p>
       <w:pPr>
-        <w:ind w:left="283"/>
+        <w:spacing w:after="80" w:before="80"/>
       </w:pPr>
       <w:r>
         <w:rPr>
-          <w:rFonts w:ascii="Calibri" w:hAnsi="Calibri"/>
           <w:b w:val="0"/>
-          <w:sz w:val="24"/>
-          <w:rFonts w:ascii="Calibri" w:hAnsi="Calibri" w:cs="Calibri"/>
+          <w:sz w:val="28"/>
+          <w:rFonts w:ascii="Arial" w:hAnsi="Arial" w:cs="Arial"/>
           <w:color w:val="000000"/>
         </w:rPr>
-        <w:t>• API integration</w:t>
+        <w:t xml:space="preserve">  •  API integration</w:t>
       </w:r>
     </w:p>
     <w:p>
       <w:pPr>
-        <w:ind w:left="283"/>
+        <w:spacing w:after="80" w:before="80"/>
       </w:pPr>
       <w:r>
         <w:rPr>
-          <w:rFonts w:ascii="Calibri" w:hAnsi="Calibri"/>
           <w:b w:val="0"/>
-          <w:sz w:val="24"/>
-          <w:rFonts w:ascii="Calibri" w:hAnsi="Calibri" w:cs="Calibri"/>
+          <w:sz w:val="28"/>
+          <w:rFonts w:ascii="Arial" w:hAnsi="Arial" w:cs="Arial"/>
           <w:color w:val="000000"/>
         </w:rPr>
-        <w:t>• Advanced SEO</w:t>
+        <w:t xml:space="preserve">  •  Advanced SEO</w:t>
       </w:r>
     </w:p>
     <w:p>
       <w:pPr>
-        <w:ind w:left="283"/>
+        <w:spacing w:after="80" w:before="80"/>
       </w:pPr>
       <w:r>
         <w:rPr>
-          <w:rFonts w:ascii="Calibri" w:hAnsi="Calibri"/>
           <w:b w:val="0"/>
-          <w:sz w:val="24"/>
-          <w:rFonts w:ascii="Calibri" w:hAnsi="Calibri" w:cs="Calibri"/>
+          <w:sz w:val="28"/>
+          <w:rFonts w:ascii="Arial" w:hAnsi="Arial" w:cs="Arial"/>
           <w:color w:val="000000"/>
         </w:rPr>
-        <w:t>• Premium security</w:t>
+        <w:t xml:space="preserve">  •  Premium security</w:t>
       </w:r>
     </w:p>
     <w:p>
       <w:pPr>
-        <w:ind w:left="283"/>
+        <w:spacing w:after="80" w:before="80"/>
       </w:pPr>
       <w:r>
         <w:rPr>
-          <w:rFonts w:ascii="Calibri" w:hAnsi="Calibri"/>
           <w:b w:val="0"/>
-          <w:sz w:val="24"/>
-          <w:rFonts w:ascii="Calibri" w:hAnsi="Calibri" w:cs="Calibri"/>
+          <w:sz w:val="28"/>
+          <w:rFonts w:ascii="Arial" w:hAnsi="Arial" w:cs="Arial"/>
           <w:color w:val="000000"/>
         </w:rPr>
-        <w:t>• Performance optimization</w:t>
+        <w:t xml:space="preserve">  •  Performance optimization</w:t>
       </w:r>
     </w:p>
     <w:p>
       <w:pPr>
-        <w:ind w:left="283"/>
+        <w:spacing w:after="80" w:before="80"/>
       </w:pPr>
       <w:r>
         <w:rPr>
-          <w:rFonts w:ascii="Calibri" w:hAnsi="Calibri"/>
           <w:b w:val="0"/>
-          <w:sz w:val="24"/>
-          <w:rFonts w:ascii="Calibri" w:hAnsi="Calibri" w:cs="Calibri"/>
+          <w:sz w:val="28"/>
+          <w:rFonts w:ascii="Arial" w:hAnsi="Arial" w:cs="Arial"/>
           <w:color w:val="000000"/>
         </w:rPr>
-        <w:t>• Admin training</w:t>
+        <w:t xml:space="preserve">  •  Admin training</w:t>
       </w:r>
     </w:p>
     <w:p>
       <w:pPr>
-        <w:ind w:left="283"/>
+        <w:spacing w:after="80" w:before="80"/>
       </w:pPr>
       <w:r>
         <w:rPr>
-          <w:rFonts w:ascii="Calibri" w:hAnsi="Calibri"/>
           <w:b w:val="0"/>
-          <w:sz w:val="24"/>
-          <w:rFonts w:ascii="Calibri" w:hAnsi="Calibri" w:cs="Calibri"/>
+          <w:sz w:val="28"/>
+          <w:rFonts w:ascii="Arial" w:hAnsi="Arial" w:cs="Arial"/>
           <w:color w:val="000000"/>
         </w:rPr>
-        <w:t>• 90 days support</w:t>
+        <w:t xml:space="preserve">  •  90 days support</w:t>
       </w:r>
     </w:p>
     <w:p>
@@ -1334,1920 +1030,1068 @@
         <w:br w:type="page"/>
       </w:r>
     </w:p>
-    <w:p/>
-    <w:tbl>
-      <w:tblPr>
-        <w:tblW w:type="auto" w:w="0"/>
-        <w:jc w:val="center"/>
-        <w:tblLook w:firstColumn="1" w:firstRow="1" w:lastColumn="0" w:lastRow="0" w:noHBand="0" w:noVBand="1" w:val="04A0"/>
-      </w:tblPr>
-      <w:tblGrid>
-        <w:gridCol w:w="9972"/>
-      </w:tblGrid>
-      <w:tr>
-        <w:tc>
-          <w:tcPr>
-            <w:tcW w:type="dxa" w:w="9972"/>
-            <w:shd w:val="clear" w:fill="04243C"/>
-            <w:tcBorders>
-              <w:top w:val="single" w:sz="12" w:color="06ACBA"/>
-              <w:left w:val="single" w:sz="12" w:color="06ACBA"/>
-              <w:bottom w:val="single" w:sz="12" w:color="06ACBA"/>
-              <w:right w:val="single" w:sz="12" w:color="06ACBA"/>
-            </w:tcBorders>
-            <w:tcBorders>
-              <w:top w:val="single" w:sz="8" w:color="04243C"/>
-              <w:left w:val="single" w:sz="8" w:color="04243C"/>
-              <w:bottom w:val="single" w:sz="8" w:color="04243C"/>
-              <w:right w:val="single" w:sz="8" w:color="04243C"/>
-            </w:tcBorders>
-          </w:tcPr>
-          <w:p>
-            <w:pPr>
-              <w:jc w:val="left"/>
-            </w:pPr>
-            <w:r>
-              <w:rPr>
-                <w:rFonts w:ascii="Calibri" w:hAnsi="Calibri"/>
-                <w:b/>
-                <w:sz w:val="36"/>
-                <w:rFonts w:ascii="Calibri" w:hAnsi="Calibri" w:cs="Calibri"/>
-                <w:color w:val="FFFFFF"/>
-              </w:rPr>
-              <w:t>Social Media Management</w:t>
-            </w:r>
-          </w:p>
-          <w:p>
-            <w:r>
-              <w:rPr>
-                <w:rFonts w:ascii="Calibri" w:hAnsi="Calibri"/>
-                <w:b w:val="0"/>
-                <w:sz w:val="24"/>
-                <w:rFonts w:ascii="Calibri" w:hAnsi="Calibri" w:cs="Calibri"/>
-                <w:color w:val="FFFFFF"/>
-              </w:rPr>
-              <w:t>Monthly price + included services</w:t>
-            </w:r>
-          </w:p>
-        </w:tc>
-      </w:tr>
-    </w:tbl>
-    <w:p/>
-    <w:p/>
-    <w:tbl>
-      <w:tblPr>
-        <w:tblW w:type="auto" w:w="0"/>
-        <w:tblLook w:firstColumn="1" w:firstRow="1" w:lastColumn="0" w:lastRow="0" w:noHBand="0" w:noVBand="1" w:val="04A0"/>
-      </w:tblPr>
-      <w:tblGrid>
-        <w:gridCol w:w="9972"/>
-      </w:tblGrid>
-      <w:tr>
-        <w:tc>
-          <w:tcPr>
-            <w:tcW w:type="dxa" w:w="9972"/>
-            <w:shd w:val="clear" w:fill="06ACBA"/>
-            <w:tcBorders>
-              <w:top w:val="single" w:sz="8" w:color="04243C"/>
-              <w:left w:val="single" w:sz="8" w:color="04243C"/>
-              <w:bottom w:val="single" w:sz="8" w:color="04243C"/>
-              <w:right w:val="single" w:sz="8" w:color="04243C"/>
-            </w:tcBorders>
-            <w:tcBorders>
-              <w:top w:val="single" w:sz="8" w:color="04243C"/>
-              <w:left w:val="single" w:sz="8" w:color="04243C"/>
-              <w:bottom w:val="single" w:sz="8" w:color="04243C"/>
-              <w:right w:val="single" w:sz="8" w:color="04243C"/>
-            </w:tcBorders>
-          </w:tcPr>
-          <w:p>
-            <w:r>
-              <w:rPr>
-                <w:rFonts w:ascii="Calibri" w:hAnsi="Calibri"/>
-                <w:b/>
-                <w:sz w:val="28"/>
-                <w:rFonts w:ascii="Calibri" w:hAnsi="Calibri" w:cs="Calibri"/>
-                <w:color w:val="000000"/>
-              </w:rPr>
-              <w:t>BASIC  —  PKR 25,000 per month</w:t>
-            </w:r>
-          </w:p>
-        </w:tc>
-      </w:tr>
-      <w:tr>
-        <w:tc>
-          <w:tcPr>
-            <w:tcW w:type="dxa" w:w="9972"/>
-            <w:shd w:val="clear" w:fill="D4EEF2"/>
-            <w:tcBorders>
-              <w:top w:val="single" w:sz="8" w:color="04243C"/>
-              <w:left w:val="single" w:sz="8" w:color="04243C"/>
-              <w:bottom w:val="single" w:sz="8" w:color="04243C"/>
-              <w:right w:val="single" w:sz="8" w:color="04243C"/>
-            </w:tcBorders>
-            <w:tcBorders>
-              <w:top w:val="single" w:sz="8" w:color="04243C"/>
-              <w:left w:val="single" w:sz="8" w:color="04243C"/>
-              <w:bottom w:val="single" w:sz="8" w:color="04243C"/>
-              <w:right w:val="single" w:sz="8" w:color="04243C"/>
-            </w:tcBorders>
-          </w:tcPr>
-          <w:p>
-            <w:r>
-              <w:rPr>
-                <w:rFonts w:ascii="Calibri" w:hAnsi="Calibri"/>
-                <w:b/>
-                <w:sz w:val="24"/>
-                <w:rFonts w:ascii="Calibri" w:hAnsi="Calibri" w:cs="Calibri"/>
-                <w:color w:val="000000"/>
-              </w:rPr>
-              <w:t>Is price me ye shamil hai:</w:t>
-            </w:r>
-          </w:p>
-          <w:p>
-            <w:r>
-              <w:rPr>
-                <w:rFonts w:ascii="Calibri" w:hAnsi="Calibri"/>
-                <w:b w:val="0"/>
-                <w:sz w:val="22"/>
-                <w:rFonts w:ascii="Calibri" w:hAnsi="Calibri" w:cs="Calibri"/>
-                <w:color w:val="000000"/>
-              </w:rPr>
-              <w:t>• Facebook</w:t>
-            </w:r>
-          </w:p>
-          <w:p>
-            <w:r>
-              <w:rPr>
-                <w:rFonts w:ascii="Calibri" w:hAnsi="Calibri"/>
-                <w:b w:val="0"/>
-                <w:sz w:val="22"/>
-                <w:rFonts w:ascii="Calibri" w:hAnsi="Calibri" w:cs="Calibri"/>
-                <w:color w:val="000000"/>
-              </w:rPr>
-              <w:t>• Instagram</w:t>
-            </w:r>
-          </w:p>
-          <w:p>
-            <w:r>
-              <w:rPr>
-                <w:rFonts w:ascii="Calibri" w:hAnsi="Calibri"/>
-                <w:b w:val="0"/>
-                <w:sz w:val="22"/>
-                <w:rFonts w:ascii="Calibri" w:hAnsi="Calibri" w:cs="Calibri"/>
-                <w:color w:val="000000"/>
-              </w:rPr>
-              <w:t>• 12 posts</w:t>
-            </w:r>
-          </w:p>
-          <w:p>
-            <w:r>
-              <w:rPr>
-                <w:rFonts w:ascii="Calibri" w:hAnsi="Calibri"/>
-                <w:b w:val="0"/>
-                <w:sz w:val="22"/>
-                <w:rFonts w:ascii="Calibri" w:hAnsi="Calibri" w:cs="Calibri"/>
-                <w:color w:val="000000"/>
-              </w:rPr>
-              <w:t>• Captions</w:t>
-            </w:r>
-          </w:p>
-          <w:p>
-            <w:r>
-              <w:rPr>
-                <w:rFonts w:ascii="Calibri" w:hAnsi="Calibri"/>
-                <w:b w:val="0"/>
-                <w:sz w:val="22"/>
-                <w:rFonts w:ascii="Calibri" w:hAnsi="Calibri" w:cs="Calibri"/>
-                <w:color w:val="000000"/>
-              </w:rPr>
-              <w:t>• Hashtags</w:t>
-            </w:r>
-          </w:p>
-          <w:p>
-            <w:r>
-              <w:rPr>
-                <w:rFonts w:ascii="Calibri" w:hAnsi="Calibri"/>
-                <w:b w:val="0"/>
-                <w:sz w:val="22"/>
-                <w:rFonts w:ascii="Calibri" w:hAnsi="Calibri" w:cs="Calibri"/>
-                <w:color w:val="000000"/>
-              </w:rPr>
-              <w:t>• Monthly report</w:t>
-            </w:r>
-          </w:p>
-        </w:tc>
-      </w:tr>
-    </w:tbl>
-    <w:p/>
-    <w:tbl>
-      <w:tblPr>
-        <w:tblW w:type="auto" w:w="0"/>
-        <w:tblLook w:firstColumn="1" w:firstRow="1" w:lastColumn="0" w:lastRow="0" w:noHBand="0" w:noVBand="1" w:val="04A0"/>
-      </w:tblPr>
-      <w:tblGrid>
-        <w:gridCol w:w="9972"/>
-      </w:tblGrid>
-      <w:tr>
-        <w:tc>
-          <w:tcPr>
-            <w:tcW w:type="dxa" w:w="9972"/>
-            <w:shd w:val="clear" w:fill="06ACBA"/>
-            <w:tcBorders>
-              <w:top w:val="single" w:sz="8" w:color="04243C"/>
-              <w:left w:val="single" w:sz="8" w:color="04243C"/>
-              <w:bottom w:val="single" w:sz="8" w:color="04243C"/>
-              <w:right w:val="single" w:sz="8" w:color="04243C"/>
-            </w:tcBorders>
-            <w:tcBorders>
-              <w:top w:val="single" w:sz="8" w:color="04243C"/>
-              <w:left w:val="single" w:sz="8" w:color="04243C"/>
-              <w:bottom w:val="single" w:sz="8" w:color="04243C"/>
-              <w:right w:val="single" w:sz="8" w:color="04243C"/>
-            </w:tcBorders>
-          </w:tcPr>
-          <w:p>
-            <w:r>
-              <w:rPr>
-                <w:rFonts w:ascii="Calibri" w:hAnsi="Calibri"/>
-                <w:b/>
-                <w:sz w:val="28"/>
-                <w:rFonts w:ascii="Calibri" w:hAnsi="Calibri" w:cs="Calibri"/>
-                <w:color w:val="000000"/>
-              </w:rPr>
-              <w:t>STANDARD  —  PKR 45,000 per month</w:t>
-            </w:r>
-          </w:p>
-        </w:tc>
-      </w:tr>
-      <w:tr>
-        <w:tc>
-          <w:tcPr>
-            <w:tcW w:type="dxa" w:w="9972"/>
-            <w:shd w:val="clear" w:fill="D4EEF2"/>
-            <w:tcBorders>
-              <w:top w:val="single" w:sz="8" w:color="04243C"/>
-              <w:left w:val="single" w:sz="8" w:color="04243C"/>
-              <w:bottom w:val="single" w:sz="8" w:color="04243C"/>
-              <w:right w:val="single" w:sz="8" w:color="04243C"/>
-            </w:tcBorders>
-            <w:tcBorders>
-              <w:top w:val="single" w:sz="8" w:color="04243C"/>
-              <w:left w:val="single" w:sz="8" w:color="04243C"/>
-              <w:bottom w:val="single" w:sz="8" w:color="04243C"/>
-              <w:right w:val="single" w:sz="8" w:color="04243C"/>
-            </w:tcBorders>
-          </w:tcPr>
-          <w:p>
-            <w:r>
-              <w:rPr>
-                <w:rFonts w:ascii="Calibri" w:hAnsi="Calibri"/>
-                <w:b/>
-                <w:sz w:val="24"/>
-                <w:rFonts w:ascii="Calibri" w:hAnsi="Calibri" w:cs="Calibri"/>
-                <w:color w:val="000000"/>
-              </w:rPr>
-              <w:t>Is price me ye shamil hai:</w:t>
-            </w:r>
-          </w:p>
-          <w:p>
-            <w:r>
-              <w:rPr>
-                <w:rFonts w:ascii="Calibri" w:hAnsi="Calibri"/>
-                <w:b w:val="0"/>
-                <w:sz w:val="22"/>
-                <w:rFonts w:ascii="Calibri" w:hAnsi="Calibri" w:cs="Calibri"/>
-                <w:color w:val="000000"/>
-              </w:rPr>
-              <w:t>• Facebook, Instagram, LinkedIn</w:t>
-            </w:r>
-          </w:p>
-          <w:p>
-            <w:r>
-              <w:rPr>
-                <w:rFonts w:ascii="Calibri" w:hAnsi="Calibri"/>
-                <w:b w:val="0"/>
-                <w:sz w:val="22"/>
-                <w:rFonts w:ascii="Calibri" w:hAnsi="Calibri" w:cs="Calibri"/>
-                <w:color w:val="000000"/>
-              </w:rPr>
-              <w:t>• 20 posts</w:t>
-            </w:r>
-          </w:p>
-          <w:p>
-            <w:r>
-              <w:rPr>
-                <w:rFonts w:ascii="Calibri" w:hAnsi="Calibri"/>
-                <w:b w:val="0"/>
-                <w:sz w:val="22"/>
-                <w:rFonts w:ascii="Calibri" w:hAnsi="Calibri" w:cs="Calibri"/>
-                <w:color w:val="000000"/>
-              </w:rPr>
-              <w:t>• Stories</w:t>
-            </w:r>
-          </w:p>
-          <w:p>
-            <w:r>
-              <w:rPr>
-                <w:rFonts w:ascii="Calibri" w:hAnsi="Calibri"/>
-                <w:b w:val="0"/>
-                <w:sz w:val="22"/>
-                <w:rFonts w:ascii="Calibri" w:hAnsi="Calibri" w:cs="Calibri"/>
-                <w:color w:val="000000"/>
-              </w:rPr>
-              <w:t>• Reels planning</w:t>
-            </w:r>
-          </w:p>
-          <w:p>
-            <w:r>
-              <w:rPr>
-                <w:rFonts w:ascii="Calibri" w:hAnsi="Calibri"/>
-                <w:b w:val="0"/>
-                <w:sz w:val="22"/>
-                <w:rFonts w:ascii="Calibri" w:hAnsi="Calibri" w:cs="Calibri"/>
-                <w:color w:val="000000"/>
-              </w:rPr>
-              <w:t>• Community management</w:t>
-            </w:r>
-          </w:p>
-          <w:p>
-            <w:r>
-              <w:rPr>
-                <w:rFonts w:ascii="Calibri" w:hAnsi="Calibri"/>
-                <w:b w:val="0"/>
-                <w:sz w:val="22"/>
-                <w:rFonts w:ascii="Calibri" w:hAnsi="Calibri" w:cs="Calibri"/>
-                <w:color w:val="000000"/>
-              </w:rPr>
-              <w:t>• Analytics</w:t>
-            </w:r>
-          </w:p>
-        </w:tc>
-      </w:tr>
-    </w:tbl>
-    <w:p/>
-    <w:tbl>
-      <w:tblPr>
-        <w:tblW w:type="auto" w:w="0"/>
-        <w:tblLook w:firstColumn="1" w:firstRow="1" w:lastColumn="0" w:lastRow="0" w:noHBand="0" w:noVBand="1" w:val="04A0"/>
-      </w:tblPr>
-      <w:tblGrid>
-        <w:gridCol w:w="9972"/>
-      </w:tblGrid>
-      <w:tr>
-        <w:tc>
-          <w:tcPr>
-            <w:tcW w:type="dxa" w:w="9972"/>
-            <w:shd w:val="clear" w:fill="06ACBA"/>
-            <w:tcBorders>
-              <w:top w:val="single" w:sz="8" w:color="04243C"/>
-              <w:left w:val="single" w:sz="8" w:color="04243C"/>
-              <w:bottom w:val="single" w:sz="8" w:color="04243C"/>
-              <w:right w:val="single" w:sz="8" w:color="04243C"/>
-            </w:tcBorders>
-            <w:tcBorders>
-              <w:top w:val="single" w:sz="8" w:color="04243C"/>
-              <w:left w:val="single" w:sz="8" w:color="04243C"/>
-              <w:bottom w:val="single" w:sz="8" w:color="04243C"/>
-              <w:right w:val="single" w:sz="8" w:color="04243C"/>
-            </w:tcBorders>
-          </w:tcPr>
-          <w:p>
-            <w:r>
-              <w:rPr>
-                <w:rFonts w:ascii="Calibri" w:hAnsi="Calibri"/>
-                <w:b/>
-                <w:sz w:val="28"/>
-                <w:rFonts w:ascii="Calibri" w:hAnsi="Calibri" w:cs="Calibri"/>
-                <w:color w:val="000000"/>
-              </w:rPr>
-              <w:t>PREMIUM  —  PKR 75,000 per month</w:t>
-            </w:r>
-          </w:p>
-        </w:tc>
-      </w:tr>
-      <w:tr>
-        <w:tc>
-          <w:tcPr>
-            <w:tcW w:type="dxa" w:w="9972"/>
-            <w:shd w:val="clear" w:fill="D4EEF2"/>
-            <w:tcBorders>
-              <w:top w:val="single" w:sz="8" w:color="04243C"/>
-              <w:left w:val="single" w:sz="8" w:color="04243C"/>
-              <w:bottom w:val="single" w:sz="8" w:color="04243C"/>
-              <w:right w:val="single" w:sz="8" w:color="04243C"/>
-            </w:tcBorders>
-            <w:tcBorders>
-              <w:top w:val="single" w:sz="8" w:color="04243C"/>
-              <w:left w:val="single" w:sz="8" w:color="04243C"/>
-              <w:bottom w:val="single" w:sz="8" w:color="04243C"/>
-              <w:right w:val="single" w:sz="8" w:color="04243C"/>
-            </w:tcBorders>
-          </w:tcPr>
-          <w:p>
-            <w:r>
-              <w:rPr>
-                <w:rFonts w:ascii="Calibri" w:hAnsi="Calibri"/>
-                <w:b/>
-                <w:sz w:val="24"/>
-                <w:rFonts w:ascii="Calibri" w:hAnsi="Calibri" w:cs="Calibri"/>
-                <w:color w:val="000000"/>
-              </w:rPr>
-              <w:t>Is price me ye shamil hai:</w:t>
-            </w:r>
-          </w:p>
-          <w:p>
-            <w:r>
-              <w:rPr>
-                <w:rFonts w:ascii="Calibri" w:hAnsi="Calibri"/>
-                <w:b w:val="0"/>
-                <w:sz w:val="22"/>
-                <w:rFonts w:ascii="Calibri" w:hAnsi="Calibri" w:cs="Calibri"/>
-                <w:color w:val="000000"/>
-              </w:rPr>
-              <w:t>• Facebook, Instagram, LinkedIn, TikTok</w:t>
-            </w:r>
-          </w:p>
-          <w:p>
-            <w:r>
-              <w:rPr>
-                <w:rFonts w:ascii="Calibri" w:hAnsi="Calibri"/>
-                <w:b w:val="0"/>
-                <w:sz w:val="22"/>
-                <w:rFonts w:ascii="Calibri" w:hAnsi="Calibri" w:cs="Calibri"/>
-                <w:color w:val="000000"/>
-              </w:rPr>
-              <w:t>• 30+ posts</w:t>
-            </w:r>
-          </w:p>
-          <w:p>
-            <w:r>
-              <w:rPr>
-                <w:rFonts w:ascii="Calibri" w:hAnsi="Calibri"/>
-                <w:b w:val="0"/>
-                <w:sz w:val="22"/>
-                <w:rFonts w:ascii="Calibri" w:hAnsi="Calibri" w:cs="Calibri"/>
-                <w:color w:val="000000"/>
-              </w:rPr>
-              <w:t>• Daily stories</w:t>
-            </w:r>
-          </w:p>
-          <w:p>
-            <w:r>
-              <w:rPr>
-                <w:rFonts w:ascii="Calibri" w:hAnsi="Calibri"/>
-                <w:b w:val="0"/>
-                <w:sz w:val="22"/>
-                <w:rFonts w:ascii="Calibri" w:hAnsi="Calibri" w:cs="Calibri"/>
-                <w:color w:val="000000"/>
-              </w:rPr>
-              <w:t>• Reels strategy</w:t>
-            </w:r>
-          </w:p>
-          <w:p>
-            <w:r>
-              <w:rPr>
-                <w:rFonts w:ascii="Calibri" w:hAnsi="Calibri"/>
-                <w:b w:val="0"/>
-                <w:sz w:val="22"/>
-                <w:rFonts w:ascii="Calibri" w:hAnsi="Calibri" w:cs="Calibri"/>
-                <w:color w:val="000000"/>
-              </w:rPr>
-              <w:t>• Community management</w:t>
-            </w:r>
-          </w:p>
-          <w:p>
-            <w:r>
-              <w:rPr>
-                <w:rFonts w:ascii="Calibri" w:hAnsi="Calibri"/>
-                <w:b w:val="0"/>
-                <w:sz w:val="22"/>
-                <w:rFonts w:ascii="Calibri" w:hAnsi="Calibri" w:cs="Calibri"/>
-                <w:color w:val="000000"/>
-              </w:rPr>
-              <w:t>• Weekly reports</w:t>
-            </w:r>
-          </w:p>
-        </w:tc>
-      </w:tr>
-    </w:tbl>
+    <w:p>
+      <w:pPr>
+        <w:spacing w:before="320" w:after="160"/>
+        <w:pBdr>
+          <w:left w:val="single" w:sz="24" w:space="8" w:color="06ACBA"/>
+        </w:pBdr>
+      </w:pPr>
+      <w:r>
+        <w:rPr>
+          <w:b/>
+          <w:sz w:val="40"/>
+          <w:rFonts w:ascii="Arial" w:hAnsi="Arial" w:cs="Arial"/>
+          <w:color w:val="000000"/>
+        </w:rPr>
+        <w:t>Social Media Management</w:t>
+      </w:r>
+    </w:p>
+    <w:p>
+      <w:pPr>
+        <w:spacing w:after="240" w:before="80"/>
+      </w:pPr>
+      <w:r>
+        <w:rPr>
+          <w:b/>
+          <w:sz w:val="28"/>
+          <w:rFonts w:ascii="Arial" w:hAnsi="Arial" w:cs="Arial"/>
+          <w:color w:val="000000"/>
+        </w:rPr>
+        <w:t>Monthly packages — price aur included services</w:t>
+      </w:r>
+    </w:p>
+    <w:p>
+      <w:pPr>
+        <w:spacing w:after="160" w:before="80"/>
+      </w:pPr>
+      <w:r>
+        <w:rPr>
+          <w:b/>
+          <w:sz w:val="32"/>
+          <w:rFonts w:ascii="Arial" w:hAnsi="Arial" w:cs="Arial"/>
+          <w:color w:val="000000"/>
+        </w:rPr>
+        <w:t>BASIC — PKR 25,000 / MONTH</w:t>
+      </w:r>
+    </w:p>
+    <w:p>
+      <w:pPr>
+        <w:spacing w:after="120" w:before="80"/>
+      </w:pPr>
+      <w:r>
+        <w:rPr>
+          <w:b/>
+          <w:sz w:val="28"/>
+          <w:rFonts w:ascii="Arial" w:hAnsi="Arial" w:cs="Arial"/>
+          <w:color w:val="06ACBA"/>
+        </w:rPr>
+        <w:t>Is price me ye shamil hai:</w:t>
+      </w:r>
+    </w:p>
+    <w:p>
+      <w:pPr>
+        <w:spacing w:after="80" w:before="80"/>
+      </w:pPr>
+      <w:r>
+        <w:rPr>
+          <w:b w:val="0"/>
+          <w:sz w:val="28"/>
+          <w:rFonts w:ascii="Arial" w:hAnsi="Arial" w:cs="Arial"/>
+          <w:color w:val="000000"/>
+        </w:rPr>
+        <w:t xml:space="preserve">  •  Facebook</w:t>
+      </w:r>
+    </w:p>
+    <w:p>
+      <w:pPr>
+        <w:spacing w:after="80" w:before="80"/>
+      </w:pPr>
+      <w:r>
+        <w:rPr>
+          <w:b w:val="0"/>
+          <w:sz w:val="28"/>
+          <w:rFonts w:ascii="Arial" w:hAnsi="Arial" w:cs="Arial"/>
+          <w:color w:val="000000"/>
+        </w:rPr>
+        <w:t xml:space="preserve">  •  Instagram</w:t>
+      </w:r>
+    </w:p>
+    <w:p>
+      <w:pPr>
+        <w:spacing w:after="80" w:before="80"/>
+      </w:pPr>
+      <w:r>
+        <w:rPr>
+          <w:b w:val="0"/>
+          <w:sz w:val="28"/>
+          <w:rFonts w:ascii="Arial" w:hAnsi="Arial" w:cs="Arial"/>
+          <w:color w:val="000000"/>
+        </w:rPr>
+        <w:t xml:space="preserve">  •  12 posts</w:t>
+      </w:r>
+    </w:p>
+    <w:p>
+      <w:pPr>
+        <w:spacing w:after="80" w:before="80"/>
+      </w:pPr>
+      <w:r>
+        <w:rPr>
+          <w:b w:val="0"/>
+          <w:sz w:val="28"/>
+          <w:rFonts w:ascii="Arial" w:hAnsi="Arial" w:cs="Arial"/>
+          <w:color w:val="000000"/>
+        </w:rPr>
+        <w:t xml:space="preserve">  •  Captions</w:t>
+      </w:r>
+    </w:p>
+    <w:p>
+      <w:pPr>
+        <w:spacing w:after="80" w:before="80"/>
+      </w:pPr>
+      <w:r>
+        <w:rPr>
+          <w:b w:val="0"/>
+          <w:sz w:val="28"/>
+          <w:rFonts w:ascii="Arial" w:hAnsi="Arial" w:cs="Arial"/>
+          <w:color w:val="000000"/>
+        </w:rPr>
+        <w:t xml:space="preserve">  •  Hashtags</w:t>
+      </w:r>
+    </w:p>
+    <w:p>
+      <w:pPr>
+        <w:spacing w:after="80" w:before="80"/>
+      </w:pPr>
+      <w:r>
+        <w:rPr>
+          <w:b w:val="0"/>
+          <w:sz w:val="28"/>
+          <w:rFonts w:ascii="Arial" w:hAnsi="Arial" w:cs="Arial"/>
+          <w:color w:val="000000"/>
+        </w:rPr>
+        <w:t xml:space="preserve">  •  Monthly report</w:t>
+      </w:r>
+    </w:p>
+    <w:p>
+      <w:pPr>
+        <w:spacing w:after="280" w:before="80"/>
+      </w:pPr>
+      <w:r>
+        <w:rPr>
+          <w:b w:val="0"/>
+          <w:sz w:val="20"/>
+          <w:rFonts w:ascii="Arial" w:hAnsi="Arial" w:cs="Arial"/>
+          <w:color w:val="000000"/>
+        </w:rPr>
+        <w:t>————————————————————————————————————————</w:t>
+      </w:r>
+    </w:p>
+    <w:p>
+      <w:pPr>
+        <w:spacing w:after="160" w:before="80"/>
+      </w:pPr>
+      <w:r>
+        <w:rPr>
+          <w:b/>
+          <w:sz w:val="32"/>
+          <w:rFonts w:ascii="Arial" w:hAnsi="Arial" w:cs="Arial"/>
+          <w:color w:val="000000"/>
+        </w:rPr>
+        <w:t>STANDARD — PKR 45,000 / MONTH</w:t>
+      </w:r>
+    </w:p>
+    <w:p>
+      <w:pPr>
+        <w:spacing w:after="120" w:before="80"/>
+      </w:pPr>
+      <w:r>
+        <w:rPr>
+          <w:b/>
+          <w:sz w:val="28"/>
+          <w:rFonts w:ascii="Arial" w:hAnsi="Arial" w:cs="Arial"/>
+          <w:color w:val="06ACBA"/>
+        </w:rPr>
+        <w:t>Is price me ye shamil hai:</w:t>
+      </w:r>
+    </w:p>
+    <w:p>
+      <w:pPr>
+        <w:spacing w:after="80" w:before="80"/>
+      </w:pPr>
+      <w:r>
+        <w:rPr>
+          <w:b w:val="0"/>
+          <w:sz w:val="28"/>
+          <w:rFonts w:ascii="Arial" w:hAnsi="Arial" w:cs="Arial"/>
+          <w:color w:val="000000"/>
+        </w:rPr>
+        <w:t xml:space="preserve">  •  Facebook, Instagram, LinkedIn</w:t>
+      </w:r>
+    </w:p>
+    <w:p>
+      <w:pPr>
+        <w:spacing w:after="80" w:before="80"/>
+      </w:pPr>
+      <w:r>
+        <w:rPr>
+          <w:b w:val="0"/>
+          <w:sz w:val="28"/>
+          <w:rFonts w:ascii="Arial" w:hAnsi="Arial" w:cs="Arial"/>
+          <w:color w:val="000000"/>
+        </w:rPr>
+        <w:t xml:space="preserve">  •  20 posts</w:t>
+      </w:r>
+    </w:p>
+    <w:p>
+      <w:pPr>
+        <w:spacing w:after="80" w:before="80"/>
+      </w:pPr>
+      <w:r>
+        <w:rPr>
+          <w:b w:val="0"/>
+          <w:sz w:val="28"/>
+          <w:rFonts w:ascii="Arial" w:hAnsi="Arial" w:cs="Arial"/>
+          <w:color w:val="000000"/>
+        </w:rPr>
+        <w:t xml:space="preserve">  •  Stories</w:t>
+      </w:r>
+    </w:p>
+    <w:p>
+      <w:pPr>
+        <w:spacing w:after="80" w:before="80"/>
+      </w:pPr>
+      <w:r>
+        <w:rPr>
+          <w:b w:val="0"/>
+          <w:sz w:val="28"/>
+          <w:rFonts w:ascii="Arial" w:hAnsi="Arial" w:cs="Arial"/>
+          <w:color w:val="000000"/>
+        </w:rPr>
+        <w:t xml:space="preserve">  •  Reels planning</w:t>
+      </w:r>
+    </w:p>
+    <w:p>
+      <w:pPr>
+        <w:spacing w:after="80" w:before="80"/>
+      </w:pPr>
+      <w:r>
+        <w:rPr>
+          <w:b w:val="0"/>
+          <w:sz w:val="28"/>
+          <w:rFonts w:ascii="Arial" w:hAnsi="Arial" w:cs="Arial"/>
+          <w:color w:val="000000"/>
+        </w:rPr>
+        <w:t xml:space="preserve">  •  Community management</w:t>
+      </w:r>
+    </w:p>
+    <w:p>
+      <w:pPr>
+        <w:spacing w:after="80" w:before="80"/>
+      </w:pPr>
+      <w:r>
+        <w:rPr>
+          <w:b w:val="0"/>
+          <w:sz w:val="28"/>
+          <w:rFonts w:ascii="Arial" w:hAnsi="Arial" w:cs="Arial"/>
+          <w:color w:val="000000"/>
+        </w:rPr>
+        <w:t xml:space="preserve">  •  Analytics</w:t>
+      </w:r>
+    </w:p>
+    <w:p>
+      <w:pPr>
+        <w:spacing w:after="280" w:before="80"/>
+      </w:pPr>
+      <w:r>
+        <w:rPr>
+          <w:b w:val="0"/>
+          <w:sz w:val="20"/>
+          <w:rFonts w:ascii="Arial" w:hAnsi="Arial" w:cs="Arial"/>
+          <w:color w:val="000000"/>
+        </w:rPr>
+        <w:t>————————————————————————————————————————</w:t>
+      </w:r>
+    </w:p>
+    <w:p>
+      <w:pPr>
+        <w:spacing w:after="160" w:before="80"/>
+      </w:pPr>
+      <w:r>
+        <w:rPr>
+          <w:b/>
+          <w:sz w:val="32"/>
+          <w:rFonts w:ascii="Arial" w:hAnsi="Arial" w:cs="Arial"/>
+          <w:color w:val="000000"/>
+        </w:rPr>
+        <w:t>PREMIUM — PKR 75,000 / MONTH</w:t>
+      </w:r>
+    </w:p>
+    <w:p>
+      <w:pPr>
+        <w:spacing w:after="120" w:before="80"/>
+      </w:pPr>
+      <w:r>
+        <w:rPr>
+          <w:b/>
+          <w:sz w:val="28"/>
+          <w:rFonts w:ascii="Arial" w:hAnsi="Arial" w:cs="Arial"/>
+          <w:color w:val="06ACBA"/>
+        </w:rPr>
+        <w:t>Is price me ye shamil hai:</w:t>
+      </w:r>
+    </w:p>
+    <w:p>
+      <w:pPr>
+        <w:spacing w:after="80" w:before="80"/>
+      </w:pPr>
+      <w:r>
+        <w:rPr>
+          <w:b w:val="0"/>
+          <w:sz w:val="28"/>
+          <w:rFonts w:ascii="Arial" w:hAnsi="Arial" w:cs="Arial"/>
+          <w:color w:val="000000"/>
+        </w:rPr>
+        <w:t xml:space="preserve">  •  Facebook, Instagram, LinkedIn, TikTok</w:t>
+      </w:r>
+    </w:p>
+    <w:p>
+      <w:pPr>
+        <w:spacing w:after="80" w:before="80"/>
+      </w:pPr>
+      <w:r>
+        <w:rPr>
+          <w:b w:val="0"/>
+          <w:sz w:val="28"/>
+          <w:rFonts w:ascii="Arial" w:hAnsi="Arial" w:cs="Arial"/>
+          <w:color w:val="000000"/>
+        </w:rPr>
+        <w:t xml:space="preserve">  •  30+ posts</w:t>
+      </w:r>
+    </w:p>
+    <w:p>
+      <w:pPr>
+        <w:spacing w:after="80" w:before="80"/>
+      </w:pPr>
+      <w:r>
+        <w:rPr>
+          <w:b w:val="0"/>
+          <w:sz w:val="28"/>
+          <w:rFonts w:ascii="Arial" w:hAnsi="Arial" w:cs="Arial"/>
+          <w:color w:val="000000"/>
+        </w:rPr>
+        <w:t xml:space="preserve">  •  Daily stories</w:t>
+      </w:r>
+    </w:p>
+    <w:p>
+      <w:pPr>
+        <w:spacing w:after="80" w:before="80"/>
+      </w:pPr>
+      <w:r>
+        <w:rPr>
+          <w:b w:val="0"/>
+          <w:sz w:val="28"/>
+          <w:rFonts w:ascii="Arial" w:hAnsi="Arial" w:cs="Arial"/>
+          <w:color w:val="000000"/>
+        </w:rPr>
+        <w:t xml:space="preserve">  •  Reels strategy</w:t>
+      </w:r>
+    </w:p>
+    <w:p>
+      <w:pPr>
+        <w:spacing w:after="80" w:before="80"/>
+      </w:pPr>
+      <w:r>
+        <w:rPr>
+          <w:b w:val="0"/>
+          <w:sz w:val="28"/>
+          <w:rFonts w:ascii="Arial" w:hAnsi="Arial" w:cs="Arial"/>
+          <w:color w:val="000000"/>
+        </w:rPr>
+        <w:t xml:space="preserve">  •  Community management</w:t>
+      </w:r>
+    </w:p>
+    <w:p>
+      <w:pPr>
+        <w:spacing w:after="80" w:before="80"/>
+      </w:pPr>
+      <w:r>
+        <w:rPr>
+          <w:b w:val="0"/>
+          <w:sz w:val="28"/>
+          <w:rFonts w:ascii="Arial" w:hAnsi="Arial" w:cs="Arial"/>
+          <w:color w:val="000000"/>
+        </w:rPr>
+        <w:t xml:space="preserve">  •  Weekly reports</w:t>
+      </w:r>
+    </w:p>
+    <w:p>
+      <w:pPr>
+        <w:spacing w:after="280" w:before="80"/>
+      </w:pPr>
+      <w:r>
+        <w:rPr>
+          <w:b w:val="0"/>
+          <w:sz w:val="20"/>
+          <w:rFonts w:ascii="Arial" w:hAnsi="Arial" w:cs="Arial"/>
+          <w:color w:val="000000"/>
+        </w:rPr>
+        <w:t>————————————————————————————————————————</w:t>
+      </w:r>
+    </w:p>
     <w:p>
       <w:r>
         <w:br w:type="page"/>
       </w:r>
     </w:p>
-    <w:p/>
-    <w:tbl>
-      <w:tblPr>
-        <w:tblW w:type="auto" w:w="0"/>
-        <w:jc w:val="center"/>
-        <w:tblLook w:firstColumn="1" w:firstRow="1" w:lastColumn="0" w:lastRow="0" w:noHBand="0" w:noVBand="1" w:val="04A0"/>
-      </w:tblPr>
-      <w:tblGrid>
-        <w:gridCol w:w="9972"/>
-      </w:tblGrid>
-      <w:tr>
-        <w:tc>
-          <w:tcPr>
-            <w:tcW w:type="dxa" w:w="9972"/>
-            <w:shd w:val="clear" w:fill="04243C"/>
-            <w:tcBorders>
-              <w:top w:val="single" w:sz="12" w:color="06ACBA"/>
-              <w:left w:val="single" w:sz="12" w:color="06ACBA"/>
-              <w:bottom w:val="single" w:sz="12" w:color="06ACBA"/>
-              <w:right w:val="single" w:sz="12" w:color="06ACBA"/>
-            </w:tcBorders>
-            <w:tcBorders>
-              <w:top w:val="single" w:sz="8" w:color="04243C"/>
-              <w:left w:val="single" w:sz="8" w:color="04243C"/>
-              <w:bottom w:val="single" w:sz="8" w:color="04243C"/>
-              <w:right w:val="single" w:sz="8" w:color="04243C"/>
-            </w:tcBorders>
-          </w:tcPr>
-          <w:p>
-            <w:pPr>
-              <w:jc w:val="left"/>
-            </w:pPr>
-            <w:r>
-              <w:rPr>
-                <w:rFonts w:ascii="Calibri" w:hAnsi="Calibri"/>
-                <w:b/>
-                <w:sz w:val="36"/>
-                <w:rFonts w:ascii="Calibri" w:hAnsi="Calibri" w:cs="Calibri"/>
-                <w:color w:val="FFFFFF"/>
-              </w:rPr>
-              <w:t>Digital Marketing</w:t>
-            </w:r>
-          </w:p>
-          <w:p>
-            <w:r>
-              <w:rPr>
-                <w:rFonts w:ascii="Calibri" w:hAnsi="Calibri"/>
-                <w:b w:val="0"/>
-                <w:sz w:val="24"/>
-                <w:rFonts w:ascii="Calibri" w:hAnsi="Calibri" w:cs="Calibri"/>
-                <w:color w:val="FFFFFF"/>
-              </w:rPr>
-              <w:t>Monthly price + included services</w:t>
-            </w:r>
-          </w:p>
-        </w:tc>
-      </w:tr>
-    </w:tbl>
-    <w:p/>
-    <w:p/>
-    <w:tbl>
-      <w:tblPr>
-        <w:tblW w:type="auto" w:w="0"/>
-        <w:tblLook w:firstColumn="1" w:firstRow="1" w:lastColumn="0" w:lastRow="0" w:noHBand="0" w:noVBand="1" w:val="04A0"/>
-      </w:tblPr>
-      <w:tblGrid>
-        <w:gridCol w:w="9972"/>
-      </w:tblGrid>
-      <w:tr>
-        <w:tc>
-          <w:tcPr>
-            <w:tcW w:type="dxa" w:w="9972"/>
-            <w:shd w:val="clear" w:fill="06ACBA"/>
-            <w:tcBorders>
-              <w:top w:val="single" w:sz="8" w:color="04243C"/>
-              <w:left w:val="single" w:sz="8" w:color="04243C"/>
-              <w:bottom w:val="single" w:sz="8" w:color="04243C"/>
-              <w:right w:val="single" w:sz="8" w:color="04243C"/>
-            </w:tcBorders>
-            <w:tcBorders>
-              <w:top w:val="single" w:sz="8" w:color="04243C"/>
-              <w:left w:val="single" w:sz="8" w:color="04243C"/>
-              <w:bottom w:val="single" w:sz="8" w:color="04243C"/>
-              <w:right w:val="single" w:sz="8" w:color="04243C"/>
-            </w:tcBorders>
-          </w:tcPr>
-          <w:p>
-            <w:r>
-              <w:rPr>
-                <w:rFonts w:ascii="Calibri" w:hAnsi="Calibri"/>
-                <w:b/>
-                <w:sz w:val="28"/>
-                <w:rFonts w:ascii="Calibri" w:hAnsi="Calibri" w:cs="Calibri"/>
-                <w:color w:val="000000"/>
-              </w:rPr>
-              <w:t>BASIC  —  PKR 35,000 per month</w:t>
-            </w:r>
-          </w:p>
-        </w:tc>
-      </w:tr>
-      <w:tr>
-        <w:tc>
-          <w:tcPr>
-            <w:tcW w:type="dxa" w:w="9972"/>
-            <w:shd w:val="clear" w:fill="D4EEF2"/>
-            <w:tcBorders>
-              <w:top w:val="single" w:sz="8" w:color="04243C"/>
-              <w:left w:val="single" w:sz="8" w:color="04243C"/>
-              <w:bottom w:val="single" w:sz="8" w:color="04243C"/>
-              <w:right w:val="single" w:sz="8" w:color="04243C"/>
-            </w:tcBorders>
-            <w:tcBorders>
-              <w:top w:val="single" w:sz="8" w:color="04243C"/>
-              <w:left w:val="single" w:sz="8" w:color="04243C"/>
-              <w:bottom w:val="single" w:sz="8" w:color="04243C"/>
-              <w:right w:val="single" w:sz="8" w:color="04243C"/>
-            </w:tcBorders>
-          </w:tcPr>
-          <w:p>
-            <w:r>
-              <w:rPr>
-                <w:rFonts w:ascii="Calibri" w:hAnsi="Calibri"/>
-                <w:b/>
-                <w:sz w:val="24"/>
-                <w:rFonts w:ascii="Calibri" w:hAnsi="Calibri" w:cs="Calibri"/>
-                <w:color w:val="000000"/>
-              </w:rPr>
-              <w:t>Is price me ye shamil hai:</w:t>
-            </w:r>
-          </w:p>
-          <w:p>
-            <w:r>
-              <w:rPr>
-                <w:rFonts w:ascii="Calibri" w:hAnsi="Calibri"/>
-                <w:b w:val="0"/>
-                <w:sz w:val="22"/>
-                <w:rFonts w:ascii="Calibri" w:hAnsi="Calibri" w:cs="Calibri"/>
-                <w:color w:val="000000"/>
-              </w:rPr>
-              <w:t>• Meta Ads</w:t>
-            </w:r>
-          </w:p>
-          <w:p>
-            <w:r>
-              <w:rPr>
-                <w:rFonts w:ascii="Calibri" w:hAnsi="Calibri"/>
-                <w:b w:val="0"/>
-                <w:sz w:val="22"/>
-                <w:rFonts w:ascii="Calibri" w:hAnsi="Calibri" w:cs="Calibri"/>
-                <w:color w:val="000000"/>
-              </w:rPr>
-              <w:t>• Audience targeting</w:t>
-            </w:r>
-          </w:p>
-          <w:p>
-            <w:r>
-              <w:rPr>
-                <w:rFonts w:ascii="Calibri" w:hAnsi="Calibri"/>
-                <w:b w:val="0"/>
-                <w:sz w:val="22"/>
-                <w:rFonts w:ascii="Calibri" w:hAnsi="Calibri" w:cs="Calibri"/>
-                <w:color w:val="000000"/>
-              </w:rPr>
-              <w:t>• Campaign optimization</w:t>
-            </w:r>
-          </w:p>
-          <w:p>
-            <w:r>
-              <w:rPr>
-                <w:rFonts w:ascii="Calibri" w:hAnsi="Calibri"/>
-                <w:b w:val="0"/>
-                <w:sz w:val="22"/>
-                <w:rFonts w:ascii="Calibri" w:hAnsi="Calibri" w:cs="Calibri"/>
-                <w:color w:val="000000"/>
-              </w:rPr>
-              <w:t>• Monthly reporting</w:t>
-            </w:r>
-          </w:p>
-        </w:tc>
-      </w:tr>
-    </w:tbl>
-    <w:p/>
-    <w:tbl>
-      <w:tblPr>
-        <w:tblW w:type="auto" w:w="0"/>
-        <w:tblLook w:firstColumn="1" w:firstRow="1" w:lastColumn="0" w:lastRow="0" w:noHBand="0" w:noVBand="1" w:val="04A0"/>
-      </w:tblPr>
-      <w:tblGrid>
-        <w:gridCol w:w="9972"/>
-      </w:tblGrid>
-      <w:tr>
-        <w:tc>
-          <w:tcPr>
-            <w:tcW w:type="dxa" w:w="9972"/>
-            <w:shd w:val="clear" w:fill="06ACBA"/>
-            <w:tcBorders>
-              <w:top w:val="single" w:sz="8" w:color="04243C"/>
-              <w:left w:val="single" w:sz="8" w:color="04243C"/>
-              <w:bottom w:val="single" w:sz="8" w:color="04243C"/>
-              <w:right w:val="single" w:sz="8" w:color="04243C"/>
-            </w:tcBorders>
-            <w:tcBorders>
-              <w:top w:val="single" w:sz="8" w:color="04243C"/>
-              <w:left w:val="single" w:sz="8" w:color="04243C"/>
-              <w:bottom w:val="single" w:sz="8" w:color="04243C"/>
-              <w:right w:val="single" w:sz="8" w:color="04243C"/>
-            </w:tcBorders>
-          </w:tcPr>
-          <w:p>
-            <w:r>
-              <w:rPr>
-                <w:rFonts w:ascii="Calibri" w:hAnsi="Calibri"/>
-                <w:b/>
-                <w:sz w:val="28"/>
-                <w:rFonts w:ascii="Calibri" w:hAnsi="Calibri" w:cs="Calibri"/>
-                <w:color w:val="000000"/>
-              </w:rPr>
-              <w:t>STANDARD  —  PKR 65,000 per month</w:t>
-            </w:r>
-          </w:p>
-        </w:tc>
-      </w:tr>
-      <w:tr>
-        <w:tc>
-          <w:tcPr>
-            <w:tcW w:type="dxa" w:w="9972"/>
-            <w:shd w:val="clear" w:fill="D4EEF2"/>
-            <w:tcBorders>
-              <w:top w:val="single" w:sz="8" w:color="04243C"/>
-              <w:left w:val="single" w:sz="8" w:color="04243C"/>
-              <w:bottom w:val="single" w:sz="8" w:color="04243C"/>
-              <w:right w:val="single" w:sz="8" w:color="04243C"/>
-            </w:tcBorders>
-            <w:tcBorders>
-              <w:top w:val="single" w:sz="8" w:color="04243C"/>
-              <w:left w:val="single" w:sz="8" w:color="04243C"/>
-              <w:bottom w:val="single" w:sz="8" w:color="04243C"/>
-              <w:right w:val="single" w:sz="8" w:color="04243C"/>
-            </w:tcBorders>
-          </w:tcPr>
-          <w:p>
-            <w:r>
-              <w:rPr>
-                <w:rFonts w:ascii="Calibri" w:hAnsi="Calibri"/>
-                <w:b/>
-                <w:sz w:val="24"/>
-                <w:rFonts w:ascii="Calibri" w:hAnsi="Calibri" w:cs="Calibri"/>
-                <w:color w:val="000000"/>
-              </w:rPr>
-              <w:t>Is price me ye shamil hai:</w:t>
-            </w:r>
-          </w:p>
-          <w:p>
-            <w:r>
-              <w:rPr>
-                <w:rFonts w:ascii="Calibri" w:hAnsi="Calibri"/>
-                <w:b w:val="0"/>
-                <w:sz w:val="22"/>
-                <w:rFonts w:ascii="Calibri" w:hAnsi="Calibri" w:cs="Calibri"/>
-                <w:color w:val="000000"/>
-              </w:rPr>
-              <w:t>• Google Ads + Meta Ads</w:t>
-            </w:r>
-          </w:p>
-          <w:p>
-            <w:r>
-              <w:rPr>
-                <w:rFonts w:ascii="Calibri" w:hAnsi="Calibri"/>
-                <w:b w:val="0"/>
-                <w:sz w:val="22"/>
-                <w:rFonts w:ascii="Calibri" w:hAnsi="Calibri" w:cs="Calibri"/>
-                <w:color w:val="000000"/>
-              </w:rPr>
-              <w:t>• Lead generation</w:t>
-            </w:r>
-          </w:p>
-          <w:p>
-            <w:r>
-              <w:rPr>
-                <w:rFonts w:ascii="Calibri" w:hAnsi="Calibri"/>
-                <w:b w:val="0"/>
-                <w:sz w:val="22"/>
-                <w:rFonts w:ascii="Calibri" w:hAnsi="Calibri" w:cs="Calibri"/>
-                <w:color w:val="000000"/>
-              </w:rPr>
-              <w:t>• Conversion tracking</w:t>
-            </w:r>
-          </w:p>
-          <w:p>
-            <w:r>
-              <w:rPr>
-                <w:rFonts w:ascii="Calibri" w:hAnsi="Calibri"/>
-                <w:b w:val="0"/>
-                <w:sz w:val="22"/>
-                <w:rFonts w:ascii="Calibri" w:hAnsi="Calibri" w:cs="Calibri"/>
-                <w:color w:val="000000"/>
-              </w:rPr>
-              <w:t>• Landing page recommendations</w:t>
-            </w:r>
-          </w:p>
-          <w:p>
-            <w:r>
-              <w:rPr>
-                <w:rFonts w:ascii="Calibri" w:hAnsi="Calibri"/>
-                <w:b w:val="0"/>
-                <w:sz w:val="22"/>
-                <w:rFonts w:ascii="Calibri" w:hAnsi="Calibri" w:cs="Calibri"/>
-                <w:color w:val="000000"/>
-              </w:rPr>
-              <w:t>• Monthly reports</w:t>
-            </w:r>
-          </w:p>
-        </w:tc>
-      </w:tr>
-    </w:tbl>
-    <w:p/>
-    <w:tbl>
-      <w:tblPr>
-        <w:tblW w:type="auto" w:w="0"/>
-        <w:tblLook w:firstColumn="1" w:firstRow="1" w:lastColumn="0" w:lastRow="0" w:noHBand="0" w:noVBand="1" w:val="04A0"/>
-      </w:tblPr>
-      <w:tblGrid>
-        <w:gridCol w:w="9972"/>
-      </w:tblGrid>
-      <w:tr>
-        <w:tc>
-          <w:tcPr>
-            <w:tcW w:type="dxa" w:w="9972"/>
-            <w:shd w:val="clear" w:fill="06ACBA"/>
-            <w:tcBorders>
-              <w:top w:val="single" w:sz="8" w:color="04243C"/>
-              <w:left w:val="single" w:sz="8" w:color="04243C"/>
-              <w:bottom w:val="single" w:sz="8" w:color="04243C"/>
-              <w:right w:val="single" w:sz="8" w:color="04243C"/>
-            </w:tcBorders>
-            <w:tcBorders>
-              <w:top w:val="single" w:sz="8" w:color="04243C"/>
-              <w:left w:val="single" w:sz="8" w:color="04243C"/>
-              <w:bottom w:val="single" w:sz="8" w:color="04243C"/>
-              <w:right w:val="single" w:sz="8" w:color="04243C"/>
-            </w:tcBorders>
-          </w:tcPr>
-          <w:p>
-            <w:r>
-              <w:rPr>
-                <w:rFonts w:ascii="Calibri" w:hAnsi="Calibri"/>
-                <w:b/>
-                <w:sz w:val="28"/>
-                <w:rFonts w:ascii="Calibri" w:hAnsi="Calibri" w:cs="Calibri"/>
-                <w:color w:val="000000"/>
-              </w:rPr>
-              <w:t>PREMIUM  —  PKR 120,000 per month</w:t>
-            </w:r>
-          </w:p>
-        </w:tc>
-      </w:tr>
-      <w:tr>
-        <w:tc>
-          <w:tcPr>
-            <w:tcW w:type="dxa" w:w="9972"/>
-            <w:shd w:val="clear" w:fill="D4EEF2"/>
-            <w:tcBorders>
-              <w:top w:val="single" w:sz="8" w:color="04243C"/>
-              <w:left w:val="single" w:sz="8" w:color="04243C"/>
-              <w:bottom w:val="single" w:sz="8" w:color="04243C"/>
-              <w:right w:val="single" w:sz="8" w:color="04243C"/>
-            </w:tcBorders>
-            <w:tcBorders>
-              <w:top w:val="single" w:sz="8" w:color="04243C"/>
-              <w:left w:val="single" w:sz="8" w:color="04243C"/>
-              <w:bottom w:val="single" w:sz="8" w:color="04243C"/>
-              <w:right w:val="single" w:sz="8" w:color="04243C"/>
-            </w:tcBorders>
-          </w:tcPr>
-          <w:p>
-            <w:r>
-              <w:rPr>
-                <w:rFonts w:ascii="Calibri" w:hAnsi="Calibri"/>
-                <w:b/>
-                <w:sz w:val="24"/>
-                <w:rFonts w:ascii="Calibri" w:hAnsi="Calibri" w:cs="Calibri"/>
-                <w:color w:val="000000"/>
-              </w:rPr>
-              <w:t>Is price me ye shamil hai:</w:t>
-            </w:r>
-          </w:p>
-          <w:p>
-            <w:r>
-              <w:rPr>
-                <w:rFonts w:ascii="Calibri" w:hAnsi="Calibri"/>
-                <w:b w:val="0"/>
-                <w:sz w:val="22"/>
-                <w:rFonts w:ascii="Calibri" w:hAnsi="Calibri" w:cs="Calibri"/>
-                <w:color w:val="000000"/>
-              </w:rPr>
-              <w:t>• Google Ads + Meta Ads</w:t>
-            </w:r>
-          </w:p>
-          <w:p>
-            <w:r>
-              <w:rPr>
-                <w:rFonts w:ascii="Calibri" w:hAnsi="Calibri"/>
-                <w:b w:val="0"/>
-                <w:sz w:val="22"/>
-                <w:rFonts w:ascii="Calibri" w:hAnsi="Calibri" w:cs="Calibri"/>
-                <w:color w:val="000000"/>
-              </w:rPr>
-              <w:t>• SEO</w:t>
-            </w:r>
-          </w:p>
-          <w:p>
-            <w:r>
-              <w:rPr>
-                <w:rFonts w:ascii="Calibri" w:hAnsi="Calibri"/>
-                <w:b w:val="0"/>
-                <w:sz w:val="22"/>
-                <w:rFonts w:ascii="Calibri" w:hAnsi="Calibri" w:cs="Calibri"/>
-                <w:color w:val="000000"/>
-              </w:rPr>
-              <w:t>• Remarketing</w:t>
-            </w:r>
-          </w:p>
-          <w:p>
-            <w:r>
-              <w:rPr>
-                <w:rFonts w:ascii="Calibri" w:hAnsi="Calibri"/>
-                <w:b w:val="0"/>
-                <w:sz w:val="22"/>
-                <w:rFonts w:ascii="Calibri" w:hAnsi="Calibri" w:cs="Calibri"/>
-                <w:color w:val="000000"/>
-              </w:rPr>
-              <w:t>• Conversion optimization</w:t>
-            </w:r>
-          </w:p>
-          <w:p>
-            <w:r>
-              <w:rPr>
-                <w:rFonts w:ascii="Calibri" w:hAnsi="Calibri"/>
-                <w:b w:val="0"/>
-                <w:sz w:val="22"/>
-                <w:rFonts w:ascii="Calibri" w:hAnsi="Calibri" w:cs="Calibri"/>
-                <w:color w:val="000000"/>
-              </w:rPr>
-              <w:t>• Marketing strategy</w:t>
-            </w:r>
-          </w:p>
-          <w:p>
-            <w:r>
-              <w:rPr>
-                <w:rFonts w:ascii="Calibri" w:hAnsi="Calibri"/>
-                <w:b w:val="0"/>
-                <w:sz w:val="22"/>
-                <w:rFonts w:ascii="Calibri" w:hAnsi="Calibri" w:cs="Calibri"/>
-                <w:color w:val="000000"/>
-              </w:rPr>
-              <w:t>• Weekly meetings</w:t>
-            </w:r>
-          </w:p>
-          <w:p>
-            <w:r>
-              <w:rPr>
-                <w:rFonts w:ascii="Calibri" w:hAnsi="Calibri"/>
-                <w:b w:val="0"/>
-                <w:sz w:val="22"/>
-                <w:rFonts w:ascii="Calibri" w:hAnsi="Calibri" w:cs="Calibri"/>
-                <w:color w:val="000000"/>
-              </w:rPr>
-              <w:t>• Detailed reports</w:t>
-            </w:r>
-          </w:p>
-        </w:tc>
-      </w:tr>
-    </w:tbl>
+    <w:p>
+      <w:pPr>
+        <w:spacing w:before="320" w:after="160"/>
+        <w:pBdr>
+          <w:left w:val="single" w:sz="24" w:space="8" w:color="06ACBA"/>
+        </w:pBdr>
+      </w:pPr>
+      <w:r>
+        <w:rPr>
+          <w:b/>
+          <w:sz w:val="40"/>
+          <w:rFonts w:ascii="Arial" w:hAnsi="Arial" w:cs="Arial"/>
+          <w:color w:val="000000"/>
+        </w:rPr>
+        <w:t>Digital Marketing</w:t>
+      </w:r>
+    </w:p>
+    <w:p>
+      <w:pPr>
+        <w:spacing w:after="240" w:before="80"/>
+      </w:pPr>
+      <w:r>
+        <w:rPr>
+          <w:b/>
+          <w:sz w:val="28"/>
+          <w:rFonts w:ascii="Arial" w:hAnsi="Arial" w:cs="Arial"/>
+          <w:color w:val="000000"/>
+        </w:rPr>
+        <w:t>Monthly packages — price aur included services</w:t>
+      </w:r>
+    </w:p>
+    <w:p>
+      <w:pPr>
+        <w:spacing w:after="160" w:before="80"/>
+      </w:pPr>
+      <w:r>
+        <w:rPr>
+          <w:b/>
+          <w:sz w:val="32"/>
+          <w:rFonts w:ascii="Arial" w:hAnsi="Arial" w:cs="Arial"/>
+          <w:color w:val="000000"/>
+        </w:rPr>
+        <w:t>BASIC — PKR 35,000 / MONTH</w:t>
+      </w:r>
+    </w:p>
+    <w:p>
+      <w:pPr>
+        <w:spacing w:after="120" w:before="80"/>
+      </w:pPr>
+      <w:r>
+        <w:rPr>
+          <w:b/>
+          <w:sz w:val="28"/>
+          <w:rFonts w:ascii="Arial" w:hAnsi="Arial" w:cs="Arial"/>
+          <w:color w:val="06ACBA"/>
+        </w:rPr>
+        <w:t>Is price me ye shamil hai:</w:t>
+      </w:r>
+    </w:p>
+    <w:p>
+      <w:pPr>
+        <w:spacing w:after="80" w:before="80"/>
+      </w:pPr>
+      <w:r>
+        <w:rPr>
+          <w:b w:val="0"/>
+          <w:sz w:val="28"/>
+          <w:rFonts w:ascii="Arial" w:hAnsi="Arial" w:cs="Arial"/>
+          <w:color w:val="000000"/>
+        </w:rPr>
+        <w:t xml:space="preserve">  •  Meta Ads</w:t>
+      </w:r>
+    </w:p>
+    <w:p>
+      <w:pPr>
+        <w:spacing w:after="80" w:before="80"/>
+      </w:pPr>
+      <w:r>
+        <w:rPr>
+          <w:b w:val="0"/>
+          <w:sz w:val="28"/>
+          <w:rFonts w:ascii="Arial" w:hAnsi="Arial" w:cs="Arial"/>
+          <w:color w:val="000000"/>
+        </w:rPr>
+        <w:t xml:space="preserve">  •  Audience targeting</w:t>
+      </w:r>
+    </w:p>
+    <w:p>
+      <w:pPr>
+        <w:spacing w:after="80" w:before="80"/>
+      </w:pPr>
+      <w:r>
+        <w:rPr>
+          <w:b w:val="0"/>
+          <w:sz w:val="28"/>
+          <w:rFonts w:ascii="Arial" w:hAnsi="Arial" w:cs="Arial"/>
+          <w:color w:val="000000"/>
+        </w:rPr>
+        <w:t xml:space="preserve">  •  Campaign optimization</w:t>
+      </w:r>
+    </w:p>
+    <w:p>
+      <w:pPr>
+        <w:spacing w:after="80" w:before="80"/>
+      </w:pPr>
+      <w:r>
+        <w:rPr>
+          <w:b w:val="0"/>
+          <w:sz w:val="28"/>
+          <w:rFonts w:ascii="Arial" w:hAnsi="Arial" w:cs="Arial"/>
+          <w:color w:val="000000"/>
+        </w:rPr>
+        <w:t xml:space="preserve">  •  Monthly reporting</w:t>
+      </w:r>
+    </w:p>
+    <w:p>
+      <w:pPr>
+        <w:spacing w:after="280" w:before="80"/>
+      </w:pPr>
+      <w:r>
+        <w:rPr>
+          <w:b w:val="0"/>
+          <w:sz w:val="20"/>
+          <w:rFonts w:ascii="Arial" w:hAnsi="Arial" w:cs="Arial"/>
+          <w:color w:val="000000"/>
+        </w:rPr>
+        <w:t>————————————————————————————————————————</w:t>
+      </w:r>
+    </w:p>
+    <w:p>
+      <w:pPr>
+        <w:spacing w:after="160" w:before="80"/>
+      </w:pPr>
+      <w:r>
+        <w:rPr>
+          <w:b/>
+          <w:sz w:val="32"/>
+          <w:rFonts w:ascii="Arial" w:hAnsi="Arial" w:cs="Arial"/>
+          <w:color w:val="000000"/>
+        </w:rPr>
+        <w:t>STANDARD — PKR 65,000 / MONTH</w:t>
+      </w:r>
+    </w:p>
+    <w:p>
+      <w:pPr>
+        <w:spacing w:after="120" w:before="80"/>
+      </w:pPr>
+      <w:r>
+        <w:rPr>
+          <w:b/>
+          <w:sz w:val="28"/>
+          <w:rFonts w:ascii="Arial" w:hAnsi="Arial" w:cs="Arial"/>
+          <w:color w:val="06ACBA"/>
+        </w:rPr>
+        <w:t>Is price me ye shamil hai:</w:t>
+      </w:r>
+    </w:p>
+    <w:p>
+      <w:pPr>
+        <w:spacing w:after="80" w:before="80"/>
+      </w:pPr>
+      <w:r>
+        <w:rPr>
+          <w:b w:val="0"/>
+          <w:sz w:val="28"/>
+          <w:rFonts w:ascii="Arial" w:hAnsi="Arial" w:cs="Arial"/>
+          <w:color w:val="000000"/>
+        </w:rPr>
+        <w:t xml:space="preserve">  •  Google Ads + Meta Ads</w:t>
+      </w:r>
+    </w:p>
+    <w:p>
+      <w:pPr>
+        <w:spacing w:after="80" w:before="80"/>
+      </w:pPr>
+      <w:r>
+        <w:rPr>
+          <w:b w:val="0"/>
+          <w:sz w:val="28"/>
+          <w:rFonts w:ascii="Arial" w:hAnsi="Arial" w:cs="Arial"/>
+          <w:color w:val="000000"/>
+        </w:rPr>
+        <w:t xml:space="preserve">  •  Lead generation</w:t>
+      </w:r>
+    </w:p>
+    <w:p>
+      <w:pPr>
+        <w:spacing w:after="80" w:before="80"/>
+      </w:pPr>
+      <w:r>
+        <w:rPr>
+          <w:b w:val="0"/>
+          <w:sz w:val="28"/>
+          <w:rFonts w:ascii="Arial" w:hAnsi="Arial" w:cs="Arial"/>
+          <w:color w:val="000000"/>
+        </w:rPr>
+        <w:t xml:space="preserve">  •  Conversion tracking</w:t>
+      </w:r>
+    </w:p>
+    <w:p>
+      <w:pPr>
+        <w:spacing w:after="80" w:before="80"/>
+      </w:pPr>
+      <w:r>
+        <w:rPr>
+          <w:b w:val="0"/>
+          <w:sz w:val="28"/>
+          <w:rFonts w:ascii="Arial" w:hAnsi="Arial" w:cs="Arial"/>
+          <w:color w:val="000000"/>
+        </w:rPr>
+        <w:t xml:space="preserve">  •  Landing page recommendations</w:t>
+      </w:r>
+    </w:p>
+    <w:p>
+      <w:pPr>
+        <w:spacing w:after="80" w:before="80"/>
+      </w:pPr>
+      <w:r>
+        <w:rPr>
+          <w:b w:val="0"/>
+          <w:sz w:val="28"/>
+          <w:rFonts w:ascii="Arial" w:hAnsi="Arial" w:cs="Arial"/>
+          <w:color w:val="000000"/>
+        </w:rPr>
+        <w:t xml:space="preserve">  •  Monthly reports</w:t>
+      </w:r>
+    </w:p>
+    <w:p>
+      <w:pPr>
+        <w:spacing w:after="280" w:before="80"/>
+      </w:pPr>
+      <w:r>
+        <w:rPr>
+          <w:b w:val="0"/>
+          <w:sz w:val="20"/>
+          <w:rFonts w:ascii="Arial" w:hAnsi="Arial" w:cs="Arial"/>
+          <w:color w:val="000000"/>
+        </w:rPr>
+        <w:t>————————————————————————————————————————</w:t>
+      </w:r>
+    </w:p>
+    <w:p>
+      <w:pPr>
+        <w:spacing w:after="160" w:before="80"/>
+      </w:pPr>
+      <w:r>
+        <w:rPr>
+          <w:b/>
+          <w:sz w:val="32"/>
+          <w:rFonts w:ascii="Arial" w:hAnsi="Arial" w:cs="Arial"/>
+          <w:color w:val="000000"/>
+        </w:rPr>
+        <w:t>PREMIUM — PKR 120,000 / MONTH</w:t>
+      </w:r>
+    </w:p>
+    <w:p>
+      <w:pPr>
+        <w:spacing w:after="120" w:before="80"/>
+      </w:pPr>
+      <w:r>
+        <w:rPr>
+          <w:b/>
+          <w:sz w:val="28"/>
+          <w:rFonts w:ascii="Arial" w:hAnsi="Arial" w:cs="Arial"/>
+          <w:color w:val="06ACBA"/>
+        </w:rPr>
+        <w:t>Is price me ye shamil hai:</w:t>
+      </w:r>
+    </w:p>
+    <w:p>
+      <w:pPr>
+        <w:spacing w:after="80" w:before="80"/>
+      </w:pPr>
+      <w:r>
+        <w:rPr>
+          <w:b w:val="0"/>
+          <w:sz w:val="28"/>
+          <w:rFonts w:ascii="Arial" w:hAnsi="Arial" w:cs="Arial"/>
+          <w:color w:val="000000"/>
+        </w:rPr>
+        <w:t xml:space="preserve">  •  Google Ads + Meta Ads</w:t>
+      </w:r>
+    </w:p>
+    <w:p>
+      <w:pPr>
+        <w:spacing w:after="80" w:before="80"/>
+      </w:pPr>
+      <w:r>
+        <w:rPr>
+          <w:b w:val="0"/>
+          <w:sz w:val="28"/>
+          <w:rFonts w:ascii="Arial" w:hAnsi="Arial" w:cs="Arial"/>
+          <w:color w:val="000000"/>
+        </w:rPr>
+        <w:t xml:space="preserve">  •  SEO</w:t>
+      </w:r>
+    </w:p>
+    <w:p>
+      <w:pPr>
+        <w:spacing w:after="80" w:before="80"/>
+      </w:pPr>
+      <w:r>
+        <w:rPr>
+          <w:b w:val="0"/>
+          <w:sz w:val="28"/>
+          <w:rFonts w:ascii="Arial" w:hAnsi="Arial" w:cs="Arial"/>
+          <w:color w:val="000000"/>
+        </w:rPr>
+        <w:t xml:space="preserve">  •  Remarketing</w:t>
+      </w:r>
+    </w:p>
+    <w:p>
+      <w:pPr>
+        <w:spacing w:after="80" w:before="80"/>
+      </w:pPr>
+      <w:r>
+        <w:rPr>
+          <w:b w:val="0"/>
+          <w:sz w:val="28"/>
+          <w:rFonts w:ascii="Arial" w:hAnsi="Arial" w:cs="Arial"/>
+          <w:color w:val="000000"/>
+        </w:rPr>
+        <w:t xml:space="preserve">  •  Conversion optimization</w:t>
+      </w:r>
+    </w:p>
+    <w:p>
+      <w:pPr>
+        <w:spacing w:after="80" w:before="80"/>
+      </w:pPr>
+      <w:r>
+        <w:rPr>
+          <w:b w:val="0"/>
+          <w:sz w:val="28"/>
+          <w:rFonts w:ascii="Arial" w:hAnsi="Arial" w:cs="Arial"/>
+          <w:color w:val="000000"/>
+        </w:rPr>
+        <w:t xml:space="preserve">  •  Marketing strategy</w:t>
+      </w:r>
+    </w:p>
+    <w:p>
+      <w:pPr>
+        <w:spacing w:after="80" w:before="80"/>
+      </w:pPr>
+      <w:r>
+        <w:rPr>
+          <w:b w:val="0"/>
+          <w:sz w:val="28"/>
+          <w:rFonts w:ascii="Arial" w:hAnsi="Arial" w:cs="Arial"/>
+          <w:color w:val="000000"/>
+        </w:rPr>
+        <w:t xml:space="preserve">  •  Weekly meetings</w:t>
+      </w:r>
+    </w:p>
+    <w:p>
+      <w:pPr>
+        <w:spacing w:after="80" w:before="80"/>
+      </w:pPr>
+      <w:r>
+        <w:rPr>
+          <w:b w:val="0"/>
+          <w:sz w:val="28"/>
+          <w:rFonts w:ascii="Arial" w:hAnsi="Arial" w:cs="Arial"/>
+          <w:color w:val="000000"/>
+        </w:rPr>
+        <w:t xml:space="preserve">  •  Detailed reports</w:t>
+      </w:r>
+    </w:p>
+    <w:p>
+      <w:pPr>
+        <w:spacing w:after="280" w:before="80"/>
+      </w:pPr>
+      <w:r>
+        <w:rPr>
+          <w:b w:val="0"/>
+          <w:sz w:val="20"/>
+          <w:rFonts w:ascii="Arial" w:hAnsi="Arial" w:cs="Arial"/>
+          <w:color w:val="000000"/>
+        </w:rPr>
+        <w:t>————————————————————————————————————————</w:t>
+      </w:r>
+    </w:p>
     <w:p>
       <w:r>
         <w:br w:type="page"/>
       </w:r>
     </w:p>
-    <w:p/>
-    <w:tbl>
-      <w:tblPr>
-        <w:tblW w:type="auto" w:w="0"/>
-        <w:jc w:val="center"/>
-        <w:tblLook w:firstColumn="1" w:firstRow="1" w:lastColumn="0" w:lastRow="0" w:noHBand="0" w:noVBand="1" w:val="04A0"/>
-      </w:tblPr>
-      <w:tblGrid>
-        <w:gridCol w:w="9972"/>
-      </w:tblGrid>
-      <w:tr>
-        <w:tc>
-          <w:tcPr>
-            <w:tcW w:type="dxa" w:w="9972"/>
-            <w:shd w:val="clear" w:fill="04243C"/>
-            <w:tcBorders>
-              <w:top w:val="single" w:sz="12" w:color="06ACBA"/>
-              <w:left w:val="single" w:sz="12" w:color="06ACBA"/>
-              <w:bottom w:val="single" w:sz="12" w:color="06ACBA"/>
-              <w:right w:val="single" w:sz="12" w:color="06ACBA"/>
-            </w:tcBorders>
-            <w:tcBorders>
-              <w:top w:val="single" w:sz="8" w:color="04243C"/>
-              <w:left w:val="single" w:sz="8" w:color="04243C"/>
-              <w:bottom w:val="single" w:sz="8" w:color="04243C"/>
-              <w:right w:val="single" w:sz="8" w:color="04243C"/>
-            </w:tcBorders>
-          </w:tcPr>
-          <w:p>
-            <w:pPr>
-              <w:jc w:val="left"/>
-            </w:pPr>
-            <w:r>
-              <w:rPr>
-                <w:rFonts w:ascii="Calibri" w:hAnsi="Calibri"/>
-                <w:b/>
-                <w:sz w:val="36"/>
-                <w:rFonts w:ascii="Calibri" w:hAnsi="Calibri" w:cs="Calibri"/>
-                <w:color w:val="FFFFFF"/>
-              </w:rPr>
-              <w:t>Add-On Services</w:t>
-            </w:r>
-          </w:p>
-          <w:p>
-            <w:r>
-              <w:rPr>
-                <w:rFonts w:ascii="Calibri" w:hAnsi="Calibri"/>
-                <w:b w:val="0"/>
-                <w:sz w:val="24"/>
-                <w:rFonts w:ascii="Calibri" w:hAnsi="Calibri" w:cs="Calibri"/>
-                <w:color w:val="FFFFFF"/>
-              </w:rPr>
-              <w:t>Optional — alag price</w:t>
-            </w:r>
-          </w:p>
-        </w:tc>
-      </w:tr>
-    </w:tbl>
-    <w:p/>
-    <w:tbl>
-      <w:tblPr>
-        <w:tblW w:type="auto" w:w="0"/>
-        <w:tblLook w:firstColumn="1" w:firstRow="1" w:lastColumn="0" w:lastRow="0" w:noHBand="0" w:noVBand="1" w:val="04A0"/>
-      </w:tblPr>
-      <w:tblGrid>
-        <w:gridCol w:w="4986"/>
-        <w:gridCol w:w="4986"/>
-      </w:tblGrid>
-      <w:tr>
-        <w:tc>
-          <w:tcPr>
-            <w:tcW w:type="dxa" w:w="4986"/>
-            <w:shd w:val="clear" w:fill="06ACBA"/>
-            <w:tcBorders>
-              <w:top w:val="single" w:sz="8" w:color="04243C"/>
-              <w:left w:val="single" w:sz="8" w:color="04243C"/>
-              <w:bottom w:val="single" w:sz="8" w:color="04243C"/>
-              <w:right w:val="single" w:sz="8" w:color="04243C"/>
-            </w:tcBorders>
-          </w:tcPr>
-          <w:p>
-            <w:r>
-              <w:rPr>
-                <w:rFonts w:ascii="Calibri" w:hAnsi="Calibri"/>
-                <w:b/>
-                <w:sz w:val="24"/>
-                <w:rFonts w:ascii="Calibri" w:hAnsi="Calibri" w:cs="Calibri"/>
-                <w:color w:val="000000"/>
-              </w:rPr>
-              <w:t>Service</w:t>
-            </w:r>
-          </w:p>
-        </w:tc>
-        <w:tc>
-          <w:tcPr>
-            <w:tcW w:type="dxa" w:w="4986"/>
-            <w:shd w:val="clear" w:fill="06ACBA"/>
-            <w:tcBorders>
-              <w:top w:val="single" w:sz="8" w:color="04243C"/>
-              <w:left w:val="single" w:sz="8" w:color="04243C"/>
-              <w:bottom w:val="single" w:sz="8" w:color="04243C"/>
-              <w:right w:val="single" w:sz="8" w:color="04243C"/>
-            </w:tcBorders>
-          </w:tcPr>
-          <w:p>
-            <w:r>
-              <w:rPr>
-                <w:rFonts w:ascii="Calibri" w:hAnsi="Calibri"/>
-                <w:b/>
-                <w:sz w:val="24"/>
-                <w:rFonts w:ascii="Calibri" w:hAnsi="Calibri" w:cs="Calibri"/>
-                <w:color w:val="000000"/>
-              </w:rPr>
-              <w:t>Price</w:t>
-            </w:r>
-          </w:p>
-        </w:tc>
-      </w:tr>
-      <w:tr>
-        <w:tc>
-          <w:tcPr>
-            <w:tcW w:type="dxa" w:w="4986"/>
-            <w:tcBorders>
-              <w:top w:val="single" w:sz="8" w:color="04243C"/>
-              <w:left w:val="single" w:sz="8" w:color="04243C"/>
-              <w:bottom w:val="single" w:sz="8" w:color="04243C"/>
-              <w:right w:val="single" w:sz="8" w:color="04243C"/>
-            </w:tcBorders>
-          </w:tcPr>
-          <w:p>
-            <w:r>
-              <w:rPr>
-                <w:rFonts w:ascii="Calibri" w:hAnsi="Calibri"/>
-                <w:b w:val="0"/>
-                <w:sz w:val="22"/>
-                <w:rFonts w:ascii="Calibri" w:hAnsi="Calibri" w:cs="Calibri"/>
-                <w:color w:val="000000"/>
-              </w:rPr>
-              <w:t>Logo Design</w:t>
-            </w:r>
-          </w:p>
-        </w:tc>
-        <w:tc>
-          <w:tcPr>
-            <w:tcW w:type="dxa" w:w="4986"/>
-            <w:tcBorders>
-              <w:top w:val="single" w:sz="8" w:color="04243C"/>
-              <w:left w:val="single" w:sz="8" w:color="04243C"/>
-              <w:bottom w:val="single" w:sz="8" w:color="04243C"/>
-              <w:right w:val="single" w:sz="8" w:color="04243C"/>
-            </w:tcBorders>
-          </w:tcPr>
-          <w:p>
-            <w:r>
-              <w:rPr>
-                <w:rFonts w:ascii="Calibri" w:hAnsi="Calibri"/>
-                <w:b/>
-                <w:sz w:val="22"/>
-                <w:rFonts w:ascii="Calibri" w:hAnsi="Calibri" w:cs="Calibri"/>
-                <w:color w:val="000000"/>
-              </w:rPr>
-              <w:t>PKR 15,000 se</w:t>
-            </w:r>
-          </w:p>
-        </w:tc>
-      </w:tr>
-      <w:tr>
-        <w:tc>
-          <w:tcPr>
-            <w:tcW w:type="dxa" w:w="4986"/>
-            <w:tcBorders>
-              <w:top w:val="single" w:sz="8" w:color="04243C"/>
-              <w:left w:val="single" w:sz="8" w:color="04243C"/>
-              <w:bottom w:val="single" w:sz="8" w:color="04243C"/>
-              <w:right w:val="single" w:sz="8" w:color="04243C"/>
-            </w:tcBorders>
-          </w:tcPr>
-          <w:p>
-            <w:r>
-              <w:rPr>
-                <w:rFonts w:ascii="Calibri" w:hAnsi="Calibri"/>
-                <w:b w:val="0"/>
-                <w:sz w:val="22"/>
-                <w:rFonts w:ascii="Calibri" w:hAnsi="Calibri" w:cs="Calibri"/>
-                <w:color w:val="000000"/>
-              </w:rPr>
-              <w:t>Brand Identity</w:t>
-            </w:r>
-          </w:p>
-        </w:tc>
-        <w:tc>
-          <w:tcPr>
-            <w:tcW w:type="dxa" w:w="4986"/>
-            <w:tcBorders>
-              <w:top w:val="single" w:sz="8" w:color="04243C"/>
-              <w:left w:val="single" w:sz="8" w:color="04243C"/>
-              <w:bottom w:val="single" w:sz="8" w:color="04243C"/>
-              <w:right w:val="single" w:sz="8" w:color="04243C"/>
-            </w:tcBorders>
-          </w:tcPr>
-          <w:p>
-            <w:r>
-              <w:rPr>
-                <w:rFonts w:ascii="Calibri" w:hAnsi="Calibri"/>
-                <w:b/>
-                <w:sz w:val="22"/>
-                <w:rFonts w:ascii="Calibri" w:hAnsi="Calibri" w:cs="Calibri"/>
-                <w:color w:val="000000"/>
-              </w:rPr>
-              <w:t>PKR 45,000 se</w:t>
-            </w:r>
-          </w:p>
-        </w:tc>
-      </w:tr>
-      <w:tr>
-        <w:tc>
-          <w:tcPr>
-            <w:tcW w:type="dxa" w:w="4986"/>
-            <w:tcBorders>
-              <w:top w:val="single" w:sz="8" w:color="04243C"/>
-              <w:left w:val="single" w:sz="8" w:color="04243C"/>
-              <w:bottom w:val="single" w:sz="8" w:color="04243C"/>
-              <w:right w:val="single" w:sz="8" w:color="04243C"/>
-            </w:tcBorders>
-          </w:tcPr>
-          <w:p>
-            <w:r>
-              <w:rPr>
-                <w:rFonts w:ascii="Calibri" w:hAnsi="Calibri"/>
-                <w:b w:val="0"/>
-                <w:sz w:val="22"/>
-                <w:rFonts w:ascii="Calibri" w:hAnsi="Calibri" w:cs="Calibri"/>
-                <w:color w:val="000000"/>
-              </w:rPr>
-              <w:t>Landing Page</w:t>
-            </w:r>
-          </w:p>
-        </w:tc>
-        <w:tc>
-          <w:tcPr>
-            <w:tcW w:type="dxa" w:w="4986"/>
-            <w:tcBorders>
-              <w:top w:val="single" w:sz="8" w:color="04243C"/>
-              <w:left w:val="single" w:sz="8" w:color="04243C"/>
-              <w:bottom w:val="single" w:sz="8" w:color="04243C"/>
-              <w:right w:val="single" w:sz="8" w:color="04243C"/>
-            </w:tcBorders>
-          </w:tcPr>
-          <w:p>
-            <w:r>
-              <w:rPr>
-                <w:rFonts w:ascii="Calibri" w:hAnsi="Calibri"/>
-                <w:b/>
-                <w:sz w:val="22"/>
-                <w:rFonts w:ascii="Calibri" w:hAnsi="Calibri" w:cs="Calibri"/>
-                <w:color w:val="000000"/>
-              </w:rPr>
-              <w:t>PKR 35,000 se</w:t>
-            </w:r>
-          </w:p>
-        </w:tc>
-      </w:tr>
-      <w:tr>
-        <w:tc>
-          <w:tcPr>
-            <w:tcW w:type="dxa" w:w="4986"/>
-            <w:tcBorders>
-              <w:top w:val="single" w:sz="8" w:color="04243C"/>
-              <w:left w:val="single" w:sz="8" w:color="04243C"/>
-              <w:bottom w:val="single" w:sz="8" w:color="04243C"/>
-              <w:right w:val="single" w:sz="8" w:color="04243C"/>
-            </w:tcBorders>
-          </w:tcPr>
-          <w:p>
-            <w:r>
-              <w:rPr>
-                <w:rFonts w:ascii="Calibri" w:hAnsi="Calibri"/>
-                <w:b w:val="0"/>
-                <w:sz w:val="22"/>
-                <w:rFonts w:ascii="Calibri" w:hAnsi="Calibri" w:cs="Calibri"/>
-                <w:color w:val="000000"/>
-              </w:rPr>
-              <w:t>Website Maintenance</w:t>
-            </w:r>
-          </w:p>
-        </w:tc>
-        <w:tc>
-          <w:tcPr>
-            <w:tcW w:type="dxa" w:w="4986"/>
-            <w:tcBorders>
-              <w:top w:val="single" w:sz="8" w:color="04243C"/>
-              <w:left w:val="single" w:sz="8" w:color="04243C"/>
-              <w:bottom w:val="single" w:sz="8" w:color="04243C"/>
-              <w:right w:val="single" w:sz="8" w:color="04243C"/>
-            </w:tcBorders>
-          </w:tcPr>
-          <w:p>
-            <w:r>
-              <w:rPr>
-                <w:rFonts w:ascii="Calibri" w:hAnsi="Calibri"/>
-                <w:b/>
-                <w:sz w:val="22"/>
-                <w:rFonts w:ascii="Calibri" w:hAnsi="Calibri" w:cs="Calibri"/>
-                <w:color w:val="000000"/>
-              </w:rPr>
-              <w:t>PKR 8,000 / month se</w:t>
-            </w:r>
-          </w:p>
-        </w:tc>
-      </w:tr>
-      <w:tr>
-        <w:tc>
-          <w:tcPr>
-            <w:tcW w:type="dxa" w:w="4986"/>
-            <w:tcBorders>
-              <w:top w:val="single" w:sz="8" w:color="04243C"/>
-              <w:left w:val="single" w:sz="8" w:color="04243C"/>
-              <w:bottom w:val="single" w:sz="8" w:color="04243C"/>
-              <w:right w:val="single" w:sz="8" w:color="04243C"/>
-            </w:tcBorders>
-          </w:tcPr>
-          <w:p>
-            <w:r>
-              <w:rPr>
-                <w:rFonts w:ascii="Calibri" w:hAnsi="Calibri"/>
-                <w:b w:val="0"/>
-                <w:sz w:val="22"/>
-                <w:rFonts w:ascii="Calibri" w:hAnsi="Calibri" w:cs="Calibri"/>
-                <w:color w:val="000000"/>
-              </w:rPr>
-              <w:t>Content Writing</w:t>
-            </w:r>
-          </w:p>
-        </w:tc>
-        <w:tc>
-          <w:tcPr>
-            <w:tcW w:type="dxa" w:w="4986"/>
-            <w:tcBorders>
-              <w:top w:val="single" w:sz="8" w:color="04243C"/>
-              <w:left w:val="single" w:sz="8" w:color="04243C"/>
-              <w:bottom w:val="single" w:sz="8" w:color="04243C"/>
-              <w:right w:val="single" w:sz="8" w:color="04243C"/>
-            </w:tcBorders>
-          </w:tcPr>
-          <w:p>
-            <w:r>
-              <w:rPr>
-                <w:rFonts w:ascii="Calibri" w:hAnsi="Calibri"/>
-                <w:b/>
-                <w:sz w:val="22"/>
-                <w:rFonts w:ascii="Calibri" w:hAnsi="Calibri" w:cs="Calibri"/>
-                <w:color w:val="000000"/>
-              </w:rPr>
-              <w:t>PKR 3,500 / page</w:t>
-            </w:r>
-          </w:p>
-        </w:tc>
-      </w:tr>
-      <w:tr>
-        <w:tc>
-          <w:tcPr>
-            <w:tcW w:type="dxa" w:w="4986"/>
-            <w:tcBorders>
-              <w:top w:val="single" w:sz="8" w:color="04243C"/>
-              <w:left w:val="single" w:sz="8" w:color="04243C"/>
-              <w:bottom w:val="single" w:sz="8" w:color="04243C"/>
-              <w:right w:val="single" w:sz="8" w:color="04243C"/>
-            </w:tcBorders>
-          </w:tcPr>
-          <w:p>
-            <w:r>
-              <w:rPr>
-                <w:rFonts w:ascii="Calibri" w:hAnsi="Calibri"/>
-                <w:b w:val="0"/>
-                <w:sz w:val="22"/>
-                <w:rFonts w:ascii="Calibri" w:hAnsi="Calibri" w:cs="Calibri"/>
-                <w:color w:val="000000"/>
-              </w:rPr>
-              <w:t>Graphic Design</w:t>
-            </w:r>
-          </w:p>
-        </w:tc>
-        <w:tc>
-          <w:tcPr>
-            <w:tcW w:type="dxa" w:w="4986"/>
-            <w:tcBorders>
-              <w:top w:val="single" w:sz="8" w:color="04243C"/>
-              <w:left w:val="single" w:sz="8" w:color="04243C"/>
-              <w:bottom w:val="single" w:sz="8" w:color="04243C"/>
-              <w:right w:val="single" w:sz="8" w:color="04243C"/>
-            </w:tcBorders>
-          </w:tcPr>
-          <w:p>
-            <w:r>
-              <w:rPr>
-                <w:rFonts w:ascii="Calibri" w:hAnsi="Calibri"/>
-                <w:b/>
-                <w:sz w:val="22"/>
-                <w:rFonts w:ascii="Calibri" w:hAnsi="Calibri" w:cs="Calibri"/>
-                <w:color w:val="000000"/>
-              </w:rPr>
-              <w:t>PKR 2,500</w:t>
-            </w:r>
-          </w:p>
-        </w:tc>
-      </w:tr>
-      <w:tr>
-        <w:tc>
-          <w:tcPr>
-            <w:tcW w:type="dxa" w:w="4986"/>
-            <w:tcBorders>
-              <w:top w:val="single" w:sz="8" w:color="04243C"/>
-              <w:left w:val="single" w:sz="8" w:color="04243C"/>
-              <w:bottom w:val="single" w:sz="8" w:color="04243C"/>
-              <w:right w:val="single" w:sz="8" w:color="04243C"/>
-            </w:tcBorders>
-          </w:tcPr>
-          <w:p>
-            <w:r>
-              <w:rPr>
-                <w:rFonts w:ascii="Calibri" w:hAnsi="Calibri"/>
-                <w:b w:val="0"/>
-                <w:sz w:val="22"/>
-                <w:rFonts w:ascii="Calibri" w:hAnsi="Calibri" w:cs="Calibri"/>
-                <w:color w:val="000000"/>
-              </w:rPr>
-              <w:t>Video Editing</w:t>
-            </w:r>
-          </w:p>
-        </w:tc>
-        <w:tc>
-          <w:tcPr>
-            <w:tcW w:type="dxa" w:w="4986"/>
-            <w:tcBorders>
-              <w:top w:val="single" w:sz="8" w:color="04243C"/>
-              <w:left w:val="single" w:sz="8" w:color="04243C"/>
-              <w:bottom w:val="single" w:sz="8" w:color="04243C"/>
-              <w:right w:val="single" w:sz="8" w:color="04243C"/>
-            </w:tcBorders>
-          </w:tcPr>
-          <w:p>
-            <w:r>
-              <w:rPr>
-                <w:rFonts w:ascii="Calibri" w:hAnsi="Calibri"/>
-                <w:b/>
-                <w:sz w:val="22"/>
-                <w:rFonts w:ascii="Calibri" w:hAnsi="Calibri" w:cs="Calibri"/>
-                <w:color w:val="000000"/>
-              </w:rPr>
-              <w:t>PKR 5,000 / minute</w:t>
-            </w:r>
-          </w:p>
-        </w:tc>
-      </w:tr>
-      <w:tr>
-        <w:tc>
-          <w:tcPr>
-            <w:tcW w:type="dxa" w:w="4986"/>
-            <w:tcBorders>
-              <w:top w:val="single" w:sz="8" w:color="04243C"/>
-              <w:left w:val="single" w:sz="8" w:color="04243C"/>
-              <w:bottom w:val="single" w:sz="8" w:color="04243C"/>
-              <w:right w:val="single" w:sz="8" w:color="04243C"/>
-            </w:tcBorders>
-          </w:tcPr>
-          <w:p>
-            <w:r>
-              <w:rPr>
-                <w:rFonts w:ascii="Calibri" w:hAnsi="Calibri"/>
-                <w:b w:val="0"/>
-                <w:sz w:val="22"/>
-                <w:rFonts w:ascii="Calibri" w:hAnsi="Calibri" w:cs="Calibri"/>
-                <w:color w:val="000000"/>
-              </w:rPr>
-              <w:t>SEO Audit</w:t>
-            </w:r>
-          </w:p>
-        </w:tc>
-        <w:tc>
-          <w:tcPr>
-            <w:tcW w:type="dxa" w:w="4986"/>
-            <w:tcBorders>
-              <w:top w:val="single" w:sz="8" w:color="04243C"/>
-              <w:left w:val="single" w:sz="8" w:color="04243C"/>
-              <w:bottom w:val="single" w:sz="8" w:color="04243C"/>
-              <w:right w:val="single" w:sz="8" w:color="04243C"/>
-            </w:tcBorders>
-          </w:tcPr>
-          <w:p>
-            <w:r>
-              <w:rPr>
-                <w:rFonts w:ascii="Calibri" w:hAnsi="Calibri"/>
-                <w:b/>
-                <w:sz w:val="22"/>
-                <w:rFonts w:ascii="Calibri" w:hAnsi="Calibri" w:cs="Calibri"/>
-                <w:color w:val="000000"/>
-              </w:rPr>
-              <w:t>PKR 25,000</w:t>
-            </w:r>
-          </w:p>
-        </w:tc>
-      </w:tr>
-      <w:tr>
-        <w:tc>
-          <w:tcPr>
-            <w:tcW w:type="dxa" w:w="4986"/>
-            <w:tcBorders>
-              <w:top w:val="single" w:sz="8" w:color="04243C"/>
-              <w:left w:val="single" w:sz="8" w:color="04243C"/>
-              <w:bottom w:val="single" w:sz="8" w:color="04243C"/>
-              <w:right w:val="single" w:sz="8" w:color="04243C"/>
-            </w:tcBorders>
-          </w:tcPr>
-          <w:p>
-            <w:r>
-              <w:rPr>
-                <w:rFonts w:ascii="Calibri" w:hAnsi="Calibri"/>
-                <w:b w:val="0"/>
-                <w:sz w:val="22"/>
-                <w:rFonts w:ascii="Calibri" w:hAnsi="Calibri" w:cs="Calibri"/>
-                <w:color w:val="000000"/>
-              </w:rPr>
-              <w:t>Product Upload</w:t>
-            </w:r>
-          </w:p>
-        </w:tc>
-        <w:tc>
-          <w:tcPr>
-            <w:tcW w:type="dxa" w:w="4986"/>
-            <w:tcBorders>
-              <w:top w:val="single" w:sz="8" w:color="04243C"/>
-              <w:left w:val="single" w:sz="8" w:color="04243C"/>
-              <w:bottom w:val="single" w:sz="8" w:color="04243C"/>
-              <w:right w:val="single" w:sz="8" w:color="04243C"/>
-            </w:tcBorders>
-          </w:tcPr>
-          <w:p>
-            <w:r>
-              <w:rPr>
-                <w:rFonts w:ascii="Calibri" w:hAnsi="Calibri"/>
-                <w:b/>
-                <w:sz w:val="22"/>
-                <w:rFonts w:ascii="Calibri" w:hAnsi="Calibri" w:cs="Calibri"/>
-                <w:color w:val="000000"/>
-              </w:rPr>
-              <w:t>PKR 500 / product</w:t>
-            </w:r>
-          </w:p>
-        </w:tc>
-      </w:tr>
-      <w:tr>
-        <w:tc>
-          <w:tcPr>
-            <w:tcW w:type="dxa" w:w="4986"/>
-            <w:tcBorders>
-              <w:top w:val="single" w:sz="8" w:color="04243C"/>
-              <w:left w:val="single" w:sz="8" w:color="04243C"/>
-              <w:bottom w:val="single" w:sz="8" w:color="04243C"/>
-              <w:right w:val="single" w:sz="8" w:color="04243C"/>
-            </w:tcBorders>
-          </w:tcPr>
-          <w:p>
-            <w:r>
-              <w:rPr>
-                <w:rFonts w:ascii="Calibri" w:hAnsi="Calibri"/>
-                <w:b w:val="0"/>
-                <w:sz w:val="22"/>
-                <w:rFonts w:ascii="Calibri" w:hAnsi="Calibri" w:cs="Calibri"/>
-                <w:color w:val="000000"/>
-              </w:rPr>
-              <w:t>Business Email</w:t>
-            </w:r>
-          </w:p>
-        </w:tc>
-        <w:tc>
-          <w:tcPr>
-            <w:tcW w:type="dxa" w:w="4986"/>
-            <w:tcBorders>
-              <w:top w:val="single" w:sz="8" w:color="04243C"/>
-              <w:left w:val="single" w:sz="8" w:color="04243C"/>
-              <w:bottom w:val="single" w:sz="8" w:color="04243C"/>
-              <w:right w:val="single" w:sz="8" w:color="04243C"/>
-            </w:tcBorders>
-          </w:tcPr>
-          <w:p>
-            <w:r>
-              <w:rPr>
-                <w:rFonts w:ascii="Calibri" w:hAnsi="Calibri"/>
-                <w:b/>
-                <w:sz w:val="22"/>
-                <w:rFonts w:ascii="Calibri" w:hAnsi="Calibri" w:cs="Calibri"/>
-                <w:color w:val="000000"/>
-              </w:rPr>
-              <w:t>PKR 5,000</w:t>
-            </w:r>
-          </w:p>
-        </w:tc>
-      </w:tr>
-      <w:tr>
-        <w:tc>
-          <w:tcPr>
-            <w:tcW w:type="dxa" w:w="4986"/>
-            <w:tcBorders>
-              <w:top w:val="single" w:sz="8" w:color="04243C"/>
-              <w:left w:val="single" w:sz="8" w:color="04243C"/>
-              <w:bottom w:val="single" w:sz="8" w:color="04243C"/>
-              <w:right w:val="single" w:sz="8" w:color="04243C"/>
-            </w:tcBorders>
-          </w:tcPr>
-          <w:p>
-            <w:r>
-              <w:rPr>
-                <w:rFonts w:ascii="Calibri" w:hAnsi="Calibri"/>
-                <w:b w:val="0"/>
-                <w:sz w:val="22"/>
-                <w:rFonts w:ascii="Calibri" w:hAnsi="Calibri" w:cs="Calibri"/>
-                <w:color w:val="000000"/>
-              </w:rPr>
-              <w:t>Domain &amp; Hosting Help</w:t>
-            </w:r>
-          </w:p>
-        </w:tc>
-        <w:tc>
-          <w:tcPr>
-            <w:tcW w:type="dxa" w:w="4986"/>
-            <w:tcBorders>
-              <w:top w:val="single" w:sz="8" w:color="04243C"/>
-              <w:left w:val="single" w:sz="8" w:color="04243C"/>
-              <w:bottom w:val="single" w:sz="8" w:color="04243C"/>
-              <w:right w:val="single" w:sz="8" w:color="04243C"/>
-            </w:tcBorders>
-          </w:tcPr>
-          <w:p>
-            <w:r>
-              <w:rPr>
-                <w:rFonts w:ascii="Calibri" w:hAnsi="Calibri"/>
-                <w:b/>
-                <w:sz w:val="22"/>
-                <w:rFonts w:ascii="Calibri" w:hAnsi="Calibri" w:cs="Calibri"/>
-                <w:color w:val="000000"/>
-              </w:rPr>
-              <w:t>Cost + PKR 3,000</w:t>
-            </w:r>
-          </w:p>
-        </w:tc>
-      </w:tr>
-    </w:tbl>
     <w:p>
-      <w:r>
-        <w:br w:type="page"/>
-      </w:r>
-    </w:p>
-    <w:p/>
-    <w:tbl>
-      <w:tblPr>
-        <w:tblW w:type="auto" w:w="0"/>
-        <w:jc w:val="center"/>
-        <w:tblLook w:firstColumn="1" w:firstRow="1" w:lastColumn="0" w:lastRow="0" w:noHBand="0" w:noVBand="1" w:val="04A0"/>
-      </w:tblPr>
-      <w:tblGrid>
-        <w:gridCol w:w="9972"/>
-      </w:tblGrid>
-      <w:tr>
-        <w:tc>
-          <w:tcPr>
-            <w:tcW w:type="dxa" w:w="9972"/>
-            <w:shd w:val="clear" w:fill="04243C"/>
-            <w:tcBorders>
-              <w:top w:val="single" w:sz="12" w:color="06ACBA"/>
-              <w:left w:val="single" w:sz="12" w:color="06ACBA"/>
-              <w:bottom w:val="single" w:sz="12" w:color="06ACBA"/>
-              <w:right w:val="single" w:sz="12" w:color="06ACBA"/>
-            </w:tcBorders>
-            <w:tcBorders>
-              <w:top w:val="single" w:sz="8" w:color="04243C"/>
-              <w:left w:val="single" w:sz="8" w:color="04243C"/>
-              <w:bottom w:val="single" w:sz="8" w:color="04243C"/>
-              <w:right w:val="single" w:sz="8" w:color="04243C"/>
-            </w:tcBorders>
-          </w:tcPr>
-          <w:p>
-            <w:pPr>
-              <w:jc w:val="left"/>
-            </w:pPr>
-            <w:r>
-              <w:rPr>
-                <w:rFonts w:ascii="Calibri" w:hAnsi="Calibri"/>
-                <w:b/>
-                <w:sz w:val="36"/>
-                <w:rFonts w:ascii="Calibri" w:hAnsi="Calibri" w:cs="Calibri"/>
-                <w:color w:val="FFFFFF"/>
-              </w:rPr>
-              <w:t>Our Process</w:t>
-            </w:r>
-          </w:p>
-        </w:tc>
-      </w:tr>
-    </w:tbl>
-    <w:p/>
-    <w:p>
+      <w:pPr>
+        <w:spacing w:before="320" w:after="160"/>
+        <w:pBdr>
+          <w:left w:val="single" w:sz="24" w:space="8" w:color="06ACBA"/>
+        </w:pBdr>
+      </w:pPr>
       <w:r>
         <w:rPr>
-          <w:rFonts w:ascii="Calibri" w:hAnsi="Calibri"/>
           <w:b/>
-          <w:sz w:val="24"/>
-          <w:rFonts w:ascii="Calibri" w:hAnsi="Calibri" w:cs="Calibri"/>
-          <w:color w:val="04243C"/>
+          <w:sz w:val="40"/>
+          <w:rFonts w:ascii="Arial" w:hAnsi="Arial" w:cs="Arial"/>
+          <w:color w:val="000000"/>
         </w:rPr>
-        <w:t>Discovery</w:t>
+        <w:t>Add-On Services</w:t>
       </w:r>
     </w:p>
     <w:p>
+      <w:pPr>
+        <w:spacing w:after="120" w:before="80"/>
+      </w:pPr>
       <w:r>
         <w:rPr>
-          <w:rFonts w:ascii="Calibri" w:hAnsi="Calibri"/>
-          <w:b/>
-          <w:sz w:val="24"/>
-          <w:rFonts w:ascii="Calibri" w:hAnsi="Calibri" w:cs="Calibri"/>
-          <w:color w:val="04243C"/>
+          <w:b w:val="0"/>
+          <w:sz w:val="28"/>
+          <w:rFonts w:ascii="Arial" w:hAnsi="Arial" w:cs="Arial"/>
+          <w:color w:val="000000"/>
         </w:rPr>
-        <w:t>Planning</w:t>
+        <w:t>Logo Design .............. PKR 15,000 se</w:t>
       </w:r>
     </w:p>
     <w:p>
+      <w:pPr>
+        <w:spacing w:after="120" w:before="80"/>
+      </w:pPr>
       <w:r>
         <w:rPr>
-          <w:rFonts w:ascii="Calibri" w:hAnsi="Calibri"/>
-          <w:b/>
-          <w:sz w:val="24"/>
-          <w:rFonts w:ascii="Calibri" w:hAnsi="Calibri" w:cs="Calibri"/>
-          <w:color w:val="04243C"/>
+          <w:b w:val="0"/>
+          <w:sz w:val="28"/>
+          <w:rFonts w:ascii="Arial" w:hAnsi="Arial" w:cs="Arial"/>
+          <w:color w:val="000000"/>
         </w:rPr>
-        <w:t>Design</w:t>
+        <w:t>Brand Identity .............. PKR 45,000 se</w:t>
       </w:r>
     </w:p>
     <w:p>
+      <w:pPr>
+        <w:spacing w:after="120" w:before="80"/>
+      </w:pPr>
       <w:r>
         <w:rPr>
-          <w:rFonts w:ascii="Calibri" w:hAnsi="Calibri"/>
-          <w:b/>
-          <w:sz w:val="24"/>
-          <w:rFonts w:ascii="Calibri" w:hAnsi="Calibri" w:cs="Calibri"/>
-          <w:color w:val="04243C"/>
+          <w:b w:val="0"/>
+          <w:sz w:val="28"/>
+          <w:rFonts w:ascii="Arial" w:hAnsi="Arial" w:cs="Arial"/>
+          <w:color w:val="000000"/>
         </w:rPr>
-        <w:t>Development</w:t>
+        <w:t>Landing Page .............. PKR 35,000 se</w:t>
       </w:r>
     </w:p>
     <w:p>
+      <w:pPr>
+        <w:spacing w:after="120" w:before="80"/>
+      </w:pPr>
       <w:r>
         <w:rPr>
-          <w:rFonts w:ascii="Calibri" w:hAnsi="Calibri"/>
-          <w:b/>
-          <w:sz w:val="24"/>
-          <w:rFonts w:ascii="Calibri" w:hAnsi="Calibri" w:cs="Calibri"/>
-          <w:color w:val="04243C"/>
+          <w:b w:val="0"/>
+          <w:sz w:val="28"/>
+          <w:rFonts w:ascii="Arial" w:hAnsi="Arial" w:cs="Arial"/>
+          <w:color w:val="000000"/>
         </w:rPr>
-        <w:t>Testing</w:t>
+        <w:t>Website Maintenance .............. PKR 8,000 / month</w:t>
       </w:r>
     </w:p>
     <w:p>
+      <w:pPr>
+        <w:spacing w:after="120" w:before="80"/>
+      </w:pPr>
       <w:r>
         <w:rPr>
-          <w:rFonts w:ascii="Calibri" w:hAnsi="Calibri"/>
-          <w:b/>
-          <w:sz w:val="24"/>
-          <w:rFonts w:ascii="Calibri" w:hAnsi="Calibri" w:cs="Calibri"/>
-          <w:color w:val="04243C"/>
+          <w:b w:val="0"/>
+          <w:sz w:val="28"/>
+          <w:rFonts w:ascii="Arial" w:hAnsi="Arial" w:cs="Arial"/>
+          <w:color w:val="000000"/>
         </w:rPr>
-        <w:t>Launch</w:t>
+        <w:t>Content Writing .............. PKR 3,500 / page</w:t>
       </w:r>
     </w:p>
     <w:p>
+      <w:pPr>
+        <w:spacing w:after="120" w:before="80"/>
+      </w:pPr>
       <w:r>
         <w:rPr>
-          <w:rFonts w:ascii="Calibri" w:hAnsi="Calibri"/>
-          <w:b/>
-          <w:sz w:val="24"/>
-          <w:rFonts w:ascii="Calibri" w:hAnsi="Calibri" w:cs="Calibri"/>
-          <w:color w:val="04243C"/>
-        </w:rPr>
-        <w:t>Support</w:t>
-      </w:r>
-    </w:p>
-    <w:p/>
-    <w:tbl>
-      <w:tblPr>
-        <w:tblW w:type="auto" w:w="0"/>
-        <w:jc w:val="center"/>
-        <w:tblLook w:firstColumn="1" w:firstRow="1" w:lastColumn="0" w:lastRow="0" w:noHBand="0" w:noVBand="1" w:val="04A0"/>
-      </w:tblPr>
-      <w:tblGrid>
-        <w:gridCol w:w="9972"/>
-      </w:tblGrid>
-      <w:tr>
-        <w:tc>
-          <w:tcPr>
-            <w:tcW w:type="dxa" w:w="9972"/>
-            <w:shd w:val="clear" w:fill="04243C"/>
-            <w:tcBorders>
-              <w:top w:val="single" w:sz="12" w:color="06ACBA"/>
-              <w:left w:val="single" w:sz="12" w:color="06ACBA"/>
-              <w:bottom w:val="single" w:sz="12" w:color="06ACBA"/>
-              <w:right w:val="single" w:sz="12" w:color="06ACBA"/>
-            </w:tcBorders>
-            <w:tcBorders>
-              <w:top w:val="single" w:sz="8" w:color="04243C"/>
-              <w:left w:val="single" w:sz="8" w:color="04243C"/>
-              <w:bottom w:val="single" w:sz="8" w:color="04243C"/>
-              <w:right w:val="single" w:sz="8" w:color="04243C"/>
-            </w:tcBorders>
-          </w:tcPr>
-          <w:p>
-            <w:pPr>
-              <w:jc w:val="left"/>
-            </w:pPr>
-            <w:r>
-              <w:rPr>
-                <w:rFonts w:ascii="Calibri" w:hAnsi="Calibri"/>
-                <w:b/>
-                <w:sz w:val="36"/>
-                <w:rFonts w:ascii="Calibri" w:hAnsi="Calibri" w:cs="Calibri"/>
-                <w:color w:val="FFFFFF"/>
-              </w:rPr>
-              <w:t>Contact</w:t>
-            </w:r>
-          </w:p>
-          <w:p>
-            <w:r>
-              <w:rPr>
-                <w:rFonts w:ascii="Calibri" w:hAnsi="Calibri"/>
-                <w:b w:val="0"/>
-                <w:sz w:val="24"/>
-                <w:rFonts w:ascii="Calibri" w:hAnsi="Calibri" w:cs="Calibri"/>
-                <w:color w:val="FFFFFF"/>
-              </w:rPr>
-              <w:t>CoLab Space Point</w:t>
-            </w:r>
-          </w:p>
-        </w:tc>
-      </w:tr>
-    </w:tbl>
-    <w:p/>
-    <w:p>
-      <w:r>
-        <w:rPr>
-          <w:rFonts w:ascii="Calibri" w:hAnsi="Calibri"/>
-          <w:b/>
-          <w:sz w:val="24"/>
-          <w:rFonts w:ascii="Calibri" w:hAnsi="Calibri" w:cs="Calibri"/>
+          <w:b w:val="0"/>
+          <w:sz w:val="28"/>
+          <w:rFonts w:ascii="Arial" w:hAnsi="Arial" w:cs="Arial"/>
           <w:color w:val="000000"/>
         </w:rPr>
-        <w:t xml:space="preserve">Website: </w:t>
-      </w:r>
-      <w:r>
-        <w:rPr>
-          <w:rFonts w:ascii="Calibri" w:hAnsi="Calibri"/>
-          <w:b w:val="0"/>
-          <w:sz w:val="24"/>
-          <w:rFonts w:ascii="Calibri" w:hAnsi="Calibri" w:cs="Calibri"/>
-          <w:color w:val="000000"/>
-        </w:rPr>
-        <w:t>www.colabpoint.com</w:t>
+        <w:t>Graphic Design .............. PKR 2,500</w:t>
       </w:r>
     </w:p>
     <w:p>
+      <w:pPr>
+        <w:spacing w:after="120" w:before="80"/>
+      </w:pPr>
       <w:r>
         <w:rPr>
-          <w:rFonts w:ascii="Calibri" w:hAnsi="Calibri"/>
-          <w:b/>
-          <w:sz w:val="24"/>
-          <w:rFonts w:ascii="Calibri" w:hAnsi="Calibri" w:cs="Calibri"/>
+          <w:b w:val="0"/>
+          <w:sz w:val="28"/>
+          <w:rFonts w:ascii="Arial" w:hAnsi="Arial" w:cs="Arial"/>
           <w:color w:val="000000"/>
         </w:rPr>
-        <w:t xml:space="preserve">Phone: </w:t>
-      </w:r>
-      <w:r>
-        <w:rPr>
-          <w:rFonts w:ascii="Calibri" w:hAnsi="Calibri"/>
-          <w:b w:val="0"/>
-          <w:sz w:val="24"/>
-          <w:rFonts w:ascii="Calibri" w:hAnsi="Calibri" w:cs="Calibri"/>
-          <w:color w:val="000000"/>
-        </w:rPr>
-        <w:t>+92 349 7684322  |  +92 332 4384322</w:t>
+        <w:t>Video Editing .............. PKR 5,000 / minute</w:t>
       </w:r>
     </w:p>
     <w:p>
+      <w:pPr>
+        <w:spacing w:after="120" w:before="80"/>
+      </w:pPr>
       <w:r>
         <w:rPr>
-          <w:rFonts w:ascii="Calibri" w:hAnsi="Calibri"/>
-          <w:b/>
-          <w:sz w:val="24"/>
-          <w:rFonts w:ascii="Calibri" w:hAnsi="Calibri" w:cs="Calibri"/>
+          <w:b w:val="0"/>
+          <w:sz w:val="28"/>
+          <w:rFonts w:ascii="Arial" w:hAnsi="Arial" w:cs="Arial"/>
           <w:color w:val="000000"/>
         </w:rPr>
-        <w:t xml:space="preserve">Email: </w:t>
-      </w:r>
-      <w:r>
-        <w:rPr>
-          <w:rFonts w:ascii="Calibri" w:hAnsi="Calibri"/>
-          <w:b w:val="0"/>
-          <w:sz w:val="24"/>
-          <w:rFonts w:ascii="Calibri" w:hAnsi="Calibri" w:cs="Calibri"/>
-          <w:color w:val="000000"/>
-        </w:rPr>
-        <w:t>colabpoint@gmail.com  |  hello@colabpoint.com</w:t>
+        <w:t>SEO Audit .............. PKR 25,000</w:t>
       </w:r>
     </w:p>
     <w:p>
+      <w:pPr>
+        <w:spacing w:after="120" w:before="80"/>
+      </w:pPr>
       <w:r>
         <w:rPr>
-          <w:rFonts w:ascii="Calibri" w:hAnsi="Calibri"/>
-          <w:b/>
-          <w:sz w:val="24"/>
-          <w:rFonts w:ascii="Calibri" w:hAnsi="Calibri" w:cs="Calibri"/>
+          <w:b w:val="0"/>
+          <w:sz w:val="28"/>
+          <w:rFonts w:ascii="Arial" w:hAnsi="Arial" w:cs="Arial"/>
           <w:color w:val="000000"/>
         </w:rPr>
-        <w:t xml:space="preserve">Address: </w:t>
+        <w:t>Product Upload .............. PKR 500 / product</w:t>
       </w:r>
+    </w:p>
+    <w:p>
+      <w:pPr>
+        <w:spacing w:after="120" w:before="80"/>
+      </w:pPr>
       <w:r>
         <w:rPr>
-          <w:rFonts w:ascii="Calibri" w:hAnsi="Calibri"/>
           <w:b w:val="0"/>
-          <w:sz w:val="24"/>
-          <w:rFonts w:ascii="Calibri" w:hAnsi="Calibri" w:cs="Calibri"/>
+          <w:sz w:val="28"/>
+          <w:rFonts w:ascii="Arial" w:hAnsi="Arial" w:cs="Arial"/>
           <w:color w:val="000000"/>
         </w:rPr>
-        <w:t>2nd Floor Anwar Center, Madina Road Near Gymkhana, Gujrat, Pakistan</w:t>
+        <w:t>Business Email .............. PKR 5,000</w:t>
+      </w:r>
+    </w:p>
+    <w:p>
+      <w:pPr>
+        <w:spacing w:after="120" w:before="80"/>
+      </w:pPr>
+      <w:r>
+        <w:rPr>
+          <w:b w:val="0"/>
+          <w:sz w:val="28"/>
+          <w:rFonts w:ascii="Arial" w:hAnsi="Arial" w:cs="Arial"/>
+          <w:color w:val="000000"/>
+        </w:rPr>
+        <w:t>Domain &amp; Hosting .............. Cost + PKR 3,000</w:t>
+      </w:r>
+    </w:p>
+    <w:p>
+      <w:pPr>
+        <w:spacing w:before="320" w:after="160"/>
+        <w:pBdr>
+          <w:left w:val="single" w:sz="24" w:space="8" w:color="06ACBA"/>
+        </w:pBdr>
+      </w:pPr>
+      <w:r>
+        <w:rPr>
+          <w:b/>
+          <w:sz w:val="40"/>
+          <w:rFonts w:ascii="Arial" w:hAnsi="Arial" w:cs="Arial"/>
+          <w:color w:val="000000"/>
+        </w:rPr>
+        <w:t>Contact</w:t>
+      </w:r>
+    </w:p>
+    <w:p>
+      <w:pPr>
+        <w:spacing w:after="120" w:before="80"/>
+      </w:pPr>
+      <w:r>
+        <w:rPr>
+          <w:b w:val="0"/>
+          <w:sz w:val="28"/>
+          <w:rFonts w:ascii="Arial" w:hAnsi="Arial" w:cs="Arial"/>
+          <w:color w:val="000000"/>
+        </w:rPr>
+        <w:t>Company: CoLab Space Point</w:t>
+      </w:r>
+    </w:p>
+    <w:p>
+      <w:pPr>
+        <w:spacing w:after="120" w:before="80"/>
+      </w:pPr>
+      <w:r>
+        <w:rPr>
+          <w:b w:val="0"/>
+          <w:sz w:val="28"/>
+          <w:rFonts w:ascii="Arial" w:hAnsi="Arial" w:cs="Arial"/>
+          <w:color w:val="000000"/>
+        </w:rPr>
+        <w:t>Website: www.colabpoint.com</w:t>
+      </w:r>
+    </w:p>
+    <w:p>
+      <w:pPr>
+        <w:spacing w:after="120" w:before="80"/>
+      </w:pPr>
+      <w:r>
+        <w:rPr>
+          <w:b w:val="0"/>
+          <w:sz w:val="28"/>
+          <w:rFonts w:ascii="Arial" w:hAnsi="Arial" w:cs="Arial"/>
+          <w:color w:val="000000"/>
+        </w:rPr>
+        <w:t>Phone: +92 349 7684322  |  +92 332 4384322</w:t>
+      </w:r>
+    </w:p>
+    <w:p>
+      <w:pPr>
+        <w:spacing w:after="120" w:before="80"/>
+      </w:pPr>
+      <w:r>
+        <w:rPr>
+          <w:b w:val="0"/>
+          <w:sz w:val="28"/>
+          <w:rFonts w:ascii="Arial" w:hAnsi="Arial" w:cs="Arial"/>
+          <w:color w:val="000000"/>
+        </w:rPr>
+        <w:t>Email: colabpoint@gmail.com  |  hello@colabpoint.com</w:t>
+      </w:r>
+    </w:p>
+    <w:p>
+      <w:pPr>
+        <w:spacing w:after="120" w:before="80"/>
+      </w:pPr>
+      <w:r>
+        <w:rPr>
+          <w:b w:val="0"/>
+          <w:sz w:val="28"/>
+          <w:rFonts w:ascii="Arial" w:hAnsi="Arial" w:cs="Arial"/>
+          <w:color w:val="000000"/>
+        </w:rPr>
+        <w:t>Address: 2nd Floor Anwar Center, Madina Road Near Gymkhana, Gujrat, Pakistan</w:t>
       </w:r>
     </w:p>
     <w:sectPr>
-      <w:footerReference w:type="default" r:id="rId9"/>
+      <w:footerReference w:type="default" r:id="rId10"/>
       <w:pgSz w:w="12240" w:h="15840"/>
-      <w:pgMar w:top="1134" w:right="1134" w:bottom="1134" w:left="1134" w:header="720" w:footer="720" w:gutter="0"/>
+      <w:pgMar w:top="1417" w:right="1417" w:bottom="1417" w:left="1417" w:header="720" w:footer="720" w:gutter="0"/>
       <w:cols w:space="720"/>
       <w:docGrid w:linePitch="360"/>
     </w:sectPr>
@@ -3264,13 +2108,12 @@
     </w:pPr>
     <w:r>
       <w:rPr>
-        <w:rFonts w:ascii="Calibri" w:hAnsi="Calibri"/>
         <w:b w:val="0"/>
-        <w:sz w:val="18"/>
-        <w:rFonts w:ascii="Calibri" w:hAnsi="Calibri" w:cs="Calibri"/>
+        <w:sz w:val="20"/>
+        <w:rFonts w:ascii="Arial" w:hAnsi="Arial" w:cs="Arial"/>
         <w:color w:val="000000"/>
       </w:rPr>
-      <w:t>CoLab Space Point | www.colabpoint.com | Gujrat</w:t>
+      <w:t>CoLab Space Point | www.colabpoint.com</w:t>
     </w:r>
   </w:p>
 </w:ftr>
@@ -3640,9 +2483,9 @@
     <w:qFormat/>
     <w:rsid w:val="00FC693F"/>
     <w:rPr>
-      <w:rFonts w:ascii="Calibri" w:hAnsi="Calibri"/>
+      <w:rFonts w:ascii="Arial" w:hAnsi="Arial"/>
       <w:color w:val="000000"/>
-      <w:sz w:val="24"/>
+      <w:sz w:val="28"/>
     </w:rPr>
   </w:style>
   <w:style w:type="paragraph" w:styleId="Header">

</xml_diff>

<commit_message>
Convert proposal copy to English only
Co-authored-by: fullstackwebdeveloper1000-coder <fullstackwebdeveloper1000-coder@users.noreply.github.com>
</commit_message>
<xml_diff>
--- a/CoLab_Space_Point_Digital_Agency_Proposal.docx
+++ b/CoLab_Space_Point_Digital_Agency_Proposal.docx
@@ -225,7 +225,7 @@
           <w:rFonts w:ascii="Arial" w:hAnsi="Arial" w:cs="Arial"/>
           <w:color w:val="000000"/>
         </w:rPr>
-        <w:t>CoLab Space Point website, WordPress, e-commerce, branding, social media, SEO, Google Ads, Meta Ads aur business growth ki services deta hai.</w:t>
+        <w:t>CoLab Space Point delivers website design, WordPress development, e-commerce, branding, social media management, SEO, Google Ads, Meta Ads, and business growth solutions.</w:t>
       </w:r>
     </w:p>
     <w:p>
@@ -239,7 +239,108 @@
           <w:rFonts w:ascii="Arial" w:hAnsi="Arial" w:cs="Arial"/>
           <w:color w:val="000000"/>
         </w:rPr>
-        <w:t>Har package ki PRICE neeche bold hai — aur usi ke neeche likha hai is price me kya shamil hoga.</w:t>
+        <w:t>Each section shows the package price in bold, followed by a clear list of everything included at that price.</w:t>
+      </w:r>
+    </w:p>
+    <w:p>
+      <w:pPr>
+        <w:spacing w:before="320" w:after="160"/>
+        <w:pBdr>
+          <w:left w:val="single" w:sz="24" w:space="8" w:color="06ACBA"/>
+        </w:pBdr>
+      </w:pPr>
+      <w:r>
+        <w:rPr>
+          <w:b/>
+          <w:sz w:val="40"/>
+          <w:rFonts w:ascii="Arial" w:hAnsi="Arial" w:cs="Arial"/>
+          <w:color w:val="000000"/>
+        </w:rPr>
+        <w:t>Why Choose CoLab Space Point</w:t>
+      </w:r>
+    </w:p>
+    <w:p>
+      <w:pPr>
+        <w:spacing w:after="80" w:before="80"/>
+      </w:pPr>
+      <w:r>
+        <w:rPr>
+          <w:b w:val="0"/>
+          <w:sz w:val="28"/>
+          <w:rFonts w:ascii="Arial" w:hAnsi="Arial" w:cs="Arial"/>
+          <w:color w:val="000000"/>
+        </w:rPr>
+        <w:t xml:space="preserve">  •  Experienced multidisciplinary team</w:t>
+      </w:r>
+    </w:p>
+    <w:p>
+      <w:pPr>
+        <w:spacing w:after="80" w:before="80"/>
+      </w:pPr>
+      <w:r>
+        <w:rPr>
+          <w:b w:val="0"/>
+          <w:sz w:val="28"/>
+          <w:rFonts w:ascii="Arial" w:hAnsi="Arial" w:cs="Arial"/>
+          <w:color w:val="000000"/>
+        </w:rPr>
+        <w:t xml:space="preserve">  •  Professional support and clear communication</w:t>
+      </w:r>
+    </w:p>
+    <w:p>
+      <w:pPr>
+        <w:spacing w:after="80" w:before="80"/>
+      </w:pPr>
+      <w:r>
+        <w:rPr>
+          <w:b w:val="0"/>
+          <w:sz w:val="28"/>
+          <w:rFonts w:ascii="Arial" w:hAnsi="Arial" w:cs="Arial"/>
+          <w:color w:val="000000"/>
+        </w:rPr>
+        <w:t xml:space="preserve">  •  Business-focused, results-driven solutions</w:t>
+      </w:r>
+    </w:p>
+    <w:p>
+      <w:pPr>
+        <w:spacing w:after="80" w:before="80"/>
+      </w:pPr>
+      <w:r>
+        <w:rPr>
+          <w:b w:val="0"/>
+          <w:sz w:val="28"/>
+          <w:rFonts w:ascii="Arial" w:hAnsi="Arial" w:cs="Arial"/>
+          <w:color w:val="000000"/>
+        </w:rPr>
+        <w:t xml:space="preserve">  •  Modern technology stack</w:t>
+      </w:r>
+    </w:p>
+    <w:p>
+      <w:pPr>
+        <w:spacing w:after="80" w:before="80"/>
+      </w:pPr>
+      <w:r>
+        <w:rPr>
+          <w:b w:val="0"/>
+          <w:sz w:val="28"/>
+          <w:rFonts w:ascii="Arial" w:hAnsi="Arial" w:cs="Arial"/>
+          <w:color w:val="000000"/>
+        </w:rPr>
+        <w:t xml:space="preserve">  •  Creative design and performance marketing</w:t>
+      </w:r>
+    </w:p>
+    <w:p>
+      <w:pPr>
+        <w:spacing w:after="80" w:before="80"/>
+      </w:pPr>
+      <w:r>
+        <w:rPr>
+          <w:b w:val="0"/>
+          <w:sz w:val="28"/>
+          <w:rFonts w:ascii="Arial" w:hAnsi="Arial" w:cs="Arial"/>
+          <w:color w:val="000000"/>
+        </w:rPr>
+        <w:t xml:space="preserve">  •  Transparent pricing and long-term partnership</w:t>
       </w:r>
     </w:p>
     <w:p>
@@ -270,7 +371,7 @@
           <w:rFonts w:ascii="Arial" w:hAnsi="Arial" w:cs="Arial"/>
           <w:color w:val="000000"/>
         </w:rPr>
-        <w:t>WordPress hamari main platform hai. Custom development bhi available hai.</w:t>
+        <w:t>WordPress is our primary platform. Fully custom development is also available on request.</w:t>
       </w:r>
     </w:p>
     <w:p>
@@ -320,7 +421,7 @@
           <w:rFonts w:ascii="Arial" w:hAnsi="Arial" w:cs="Arial"/>
           <w:color w:val="000000"/>
         </w:rPr>
-        <w:t>Best for: Small business aur startups</w:t>
+        <w:t>Best for: Small businesses and startups</w:t>
       </w:r>
     </w:p>
     <w:p>
@@ -334,7 +435,7 @@
           <w:rFonts w:ascii="Arial" w:hAnsi="Arial" w:cs="Arial"/>
           <w:color w:val="06ACBA"/>
         </w:rPr>
-        <w:t>IS PRICE ME YE SHAMIL HOGA:</w:t>
+        <w:t>WHAT IS INCLUDED IN THIS PRICE:</w:t>
       </w:r>
     </w:p>
     <w:p>
@@ -558,7 +659,7 @@
           <w:rFonts w:ascii="Arial" w:hAnsi="Arial" w:cs="Arial"/>
           <w:color w:val="04243C"/>
         </w:rPr>
-        <w:t>IMPORTANT: Is package me E-Commerce NAHI hai.</w:t>
+        <w:t>IMPORTANT: E-commerce is NOT included in this package.</w:t>
       </w:r>
     </w:p>
     <w:p>
@@ -622,7 +723,7 @@
           <w:rFonts w:ascii="Arial" w:hAnsi="Arial" w:cs="Arial"/>
           <w:color w:val="06ACBA"/>
         </w:rPr>
-        <w:t>IS PRICE ME YE SHAMIL HOGA:</w:t>
+        <w:t>WHAT IS INCLUDED IN THIS PRICE:</w:t>
       </w:r>
     </w:p>
     <w:p>
@@ -840,7 +941,7 @@
           <w:rFonts w:ascii="Arial" w:hAnsi="Arial" w:cs="Arial"/>
           <w:color w:val="06ACBA"/>
         </w:rPr>
-        <w:t>IS PRICE ME YE SHAMIL HOGA:</w:t>
+        <w:t>WHAT IS INCLUDED IN THIS PRICE:</w:t>
       </w:r>
     </w:p>
     <w:p>
@@ -1058,7 +1159,7 @@
           <w:rFonts w:ascii="Arial" w:hAnsi="Arial" w:cs="Arial"/>
           <w:color w:val="000000"/>
         </w:rPr>
-        <w:t>Monthly packages — price aur included services</w:t>
+        <w:t>Monthly packages — pricing and included services</w:t>
       </w:r>
     </w:p>
     <w:p>
@@ -1086,7 +1187,7 @@
           <w:rFonts w:ascii="Arial" w:hAnsi="Arial" w:cs="Arial"/>
           <w:color w:val="06ACBA"/>
         </w:rPr>
-        <w:t>Is price me ye shamil hai:</w:t>
+        <w:t>What is included:</w:t>
       </w:r>
     </w:p>
     <w:p>
@@ -1212,7 +1313,7 @@
           <w:rFonts w:ascii="Arial" w:hAnsi="Arial" w:cs="Arial"/>
           <w:color w:val="06ACBA"/>
         </w:rPr>
-        <w:t>Is price me ye shamil hai:</w:t>
+        <w:t>What is included:</w:t>
       </w:r>
     </w:p>
     <w:p>
@@ -1338,7 +1439,7 @@
           <w:rFonts w:ascii="Arial" w:hAnsi="Arial" w:cs="Arial"/>
           <w:color w:val="06ACBA"/>
         </w:rPr>
-        <w:t>Is price me ye shamil hai:</w:t>
+        <w:t>What is included:</w:t>
       </w:r>
     </w:p>
     <w:p>
@@ -1472,7 +1573,7 @@
           <w:rFonts w:ascii="Arial" w:hAnsi="Arial" w:cs="Arial"/>
           <w:color w:val="000000"/>
         </w:rPr>
-        <w:t>Monthly packages — price aur included services</w:t>
+        <w:t>Monthly packages — pricing and included services</w:t>
       </w:r>
     </w:p>
     <w:p>
@@ -1500,7 +1601,7 @@
           <w:rFonts w:ascii="Arial" w:hAnsi="Arial" w:cs="Arial"/>
           <w:color w:val="06ACBA"/>
         </w:rPr>
-        <w:t>Is price me ye shamil hai:</w:t>
+        <w:t>What is included:</w:t>
       </w:r>
     </w:p>
     <w:p>
@@ -1598,7 +1699,7 @@
           <w:rFonts w:ascii="Arial" w:hAnsi="Arial" w:cs="Arial"/>
           <w:color w:val="06ACBA"/>
         </w:rPr>
-        <w:t>Is price me ye shamil hai:</w:t>
+        <w:t>What is included:</w:t>
       </w:r>
     </w:p>
     <w:p>
@@ -1710,7 +1811,7 @@
           <w:rFonts w:ascii="Arial" w:hAnsi="Arial" w:cs="Arial"/>
           <w:color w:val="06ACBA"/>
         </w:rPr>
-        <w:t>Is price me ye shamil hai:</w:t>
+        <w:t>What is included:</w:t>
       </w:r>
     </w:p>
     <w:p>
@@ -1858,7 +1959,7 @@
           <w:rFonts w:ascii="Arial" w:hAnsi="Arial" w:cs="Arial"/>
           <w:color w:val="000000"/>
         </w:rPr>
-        <w:t>Logo Design .............. PKR 15,000 se</w:t>
+        <w:t>Logo Design .............. From PKR 15,000</w:t>
       </w:r>
     </w:p>
     <w:p>
@@ -1872,7 +1973,7 @@
           <w:rFonts w:ascii="Arial" w:hAnsi="Arial" w:cs="Arial"/>
           <w:color w:val="000000"/>
         </w:rPr>
-        <w:t>Brand Identity .............. PKR 45,000 se</w:t>
+        <w:t>Brand Identity .............. From PKR 45,000</w:t>
       </w:r>
     </w:p>
     <w:p>
@@ -1886,7 +1987,7 @@
           <w:rFonts w:ascii="Arial" w:hAnsi="Arial" w:cs="Arial"/>
           <w:color w:val="000000"/>
         </w:rPr>
-        <w:t>Landing Page .............. PKR 35,000 se</w:t>
+        <w:t>Landing Page .............. From PKR 35,000</w:t>
       </w:r>
     </w:p>
     <w:p>
@@ -1900,7 +2001,7 @@
           <w:rFonts w:ascii="Arial" w:hAnsi="Arial" w:cs="Arial"/>
           <w:color w:val="000000"/>
         </w:rPr>
-        <w:t>Website Maintenance .............. PKR 8,000 / month</w:t>
+        <w:t>Website Maintenance .............. From PKR 8,000 / month</w:t>
       </w:r>
     </w:p>
     <w:p>
@@ -1914,7 +2015,7 @@
           <w:rFonts w:ascii="Arial" w:hAnsi="Arial" w:cs="Arial"/>
           <w:color w:val="000000"/>
         </w:rPr>
-        <w:t>Content Writing .............. PKR 3,500 / page</w:t>
+        <w:t>Content Writing .............. From PKR 3,500 / page</w:t>
       </w:r>
     </w:p>
     <w:p>
@@ -1928,7 +2029,7 @@
           <w:rFonts w:ascii="Arial" w:hAnsi="Arial" w:cs="Arial"/>
           <w:color w:val="000000"/>
         </w:rPr>
-        <w:t>Graphic Design .............. PKR 2,500</w:t>
+        <w:t>Graphic Design .............. From PKR 2,500</w:t>
       </w:r>
     </w:p>
     <w:p>
@@ -1942,7 +2043,7 @@
           <w:rFonts w:ascii="Arial" w:hAnsi="Arial" w:cs="Arial"/>
           <w:color w:val="000000"/>
         </w:rPr>
-        <w:t>Video Editing .............. PKR 5,000 / minute</w:t>
+        <w:t>Video Editing .............. From PKR 5,000 / minute</w:t>
       </w:r>
     </w:p>
     <w:p>
@@ -1956,7 +2057,7 @@
           <w:rFonts w:ascii="Arial" w:hAnsi="Arial" w:cs="Arial"/>
           <w:color w:val="000000"/>
         </w:rPr>
-        <w:t>SEO Audit .............. PKR 25,000</w:t>
+        <w:t>SEO Audit .............. From PKR 25,000</w:t>
       </w:r>
     </w:p>
     <w:p>
@@ -1970,7 +2071,7 @@
           <w:rFonts w:ascii="Arial" w:hAnsi="Arial" w:cs="Arial"/>
           <w:color w:val="000000"/>
         </w:rPr>
-        <w:t>Product Upload .............. PKR 500 / product</w:t>
+        <w:t>Product Upload .............. From PKR 500 / product</w:t>
       </w:r>
     </w:p>
     <w:p>
@@ -1984,7 +2085,7 @@
           <w:rFonts w:ascii="Arial" w:hAnsi="Arial" w:cs="Arial"/>
           <w:color w:val="000000"/>
         </w:rPr>
-        <w:t>Business Email .............. PKR 5,000</w:t>
+        <w:t>Business Email .............. From PKR 5,000</w:t>
       </w:r>
     </w:p>
     <w:p>
@@ -1998,7 +2099,7 @@
           <w:rFonts w:ascii="Arial" w:hAnsi="Arial" w:cs="Arial"/>
           <w:color w:val="000000"/>
         </w:rPr>
-        <w:t>Domain &amp; Hosting .............. Cost + PKR 3,000</w:t>
+        <w:t>Domain &amp; Hosting .............. At cost + PKR 3,000 setup</w:t>
       </w:r>
     </w:p>
     <w:p>

</xml_diff>

<commit_message>
Update proposal pricing, contact, website tiers and social integration
Co-authored-by: fullstackwebdeveloper1000-coder <fullstackwebdeveloper1000-coder@users.noreply.github.com>
</commit_message>
<xml_diff>
--- a/CoLab_Space_Point_Digital_Agency_Proposal.docx
+++ b/CoLab_Space_Point_Digital_Agency_Proposal.docx
@@ -174,7 +174,7 @@
           <w:rFonts w:ascii="Arial" w:hAnsi="Arial" w:cs="Arial"/>
           <w:color w:val="000000"/>
         </w:rPr>
-        <w:t>+92 349 7684322  |  +92 332 4384322</w:t>
+        <w:t>+92 349 7684322  |  +92 478 986460</w:t>
       </w:r>
     </w:p>
     <w:p>
@@ -375,6 +375,20 @@
       </w:r>
     </w:p>
     <w:p>
+      <w:pPr>
+        <w:spacing w:after="200" w:before="80"/>
+      </w:pPr>
+      <w:r>
+        <w:rPr>
+          <w:b w:val="0"/>
+          <w:sz w:val="28"/>
+          <w:rFonts w:ascii="Arial" w:hAnsi="Arial" w:cs="Arial"/>
+          <w:color w:val="000000"/>
+        </w:rPr>
+        <w:t>Standard and Premium website packages include social media management at the matching tier. Standalone social media and digital marketing packages are also available monthly.</w:t>
+      </w:r>
+    </w:p>
+    <w:p>
       <w:r>
         <w:br w:type="page"/>
       </w:r>
@@ -407,7 +421,7 @@
           <w:rFonts w:ascii="Arial" w:hAnsi="Arial" w:cs="Arial"/>
           <w:color w:val="04243C"/>
         </w:rPr>
-        <w:t>Package Price: PKR 60,000</w:t>
+        <w:t>Package Price: PKR 50,000</w:t>
       </w:r>
     </w:p>
     <w:p>
@@ -477,7 +491,7 @@
           <w:rFonts w:ascii="Arial" w:hAnsi="Arial" w:cs="Arial"/>
           <w:color w:val="000000"/>
         </w:rPr>
-        <w:t xml:space="preserve">  •  Responsive design</w:t>
+        <w:t xml:space="preserve">  •  Responsive mobile design</w:t>
       </w:r>
     </w:p>
     <w:p>
@@ -547,7 +561,7 @@
           <w:rFonts w:ascii="Arial" w:hAnsi="Arial" w:cs="Arial"/>
           <w:color w:val="000000"/>
         </w:rPr>
-        <w:t xml:space="preserve">  •  Social media integration</w:t>
+        <w:t xml:space="preserve">  •  Social media profile links</w:t>
       </w:r>
     </w:p>
     <w:p>
@@ -561,7 +575,7 @@
           <w:rFonts w:ascii="Arial" w:hAnsi="Arial" w:cs="Arial"/>
           <w:color w:val="000000"/>
         </w:rPr>
-        <w:t xml:space="preserve">  •  Basic SEO</w:t>
+        <w:t xml:space="preserve">  •  Google Analytics setup</w:t>
       </w:r>
     </w:p>
     <w:p>
@@ -575,7 +589,239 @@
           <w:rFonts w:ascii="Arial" w:hAnsi="Arial" w:cs="Arial"/>
           <w:color w:val="000000"/>
         </w:rPr>
-        <w:t xml:space="preserve">  •  Google Analytics</w:t>
+        <w:t xml:space="preserve">  •  SSL configuration</w:t>
+      </w:r>
+    </w:p>
+    <w:p>
+      <w:pPr>
+        <w:spacing w:after="80" w:before="80"/>
+      </w:pPr>
+      <w:r>
+        <w:rPr>
+          <w:b w:val="0"/>
+          <w:sz w:val="28"/>
+          <w:rFonts w:ascii="Arial" w:hAnsi="Arial" w:cs="Arial"/>
+          <w:color w:val="000000"/>
+        </w:rPr>
+        <w:t xml:space="preserve">  •  30 days support</w:t>
+      </w:r>
+    </w:p>
+    <w:p>
+      <w:pPr>
+        <w:spacing w:after="240" w:before="80"/>
+      </w:pPr>
+      <w:r>
+        <w:rPr>
+          <w:b/>
+          <w:sz w:val="28"/>
+          <w:rFonts w:ascii="Arial" w:hAnsi="Arial" w:cs="Arial"/>
+          <w:color w:val="04243C"/>
+        </w:rPr>
+        <w:t>IMPORTANT: SEO and e-commerce are NOT included in this package.</w:t>
+      </w:r>
+    </w:p>
+    <w:p>
+      <w:r>
+        <w:br w:type="page"/>
+      </w:r>
+    </w:p>
+    <w:p>
+      <w:pPr>
+        <w:spacing w:before="320" w:after="160"/>
+        <w:pBdr>
+          <w:left w:val="single" w:sz="24" w:space="8" w:color="06ACBA"/>
+        </w:pBdr>
+      </w:pPr>
+      <w:r>
+        <w:rPr>
+          <w:b/>
+          <w:sz w:val="40"/>
+          <w:rFonts w:ascii="Arial" w:hAnsi="Arial" w:cs="Arial"/>
+          <w:color w:val="000000"/>
+        </w:rPr>
+        <w:t>STANDARD WEBSITE</w:t>
+      </w:r>
+    </w:p>
+    <w:p>
+      <w:pPr>
+        <w:spacing w:after="120" w:before="80"/>
+      </w:pPr>
+      <w:r>
+        <w:rPr>
+          <w:b/>
+          <w:sz w:val="36"/>
+          <w:rFonts w:ascii="Arial" w:hAnsi="Arial" w:cs="Arial"/>
+          <w:color w:val="04243C"/>
+        </w:rPr>
+        <w:t>Package Price: PKR 80,000</w:t>
+      </w:r>
+    </w:p>
+    <w:p>
+      <w:pPr>
+        <w:spacing w:after="240" w:before="80"/>
+      </w:pPr>
+      <w:r>
+        <w:rPr>
+          <w:b w:val="0"/>
+          <w:sz w:val="28"/>
+          <w:rFonts w:ascii="Arial" w:hAnsi="Arial" w:cs="Arial"/>
+          <w:color w:val="000000"/>
+        </w:rPr>
+        <w:t>Best for: Growing brands and online sellers</w:t>
+      </w:r>
+    </w:p>
+    <w:p>
+      <w:pPr>
+        <w:spacing w:after="160" w:before="80"/>
+      </w:pPr>
+      <w:r>
+        <w:rPr>
+          <w:b/>
+          <w:sz w:val="32"/>
+          <w:rFonts w:ascii="Arial" w:hAnsi="Arial" w:cs="Arial"/>
+          <w:color w:val="06ACBA"/>
+        </w:rPr>
+        <w:t>WHAT IS INCLUDED IN THIS PRICE:</w:t>
+      </w:r>
+    </w:p>
+    <w:p>
+      <w:pPr>
+        <w:spacing w:after="80" w:before="80"/>
+      </w:pPr>
+      <w:r>
+        <w:rPr>
+          <w:b w:val="0"/>
+          <w:sz w:val="28"/>
+          <w:rFonts w:ascii="Arial" w:hAnsi="Arial" w:cs="Arial"/>
+          <w:color w:val="000000"/>
+        </w:rPr>
+        <w:t xml:space="preserve">  •  Everything in Basic Website, plus:</w:t>
+      </w:r>
+    </w:p>
+    <w:p>
+      <w:pPr>
+        <w:spacing w:after="80" w:before="80"/>
+      </w:pPr>
+      <w:r>
+        <w:rPr>
+          <w:b w:val="0"/>
+          <w:sz w:val="28"/>
+          <w:rFonts w:ascii="Arial" w:hAnsi="Arial" w:cs="Arial"/>
+          <w:color w:val="000000"/>
+        </w:rPr>
+        <w:t xml:space="preserve">  •  Up to 10 pages</w:t>
+      </w:r>
+    </w:p>
+    <w:p>
+      <w:pPr>
+        <w:spacing w:after="80" w:before="80"/>
+      </w:pPr>
+      <w:r>
+        <w:rPr>
+          <w:b w:val="0"/>
+          <w:sz w:val="28"/>
+          <w:rFonts w:ascii="Arial" w:hAnsi="Arial" w:cs="Arial"/>
+          <w:color w:val="000000"/>
+        </w:rPr>
+        <w:t xml:space="preserve">  •  Premium UI/UX design</w:t>
+      </w:r>
+    </w:p>
+    <w:p>
+      <w:pPr>
+        <w:spacing w:after="80" w:before="80"/>
+      </w:pPr>
+      <w:r>
+        <w:rPr>
+          <w:b w:val="0"/>
+          <w:sz w:val="28"/>
+          <w:rFonts w:ascii="Arial" w:hAnsi="Arial" w:cs="Arial"/>
+          <w:color w:val="000000"/>
+        </w:rPr>
+        <w:t xml:space="preserve">  •  Blog section</w:t>
+      </w:r>
+    </w:p>
+    <w:p>
+      <w:pPr>
+        <w:spacing w:after="80" w:before="80"/>
+      </w:pPr>
+      <w:r>
+        <w:rPr>
+          <w:b w:val="0"/>
+          <w:sz w:val="28"/>
+          <w:rFonts w:ascii="Arial" w:hAnsi="Arial" w:cs="Arial"/>
+          <w:color w:val="000000"/>
+        </w:rPr>
+        <w:t xml:space="preserve">  •  WooCommerce online store</w:t>
+      </w:r>
+    </w:p>
+    <w:p>
+      <w:pPr>
+        <w:spacing w:after="80" w:before="80"/>
+      </w:pPr>
+      <w:r>
+        <w:rPr>
+          <w:b w:val="0"/>
+          <w:sz w:val="28"/>
+          <w:rFonts w:ascii="Arial" w:hAnsi="Arial" w:cs="Arial"/>
+          <w:color w:val="000000"/>
+        </w:rPr>
+        <w:t xml:space="preserve">  •  Product upload (initial batch)</w:t>
+      </w:r>
+    </w:p>
+    <w:p>
+      <w:pPr>
+        <w:spacing w:after="80" w:before="80"/>
+      </w:pPr>
+      <w:r>
+        <w:rPr>
+          <w:b w:val="0"/>
+          <w:sz w:val="28"/>
+          <w:rFonts w:ascii="Arial" w:hAnsi="Arial" w:cs="Arial"/>
+          <w:color w:val="000000"/>
+        </w:rPr>
+        <w:t xml:space="preserve">  •  Payment gateway integration</w:t>
+      </w:r>
+    </w:p>
+    <w:p>
+      <w:pPr>
+        <w:spacing w:after="80" w:before="80"/>
+      </w:pPr>
+      <w:r>
+        <w:rPr>
+          <w:b w:val="0"/>
+          <w:sz w:val="28"/>
+          <w:rFonts w:ascii="Arial" w:hAnsi="Arial" w:cs="Arial"/>
+          <w:color w:val="000000"/>
+        </w:rPr>
+        <w:t xml:space="preserve">  •  Google Search Console setup</w:t>
+      </w:r>
+    </w:p>
+    <w:p>
+      <w:pPr>
+        <w:spacing w:after="80" w:before="80"/>
+      </w:pPr>
+      <w:r>
+        <w:rPr>
+          <w:b w:val="0"/>
+          <w:sz w:val="28"/>
+          <w:rFonts w:ascii="Arial" w:hAnsi="Arial" w:cs="Arial"/>
+          <w:color w:val="000000"/>
+        </w:rPr>
+        <w:t xml:space="preserve">  •  Facebook Pixel</w:t>
+      </w:r>
+    </w:p>
+    <w:p>
+      <w:pPr>
+        <w:spacing w:after="80" w:before="80"/>
+      </w:pPr>
+      <w:r>
+        <w:rPr>
+          <w:b w:val="0"/>
+          <w:sz w:val="28"/>
+          <w:rFonts w:ascii="Arial" w:hAnsi="Arial" w:cs="Arial"/>
+          <w:color w:val="000000"/>
+        </w:rPr>
+        <w:t xml:space="preserve">  •  Advanced SEO</w:t>
       </w:r>
     </w:p>
     <w:p>
@@ -603,7 +849,7 @@
           <w:rFonts w:ascii="Arial" w:hAnsi="Arial" w:cs="Arial"/>
           <w:color w:val="000000"/>
         </w:rPr>
-        <w:t xml:space="preserve">  •  SSL configuration</w:t>
+        <w:t xml:space="preserve">  •  60 days support</w:t>
       </w:r>
     </w:p>
     <w:p>
@@ -617,7 +863,7 @@
           <w:rFonts w:ascii="Arial" w:hAnsi="Arial" w:cs="Arial"/>
           <w:color w:val="000000"/>
         </w:rPr>
-        <w:t xml:space="preserve">  •  Security setup</w:t>
+        <w:t xml:space="preserve">  •  --- Social Media (Standard tier — included) ---</w:t>
       </w:r>
     </w:p>
     <w:p>
@@ -631,7 +877,7 @@
           <w:rFonts w:ascii="Arial" w:hAnsi="Arial" w:cs="Arial"/>
           <w:color w:val="000000"/>
         </w:rPr>
-        <w:t xml:space="preserve">  •  Training</w:t>
+        <w:t xml:space="preserve">  •  Facebook, Instagram &amp; LinkedIn management</w:t>
       </w:r>
     </w:p>
     <w:p>
@@ -645,21 +891,63 @@
           <w:rFonts w:ascii="Arial" w:hAnsi="Arial" w:cs="Arial"/>
           <w:color w:val="000000"/>
         </w:rPr>
-        <w:t xml:space="preserve">  •  30 days support</w:t>
+        <w:t xml:space="preserve">  •  15 posts per month</w:t>
       </w:r>
     </w:p>
     <w:p>
       <w:pPr>
-        <w:spacing w:after="240" w:before="80"/>
+        <w:spacing w:after="80" w:before="80"/>
       </w:pPr>
       <w:r>
         <w:rPr>
-          <w:b/>
+          <w:b w:val="0"/>
           <w:sz w:val="28"/>
           <w:rFonts w:ascii="Arial" w:hAnsi="Arial" w:cs="Arial"/>
-          <w:color w:val="04243C"/>
+          <w:color w:val="000000"/>
         </w:rPr>
-        <w:t>IMPORTANT: E-commerce is NOT included in this package.</w:t>
+        <w:t xml:space="preserve">  •  Captions and hashtags</w:t>
+      </w:r>
+    </w:p>
+    <w:p>
+      <w:pPr>
+        <w:spacing w:after="80" w:before="80"/>
+      </w:pPr>
+      <w:r>
+        <w:rPr>
+          <w:b w:val="0"/>
+          <w:sz w:val="28"/>
+          <w:rFonts w:ascii="Arial" w:hAnsi="Arial" w:cs="Arial"/>
+          <w:color w:val="000000"/>
+        </w:rPr>
+        <w:t xml:space="preserve">  •  Stories and reels planning</w:t>
+      </w:r>
+    </w:p>
+    <w:p>
+      <w:pPr>
+        <w:spacing w:after="80" w:before="80"/>
+      </w:pPr>
+      <w:r>
+        <w:rPr>
+          <w:b w:val="0"/>
+          <w:sz w:val="28"/>
+          <w:rFonts w:ascii="Arial" w:hAnsi="Arial" w:cs="Arial"/>
+          <w:color w:val="000000"/>
+        </w:rPr>
+        <w:t xml:space="preserve">  •  Community management</w:t>
+      </w:r>
+    </w:p>
+    <w:p>
+      <w:pPr>
+        <w:spacing w:after="80" w:before="80"/>
+      </w:pPr>
+      <w:r>
+        <w:rPr>
+          <w:b w:val="0"/>
+          <w:sz w:val="28"/>
+          <w:rFonts w:ascii="Arial" w:hAnsi="Arial" w:cs="Arial"/>
+          <w:color w:val="000000"/>
+        </w:rPr>
+        <w:t xml:space="preserve">  •  Monthly analytics report</w:t>
       </w:r>
     </w:p>
     <w:p>
@@ -681,7 +969,7 @@
           <w:rFonts w:ascii="Arial" w:hAnsi="Arial" w:cs="Arial"/>
           <w:color w:val="000000"/>
         </w:rPr>
-        <w:t>STANDARD WEBSITE</w:t>
+        <w:t>PREMIUM WEBSITE</w:t>
       </w:r>
     </w:p>
     <w:p>
@@ -709,7 +997,7 @@
           <w:rFonts w:ascii="Arial" w:hAnsi="Arial" w:cs="Arial"/>
           <w:color w:val="000000"/>
         </w:rPr>
-        <w:t>Best for: Growing brands</w:t>
+        <w:t>Best for: Established businesses and enterprises</w:t>
       </w:r>
     </w:p>
     <w:p>
@@ -737,211 +1025,7 @@
           <w:rFonts w:ascii="Arial" w:hAnsi="Arial" w:cs="Arial"/>
           <w:color w:val="000000"/>
         </w:rPr>
-        <w:t xml:space="preserve">  •  Up to 10 pages</w:t>
-      </w:r>
-    </w:p>
-    <w:p>
-      <w:pPr>
-        <w:spacing w:after="80" w:before="80"/>
-      </w:pPr>
-      <w:r>
-        <w:rPr>
-          <w:b w:val="0"/>
-          <w:sz w:val="28"/>
-          <w:rFonts w:ascii="Arial" w:hAnsi="Arial" w:cs="Arial"/>
-          <w:color w:val="000000"/>
-        </w:rPr>
-        <w:t xml:space="preserve">  •  Premium UI/UX</w:t>
-      </w:r>
-    </w:p>
-    <w:p>
-      <w:pPr>
-        <w:spacing w:after="80" w:before="80"/>
-      </w:pPr>
-      <w:r>
-        <w:rPr>
-          <w:b w:val="0"/>
-          <w:sz w:val="28"/>
-          <w:rFonts w:ascii="Arial" w:hAnsi="Arial" w:cs="Arial"/>
-          <w:color w:val="000000"/>
-        </w:rPr>
-        <w:t xml:space="preserve">  •  Blog</w:t>
-      </w:r>
-    </w:p>
-    <w:p>
-      <w:pPr>
-        <w:spacing w:after="80" w:before="80"/>
-      </w:pPr>
-      <w:r>
-        <w:rPr>
-          <w:b w:val="0"/>
-          <w:sz w:val="28"/>
-          <w:rFonts w:ascii="Arial" w:hAnsi="Arial" w:cs="Arial"/>
-          <w:color w:val="000000"/>
-        </w:rPr>
-        <w:t xml:space="preserve">  •  WooCommerce store</w:t>
-      </w:r>
-    </w:p>
-    <w:p>
-      <w:pPr>
-        <w:spacing w:after="80" w:before="80"/>
-      </w:pPr>
-      <w:r>
-        <w:rPr>
-          <w:b w:val="0"/>
-          <w:sz w:val="28"/>
-          <w:rFonts w:ascii="Arial" w:hAnsi="Arial" w:cs="Arial"/>
-          <w:color w:val="000000"/>
-        </w:rPr>
-        <w:t xml:space="preserve">  •  Product upload</w:t>
-      </w:r>
-    </w:p>
-    <w:p>
-      <w:pPr>
-        <w:spacing w:after="80" w:before="80"/>
-      </w:pPr>
-      <w:r>
-        <w:rPr>
-          <w:b w:val="0"/>
-          <w:sz w:val="28"/>
-          <w:rFonts w:ascii="Arial" w:hAnsi="Arial" w:cs="Arial"/>
-          <w:color w:val="000000"/>
-        </w:rPr>
-        <w:t xml:space="preserve">  •  Payment gateway</w:t>
-      </w:r>
-    </w:p>
-    <w:p>
-      <w:pPr>
-        <w:spacing w:after="80" w:before="80"/>
-      </w:pPr>
-      <w:r>
-        <w:rPr>
-          <w:b w:val="0"/>
-          <w:sz w:val="28"/>
-          <w:rFonts w:ascii="Arial" w:hAnsi="Arial" w:cs="Arial"/>
-          <w:color w:val="000000"/>
-        </w:rPr>
-        <w:t xml:space="preserve">  •  Google Search Console</w:t>
-      </w:r>
-    </w:p>
-    <w:p>
-      <w:pPr>
-        <w:spacing w:after="80" w:before="80"/>
-      </w:pPr>
-      <w:r>
-        <w:rPr>
-          <w:b w:val="0"/>
-          <w:sz w:val="28"/>
-          <w:rFonts w:ascii="Arial" w:hAnsi="Arial" w:cs="Arial"/>
-          <w:color w:val="000000"/>
-        </w:rPr>
-        <w:t xml:space="preserve">  •  Facebook Pixel</w:t>
-      </w:r>
-    </w:p>
-    <w:p>
-      <w:pPr>
-        <w:spacing w:after="80" w:before="80"/>
-      </w:pPr>
-      <w:r>
-        <w:rPr>
-          <w:b w:val="0"/>
-          <w:sz w:val="28"/>
-          <w:rFonts w:ascii="Arial" w:hAnsi="Arial" w:cs="Arial"/>
-          <w:color w:val="000000"/>
-        </w:rPr>
-        <w:t xml:space="preserve">  •  Advanced SEO</w:t>
-      </w:r>
-    </w:p>
-    <w:p>
-      <w:pPr>
-        <w:spacing w:after="80" w:before="80"/>
-      </w:pPr>
-      <w:r>
-        <w:rPr>
-          <w:b w:val="0"/>
-          <w:sz w:val="28"/>
-          <w:rFonts w:ascii="Arial" w:hAnsi="Arial" w:cs="Arial"/>
-          <w:color w:val="000000"/>
-        </w:rPr>
-        <w:t xml:space="preserve">  •  Speed optimization</w:t>
-      </w:r>
-    </w:p>
-    <w:p>
-      <w:pPr>
-        <w:spacing w:after="80" w:before="80"/>
-      </w:pPr>
-      <w:r>
-        <w:rPr>
-          <w:b w:val="0"/>
-          <w:sz w:val="28"/>
-          <w:rFonts w:ascii="Arial" w:hAnsi="Arial" w:cs="Arial"/>
-          <w:color w:val="000000"/>
-        </w:rPr>
-        <w:t xml:space="preserve">  •  60 days support</w:t>
-      </w:r>
-    </w:p>
-    <w:p>
-      <w:r>
-        <w:br w:type="page"/>
-      </w:r>
-    </w:p>
-    <w:p>
-      <w:pPr>
-        <w:spacing w:before="320" w:after="160"/>
-        <w:pBdr>
-          <w:left w:val="single" w:sz="24" w:space="8" w:color="06ACBA"/>
-        </w:pBdr>
-      </w:pPr>
-      <w:r>
-        <w:rPr>
-          <w:b/>
-          <w:sz w:val="40"/>
-          <w:rFonts w:ascii="Arial" w:hAnsi="Arial" w:cs="Arial"/>
-          <w:color w:val="000000"/>
-        </w:rPr>
-        <w:t>PREMIUM WEBSITE</w:t>
-      </w:r>
-    </w:p>
-    <w:p>
-      <w:pPr>
-        <w:spacing w:after="120" w:before="80"/>
-      </w:pPr>
-      <w:r>
-        <w:rPr>
-          <w:b/>
-          <w:sz w:val="36"/>
-          <w:rFonts w:ascii="Arial" w:hAnsi="Arial" w:cs="Arial"/>
-          <w:color w:val="04243C"/>
-        </w:rPr>
-        <w:t>Package Price: PKR 250,000</w:t>
-      </w:r>
-    </w:p>
-    <w:p>
-      <w:pPr>
-        <w:spacing w:after="240" w:before="80"/>
-      </w:pPr>
-      <w:r>
-        <w:rPr>
-          <w:b w:val="0"/>
-          <w:sz w:val="28"/>
-          <w:rFonts w:ascii="Arial" w:hAnsi="Arial" w:cs="Arial"/>
-          <w:color w:val="000000"/>
-        </w:rPr>
-        <w:t>Best for: Enterprise clients</w:t>
-      </w:r>
-    </w:p>
-    <w:p>
-      <w:pPr>
-        <w:spacing w:after="160" w:before="80"/>
-      </w:pPr>
-      <w:r>
-        <w:rPr>
-          <w:b/>
-          <w:sz w:val="32"/>
-          <w:rFonts w:ascii="Arial" w:hAnsi="Arial" w:cs="Arial"/>
-          <w:color w:val="06ACBA"/>
-        </w:rPr>
-        <w:t>WHAT IS INCLUDED IN THIS PRICE:</w:t>
+        <w:t xml:space="preserve">  •  Everything in Standard Website, plus:</w:t>
       </w:r>
     </w:p>
     <w:p>
@@ -983,7 +1067,7 @@
           <w:rFonts w:ascii="Arial" w:hAnsi="Arial" w:cs="Arial"/>
           <w:color w:val="000000"/>
         </w:rPr>
-        <w:t xml:space="preserve">  •  Advanced WooCommerce</w:t>
+        <w:t xml:space="preserve">  •  Advanced WooCommerce setup</w:t>
       </w:r>
     </w:p>
     <w:p>
@@ -997,21 +1081,7 @@
           <w:rFonts w:ascii="Arial" w:hAnsi="Arial" w:cs="Arial"/>
           <w:color w:val="000000"/>
         </w:rPr>
-        <w:t xml:space="preserve">  •  Unlimited products</w:t>
-      </w:r>
-    </w:p>
-    <w:p>
-      <w:pPr>
-        <w:spacing w:after="80" w:before="80"/>
-      </w:pPr>
-      <w:r>
-        <w:rPr>
-          <w:b w:val="0"/>
-          <w:sz w:val="28"/>
-          <w:rFonts w:ascii="Arial" w:hAnsi="Arial" w:cs="Arial"/>
-          <w:color w:val="000000"/>
-        </w:rPr>
-        <w:t xml:space="preserve">  •  Payment gateway</w:t>
+        <w:t xml:space="preserve">  •  Unlimited product catalog setup</w:t>
       </w:r>
     </w:p>
     <w:p>
@@ -1039,7 +1109,7 @@
           <w:rFonts w:ascii="Arial" w:hAnsi="Arial" w:cs="Arial"/>
           <w:color w:val="000000"/>
         </w:rPr>
-        <w:t xml:space="preserve">  •  Booking system</w:t>
+        <w:t xml:space="preserve">  •  Booking / appointment system</w:t>
       </w:r>
     </w:p>
     <w:p>
@@ -1053,7 +1123,7 @@
           <w:rFonts w:ascii="Arial" w:hAnsi="Arial" w:cs="Arial"/>
           <w:color w:val="000000"/>
         </w:rPr>
-        <w:t xml:space="preserve">  •  API integration</w:t>
+        <w:t xml:space="preserve">  •  API integrations</w:t>
       </w:r>
     </w:p>
     <w:p>
@@ -1067,35 +1137,7 @@
           <w:rFonts w:ascii="Arial" w:hAnsi="Arial" w:cs="Arial"/>
           <w:color w:val="000000"/>
         </w:rPr>
-        <w:t xml:space="preserve">  •  Advanced SEO</w:t>
-      </w:r>
-    </w:p>
-    <w:p>
-      <w:pPr>
-        <w:spacing w:after="80" w:before="80"/>
-      </w:pPr>
-      <w:r>
-        <w:rPr>
-          <w:b w:val="0"/>
-          <w:sz w:val="28"/>
-          <w:rFonts w:ascii="Arial" w:hAnsi="Arial" w:cs="Arial"/>
-          <w:color w:val="000000"/>
-        </w:rPr>
-        <w:t xml:space="preserve">  •  Premium security</w:t>
-      </w:r>
-    </w:p>
-    <w:p>
-      <w:pPr>
-        <w:spacing w:after="80" w:before="80"/>
-      </w:pPr>
-      <w:r>
-        <w:rPr>
-          <w:b w:val="0"/>
-          <w:sz w:val="28"/>
-          <w:rFonts w:ascii="Arial" w:hAnsi="Arial" w:cs="Arial"/>
-          <w:color w:val="000000"/>
-        </w:rPr>
-        <w:t xml:space="preserve">  •  Performance optimization</w:t>
+        <w:t xml:space="preserve">  •  Premium security and performance optimization</w:t>
       </w:r>
     </w:p>
     <w:p>
@@ -1123,7 +1165,105 @@
           <w:rFonts w:ascii="Arial" w:hAnsi="Arial" w:cs="Arial"/>
           <w:color w:val="000000"/>
         </w:rPr>
-        <w:t xml:space="preserve">  •  90 days support</w:t>
+        <w:t xml:space="preserve">  •  90 days priority support</w:t>
+      </w:r>
+    </w:p>
+    <w:p>
+      <w:pPr>
+        <w:spacing w:after="80" w:before="80"/>
+      </w:pPr>
+      <w:r>
+        <w:rPr>
+          <w:b w:val="0"/>
+          <w:sz w:val="28"/>
+          <w:rFonts w:ascii="Arial" w:hAnsi="Arial" w:cs="Arial"/>
+          <w:color w:val="000000"/>
+        </w:rPr>
+        <w:t xml:space="preserve">  •  --- Social Media (Premium tier — included) ---</w:t>
+      </w:r>
+    </w:p>
+    <w:p>
+      <w:pPr>
+        <w:spacing w:after="80" w:before="80"/>
+      </w:pPr>
+      <w:r>
+        <w:rPr>
+          <w:b w:val="0"/>
+          <w:sz w:val="28"/>
+          <w:rFonts w:ascii="Arial" w:hAnsi="Arial" w:cs="Arial"/>
+          <w:color w:val="000000"/>
+        </w:rPr>
+        <w:t xml:space="preserve">  •  Facebook, Instagram, LinkedIn &amp; TikTok management</w:t>
+      </w:r>
+    </w:p>
+    <w:p>
+      <w:pPr>
+        <w:spacing w:after="80" w:before="80"/>
+      </w:pPr>
+      <w:r>
+        <w:rPr>
+          <w:b w:val="0"/>
+          <w:sz w:val="28"/>
+          <w:rFonts w:ascii="Arial" w:hAnsi="Arial" w:cs="Arial"/>
+          <w:color w:val="000000"/>
+        </w:rPr>
+        <w:t xml:space="preserve">  •  25 posts per month</w:t>
+      </w:r>
+    </w:p>
+    <w:p>
+      <w:pPr>
+        <w:spacing w:after="80" w:before="80"/>
+      </w:pPr>
+      <w:r>
+        <w:rPr>
+          <w:b w:val="0"/>
+          <w:sz w:val="28"/>
+          <w:rFonts w:ascii="Arial" w:hAnsi="Arial" w:cs="Arial"/>
+          <w:color w:val="000000"/>
+        </w:rPr>
+        <w:t xml:space="preserve">  •  Daily stories</w:t>
+      </w:r>
+    </w:p>
+    <w:p>
+      <w:pPr>
+        <w:spacing w:after="80" w:before="80"/>
+      </w:pPr>
+      <w:r>
+        <w:rPr>
+          <w:b w:val="0"/>
+          <w:sz w:val="28"/>
+          <w:rFonts w:ascii="Arial" w:hAnsi="Arial" w:cs="Arial"/>
+          <w:color w:val="000000"/>
+        </w:rPr>
+        <w:t xml:space="preserve">  •  Full reels strategy</w:t>
+      </w:r>
+    </w:p>
+    <w:p>
+      <w:pPr>
+        <w:spacing w:after="80" w:before="80"/>
+      </w:pPr>
+      <w:r>
+        <w:rPr>
+          <w:b w:val="0"/>
+          <w:sz w:val="28"/>
+          <w:rFonts w:ascii="Arial" w:hAnsi="Arial" w:cs="Arial"/>
+          <w:color w:val="000000"/>
+        </w:rPr>
+        <w:t xml:space="preserve">  •  Community management</w:t>
+      </w:r>
+    </w:p>
+    <w:p>
+      <w:pPr>
+        <w:spacing w:after="80" w:before="80"/>
+      </w:pPr>
+      <w:r>
+        <w:rPr>
+          <w:b w:val="0"/>
+          <w:sz w:val="28"/>
+          <w:rFonts w:ascii="Arial" w:hAnsi="Arial" w:cs="Arial"/>
+          <w:color w:val="000000"/>
+        </w:rPr>
+        <w:t xml:space="preserve">  •  Weekly performance reports</w:t>
       </w:r>
     </w:p>
     <w:p>
@@ -1159,7 +1299,7 @@
           <w:rFonts w:ascii="Arial" w:hAnsi="Arial" w:cs="Arial"/>
           <w:color w:val="000000"/>
         </w:rPr>
-        <w:t>Monthly packages — pricing and included services</w:t>
+        <w:t>Monthly packages for clients who need social media only (also included in Standard &amp; Premium website packages above).</w:t>
       </w:r>
     </w:p>
     <w:p>
@@ -1229,7 +1369,7 @@
           <w:rFonts w:ascii="Arial" w:hAnsi="Arial" w:cs="Arial"/>
           <w:color w:val="000000"/>
         </w:rPr>
-        <w:t xml:space="preserve">  •  12 posts</w:t>
+        <w:t xml:space="preserve">  •  8 posts per month</w:t>
       </w:r>
     </w:p>
     <w:p>
@@ -1327,7 +1467,7 @@
           <w:rFonts w:ascii="Arial" w:hAnsi="Arial" w:cs="Arial"/>
           <w:color w:val="000000"/>
         </w:rPr>
-        <w:t xml:space="preserve">  •  Facebook, Instagram, LinkedIn</w:t>
+        <w:t xml:space="preserve">  •  Facebook, Instagram &amp; LinkedIn</w:t>
       </w:r>
     </w:p>
     <w:p>
@@ -1341,7 +1481,7 @@
           <w:rFonts w:ascii="Arial" w:hAnsi="Arial" w:cs="Arial"/>
           <w:color w:val="000000"/>
         </w:rPr>
-        <w:t xml:space="preserve">  •  20 posts</w:t>
+        <w:t xml:space="preserve">  •  15 posts per month</w:t>
       </w:r>
     </w:p>
     <w:p>
@@ -1397,7 +1537,7 @@
           <w:rFonts w:ascii="Arial" w:hAnsi="Arial" w:cs="Arial"/>
           <w:color w:val="000000"/>
         </w:rPr>
-        <w:t xml:space="preserve">  •  Analytics</w:t>
+        <w:t xml:space="preserve">  •  Analytics report</w:t>
       </w:r>
     </w:p>
     <w:p>
@@ -1453,7 +1593,7 @@
           <w:rFonts w:ascii="Arial" w:hAnsi="Arial" w:cs="Arial"/>
           <w:color w:val="000000"/>
         </w:rPr>
-        <w:t xml:space="preserve">  •  Facebook, Instagram, LinkedIn, TikTok</w:t>
+        <w:t xml:space="preserve">  •  Facebook, Instagram, LinkedIn &amp; TikTok</w:t>
       </w:r>
     </w:p>
     <w:p>
@@ -1467,7 +1607,7 @@
           <w:rFonts w:ascii="Arial" w:hAnsi="Arial" w:cs="Arial"/>
           <w:color w:val="000000"/>
         </w:rPr>
-        <w:t xml:space="preserve">  •  30+ posts</w:t>
+        <w:t xml:space="preserve">  •  25 posts per month</w:t>
       </w:r>
     </w:p>
     <w:p>
@@ -1587,7 +1727,7 @@
           <w:rFonts w:ascii="Arial" w:hAnsi="Arial" w:cs="Arial"/>
           <w:color w:val="000000"/>
         </w:rPr>
-        <w:t>BASIC — PKR 35,000 / MONTH</w:t>
+        <w:t>BASIC — PKR 15,000 / MONTH</w:t>
       </w:r>
     </w:p>
     <w:p>
@@ -1685,7 +1825,7 @@
           <w:rFonts w:ascii="Arial" w:hAnsi="Arial" w:cs="Arial"/>
           <w:color w:val="000000"/>
         </w:rPr>
-        <w:t>STANDARD — PKR 65,000 / MONTH</w:t>
+        <w:t>STANDARD — PKR 30,000 / MONTH</w:t>
       </w:r>
     </w:p>
     <w:p>
@@ -1797,7 +1937,7 @@
           <w:rFonts w:ascii="Arial" w:hAnsi="Arial" w:cs="Arial"/>
           <w:color w:val="000000"/>
         </w:rPr>
-        <w:t>PREMIUM — PKR 120,000 / MONTH</w:t>
+        <w:t>PREMIUM — PKR 50,000 / MONTH</w:t>
       </w:r>
     </w:p>
     <w:p>
@@ -2158,7 +2298,7 @@
           <w:rFonts w:ascii="Arial" w:hAnsi="Arial" w:cs="Arial"/>
           <w:color w:val="000000"/>
         </w:rPr>
-        <w:t>Phone: +92 349 7684322  |  +92 332 4384322</w:t>
+        <w:t>Phone: +92 349 7684322  |  +92 478 986460</w:t>
       </w:r>
     </w:p>
     <w:p>

</xml_diff>

<commit_message>
Remove add-on and social media sections; keep white background
Co-authored-by: fullstackwebdeveloper1000-coder <fullstackwebdeveloper1000-coder@users.noreply.github.com>
</commit_message>
<xml_diff>
--- a/CoLab_Space_Point_Digital_Agency_Proposal.docx
+++ b/CoLab_Space_Point_Digital_Agency_Proposal.docx
@@ -114,21 +114,6 @@
           <w:rFonts w:ascii="Arial" w:hAnsi="Arial" w:cs="Arial"/>
           <w:color w:val="000000"/>
         </w:rPr>
-        <w:t>Social Media Management</w:t>
-      </w:r>
-    </w:p>
-    <w:p>
-      <w:pPr>
-        <w:spacing w:after="120" w:before="80"/>
-        <w:jc w:val="center"/>
-      </w:pPr>
-      <w:r>
-        <w:rPr>
-          <w:b w:val="0"/>
-          <w:sz w:val="30"/>
-          <w:rFonts w:ascii="Arial" w:hAnsi="Arial" w:cs="Arial"/>
-          <w:color w:val="000000"/>
-        </w:rPr>
         <w:t>Digital Marketing</w:t>
       </w:r>
     </w:p>
@@ -225,7 +210,7 @@
           <w:rFonts w:ascii="Arial" w:hAnsi="Arial" w:cs="Arial"/>
           <w:color w:val="000000"/>
         </w:rPr>
-        <w:t>CoLab Space Point delivers website design, WordPress development, e-commerce, branding, social media management, SEO, Google Ads, Meta Ads, and business growth solutions.</w:t>
+        <w:t>CoLab Space Point delivers website design, WordPress development, e-commerce, branding, SEO, Google Ads, Meta Ads, and business growth solutions.</w:t>
       </w:r>
     </w:p>
     <w:p>
@@ -372,20 +357,6 @@
           <w:color w:val="000000"/>
         </w:rPr>
         <w:t>WordPress is our primary platform. Fully custom development is also available on request.</w:t>
-      </w:r>
-    </w:p>
-    <w:p>
-      <w:pPr>
-        <w:spacing w:after="200" w:before="80"/>
-      </w:pPr>
-      <w:r>
-        <w:rPr>
-          <w:b w:val="0"/>
-          <w:sz w:val="28"/>
-          <w:rFonts w:ascii="Arial" w:hAnsi="Arial" w:cs="Arial"/>
-          <w:color w:val="000000"/>
-        </w:rPr>
-        <w:t>Standard and Premium website packages include social media management at the matching tier. Standalone social media and digital marketing packages are also available monthly.</w:t>
       </w:r>
     </w:p>
     <w:p>
@@ -853,104 +824,6 @@
       </w:r>
     </w:p>
     <w:p>
-      <w:pPr>
-        <w:spacing w:after="80" w:before="80"/>
-      </w:pPr>
-      <w:r>
-        <w:rPr>
-          <w:b w:val="0"/>
-          <w:sz w:val="28"/>
-          <w:rFonts w:ascii="Arial" w:hAnsi="Arial" w:cs="Arial"/>
-          <w:color w:val="000000"/>
-        </w:rPr>
-        <w:t xml:space="preserve">  •  --- Social Media (Standard tier — included) ---</w:t>
-      </w:r>
-    </w:p>
-    <w:p>
-      <w:pPr>
-        <w:spacing w:after="80" w:before="80"/>
-      </w:pPr>
-      <w:r>
-        <w:rPr>
-          <w:b w:val="0"/>
-          <w:sz w:val="28"/>
-          <w:rFonts w:ascii="Arial" w:hAnsi="Arial" w:cs="Arial"/>
-          <w:color w:val="000000"/>
-        </w:rPr>
-        <w:t xml:space="preserve">  •  Facebook, Instagram &amp; LinkedIn management</w:t>
-      </w:r>
-    </w:p>
-    <w:p>
-      <w:pPr>
-        <w:spacing w:after="80" w:before="80"/>
-      </w:pPr>
-      <w:r>
-        <w:rPr>
-          <w:b w:val="0"/>
-          <w:sz w:val="28"/>
-          <w:rFonts w:ascii="Arial" w:hAnsi="Arial" w:cs="Arial"/>
-          <w:color w:val="000000"/>
-        </w:rPr>
-        <w:t xml:space="preserve">  •  15 posts per month</w:t>
-      </w:r>
-    </w:p>
-    <w:p>
-      <w:pPr>
-        <w:spacing w:after="80" w:before="80"/>
-      </w:pPr>
-      <w:r>
-        <w:rPr>
-          <w:b w:val="0"/>
-          <w:sz w:val="28"/>
-          <w:rFonts w:ascii="Arial" w:hAnsi="Arial" w:cs="Arial"/>
-          <w:color w:val="000000"/>
-        </w:rPr>
-        <w:t xml:space="preserve">  •  Captions and hashtags</w:t>
-      </w:r>
-    </w:p>
-    <w:p>
-      <w:pPr>
-        <w:spacing w:after="80" w:before="80"/>
-      </w:pPr>
-      <w:r>
-        <w:rPr>
-          <w:b w:val="0"/>
-          <w:sz w:val="28"/>
-          <w:rFonts w:ascii="Arial" w:hAnsi="Arial" w:cs="Arial"/>
-          <w:color w:val="000000"/>
-        </w:rPr>
-        <w:t xml:space="preserve">  •  Stories and reels planning</w:t>
-      </w:r>
-    </w:p>
-    <w:p>
-      <w:pPr>
-        <w:spacing w:after="80" w:before="80"/>
-      </w:pPr>
-      <w:r>
-        <w:rPr>
-          <w:b w:val="0"/>
-          <w:sz w:val="28"/>
-          <w:rFonts w:ascii="Arial" w:hAnsi="Arial" w:cs="Arial"/>
-          <w:color w:val="000000"/>
-        </w:rPr>
-        <w:t xml:space="preserve">  •  Community management</w:t>
-      </w:r>
-    </w:p>
-    <w:p>
-      <w:pPr>
-        <w:spacing w:after="80" w:before="80"/>
-      </w:pPr>
-      <w:r>
-        <w:rPr>
-          <w:b w:val="0"/>
-          <w:sz w:val="28"/>
-          <w:rFonts w:ascii="Arial" w:hAnsi="Arial" w:cs="Arial"/>
-          <w:color w:val="000000"/>
-        </w:rPr>
-        <w:t xml:space="preserve">  •  Monthly analytics report</w:t>
-      </w:r>
-    </w:p>
-    <w:p>
       <w:r>
         <w:br w:type="page"/>
       </w:r>
@@ -1166,518 +1039,6 @@
           <w:color w:val="000000"/>
         </w:rPr>
         <w:t xml:space="preserve">  •  90 days priority support</w:t>
-      </w:r>
-    </w:p>
-    <w:p>
-      <w:pPr>
-        <w:spacing w:after="80" w:before="80"/>
-      </w:pPr>
-      <w:r>
-        <w:rPr>
-          <w:b w:val="0"/>
-          <w:sz w:val="28"/>
-          <w:rFonts w:ascii="Arial" w:hAnsi="Arial" w:cs="Arial"/>
-          <w:color w:val="000000"/>
-        </w:rPr>
-        <w:t xml:space="preserve">  •  --- Social Media (Premium tier — included) ---</w:t>
-      </w:r>
-    </w:p>
-    <w:p>
-      <w:pPr>
-        <w:spacing w:after="80" w:before="80"/>
-      </w:pPr>
-      <w:r>
-        <w:rPr>
-          <w:b w:val="0"/>
-          <w:sz w:val="28"/>
-          <w:rFonts w:ascii="Arial" w:hAnsi="Arial" w:cs="Arial"/>
-          <w:color w:val="000000"/>
-        </w:rPr>
-        <w:t xml:space="preserve">  •  Facebook, Instagram, LinkedIn &amp; TikTok management</w:t>
-      </w:r>
-    </w:p>
-    <w:p>
-      <w:pPr>
-        <w:spacing w:after="80" w:before="80"/>
-      </w:pPr>
-      <w:r>
-        <w:rPr>
-          <w:b w:val="0"/>
-          <w:sz w:val="28"/>
-          <w:rFonts w:ascii="Arial" w:hAnsi="Arial" w:cs="Arial"/>
-          <w:color w:val="000000"/>
-        </w:rPr>
-        <w:t xml:space="preserve">  •  25 posts per month</w:t>
-      </w:r>
-    </w:p>
-    <w:p>
-      <w:pPr>
-        <w:spacing w:after="80" w:before="80"/>
-      </w:pPr>
-      <w:r>
-        <w:rPr>
-          <w:b w:val="0"/>
-          <w:sz w:val="28"/>
-          <w:rFonts w:ascii="Arial" w:hAnsi="Arial" w:cs="Arial"/>
-          <w:color w:val="000000"/>
-        </w:rPr>
-        <w:t xml:space="preserve">  •  Daily stories</w:t>
-      </w:r>
-    </w:p>
-    <w:p>
-      <w:pPr>
-        <w:spacing w:after="80" w:before="80"/>
-      </w:pPr>
-      <w:r>
-        <w:rPr>
-          <w:b w:val="0"/>
-          <w:sz w:val="28"/>
-          <w:rFonts w:ascii="Arial" w:hAnsi="Arial" w:cs="Arial"/>
-          <w:color w:val="000000"/>
-        </w:rPr>
-        <w:t xml:space="preserve">  •  Full reels strategy</w:t>
-      </w:r>
-    </w:p>
-    <w:p>
-      <w:pPr>
-        <w:spacing w:after="80" w:before="80"/>
-      </w:pPr>
-      <w:r>
-        <w:rPr>
-          <w:b w:val="0"/>
-          <w:sz w:val="28"/>
-          <w:rFonts w:ascii="Arial" w:hAnsi="Arial" w:cs="Arial"/>
-          <w:color w:val="000000"/>
-        </w:rPr>
-        <w:t xml:space="preserve">  •  Community management</w:t>
-      </w:r>
-    </w:p>
-    <w:p>
-      <w:pPr>
-        <w:spacing w:after="80" w:before="80"/>
-      </w:pPr>
-      <w:r>
-        <w:rPr>
-          <w:b w:val="0"/>
-          <w:sz w:val="28"/>
-          <w:rFonts w:ascii="Arial" w:hAnsi="Arial" w:cs="Arial"/>
-          <w:color w:val="000000"/>
-        </w:rPr>
-        <w:t xml:space="preserve">  •  Weekly performance reports</w:t>
-      </w:r>
-    </w:p>
-    <w:p>
-      <w:r>
-        <w:br w:type="page"/>
-      </w:r>
-    </w:p>
-    <w:p>
-      <w:pPr>
-        <w:spacing w:before="320" w:after="160"/>
-        <w:pBdr>
-          <w:left w:val="single" w:sz="24" w:space="8" w:color="06ACBA"/>
-        </w:pBdr>
-      </w:pPr>
-      <w:r>
-        <w:rPr>
-          <w:b/>
-          <w:sz w:val="40"/>
-          <w:rFonts w:ascii="Arial" w:hAnsi="Arial" w:cs="Arial"/>
-          <w:color w:val="000000"/>
-        </w:rPr>
-        <w:t>Social Media Management</w:t>
-      </w:r>
-    </w:p>
-    <w:p>
-      <w:pPr>
-        <w:spacing w:after="240" w:before="80"/>
-      </w:pPr>
-      <w:r>
-        <w:rPr>
-          <w:b/>
-          <w:sz w:val="28"/>
-          <w:rFonts w:ascii="Arial" w:hAnsi="Arial" w:cs="Arial"/>
-          <w:color w:val="000000"/>
-        </w:rPr>
-        <w:t>Monthly packages for clients who need social media only (also included in Standard &amp; Premium website packages above).</w:t>
-      </w:r>
-    </w:p>
-    <w:p>
-      <w:pPr>
-        <w:spacing w:after="160" w:before="80"/>
-      </w:pPr>
-      <w:r>
-        <w:rPr>
-          <w:b/>
-          <w:sz w:val="32"/>
-          <w:rFonts w:ascii="Arial" w:hAnsi="Arial" w:cs="Arial"/>
-          <w:color w:val="000000"/>
-        </w:rPr>
-        <w:t>BASIC — PKR 25,000 / MONTH</w:t>
-      </w:r>
-    </w:p>
-    <w:p>
-      <w:pPr>
-        <w:spacing w:after="120" w:before="80"/>
-      </w:pPr>
-      <w:r>
-        <w:rPr>
-          <w:b/>
-          <w:sz w:val="28"/>
-          <w:rFonts w:ascii="Arial" w:hAnsi="Arial" w:cs="Arial"/>
-          <w:color w:val="06ACBA"/>
-        </w:rPr>
-        <w:t>What is included:</w:t>
-      </w:r>
-    </w:p>
-    <w:p>
-      <w:pPr>
-        <w:spacing w:after="80" w:before="80"/>
-      </w:pPr>
-      <w:r>
-        <w:rPr>
-          <w:b w:val="0"/>
-          <w:sz w:val="28"/>
-          <w:rFonts w:ascii="Arial" w:hAnsi="Arial" w:cs="Arial"/>
-          <w:color w:val="000000"/>
-        </w:rPr>
-        <w:t xml:space="preserve">  •  Facebook</w:t>
-      </w:r>
-    </w:p>
-    <w:p>
-      <w:pPr>
-        <w:spacing w:after="80" w:before="80"/>
-      </w:pPr>
-      <w:r>
-        <w:rPr>
-          <w:b w:val="0"/>
-          <w:sz w:val="28"/>
-          <w:rFonts w:ascii="Arial" w:hAnsi="Arial" w:cs="Arial"/>
-          <w:color w:val="000000"/>
-        </w:rPr>
-        <w:t xml:space="preserve">  •  Instagram</w:t>
-      </w:r>
-    </w:p>
-    <w:p>
-      <w:pPr>
-        <w:spacing w:after="80" w:before="80"/>
-      </w:pPr>
-      <w:r>
-        <w:rPr>
-          <w:b w:val="0"/>
-          <w:sz w:val="28"/>
-          <w:rFonts w:ascii="Arial" w:hAnsi="Arial" w:cs="Arial"/>
-          <w:color w:val="000000"/>
-        </w:rPr>
-        <w:t xml:space="preserve">  •  8 posts per month</w:t>
-      </w:r>
-    </w:p>
-    <w:p>
-      <w:pPr>
-        <w:spacing w:after="80" w:before="80"/>
-      </w:pPr>
-      <w:r>
-        <w:rPr>
-          <w:b w:val="0"/>
-          <w:sz w:val="28"/>
-          <w:rFonts w:ascii="Arial" w:hAnsi="Arial" w:cs="Arial"/>
-          <w:color w:val="000000"/>
-        </w:rPr>
-        <w:t xml:space="preserve">  •  Captions</w:t>
-      </w:r>
-    </w:p>
-    <w:p>
-      <w:pPr>
-        <w:spacing w:after="80" w:before="80"/>
-      </w:pPr>
-      <w:r>
-        <w:rPr>
-          <w:b w:val="0"/>
-          <w:sz w:val="28"/>
-          <w:rFonts w:ascii="Arial" w:hAnsi="Arial" w:cs="Arial"/>
-          <w:color w:val="000000"/>
-        </w:rPr>
-        <w:t xml:space="preserve">  •  Hashtags</w:t>
-      </w:r>
-    </w:p>
-    <w:p>
-      <w:pPr>
-        <w:spacing w:after="80" w:before="80"/>
-      </w:pPr>
-      <w:r>
-        <w:rPr>
-          <w:b w:val="0"/>
-          <w:sz w:val="28"/>
-          <w:rFonts w:ascii="Arial" w:hAnsi="Arial" w:cs="Arial"/>
-          <w:color w:val="000000"/>
-        </w:rPr>
-        <w:t xml:space="preserve">  •  Monthly report</w:t>
-      </w:r>
-    </w:p>
-    <w:p>
-      <w:pPr>
-        <w:spacing w:after="280" w:before="80"/>
-      </w:pPr>
-      <w:r>
-        <w:rPr>
-          <w:b w:val="0"/>
-          <w:sz w:val="20"/>
-          <w:rFonts w:ascii="Arial" w:hAnsi="Arial" w:cs="Arial"/>
-          <w:color w:val="000000"/>
-        </w:rPr>
-        <w:t>————————————————————————————————————————</w:t>
-      </w:r>
-    </w:p>
-    <w:p>
-      <w:pPr>
-        <w:spacing w:after="160" w:before="80"/>
-      </w:pPr>
-      <w:r>
-        <w:rPr>
-          <w:b/>
-          <w:sz w:val="32"/>
-          <w:rFonts w:ascii="Arial" w:hAnsi="Arial" w:cs="Arial"/>
-          <w:color w:val="000000"/>
-        </w:rPr>
-        <w:t>STANDARD — PKR 45,000 / MONTH</w:t>
-      </w:r>
-    </w:p>
-    <w:p>
-      <w:pPr>
-        <w:spacing w:after="120" w:before="80"/>
-      </w:pPr>
-      <w:r>
-        <w:rPr>
-          <w:b/>
-          <w:sz w:val="28"/>
-          <w:rFonts w:ascii="Arial" w:hAnsi="Arial" w:cs="Arial"/>
-          <w:color w:val="06ACBA"/>
-        </w:rPr>
-        <w:t>What is included:</w:t>
-      </w:r>
-    </w:p>
-    <w:p>
-      <w:pPr>
-        <w:spacing w:after="80" w:before="80"/>
-      </w:pPr>
-      <w:r>
-        <w:rPr>
-          <w:b w:val="0"/>
-          <w:sz w:val="28"/>
-          <w:rFonts w:ascii="Arial" w:hAnsi="Arial" w:cs="Arial"/>
-          <w:color w:val="000000"/>
-        </w:rPr>
-        <w:t xml:space="preserve">  •  Facebook, Instagram &amp; LinkedIn</w:t>
-      </w:r>
-    </w:p>
-    <w:p>
-      <w:pPr>
-        <w:spacing w:after="80" w:before="80"/>
-      </w:pPr>
-      <w:r>
-        <w:rPr>
-          <w:b w:val="0"/>
-          <w:sz w:val="28"/>
-          <w:rFonts w:ascii="Arial" w:hAnsi="Arial" w:cs="Arial"/>
-          <w:color w:val="000000"/>
-        </w:rPr>
-        <w:t xml:space="preserve">  •  15 posts per month</w:t>
-      </w:r>
-    </w:p>
-    <w:p>
-      <w:pPr>
-        <w:spacing w:after="80" w:before="80"/>
-      </w:pPr>
-      <w:r>
-        <w:rPr>
-          <w:b w:val="0"/>
-          <w:sz w:val="28"/>
-          <w:rFonts w:ascii="Arial" w:hAnsi="Arial" w:cs="Arial"/>
-          <w:color w:val="000000"/>
-        </w:rPr>
-        <w:t xml:space="preserve">  •  Stories</w:t>
-      </w:r>
-    </w:p>
-    <w:p>
-      <w:pPr>
-        <w:spacing w:after="80" w:before="80"/>
-      </w:pPr>
-      <w:r>
-        <w:rPr>
-          <w:b w:val="0"/>
-          <w:sz w:val="28"/>
-          <w:rFonts w:ascii="Arial" w:hAnsi="Arial" w:cs="Arial"/>
-          <w:color w:val="000000"/>
-        </w:rPr>
-        <w:t xml:space="preserve">  •  Reels planning</w:t>
-      </w:r>
-    </w:p>
-    <w:p>
-      <w:pPr>
-        <w:spacing w:after="80" w:before="80"/>
-      </w:pPr>
-      <w:r>
-        <w:rPr>
-          <w:b w:val="0"/>
-          <w:sz w:val="28"/>
-          <w:rFonts w:ascii="Arial" w:hAnsi="Arial" w:cs="Arial"/>
-          <w:color w:val="000000"/>
-        </w:rPr>
-        <w:t xml:space="preserve">  •  Community management</w:t>
-      </w:r>
-    </w:p>
-    <w:p>
-      <w:pPr>
-        <w:spacing w:after="80" w:before="80"/>
-      </w:pPr>
-      <w:r>
-        <w:rPr>
-          <w:b w:val="0"/>
-          <w:sz w:val="28"/>
-          <w:rFonts w:ascii="Arial" w:hAnsi="Arial" w:cs="Arial"/>
-          <w:color w:val="000000"/>
-        </w:rPr>
-        <w:t xml:space="preserve">  •  Analytics report</w:t>
-      </w:r>
-    </w:p>
-    <w:p>
-      <w:pPr>
-        <w:spacing w:after="280" w:before="80"/>
-      </w:pPr>
-      <w:r>
-        <w:rPr>
-          <w:b w:val="0"/>
-          <w:sz w:val="20"/>
-          <w:rFonts w:ascii="Arial" w:hAnsi="Arial" w:cs="Arial"/>
-          <w:color w:val="000000"/>
-        </w:rPr>
-        <w:t>————————————————————————————————————————</w:t>
-      </w:r>
-    </w:p>
-    <w:p>
-      <w:pPr>
-        <w:spacing w:after="160" w:before="80"/>
-      </w:pPr>
-      <w:r>
-        <w:rPr>
-          <w:b/>
-          <w:sz w:val="32"/>
-          <w:rFonts w:ascii="Arial" w:hAnsi="Arial" w:cs="Arial"/>
-          <w:color w:val="000000"/>
-        </w:rPr>
-        <w:t>PREMIUM — PKR 75,000 / MONTH</w:t>
-      </w:r>
-    </w:p>
-    <w:p>
-      <w:pPr>
-        <w:spacing w:after="120" w:before="80"/>
-      </w:pPr>
-      <w:r>
-        <w:rPr>
-          <w:b/>
-          <w:sz w:val="28"/>
-          <w:rFonts w:ascii="Arial" w:hAnsi="Arial" w:cs="Arial"/>
-          <w:color w:val="06ACBA"/>
-        </w:rPr>
-        <w:t>What is included:</w:t>
-      </w:r>
-    </w:p>
-    <w:p>
-      <w:pPr>
-        <w:spacing w:after="80" w:before="80"/>
-      </w:pPr>
-      <w:r>
-        <w:rPr>
-          <w:b w:val="0"/>
-          <w:sz w:val="28"/>
-          <w:rFonts w:ascii="Arial" w:hAnsi="Arial" w:cs="Arial"/>
-          <w:color w:val="000000"/>
-        </w:rPr>
-        <w:t xml:space="preserve">  •  Facebook, Instagram, LinkedIn &amp; TikTok</w:t>
-      </w:r>
-    </w:p>
-    <w:p>
-      <w:pPr>
-        <w:spacing w:after="80" w:before="80"/>
-      </w:pPr>
-      <w:r>
-        <w:rPr>
-          <w:b w:val="0"/>
-          <w:sz w:val="28"/>
-          <w:rFonts w:ascii="Arial" w:hAnsi="Arial" w:cs="Arial"/>
-          <w:color w:val="000000"/>
-        </w:rPr>
-        <w:t xml:space="preserve">  •  25 posts per month</w:t>
-      </w:r>
-    </w:p>
-    <w:p>
-      <w:pPr>
-        <w:spacing w:after="80" w:before="80"/>
-      </w:pPr>
-      <w:r>
-        <w:rPr>
-          <w:b w:val="0"/>
-          <w:sz w:val="28"/>
-          <w:rFonts w:ascii="Arial" w:hAnsi="Arial" w:cs="Arial"/>
-          <w:color w:val="000000"/>
-        </w:rPr>
-        <w:t xml:space="preserve">  •  Daily stories</w:t>
-      </w:r>
-    </w:p>
-    <w:p>
-      <w:pPr>
-        <w:spacing w:after="80" w:before="80"/>
-      </w:pPr>
-      <w:r>
-        <w:rPr>
-          <w:b w:val="0"/>
-          <w:sz w:val="28"/>
-          <w:rFonts w:ascii="Arial" w:hAnsi="Arial" w:cs="Arial"/>
-          <w:color w:val="000000"/>
-        </w:rPr>
-        <w:t xml:space="preserve">  •  Reels strategy</w:t>
-      </w:r>
-    </w:p>
-    <w:p>
-      <w:pPr>
-        <w:spacing w:after="80" w:before="80"/>
-      </w:pPr>
-      <w:r>
-        <w:rPr>
-          <w:b w:val="0"/>
-          <w:sz w:val="28"/>
-          <w:rFonts w:ascii="Arial" w:hAnsi="Arial" w:cs="Arial"/>
-          <w:color w:val="000000"/>
-        </w:rPr>
-        <w:t xml:space="preserve">  •  Community management</w:t>
-      </w:r>
-    </w:p>
-    <w:p>
-      <w:pPr>
-        <w:spacing w:after="80" w:before="80"/>
-      </w:pPr>
-      <w:r>
-        <w:rPr>
-          <w:b w:val="0"/>
-          <w:sz w:val="28"/>
-          <w:rFonts w:ascii="Arial" w:hAnsi="Arial" w:cs="Arial"/>
-          <w:color w:val="000000"/>
-        </w:rPr>
-        <w:t xml:space="preserve">  •  Weekly reports</w:t>
-      </w:r>
-    </w:p>
-    <w:p>
-      <w:pPr>
-        <w:spacing w:after="280" w:before="80"/>
-      </w:pPr>
-      <w:r>
-        <w:rPr>
-          <w:b w:val="0"/>
-          <w:sz w:val="20"/>
-          <w:rFonts w:ascii="Arial" w:hAnsi="Arial" w:cs="Arial"/>
-          <w:color w:val="000000"/>
-        </w:rPr>
-        <w:t>————————————————————————————————————————</w:t>
       </w:r>
     </w:p>
     <w:p>
@@ -2085,177 +1446,6 @@
           <w:rFonts w:ascii="Arial" w:hAnsi="Arial" w:cs="Arial"/>
           <w:color w:val="000000"/>
         </w:rPr>
-        <w:t>Add-On Services</w:t>
-      </w:r>
-    </w:p>
-    <w:p>
-      <w:pPr>
-        <w:spacing w:after="120" w:before="80"/>
-      </w:pPr>
-      <w:r>
-        <w:rPr>
-          <w:b w:val="0"/>
-          <w:sz w:val="28"/>
-          <w:rFonts w:ascii="Arial" w:hAnsi="Arial" w:cs="Arial"/>
-          <w:color w:val="000000"/>
-        </w:rPr>
-        <w:t>Logo Design .............. From PKR 15,000</w:t>
-      </w:r>
-    </w:p>
-    <w:p>
-      <w:pPr>
-        <w:spacing w:after="120" w:before="80"/>
-      </w:pPr>
-      <w:r>
-        <w:rPr>
-          <w:b w:val="0"/>
-          <w:sz w:val="28"/>
-          <w:rFonts w:ascii="Arial" w:hAnsi="Arial" w:cs="Arial"/>
-          <w:color w:val="000000"/>
-        </w:rPr>
-        <w:t>Brand Identity .............. From PKR 45,000</w:t>
-      </w:r>
-    </w:p>
-    <w:p>
-      <w:pPr>
-        <w:spacing w:after="120" w:before="80"/>
-      </w:pPr>
-      <w:r>
-        <w:rPr>
-          <w:b w:val="0"/>
-          <w:sz w:val="28"/>
-          <w:rFonts w:ascii="Arial" w:hAnsi="Arial" w:cs="Arial"/>
-          <w:color w:val="000000"/>
-        </w:rPr>
-        <w:t>Landing Page .............. From PKR 35,000</w:t>
-      </w:r>
-    </w:p>
-    <w:p>
-      <w:pPr>
-        <w:spacing w:after="120" w:before="80"/>
-      </w:pPr>
-      <w:r>
-        <w:rPr>
-          <w:b w:val="0"/>
-          <w:sz w:val="28"/>
-          <w:rFonts w:ascii="Arial" w:hAnsi="Arial" w:cs="Arial"/>
-          <w:color w:val="000000"/>
-        </w:rPr>
-        <w:t>Website Maintenance .............. From PKR 8,000 / month</w:t>
-      </w:r>
-    </w:p>
-    <w:p>
-      <w:pPr>
-        <w:spacing w:after="120" w:before="80"/>
-      </w:pPr>
-      <w:r>
-        <w:rPr>
-          <w:b w:val="0"/>
-          <w:sz w:val="28"/>
-          <w:rFonts w:ascii="Arial" w:hAnsi="Arial" w:cs="Arial"/>
-          <w:color w:val="000000"/>
-        </w:rPr>
-        <w:t>Content Writing .............. From PKR 3,500 / page</w:t>
-      </w:r>
-    </w:p>
-    <w:p>
-      <w:pPr>
-        <w:spacing w:after="120" w:before="80"/>
-      </w:pPr>
-      <w:r>
-        <w:rPr>
-          <w:b w:val="0"/>
-          <w:sz w:val="28"/>
-          <w:rFonts w:ascii="Arial" w:hAnsi="Arial" w:cs="Arial"/>
-          <w:color w:val="000000"/>
-        </w:rPr>
-        <w:t>Graphic Design .............. From PKR 2,500</w:t>
-      </w:r>
-    </w:p>
-    <w:p>
-      <w:pPr>
-        <w:spacing w:after="120" w:before="80"/>
-      </w:pPr>
-      <w:r>
-        <w:rPr>
-          <w:b w:val="0"/>
-          <w:sz w:val="28"/>
-          <w:rFonts w:ascii="Arial" w:hAnsi="Arial" w:cs="Arial"/>
-          <w:color w:val="000000"/>
-        </w:rPr>
-        <w:t>Video Editing .............. From PKR 5,000 / minute</w:t>
-      </w:r>
-    </w:p>
-    <w:p>
-      <w:pPr>
-        <w:spacing w:after="120" w:before="80"/>
-      </w:pPr>
-      <w:r>
-        <w:rPr>
-          <w:b w:val="0"/>
-          <w:sz w:val="28"/>
-          <w:rFonts w:ascii="Arial" w:hAnsi="Arial" w:cs="Arial"/>
-          <w:color w:val="000000"/>
-        </w:rPr>
-        <w:t>SEO Audit .............. From PKR 25,000</w:t>
-      </w:r>
-    </w:p>
-    <w:p>
-      <w:pPr>
-        <w:spacing w:after="120" w:before="80"/>
-      </w:pPr>
-      <w:r>
-        <w:rPr>
-          <w:b w:val="0"/>
-          <w:sz w:val="28"/>
-          <w:rFonts w:ascii="Arial" w:hAnsi="Arial" w:cs="Arial"/>
-          <w:color w:val="000000"/>
-        </w:rPr>
-        <w:t>Product Upload .............. From PKR 500 / product</w:t>
-      </w:r>
-    </w:p>
-    <w:p>
-      <w:pPr>
-        <w:spacing w:after="120" w:before="80"/>
-      </w:pPr>
-      <w:r>
-        <w:rPr>
-          <w:b w:val="0"/>
-          <w:sz w:val="28"/>
-          <w:rFonts w:ascii="Arial" w:hAnsi="Arial" w:cs="Arial"/>
-          <w:color w:val="000000"/>
-        </w:rPr>
-        <w:t>Business Email .............. From PKR 5,000</w:t>
-      </w:r>
-    </w:p>
-    <w:p>
-      <w:pPr>
-        <w:spacing w:after="120" w:before="80"/>
-      </w:pPr>
-      <w:r>
-        <w:rPr>
-          <w:b w:val="0"/>
-          <w:sz w:val="28"/>
-          <w:rFonts w:ascii="Arial" w:hAnsi="Arial" w:cs="Arial"/>
-          <w:color w:val="000000"/>
-        </w:rPr>
-        <w:t>Domain &amp; Hosting .............. At cost + PKR 3,000 setup</w:t>
-      </w:r>
-    </w:p>
-    <w:p>
-      <w:pPr>
-        <w:spacing w:before="320" w:after="160"/>
-        <w:pBdr>
-          <w:left w:val="single" w:sz="24" w:space="8" w:color="06ACBA"/>
-        </w:pBdr>
-      </w:pPr>
-      <w:r>
-        <w:rPr>
-          <w:b/>
-          <w:sz w:val="40"/>
-          <w:rFonts w:ascii="Arial" w:hAnsi="Arial" w:cs="Arial"/>
-          <w:color w:val="000000"/>
-        </w:rPr>
         <w:t>Contact</w:t>
       </w:r>
     </w:p>

</xml_diff>

<commit_message>
Add professional images to digital agency proposal
Co-authored-by: fullstackwebdeveloper1000-coder <fullstackwebdeveloper1000-coder@users.noreply.github.com>
</commit_message>
<xml_diff>
--- a/CoLab_Space_Point_Digital_Agency_Proposal.docx
+++ b/CoLab_Space_Point_Digital_Agency_Proposal.docx
@@ -5,12 +5,13 @@
   <w:body>
     <w:p>
       <w:pPr>
+        <w:spacing w:before="120" w:after="240"/>
         <w:jc w:val="center"/>
       </w:pPr>
       <w:r>
         <w:drawing>
           <wp:inline xmlns:a="http://schemas.openxmlformats.org/drawingml/2006/main" xmlns:pic="http://schemas.openxmlformats.org/drawingml/2006/picture">
-            <wp:extent cx="1463040" cy="1414272"/>
+            <wp:extent cx="5669280" cy="2070616"/>
             <wp:docPr id="1" name="Picture 1"/>
             <wp:cNvGraphicFramePr>
               <a:graphicFrameLocks noChangeAspect="1"/>
@@ -19,7 +20,7 @@
               <a:graphicData uri="http://schemas.openxmlformats.org/drawingml/2006/picture">
                 <pic:pic>
                   <pic:nvPicPr>
-                    <pic:cNvPr id="0" name="image.png"/>
+                    <pic:cNvPr id="0" name="image.jpg"/>
                     <pic:cNvPicPr/>
                   </pic:nvPicPr>
                   <pic:blipFill>
@@ -31,7 +32,7 @@
                   <pic:spPr>
                     <a:xfrm>
                       <a:off x="0" y="0"/>
-                      <a:ext cx="1463040" cy="1414272"/>
+                      <a:ext cx="5669280" cy="2070616"/>
                     </a:xfrm>
                     <a:prstGeom prst="rect"/>
                   </pic:spPr>
@@ -44,7 +45,47 @@
     </w:p>
     <w:p>
       <w:pPr>
-        <w:spacing w:after="160" w:before="80"/>
+        <w:spacing w:before="120" w:after="200"/>
+        <w:jc w:val="center"/>
+      </w:pPr>
+      <w:r>
+        <w:drawing>
+          <wp:inline xmlns:a="http://schemas.openxmlformats.org/drawingml/2006/main" xmlns:pic="http://schemas.openxmlformats.org/drawingml/2006/picture">
+            <wp:extent cx="1645920" cy="397764"/>
+            <wp:docPr id="2" name="Picture 2"/>
+            <wp:cNvGraphicFramePr>
+              <a:graphicFrameLocks noChangeAspect="1"/>
+            </wp:cNvGraphicFramePr>
+            <a:graphic>
+              <a:graphicData uri="http://schemas.openxmlformats.org/drawingml/2006/picture">
+                <pic:pic>
+                  <pic:nvPicPr>
+                    <pic:cNvPr id="0" name="image.png"/>
+                    <pic:cNvPicPr/>
+                  </pic:nvPicPr>
+                  <pic:blipFill>
+                    <a:blip r:embed="rId10"/>
+                    <a:stretch>
+                      <a:fillRect/>
+                    </a:stretch>
+                  </pic:blipFill>
+                  <pic:spPr>
+                    <a:xfrm>
+                      <a:off x="0" y="0"/>
+                      <a:ext cx="1645920" cy="397764"/>
+                    </a:xfrm>
+                    <a:prstGeom prst="rect"/>
+                  </pic:spPr>
+                </pic:pic>
+              </a:graphicData>
+            </a:graphic>
+          </wp:inline>
+        </w:drawing>
+      </w:r>
+    </w:p>
+    <w:p>
+      <w:pPr>
+        <w:spacing w:after="120" w:before="80"/>
         <w:jc w:val="center"/>
       </w:pPr>
       <w:r>
@@ -65,7 +106,7 @@
       <w:r>
         <w:rPr>
           <w:b/>
-          <w:sz w:val="64"/>
+          <w:sz w:val="60"/>
           <w:rFonts w:ascii="Arial" w:hAnsi="Arial" w:cs="Arial"/>
           <w:color w:val="000000"/>
         </w:rPr>
@@ -74,7 +115,7 @@
     </w:p>
     <w:p>
       <w:pPr>
-        <w:spacing w:after="320" w:before="80"/>
+        <w:spacing w:after="280" w:before="80"/>
         <w:jc w:val="center"/>
       </w:pPr>
       <w:r>
@@ -89,7 +130,7 @@
     </w:p>
     <w:p>
       <w:pPr>
-        <w:spacing w:after="120" w:before="80"/>
+        <w:spacing w:after="100" w:before="80"/>
         <w:jc w:val="center"/>
       </w:pPr>
       <w:r>
@@ -104,7 +145,7 @@
     </w:p>
     <w:p>
       <w:pPr>
-        <w:spacing w:after="120" w:before="80"/>
+        <w:spacing w:after="100" w:before="80"/>
         <w:jc w:val="center"/>
       </w:pPr>
       <w:r>
@@ -119,7 +160,7 @@
     </w:p>
     <w:p>
       <w:pPr>
-        <w:spacing w:after="240" w:before="80"/>
+        <w:spacing w:after="200" w:before="80"/>
         <w:jc w:val="center"/>
       </w:pPr>
       <w:r>
@@ -140,7 +181,7 @@
       <w:r>
         <w:rPr>
           <w:b w:val="0"/>
-          <w:sz w:val="28"/>
+          <w:sz w:val="26"/>
           <w:rFonts w:ascii="Arial" w:hAnsi="Arial" w:cs="Arial"/>
           <w:color w:val="000000"/>
         </w:rPr>
@@ -155,7 +196,7 @@
       <w:r>
         <w:rPr>
           <w:b w:val="0"/>
-          <w:sz w:val="28"/>
+          <w:sz w:val="26"/>
           <w:rFonts w:ascii="Arial" w:hAnsi="Arial" w:cs="Arial"/>
           <w:color w:val="000000"/>
         </w:rPr>
@@ -170,7 +211,7 @@
       <w:r>
         <w:rPr>
           <w:b w:val="0"/>
-          <w:sz w:val="28"/>
+          <w:sz w:val="26"/>
           <w:rFonts w:ascii="Arial" w:hAnsi="Arial" w:cs="Arial"/>
           <w:color w:val="000000"/>
         </w:rPr>
@@ -201,6 +242,46 @@
     </w:p>
     <w:p>
       <w:pPr>
+        <w:spacing w:before="120" w:after="200"/>
+        <w:jc w:val="center"/>
+      </w:pPr>
+      <w:r>
+        <w:drawing>
+          <wp:inline xmlns:a="http://schemas.openxmlformats.org/drawingml/2006/main" xmlns:pic="http://schemas.openxmlformats.org/drawingml/2006/picture">
+            <wp:extent cx="5029200" cy="3356991"/>
+            <wp:docPr id="3" name="Picture 3"/>
+            <wp:cNvGraphicFramePr>
+              <a:graphicFrameLocks noChangeAspect="1"/>
+            </wp:cNvGraphicFramePr>
+            <a:graphic>
+              <a:graphicData uri="http://schemas.openxmlformats.org/drawingml/2006/picture">
+                <pic:pic>
+                  <pic:nvPicPr>
+                    <pic:cNvPr id="0" name="image.jpg"/>
+                    <pic:cNvPicPr/>
+                  </pic:nvPicPr>
+                  <pic:blipFill>
+                    <a:blip r:embed="rId11"/>
+                    <a:stretch>
+                      <a:fillRect/>
+                    </a:stretch>
+                  </pic:blipFill>
+                  <pic:spPr>
+                    <a:xfrm>
+                      <a:off x="0" y="0"/>
+                      <a:ext cx="5029200" cy="3356991"/>
+                    </a:xfrm>
+                    <a:prstGeom prst="rect"/>
+                  </pic:spPr>
+                </pic:pic>
+              </a:graphicData>
+            </a:graphic>
+          </wp:inline>
+        </w:drawing>
+      </w:r>
+    </w:p>
+    <w:p>
+      <w:pPr>
         <w:spacing w:after="200" w:before="80"/>
       </w:pPr>
       <w:r>
@@ -210,7 +291,7 @@
           <w:rFonts w:ascii="Arial" w:hAnsi="Arial" w:cs="Arial"/>
           <w:color w:val="000000"/>
         </w:rPr>
-        <w:t>CoLab Space Point delivers website design, WordPress development, e-commerce, branding, SEO, Google Ads, Meta Ads, and business growth solutions.</w:t>
+        <w:t>CoLab Space Point is the digital services arm of CoLab Point — a trusted innovation hub in Gujrat since 2021. We deliver website design, WordPress development, e-commerce, branding, SEO, Google Ads, Meta Ads, and business growth solutions.</w:t>
       </w:r>
     </w:p>
     <w:p>
@@ -224,7 +305,7 @@
           <w:rFonts w:ascii="Arial" w:hAnsi="Arial" w:cs="Arial"/>
           <w:color w:val="000000"/>
         </w:rPr>
-        <w:t>Each section shows the package price in bold, followed by a clear list of everything included at that price.</w:t>
+        <w:t>Each package price is shown in bold, followed by a complete list of what is included.</w:t>
       </w:r>
     </w:p>
     <w:p>
@@ -329,6 +410,11 @@
       </w:r>
     </w:p>
     <w:p>
+      <w:r>
+        <w:br w:type="page"/>
+      </w:r>
+    </w:p>
+    <w:p>
       <w:pPr>
         <w:spacing w:before="320" w:after="160"/>
         <w:pBdr>
@@ -343,6 +429,46 @@
           <w:color w:val="000000"/>
         </w:rPr>
         <w:t>Website Designing &amp; Development</w:t>
+      </w:r>
+    </w:p>
+    <w:p>
+      <w:pPr>
+        <w:spacing w:before="120" w:after="200"/>
+        <w:jc w:val="center"/>
+      </w:pPr>
+      <w:r>
+        <w:drawing>
+          <wp:inline xmlns:a="http://schemas.openxmlformats.org/drawingml/2006/main" xmlns:pic="http://schemas.openxmlformats.org/drawingml/2006/picture">
+            <wp:extent cx="5029200" cy="3583305"/>
+            <wp:docPr id="4" name="Picture 4"/>
+            <wp:cNvGraphicFramePr>
+              <a:graphicFrameLocks noChangeAspect="1"/>
+            </wp:cNvGraphicFramePr>
+            <a:graphic>
+              <a:graphicData uri="http://schemas.openxmlformats.org/drawingml/2006/picture">
+                <pic:pic>
+                  <pic:nvPicPr>
+                    <pic:cNvPr id="0" name="image.jpg"/>
+                    <pic:cNvPicPr/>
+                  </pic:nvPicPr>
+                  <pic:blipFill>
+                    <a:blip r:embed="rId12"/>
+                    <a:stretch>
+                      <a:fillRect/>
+                    </a:stretch>
+                  </pic:blipFill>
+                  <pic:spPr>
+                    <a:xfrm>
+                      <a:off x="0" y="0"/>
+                      <a:ext cx="5029200" cy="3583305"/>
+                    </a:xfrm>
+                    <a:prstGeom prst="rect"/>
+                  </pic:spPr>
+                </pic:pic>
+              </a:graphicData>
+            </a:graphic>
+          </wp:inline>
+        </w:drawing>
       </w:r>
     </w:p>
     <w:p>
@@ -379,6 +505,46 @@
           <w:color w:val="000000"/>
         </w:rPr>
         <w:t>BASIC WEBSITE</w:t>
+      </w:r>
+    </w:p>
+    <w:p>
+      <w:pPr>
+        <w:spacing w:before="120" w:after="160"/>
+        <w:jc w:val="center"/>
+      </w:pPr>
+      <w:r>
+        <w:drawing>
+          <wp:inline xmlns:a="http://schemas.openxmlformats.org/drawingml/2006/main" xmlns:pic="http://schemas.openxmlformats.org/drawingml/2006/picture">
+            <wp:extent cx="4572000" cy="3257550"/>
+            <wp:docPr id="5" name="Picture 5"/>
+            <wp:cNvGraphicFramePr>
+              <a:graphicFrameLocks noChangeAspect="1"/>
+            </wp:cNvGraphicFramePr>
+            <a:graphic>
+              <a:graphicData uri="http://schemas.openxmlformats.org/drawingml/2006/picture">
+                <pic:pic>
+                  <pic:nvPicPr>
+                    <pic:cNvPr id="0" name="image.jpg"/>
+                    <pic:cNvPicPr/>
+                  </pic:nvPicPr>
+                  <pic:blipFill>
+                    <a:blip r:embed="rId12"/>
+                    <a:stretch>
+                      <a:fillRect/>
+                    </a:stretch>
+                  </pic:blipFill>
+                  <pic:spPr>
+                    <a:xfrm>
+                      <a:off x="0" y="0"/>
+                      <a:ext cx="4572000" cy="3257550"/>
+                    </a:xfrm>
+                    <a:prstGeom prst="rect"/>
+                  </pic:spPr>
+                </pic:pic>
+              </a:graphicData>
+            </a:graphic>
+          </wp:inline>
+        </w:drawing>
       </w:r>
     </w:p>
     <w:p>
@@ -615,6 +781,46 @@
     </w:p>
     <w:p>
       <w:pPr>
+        <w:spacing w:before="120" w:after="160"/>
+        <w:jc w:val="center"/>
+      </w:pPr>
+      <w:r>
+        <w:drawing>
+          <wp:inline xmlns:a="http://schemas.openxmlformats.org/drawingml/2006/main" xmlns:pic="http://schemas.openxmlformats.org/drawingml/2006/picture">
+            <wp:extent cx="4572000" cy="3051810"/>
+            <wp:docPr id="6" name="Picture 6"/>
+            <wp:cNvGraphicFramePr>
+              <a:graphicFrameLocks noChangeAspect="1"/>
+            </wp:cNvGraphicFramePr>
+            <a:graphic>
+              <a:graphicData uri="http://schemas.openxmlformats.org/drawingml/2006/picture">
+                <pic:pic>
+                  <pic:nvPicPr>
+                    <pic:cNvPr id="0" name="image.jpg"/>
+                    <pic:cNvPicPr/>
+                  </pic:nvPicPr>
+                  <pic:blipFill>
+                    <a:blip r:embed="rId13"/>
+                    <a:stretch>
+                      <a:fillRect/>
+                    </a:stretch>
+                  </pic:blipFill>
+                  <pic:spPr>
+                    <a:xfrm>
+                      <a:off x="0" y="0"/>
+                      <a:ext cx="4572000" cy="3051810"/>
+                    </a:xfrm>
+                    <a:prstGeom prst="rect"/>
+                  </pic:spPr>
+                </pic:pic>
+              </a:graphicData>
+            </a:graphic>
+          </wp:inline>
+        </w:drawing>
+      </w:r>
+    </w:p>
+    <w:p>
+      <w:pPr>
         <w:spacing w:after="120" w:before="80"/>
       </w:pPr>
       <w:r>
@@ -847,6 +1053,46 @@
     </w:p>
     <w:p>
       <w:pPr>
+        <w:spacing w:before="120" w:after="160"/>
+        <w:jc w:val="center"/>
+      </w:pPr>
+      <w:r>
+        <w:drawing>
+          <wp:inline xmlns:a="http://schemas.openxmlformats.org/drawingml/2006/main" xmlns:pic="http://schemas.openxmlformats.org/drawingml/2006/picture">
+            <wp:extent cx="4572000" cy="3044190"/>
+            <wp:docPr id="7" name="Picture 7"/>
+            <wp:cNvGraphicFramePr>
+              <a:graphicFrameLocks noChangeAspect="1"/>
+            </wp:cNvGraphicFramePr>
+            <a:graphic>
+              <a:graphicData uri="http://schemas.openxmlformats.org/drawingml/2006/picture">
+                <pic:pic>
+                  <pic:nvPicPr>
+                    <pic:cNvPr id="0" name="image.jpg"/>
+                    <pic:cNvPicPr/>
+                  </pic:nvPicPr>
+                  <pic:blipFill>
+                    <a:blip r:embed="rId14"/>
+                    <a:stretch>
+                      <a:fillRect/>
+                    </a:stretch>
+                  </pic:blipFill>
+                  <pic:spPr>
+                    <a:xfrm>
+                      <a:off x="0" y="0"/>
+                      <a:ext cx="4572000" cy="3044190"/>
+                    </a:xfrm>
+                    <a:prstGeom prst="rect"/>
+                  </pic:spPr>
+                </pic:pic>
+              </a:graphicData>
+            </a:graphic>
+          </wp:inline>
+        </w:drawing>
+      </w:r>
+    </w:p>
+    <w:p>
+      <w:pPr>
         <w:spacing w:after="120" w:before="80"/>
       </w:pPr>
       <w:r>
@@ -1061,6 +1307,46 @@
           <w:color w:val="000000"/>
         </w:rPr>
         <w:t>Digital Marketing</w:t>
+      </w:r>
+    </w:p>
+    <w:p>
+      <w:pPr>
+        <w:spacing w:before="120" w:after="200"/>
+        <w:jc w:val="center"/>
+      </w:pPr>
+      <w:r>
+        <w:drawing>
+          <wp:inline xmlns:a="http://schemas.openxmlformats.org/drawingml/2006/main" xmlns:pic="http://schemas.openxmlformats.org/drawingml/2006/picture">
+            <wp:extent cx="5029200" cy="3352800"/>
+            <wp:docPr id="8" name="Picture 8"/>
+            <wp:cNvGraphicFramePr>
+              <a:graphicFrameLocks noChangeAspect="1"/>
+            </wp:cNvGraphicFramePr>
+            <a:graphic>
+              <a:graphicData uri="http://schemas.openxmlformats.org/drawingml/2006/picture">
+                <pic:pic>
+                  <pic:nvPicPr>
+                    <pic:cNvPr id="0" name="image.jpg"/>
+                    <pic:cNvPicPr/>
+                  </pic:nvPicPr>
+                  <pic:blipFill>
+                    <a:blip r:embed="rId15"/>
+                    <a:stretch>
+                      <a:fillRect/>
+                    </a:stretch>
+                  </pic:blipFill>
+                  <pic:spPr>
+                    <a:xfrm>
+                      <a:off x="0" y="0"/>
+                      <a:ext cx="5029200" cy="3352800"/>
+                    </a:xfrm>
+                    <a:prstGeom prst="rect"/>
+                  </pic:spPr>
+                </pic:pic>
+              </a:graphicData>
+            </a:graphic>
+          </wp:inline>
+        </w:drawing>
       </w:r>
     </w:p>
     <w:p>
@@ -1451,6 +1737,46 @@
     </w:p>
     <w:p>
       <w:pPr>
+        <w:spacing w:before="120" w:after="200"/>
+        <w:jc w:val="center"/>
+      </w:pPr>
+      <w:r>
+        <w:drawing>
+          <wp:inline xmlns:a="http://schemas.openxmlformats.org/drawingml/2006/main" xmlns:pic="http://schemas.openxmlformats.org/drawingml/2006/picture">
+            <wp:extent cx="4114800" cy="2743200"/>
+            <wp:docPr id="9" name="Picture 9"/>
+            <wp:cNvGraphicFramePr>
+              <a:graphicFrameLocks noChangeAspect="1"/>
+            </wp:cNvGraphicFramePr>
+            <a:graphic>
+              <a:graphicData uri="http://schemas.openxmlformats.org/drawingml/2006/picture">
+                <pic:pic>
+                  <pic:nvPicPr>
+                    <pic:cNvPr id="0" name="image.jpg"/>
+                    <pic:cNvPicPr/>
+                  </pic:nvPicPr>
+                  <pic:blipFill>
+                    <a:blip r:embed="rId16"/>
+                    <a:stretch>
+                      <a:fillRect/>
+                    </a:stretch>
+                  </pic:blipFill>
+                  <pic:spPr>
+                    <a:xfrm>
+                      <a:off x="0" y="0"/>
+                      <a:ext cx="4114800" cy="2743200"/>
+                    </a:xfrm>
+                    <a:prstGeom prst="rect"/>
+                  </pic:spPr>
+                </pic:pic>
+              </a:graphicData>
+            </a:graphic>
+          </wp:inline>
+        </w:drawing>
+      </w:r>
+    </w:p>
+    <w:p>
+      <w:pPr>
         <w:spacing w:after="120" w:before="80"/>
       </w:pPr>
       <w:r>
@@ -1520,9 +1846,9 @@
       </w:r>
     </w:p>
     <w:sectPr>
-      <w:footerReference w:type="default" r:id="rId10"/>
+      <w:footerReference w:type="default" r:id="rId17"/>
       <w:pgSz w:w="12240" w:h="15840"/>
-      <w:pgMar w:top="1417" w:right="1417" w:bottom="1417" w:left="1417" w:header="720" w:footer="720" w:gutter="0"/>
+      <w:pgMar w:top="1134" w:right="1134" w:bottom="1134" w:left="1134" w:header="720" w:footer="720" w:gutter="0"/>
       <w:cols w:space="720"/>
       <w:docGrid w:linePitch="360"/>
     </w:sectPr>

</xml_diff>

<commit_message>
Proposal: full content with small side icons, no large photos
Co-authored-by: fullstackwebdeveloper1000-coder <fullstackwebdeveloper1000-coder@users.noreply.github.com>
</commit_message>
<xml_diff>
--- a/CoLab_Space_Point_Digital_Agency_Proposal.docx
+++ b/CoLab_Space_Point_Digital_Agency_Proposal.docx
@@ -5,13 +5,12 @@
   <w:body>
     <w:p>
       <w:pPr>
-        <w:spacing w:before="160" w:after="240"/>
         <w:jc w:val="center"/>
       </w:pPr>
       <w:r>
         <w:drawing>
           <wp:inline xmlns:a="http://schemas.openxmlformats.org/drawingml/2006/main" xmlns:pic="http://schemas.openxmlformats.org/drawingml/2006/picture">
-            <wp:extent cx="5943600" cy="2170807"/>
+            <wp:extent cx="1280160" cy="309372"/>
             <wp:docPr id="1" name="Picture 1"/>
             <wp:cNvGraphicFramePr>
               <a:graphicFrameLocks noChangeAspect="1"/>
@@ -20,7 +19,7 @@
               <a:graphicData uri="http://schemas.openxmlformats.org/drawingml/2006/picture">
                 <pic:pic>
                   <pic:nvPicPr>
-                    <pic:cNvPr id="0" name="cover_banner.jpg"/>
+                    <pic:cNvPr id="0" name="logo.png"/>
                     <pic:cNvPicPr/>
                   </pic:nvPicPr>
                   <pic:blipFill>
@@ -32,7 +31,7 @@
                   <pic:spPr>
                     <a:xfrm>
                       <a:off x="0" y="0"/>
-                      <a:ext cx="5943600" cy="2170807"/>
+                      <a:ext cx="1280160" cy="309372"/>
                     </a:xfrm>
                     <a:prstGeom prst="rect"/>
                   </pic:spPr>
@@ -45,47 +44,7 @@
     </w:p>
     <w:p>
       <w:pPr>
-        <w:spacing w:before="160" w:after="240"/>
-        <w:jc w:val="center"/>
-      </w:pPr>
-      <w:r>
-        <w:drawing>
-          <wp:inline xmlns:a="http://schemas.openxmlformats.org/drawingml/2006/main" xmlns:pic="http://schemas.openxmlformats.org/drawingml/2006/picture">
-            <wp:extent cx="1828800" cy="441960"/>
-            <wp:docPr id="2" name="Picture 2"/>
-            <wp:cNvGraphicFramePr>
-              <a:graphicFrameLocks noChangeAspect="1"/>
-            </wp:cNvGraphicFramePr>
-            <a:graphic>
-              <a:graphicData uri="http://schemas.openxmlformats.org/drawingml/2006/picture">
-                <pic:pic>
-                  <pic:nvPicPr>
-                    <pic:cNvPr id="0" name="logo.png"/>
-                    <pic:cNvPicPr/>
-                  </pic:nvPicPr>
-                  <pic:blipFill>
-                    <a:blip r:embed="rId10"/>
-                    <a:stretch>
-                      <a:fillRect/>
-                    </a:stretch>
-                  </pic:blipFill>
-                  <pic:spPr>
-                    <a:xfrm>
-                      <a:off x="0" y="0"/>
-                      <a:ext cx="1828800" cy="441960"/>
-                    </a:xfrm>
-                    <a:prstGeom prst="rect"/>
-                  </pic:spPr>
-                </pic:pic>
-              </a:graphicData>
-            </a:graphic>
-          </wp:inline>
-        </w:drawing>
-      </w:r>
-    </w:p>
-    <w:p>
-      <w:pPr>
-        <w:spacing w:after="200"/>
+        <w:spacing w:after="80" w:before="40"/>
         <w:jc w:val="center"/>
       </w:pPr>
       <w:r>
@@ -93,14 +52,14 @@
           <w:rFonts w:ascii="Arial" w:hAnsi="Arial"/>
           <w:b/>
           <w:color w:val="06ACBA"/>
-          <w:sz w:val="32"/>
+          <w:sz w:val="28"/>
         </w:rPr>
         <w:t>CoLab Point</w:t>
       </w:r>
     </w:p>
     <w:p>
       <w:pPr>
-        <w:spacing w:after="200"/>
+        <w:spacing w:after="120" w:before="40"/>
         <w:jc w:val="center"/>
       </w:pPr>
       <w:r>
@@ -108,14 +67,14 @@
           <w:rFonts w:ascii="Arial" w:hAnsi="Arial"/>
           <w:b/>
           <w:color w:val="000000"/>
-          <w:sz w:val="56"/>
+          <w:sz w:val="52"/>
         </w:rPr>
         <w:t>CoLab Space Point</w:t>
       </w:r>
     </w:p>
     <w:p>
       <w:pPr>
-        <w:spacing w:after="200"/>
+        <w:spacing w:after="200" w:before="40"/>
         <w:jc w:val="center"/>
       </w:pPr>
       <w:r>
@@ -123,44 +82,14 @@
           <w:rFonts w:ascii="Arial" w:hAnsi="Arial"/>
           <w:b/>
           <w:color w:val="000000"/>
-          <w:sz w:val="36"/>
+          <w:sz w:val="32"/>
         </w:rPr>
         <w:t>Digital Agency Proposal</w:t>
       </w:r>
     </w:p>
     <w:p>
       <w:pPr>
-        <w:spacing w:after="200"/>
-        <w:jc w:val="center"/>
-      </w:pPr>
-      <w:r>
-        <w:rPr>
-          <w:rFonts w:ascii="Arial" w:hAnsi="Arial"/>
-          <w:b w:val="0"/>
-          <w:color w:val="000000"/>
-          <w:sz w:val="26"/>
-        </w:rPr>
-        <w:t>Website Designing &amp; Development  |  Digital Marketing</w:t>
-      </w:r>
-    </w:p>
-    <w:p>
-      <w:pPr>
-        <w:spacing w:after="200"/>
-        <w:jc w:val="center"/>
-      </w:pPr>
-      <w:r>
-        <w:rPr>
-          <w:rFonts w:ascii="Arial" w:hAnsi="Arial"/>
-          <w:b/>
-          <w:color w:val="04243C"/>
-          <w:sz w:val="26"/>
-        </w:rPr>
-        <w:t>www.colabpoint.com</w:t>
-      </w:r>
-    </w:p>
-    <w:p>
-      <w:pPr>
-        <w:spacing w:after="200"/>
+        <w:spacing w:after="120" w:before="40"/>
         <w:jc w:val="center"/>
       </w:pPr>
       <w:r>
@@ -170,12 +99,27 @@
           <w:color w:val="000000"/>
           <w:sz w:val="24"/>
         </w:rPr>
-        <w:t>+92 349 7684322  |  +92 478 986460</w:t>
+        <w:t>Website Designing &amp; Development  |  Digital Marketing</w:t>
       </w:r>
     </w:p>
     <w:p>
       <w:pPr>
-        <w:spacing w:after="200"/>
+        <w:spacing w:after="160" w:before="40"/>
+        <w:jc w:val="center"/>
+      </w:pPr>
+      <w:r>
+        <w:rPr>
+          <w:rFonts w:ascii="Arial" w:hAnsi="Arial"/>
+          <w:b/>
+          <w:color w:val="04243C"/>
+          <w:sz w:val="24"/>
+        </w:rPr>
+        <w:t>www.colabpoint.com</w:t>
+      </w:r>
+    </w:p>
+    <w:p>
+      <w:pPr>
+        <w:spacing w:after="60" w:before="40"/>
         <w:jc w:val="center"/>
       </w:pPr>
       <w:r>
@@ -183,14 +127,14 @@
           <w:rFonts w:ascii="Arial" w:hAnsi="Arial"/>
           <w:b w:val="0"/>
           <w:color w:val="000000"/>
-          <w:sz w:val="24"/>
+          <w:sz w:val="22"/>
         </w:rPr>
-        <w:t>colabpoint@gmail.com  |  hello@colabpoint.com</w:t>
+        <w:t>+92 349 7684322  |  +92 478 986460</w:t>
       </w:r>
     </w:p>
     <w:p>
       <w:pPr>
-        <w:spacing w:after="200"/>
+        <w:spacing w:after="60" w:before="40"/>
         <w:jc w:val="center"/>
       </w:pPr>
       <w:r>
@@ -198,7 +142,22 @@
           <w:rFonts w:ascii="Arial" w:hAnsi="Arial"/>
           <w:b w:val="0"/>
           <w:color w:val="000000"/>
-          <w:sz w:val="24"/>
+          <w:sz w:val="22"/>
+        </w:rPr>
+        <w:t>colabpoint@gmail.com  |  hello@colabpoint.com</w:t>
+      </w:r>
+    </w:p>
+    <w:p>
+      <w:pPr>
+        <w:spacing w:after="60" w:before="40"/>
+        <w:jc w:val="center"/>
+      </w:pPr>
+      <w:r>
+        <w:rPr>
+          <w:rFonts w:ascii="Arial" w:hAnsi="Arial"/>
+          <w:b w:val="0"/>
+          <w:color w:val="000000"/>
+          <w:sz w:val="22"/>
         </w:rPr>
         <w:t>2nd Floor Anwar Center, Madina Road Near Gymkhana, Gujrat, Pakistan</w:t>
       </w:r>
@@ -208,605 +167,300 @@
         <w:br w:type="page"/>
       </w:r>
     </w:p>
+    <w:tbl>
+      <w:tblPr>
+        <w:tblW w:type="auto" w:w="0"/>
+        <w:jc w:val="left"/>
+        <w:tblLook w:firstColumn="1" w:firstRow="1" w:lastColumn="0" w:lastRow="0" w:noHBand="0" w:noVBand="1" w:val="04A0"/>
+      </w:tblPr>
+      <w:tblGrid>
+        <w:gridCol w:w="907"/>
+        <w:gridCol w:w="8504"/>
+      </w:tblGrid>
+      <w:tr>
+        <w:tc>
+          <w:tcPr>
+            <w:tcW w:type="dxa" w:w="4873"/>
+          </w:tcPr>
+          <w:p>
+            <w:pPr>
+              <w:jc w:val="center"/>
+            </w:pPr>
+            <w:r>
+              <w:drawing>
+                <wp:inline xmlns:a="http://schemas.openxmlformats.org/drawingml/2006/main" xmlns:pic="http://schemas.openxmlformats.org/drawingml/2006/picture">
+                  <wp:extent cx="502920" cy="502920"/>
+                  <wp:docPr id="2" name="Picture 2"/>
+                  <wp:cNvGraphicFramePr>
+                    <a:graphicFrameLocks noChangeAspect="1"/>
+                  </wp:cNvGraphicFramePr>
+                  <a:graphic>
+                    <a:graphicData uri="http://schemas.openxmlformats.org/drawingml/2006/picture">
+                      <pic:pic>
+                        <pic:nvPicPr>
+                          <pic:cNvPr id="0" name="company.png"/>
+                          <pic:cNvPicPr/>
+                        </pic:nvPicPr>
+                        <pic:blipFill>
+                          <a:blip r:embed="rId10"/>
+                          <a:stretch>
+                            <a:fillRect/>
+                          </a:stretch>
+                        </pic:blipFill>
+                        <pic:spPr>
+                          <a:xfrm>
+                            <a:off x="0" y="0"/>
+                            <a:ext cx="502920" cy="502920"/>
+                          </a:xfrm>
+                          <a:prstGeom prst="rect"/>
+                        </pic:spPr>
+                      </pic:pic>
+                    </a:graphicData>
+                  </a:graphic>
+                </wp:inline>
+              </w:drawing>
+            </w:r>
+          </w:p>
+        </w:tc>
+        <w:tc>
+          <w:tcPr>
+            <w:tcW w:type="dxa" w:w="4873"/>
+          </w:tcPr>
+          <w:p>
+            <w:r>
+              <w:rPr>
+                <w:rFonts w:ascii="Arial" w:hAnsi="Arial"/>
+                <w:b/>
+                <w:color w:val="000000"/>
+                <w:sz w:val="36"/>
+              </w:rPr>
+              <w:t>Company Profile</w:t>
+            </w:r>
+          </w:p>
+          <w:p>
+            <w:r>
+              <w:rPr>
+                <w:rFonts w:ascii="Arial" w:hAnsi="Arial"/>
+                <w:b w:val="0"/>
+                <w:color w:val="04243C"/>
+                <w:sz w:val="22"/>
+              </w:rPr>
+              <w:t>Digital services from CoLab Point, Gujrat</w:t>
+            </w:r>
+          </w:p>
+        </w:tc>
+      </w:tr>
+    </w:tbl>
+    <w:p/>
     <w:p>
       <w:pPr>
-        <w:spacing w:before="280" w:after="120"/>
+        <w:spacing w:after="160" w:before="40"/>
+      </w:pPr>
+      <w:r>
+        <w:rPr>
+          <w:rFonts w:ascii="Arial" w:hAnsi="Arial"/>
+          <w:b w:val="0"/>
+          <w:color w:val="000000"/>
+          <w:sz w:val="24"/>
+        </w:rPr>
+        <w:t>CoLab Space Point is the digital services arm of CoLab Point, Gujrat. We build websites, e-commerce stores, and run performance marketing campaigns.</w:t>
+      </w:r>
+    </w:p>
+    <w:p>
+      <w:pPr>
+        <w:spacing w:after="200" w:before="40"/>
+      </w:pPr>
+      <w:r>
+        <w:rPr>
+          <w:rFonts w:ascii="Arial" w:hAnsi="Arial"/>
+          <w:b w:val="0"/>
+          <w:color w:val="000000"/>
+          <w:sz w:val="24"/>
+        </w:rPr>
+        <w:t>WordPress is our primary development platform. Custom solutions are available on request.</w:t>
+      </w:r>
+    </w:p>
+    <w:tbl>
+      <w:tblPr>
+        <w:tblW w:type="auto" w:w="0"/>
+        <w:jc w:val="left"/>
+        <w:tblLook w:firstColumn="1" w:firstRow="1" w:lastColumn="0" w:lastRow="0" w:noHBand="0" w:noVBand="1" w:val="04A0"/>
+      </w:tblPr>
+      <w:tblGrid>
+        <w:gridCol w:w="907"/>
+        <w:gridCol w:w="8504"/>
+      </w:tblGrid>
+      <w:tr>
+        <w:tc>
+          <w:tcPr>
+            <w:tcW w:type="dxa" w:w="4873"/>
+          </w:tcPr>
+          <w:p>
+            <w:pPr>
+              <w:jc w:val="center"/>
+            </w:pPr>
+            <w:r>
+              <w:drawing>
+                <wp:inline xmlns:a="http://schemas.openxmlformats.org/drawingml/2006/main" xmlns:pic="http://schemas.openxmlformats.org/drawingml/2006/picture">
+                  <wp:extent cx="502920" cy="502920"/>
+                  <wp:docPr id="3" name="Picture 3"/>
+                  <wp:cNvGraphicFramePr>
+                    <a:graphicFrameLocks noChangeAspect="1"/>
+                  </wp:cNvGraphicFramePr>
+                  <a:graphic>
+                    <a:graphicData uri="http://schemas.openxmlformats.org/drawingml/2006/picture">
+                      <pic:pic>
+                        <pic:nvPicPr>
+                          <pic:cNvPr id="0" name="website.png"/>
+                          <pic:cNvPicPr/>
+                        </pic:nvPicPr>
+                        <pic:blipFill>
+                          <a:blip r:embed="rId11"/>
+                          <a:stretch>
+                            <a:fillRect/>
+                          </a:stretch>
+                        </pic:blipFill>
+                        <pic:spPr>
+                          <a:xfrm>
+                            <a:off x="0" y="0"/>
+                            <a:ext cx="502920" cy="502920"/>
+                          </a:xfrm>
+                          <a:prstGeom prst="rect"/>
+                        </pic:spPr>
+                      </pic:pic>
+                    </a:graphicData>
+                  </a:graphic>
+                </wp:inline>
+              </w:drawing>
+            </w:r>
+          </w:p>
+        </w:tc>
+        <w:tc>
+          <w:tcPr>
+            <w:tcW w:type="dxa" w:w="4873"/>
+          </w:tcPr>
+          <w:p>
+            <w:r>
+              <w:rPr>
+                <w:rFonts w:ascii="Arial" w:hAnsi="Arial"/>
+                <w:b/>
+                <w:color w:val="000000"/>
+                <w:sz w:val="36"/>
+              </w:rPr>
+              <w:t>Website Designing &amp; Development</w:t>
+            </w:r>
+          </w:p>
+        </w:tc>
+      </w:tr>
+    </w:tbl>
+    <w:p/>
+    <w:p>
+      <w:r>
+        <w:br w:type="page"/>
+      </w:r>
+    </w:p>
+    <w:tbl>
+      <w:tblPr>
+        <w:tblW w:type="auto" w:w="0"/>
+        <w:jc w:val="left"/>
+        <w:tblLook w:firstColumn="1" w:firstRow="1" w:lastColumn="0" w:lastRow="0" w:noHBand="0" w:noVBand="1" w:val="04A0"/>
+      </w:tblPr>
+      <w:tblGrid>
+        <w:gridCol w:w="907"/>
+        <w:gridCol w:w="8504"/>
+      </w:tblGrid>
+      <w:tr>
+        <w:tc>
+          <w:tcPr>
+            <w:tcW w:type="dxa" w:w="4873"/>
+          </w:tcPr>
+          <w:p>
+            <w:pPr>
+              <w:jc w:val="center"/>
+            </w:pPr>
+            <w:r>
+              <w:drawing>
+                <wp:inline xmlns:a="http://schemas.openxmlformats.org/drawingml/2006/main" xmlns:pic="http://schemas.openxmlformats.org/drawingml/2006/picture">
+                  <wp:extent cx="502920" cy="502920"/>
+                  <wp:docPr id="4" name="Picture 4"/>
+                  <wp:cNvGraphicFramePr>
+                    <a:graphicFrameLocks noChangeAspect="1"/>
+                  </wp:cNvGraphicFramePr>
+                  <a:graphic>
+                    <a:graphicData uri="http://schemas.openxmlformats.org/drawingml/2006/picture">
+                      <pic:pic>
+                        <pic:nvPicPr>
+                          <pic:cNvPr id="0" name="basic.png"/>
+                          <pic:cNvPicPr/>
+                        </pic:nvPicPr>
+                        <pic:blipFill>
+                          <a:blip r:embed="rId12"/>
+                          <a:stretch>
+                            <a:fillRect/>
+                          </a:stretch>
+                        </pic:blipFill>
+                        <pic:spPr>
+                          <a:xfrm>
+                            <a:off x="0" y="0"/>
+                            <a:ext cx="502920" cy="502920"/>
+                          </a:xfrm>
+                          <a:prstGeom prst="rect"/>
+                        </pic:spPr>
+                      </pic:pic>
+                    </a:graphicData>
+                  </a:graphic>
+                </wp:inline>
+              </w:drawing>
+            </w:r>
+          </w:p>
+        </w:tc>
+        <w:tc>
+          <w:tcPr>
+            <w:tcW w:type="dxa" w:w="4873"/>
+          </w:tcPr>
+          <w:p>
+            <w:r>
+              <w:rPr>
+                <w:rFonts w:ascii="Arial" w:hAnsi="Arial"/>
+                <w:b/>
+                <w:color w:val="000000"/>
+                <w:sz w:val="36"/>
+              </w:rPr>
+              <w:t>BASIC WEBSITE — PKR 50,000</w:t>
+            </w:r>
+          </w:p>
+          <w:p>
+            <w:r>
+              <w:rPr>
+                <w:rFonts w:ascii="Arial" w:hAnsi="Arial"/>
+                <w:b w:val="0"/>
+                <w:color w:val="04243C"/>
+                <w:sz w:val="22"/>
+              </w:rPr>
+              <w:t>Package Price: PKR 50,000</w:t>
+            </w:r>
+          </w:p>
+        </w:tc>
+      </w:tr>
+    </w:tbl>
+    <w:p/>
+    <w:p>
+      <w:pPr>
+        <w:spacing w:after="160" w:before="40"/>
       </w:pPr>
       <w:r>
         <w:rPr>
           <w:rFonts w:ascii="Arial" w:hAnsi="Arial"/>
           <w:b/>
           <w:color w:val="000000"/>
-          <w:sz w:val="40"/>
+          <w:sz w:val="24"/>
         </w:rPr>
-        <w:t>Company Profile</w:t>
+        <w:t>Best for: Small businesses and startups</w:t>
       </w:r>
     </w:p>
     <w:p>
       <w:pPr>
-        <w:spacing w:before="160" w:after="240"/>
-        <w:jc w:val="center"/>
-      </w:pPr>
-      <w:r>
-        <w:drawing>
-          <wp:inline xmlns:a="http://schemas.openxmlformats.org/drawingml/2006/main" xmlns:pic="http://schemas.openxmlformats.org/drawingml/2006/picture">
-            <wp:extent cx="5943600" cy="3967353"/>
-            <wp:docPr id="3" name="Picture 3"/>
-            <wp:cNvGraphicFramePr>
-              <a:graphicFrameLocks noChangeAspect="1"/>
-            </wp:cNvGraphicFramePr>
-            <a:graphic>
-              <a:graphicData uri="http://schemas.openxmlformats.org/drawingml/2006/picture">
-                <pic:pic>
-                  <pic:nvPicPr>
-                    <pic:cNvPr id="0" name="office.png"/>
-                    <pic:cNvPicPr/>
-                  </pic:nvPicPr>
-                  <pic:blipFill>
-                    <a:blip r:embed="rId11"/>
-                    <a:stretch>
-                      <a:fillRect/>
-                    </a:stretch>
-                  </pic:blipFill>
-                  <pic:spPr>
-                    <a:xfrm>
-                      <a:off x="0" y="0"/>
-                      <a:ext cx="5943600" cy="3967353"/>
-                    </a:xfrm>
-                    <a:prstGeom prst="rect"/>
-                  </pic:spPr>
-                </pic:pic>
-              </a:graphicData>
-            </a:graphic>
-          </wp:inline>
-        </w:drawing>
-      </w:r>
-    </w:p>
-    <w:p>
-      <w:pPr>
-        <w:spacing w:after="200"/>
-      </w:pPr>
-      <w:r>
-        <w:rPr>
-          <w:rFonts w:ascii="Arial" w:hAnsi="Arial"/>
-          <w:b w:val="0"/>
-          <w:color w:val="000000"/>
-          <w:sz w:val="28"/>
-        </w:rPr>
-        <w:t>CoLab Space Point is the digital services arm of CoLab Point, Gujrat. We build websites, e-commerce stores, and run performance marketing campaigns.</w:t>
-      </w:r>
-    </w:p>
-    <w:p>
-      <w:pPr>
-        <w:spacing w:before="280" w:after="120"/>
-      </w:pPr>
-      <w:r>
-        <w:rPr>
-          <w:rFonts w:ascii="Arial" w:hAnsi="Arial"/>
-          <w:b/>
-          <w:color w:val="000000"/>
-          <w:sz w:val="40"/>
-        </w:rPr>
-        <w:t>Website Designing &amp; Development</w:t>
-      </w:r>
-    </w:p>
-    <w:p>
-      <w:pPr>
-        <w:spacing w:before="160" w:after="240"/>
-        <w:jc w:val="center"/>
-      </w:pPr>
-      <w:r>
-        <w:drawing>
-          <wp:inline xmlns:a="http://schemas.openxmlformats.org/drawingml/2006/main" xmlns:pic="http://schemas.openxmlformats.org/drawingml/2006/picture">
-            <wp:extent cx="5943600" cy="4234815"/>
-            <wp:docPr id="4" name="Picture 4"/>
-            <wp:cNvGraphicFramePr>
-              <a:graphicFrameLocks noChangeAspect="1"/>
-            </wp:cNvGraphicFramePr>
-            <a:graphic>
-              <a:graphicData uri="http://schemas.openxmlformats.org/drawingml/2006/picture">
-                <pic:pic>
-                  <pic:nvPicPr>
-                    <pic:cNvPr id="0" name="web_design.png"/>
-                    <pic:cNvPicPr/>
-                  </pic:nvPicPr>
-                  <pic:blipFill>
-                    <a:blip r:embed="rId12"/>
-                    <a:stretch>
-                      <a:fillRect/>
-                    </a:stretch>
-                  </pic:blipFill>
-                  <pic:spPr>
-                    <a:xfrm>
-                      <a:off x="0" y="0"/>
-                      <a:ext cx="5943600" cy="4234815"/>
-                    </a:xfrm>
-                    <a:prstGeom prst="rect"/>
-                  </pic:spPr>
-                </pic:pic>
-              </a:graphicData>
-            </a:graphic>
-          </wp:inline>
-        </w:drawing>
-      </w:r>
-    </w:p>
-    <w:p>
-      <w:r>
-        <w:br w:type="page"/>
-      </w:r>
-    </w:p>
-    <w:p>
-      <w:pPr>
-        <w:spacing w:before="280" w:after="120"/>
-      </w:pPr>
-      <w:r>
-        <w:rPr>
-          <w:rFonts w:ascii="Arial" w:hAnsi="Arial"/>
-          <w:b/>
-          <w:color w:val="000000"/>
-          <w:sz w:val="40"/>
-        </w:rPr>
-        <w:t>BASIC WEBSITE — PKR 50,000</w:t>
-      </w:r>
-    </w:p>
-    <w:p>
-      <w:pPr>
-        <w:spacing w:before="160" w:after="240"/>
-        <w:jc w:val="center"/>
-      </w:pPr>
-      <w:r>
-        <w:drawing>
-          <wp:inline xmlns:a="http://schemas.openxmlformats.org/drawingml/2006/main" xmlns:pic="http://schemas.openxmlformats.org/drawingml/2006/picture">
-            <wp:extent cx="5486400" cy="3909060"/>
-            <wp:docPr id="5" name="Picture 5"/>
-            <wp:cNvGraphicFramePr>
-              <a:graphicFrameLocks noChangeAspect="1"/>
-            </wp:cNvGraphicFramePr>
-            <a:graphic>
-              <a:graphicData uri="http://schemas.openxmlformats.org/drawingml/2006/picture">
-                <pic:pic>
-                  <pic:nvPicPr>
-                    <pic:cNvPr id="0" name="web_design.png"/>
-                    <pic:cNvPicPr/>
-                  </pic:nvPicPr>
-                  <pic:blipFill>
-                    <a:blip r:embed="rId12"/>
-                    <a:stretch>
-                      <a:fillRect/>
-                    </a:stretch>
-                  </pic:blipFill>
-                  <pic:spPr>
-                    <a:xfrm>
-                      <a:off x="0" y="0"/>
-                      <a:ext cx="5486400" cy="3909060"/>
-                    </a:xfrm>
-                    <a:prstGeom prst="rect"/>
-                  </pic:spPr>
-                </pic:pic>
-              </a:graphicData>
-            </a:graphic>
-          </wp:inline>
-        </w:drawing>
-      </w:r>
-    </w:p>
-    <w:p>
-      <w:pPr>
-        <w:spacing w:after="200"/>
-      </w:pPr>
-      <w:r>
-        <w:rPr>
-          <w:rFonts w:ascii="Arial" w:hAnsi="Arial"/>
-          <w:b/>
-          <w:color w:val="000000"/>
-          <w:sz w:val="26"/>
-        </w:rPr>
-        <w:t>Best for: Small businesses</w:t>
-      </w:r>
-    </w:p>
-    <w:p>
-      <w:pPr>
-        <w:spacing w:after="200"/>
-      </w:pPr>
-      <w:r>
-        <w:rPr>
-          <w:rFonts w:ascii="Arial" w:hAnsi="Arial"/>
-          <w:b/>
-          <w:color w:val="06ACBA"/>
-          <w:sz w:val="28"/>
-        </w:rPr>
-        <w:t>WHAT IS INCLUDED IN THIS PRICE:</w:t>
-      </w:r>
-    </w:p>
-    <w:p>
-      <w:pPr>
-        <w:spacing w:after="80"/>
-      </w:pPr>
-      <w:r>
-        <w:rPr>
-          <w:rFonts w:ascii="Arial" w:hAnsi="Arial"/>
-          <w:b w:val="0"/>
-          <w:color w:val="000000"/>
-          <w:sz w:val="26"/>
-        </w:rPr>
-        <w:t xml:space="preserve">  •  Up to 5 pages, WordPress, custom UI</w:t>
-      </w:r>
-    </w:p>
-    <w:p>
-      <w:pPr>
-        <w:spacing w:after="80"/>
-      </w:pPr>
-      <w:r>
-        <w:rPr>
-          <w:rFonts w:ascii="Arial" w:hAnsi="Arial"/>
-          <w:b w:val="0"/>
-          <w:color w:val="000000"/>
-          <w:sz w:val="26"/>
-        </w:rPr>
-        <w:t xml:space="preserve">  •  Contact form, WhatsApp, Analytics, SSL</w:t>
-      </w:r>
-    </w:p>
-    <w:p>
-      <w:pPr>
-        <w:spacing w:after="80"/>
-      </w:pPr>
-      <w:r>
-        <w:rPr>
-          <w:rFonts w:ascii="Arial" w:hAnsi="Arial"/>
-          <w:b w:val="0"/>
-          <w:color w:val="000000"/>
-          <w:sz w:val="26"/>
-        </w:rPr>
-        <w:t xml:space="preserve">  •  30 days support</w:t>
-      </w:r>
-    </w:p>
-    <w:p>
-      <w:pPr>
-        <w:spacing w:after="80"/>
-      </w:pPr>
-      <w:r>
-        <w:rPr>
-          <w:rFonts w:ascii="Arial" w:hAnsi="Arial"/>
-          <w:b w:val="0"/>
-          <w:color w:val="000000"/>
-          <w:sz w:val="26"/>
-        </w:rPr>
-        <w:t xml:space="preserve">  •  SEO &amp; e-commerce NOT included</w:t>
-      </w:r>
-    </w:p>
-    <w:p>
-      <w:r>
-        <w:br w:type="page"/>
-      </w:r>
-    </w:p>
-    <w:p>
-      <w:pPr>
-        <w:spacing w:before="280" w:after="120"/>
-      </w:pPr>
-      <w:r>
-        <w:rPr>
-          <w:rFonts w:ascii="Arial" w:hAnsi="Arial"/>
-          <w:b/>
-          <w:color w:val="000000"/>
-          <w:sz w:val="40"/>
-        </w:rPr>
-        <w:t>STANDARD WEBSITE — PKR 80,000</w:t>
-      </w:r>
-    </w:p>
-    <w:p>
-      <w:pPr>
-        <w:spacing w:before="160" w:after="240"/>
-        <w:jc w:val="center"/>
-      </w:pPr>
-      <w:r>
-        <w:drawing>
-          <wp:inline xmlns:a="http://schemas.openxmlformats.org/drawingml/2006/main" xmlns:pic="http://schemas.openxmlformats.org/drawingml/2006/picture">
-            <wp:extent cx="5486400" cy="3662172"/>
-            <wp:docPr id="6" name="Picture 6"/>
-            <wp:cNvGraphicFramePr>
-              <a:graphicFrameLocks noChangeAspect="1"/>
-            </wp:cNvGraphicFramePr>
-            <a:graphic>
-              <a:graphicData uri="http://schemas.openxmlformats.org/drawingml/2006/picture">
-                <pic:pic>
-                  <pic:nvPicPr>
-                    <pic:cNvPr id="0" name="ecommerce.png"/>
-                    <pic:cNvPicPr/>
-                  </pic:nvPicPr>
-                  <pic:blipFill>
-                    <a:blip r:embed="rId13"/>
-                    <a:stretch>
-                      <a:fillRect/>
-                    </a:stretch>
-                  </pic:blipFill>
-                  <pic:spPr>
-                    <a:xfrm>
-                      <a:off x="0" y="0"/>
-                      <a:ext cx="5486400" cy="3662172"/>
-                    </a:xfrm>
-                    <a:prstGeom prst="rect"/>
-                  </pic:spPr>
-                </pic:pic>
-              </a:graphicData>
-            </a:graphic>
-          </wp:inline>
-        </w:drawing>
-      </w:r>
-    </w:p>
-    <w:p>
-      <w:pPr>
-        <w:spacing w:after="200"/>
-      </w:pPr>
-      <w:r>
-        <w:rPr>
-          <w:rFonts w:ascii="Arial" w:hAnsi="Arial"/>
-          <w:b/>
-          <w:color w:val="000000"/>
-          <w:sz w:val="26"/>
-        </w:rPr>
-        <w:t>Best for: Growing brands</w:t>
-      </w:r>
-    </w:p>
-    <w:p>
-      <w:pPr>
-        <w:spacing w:after="200"/>
-      </w:pPr>
-      <w:r>
-        <w:rPr>
-          <w:rFonts w:ascii="Arial" w:hAnsi="Arial"/>
-          <w:b/>
-          <w:color w:val="06ACBA"/>
-          <w:sz w:val="28"/>
-        </w:rPr>
-        <w:t>WHAT IS INCLUDED IN THIS PRICE:</w:t>
-      </w:r>
-    </w:p>
-    <w:p>
-      <w:pPr>
-        <w:spacing w:after="80"/>
-      </w:pPr>
-      <w:r>
-        <w:rPr>
-          <w:rFonts w:ascii="Arial" w:hAnsi="Arial"/>
-          <w:b w:val="0"/>
-          <w:color w:val="000000"/>
-          <w:sz w:val="26"/>
-        </w:rPr>
-        <w:t xml:space="preserve">  •  Everything in Basic, plus 10 pages</w:t>
-      </w:r>
-    </w:p>
-    <w:p>
-      <w:pPr>
-        <w:spacing w:after="80"/>
-      </w:pPr>
-      <w:r>
-        <w:rPr>
-          <w:rFonts w:ascii="Arial" w:hAnsi="Arial"/>
-          <w:b w:val="0"/>
-          <w:color w:val="000000"/>
-          <w:sz w:val="26"/>
-        </w:rPr>
-        <w:t xml:space="preserve">  •  WooCommerce, payment gateway, blog</w:t>
-      </w:r>
-    </w:p>
-    <w:p>
-      <w:pPr>
-        <w:spacing w:after="80"/>
-      </w:pPr>
-      <w:r>
-        <w:rPr>
-          <w:rFonts w:ascii="Arial" w:hAnsi="Arial"/>
-          <w:b w:val="0"/>
-          <w:color w:val="000000"/>
-          <w:sz w:val="26"/>
-        </w:rPr>
-        <w:t xml:space="preserve">  •  Advanced SEO, Facebook Pixel, 60 days support</w:t>
-      </w:r>
-    </w:p>
-    <w:p>
-      <w:r>
-        <w:br w:type="page"/>
-      </w:r>
-    </w:p>
-    <w:p>
-      <w:pPr>
-        <w:spacing w:before="280" w:after="120"/>
-      </w:pPr>
-      <w:r>
-        <w:rPr>
-          <w:rFonts w:ascii="Arial" w:hAnsi="Arial"/>
-          <w:b/>
-          <w:color w:val="000000"/>
-          <w:sz w:val="40"/>
-        </w:rPr>
-        <w:t>PREMIUM WEBSITE — PKR 120,000</w:t>
-      </w:r>
-    </w:p>
-    <w:p>
-      <w:pPr>
-        <w:spacing w:before="160" w:after="240"/>
-        <w:jc w:val="center"/>
-      </w:pPr>
-      <w:r>
-        <w:drawing>
-          <wp:inline xmlns:a="http://schemas.openxmlformats.org/drawingml/2006/main" xmlns:pic="http://schemas.openxmlformats.org/drawingml/2006/picture">
-            <wp:extent cx="5486400" cy="3653028"/>
-            <wp:docPr id="7" name="Picture 7"/>
-            <wp:cNvGraphicFramePr>
-              <a:graphicFrameLocks noChangeAspect="1"/>
-            </wp:cNvGraphicFramePr>
-            <a:graphic>
-              <a:graphicData uri="http://schemas.openxmlformats.org/drawingml/2006/picture">
-                <pic:pic>
-                  <pic:nvPicPr>
-                    <pic:cNvPr id="0" name="premium_web.png"/>
-                    <pic:cNvPicPr/>
-                  </pic:nvPicPr>
-                  <pic:blipFill>
-                    <a:blip r:embed="rId14"/>
-                    <a:stretch>
-                      <a:fillRect/>
-                    </a:stretch>
-                  </pic:blipFill>
-                  <pic:spPr>
-                    <a:xfrm>
-                      <a:off x="0" y="0"/>
-                      <a:ext cx="5486400" cy="3653028"/>
-                    </a:xfrm>
-                    <a:prstGeom prst="rect"/>
-                  </pic:spPr>
-                </pic:pic>
-              </a:graphicData>
-            </a:graphic>
-          </wp:inline>
-        </w:drawing>
-      </w:r>
-    </w:p>
-    <w:p>
-      <w:pPr>
-        <w:spacing w:after="200"/>
-      </w:pPr>
-      <w:r>
-        <w:rPr>
-          <w:rFonts w:ascii="Arial" w:hAnsi="Arial"/>
-          <w:b/>
-          <w:color w:val="000000"/>
-          <w:sz w:val="26"/>
-        </w:rPr>
-        <w:t>Best for: Enterprises</w:t>
-      </w:r>
-    </w:p>
-    <w:p>
-      <w:pPr>
-        <w:spacing w:after="200"/>
-      </w:pPr>
-      <w:r>
-        <w:rPr>
-          <w:rFonts w:ascii="Arial" w:hAnsi="Arial"/>
-          <w:b/>
-          <w:color w:val="06ACBA"/>
-          <w:sz w:val="28"/>
-        </w:rPr>
-        <w:t>WHAT IS INCLUDED IN THIS PRICE:</w:t>
-      </w:r>
-    </w:p>
-    <w:p>
-      <w:pPr>
-        <w:spacing w:after="80"/>
-      </w:pPr>
-      <w:r>
-        <w:rPr>
-          <w:rFonts w:ascii="Arial" w:hAnsi="Arial"/>
-          <w:b w:val="0"/>
-          <w:color w:val="000000"/>
-          <w:sz w:val="26"/>
-        </w:rPr>
-        <w:t xml:space="preserve">  •  Everything in Standard, plus custom design</w:t>
-      </w:r>
-    </w:p>
-    <w:p>
-      <w:pPr>
-        <w:spacing w:after="80"/>
-      </w:pPr>
-      <w:r>
-        <w:rPr>
-          <w:rFonts w:ascii="Arial" w:hAnsi="Arial"/>
-          <w:b w:val="0"/>
-          <w:color w:val="000000"/>
-          <w:sz w:val="26"/>
-        </w:rPr>
-        <w:t xml:space="preserve">  •  CRM, booking, API integrations</w:t>
-      </w:r>
-    </w:p>
-    <w:p>
-      <w:pPr>
-        <w:spacing w:after="80"/>
-      </w:pPr>
-      <w:r>
-        <w:rPr>
-          <w:rFonts w:ascii="Arial" w:hAnsi="Arial"/>
-          <w:b w:val="0"/>
-          <w:color w:val="000000"/>
-          <w:sz w:val="26"/>
-        </w:rPr>
-        <w:t xml:space="preserve">  •  Premium security, admin training, 90 days support</w:t>
-      </w:r>
-    </w:p>
-    <w:p>
-      <w:r>
-        <w:br w:type="page"/>
-      </w:r>
-    </w:p>
-    <w:p>
-      <w:pPr>
-        <w:spacing w:before="280" w:after="120"/>
-      </w:pPr>
-      <w:r>
-        <w:rPr>
-          <w:rFonts w:ascii="Arial" w:hAnsi="Arial"/>
-          <w:b/>
-          <w:color w:val="000000"/>
-          <w:sz w:val="40"/>
-        </w:rPr>
-        <w:t>Digital Marketing</w:t>
-      </w:r>
-    </w:p>
-    <w:p>
-      <w:pPr>
-        <w:spacing w:before="160" w:after="240"/>
-        <w:jc w:val="center"/>
-      </w:pPr>
-      <w:r>
-        <w:drawing>
-          <wp:inline xmlns:a="http://schemas.openxmlformats.org/drawingml/2006/main" xmlns:pic="http://schemas.openxmlformats.org/drawingml/2006/picture">
-            <wp:extent cx="5943600" cy="3962400"/>
-            <wp:docPr id="8" name="Picture 8"/>
-            <wp:cNvGraphicFramePr>
-              <a:graphicFrameLocks noChangeAspect="1"/>
-            </wp:cNvGraphicFramePr>
-            <a:graphic>
-              <a:graphicData uri="http://schemas.openxmlformats.org/drawingml/2006/picture">
-                <pic:pic>
-                  <pic:nvPicPr>
-                    <pic:cNvPr id="0" name="digital_marketing.png"/>
-                    <pic:cNvPicPr/>
-                  </pic:nvPicPr>
-                  <pic:blipFill>
-                    <a:blip r:embed="rId15"/>
-                    <a:stretch>
-                      <a:fillRect/>
-                    </a:stretch>
-                  </pic:blipFill>
-                  <pic:spPr>
-                    <a:xfrm>
-                      <a:off x="0" y="0"/>
-                      <a:ext cx="5943600" cy="3962400"/>
-                    </a:xfrm>
-                    <a:prstGeom prst="rect"/>
-                  </pic:spPr>
-                </pic:pic>
-              </a:graphicData>
-            </a:graphic>
-          </wp:inline>
-        </w:drawing>
-      </w:r>
-    </w:p>
-    <w:p>
-      <w:pPr>
-        <w:spacing w:after="200"/>
-      </w:pPr>
-      <w:r>
-        <w:rPr>
-          <w:rFonts w:ascii="Arial" w:hAnsi="Arial"/>
-          <w:b/>
-          <w:color w:val="000000"/>
-          <w:sz w:val="30"/>
-        </w:rPr>
-        <w:t>BASIC — PKR 15,000 / month</w:t>
-      </w:r>
-    </w:p>
-    <w:p>
-      <w:pPr>
-        <w:spacing w:after="200"/>
+        <w:spacing w:after="120" w:before="40"/>
       </w:pPr>
       <w:r>
         <w:rPr>
@@ -815,87 +469,284 @@
           <w:color w:val="06ACBA"/>
           <w:sz w:val="26"/>
         </w:rPr>
-        <w:t>What is included:</w:t>
+        <w:t>WHAT IS INCLUDED IN THIS PRICE:</w:t>
       </w:r>
     </w:p>
     <w:p>
       <w:pPr>
-        <w:spacing w:after="80"/>
+        <w:spacing w:after="60" w:before="40"/>
       </w:pPr>
       <w:r>
         <w:rPr>
           <w:rFonts w:ascii="Arial" w:hAnsi="Arial"/>
           <w:b w:val="0"/>
           <w:color w:val="000000"/>
-          <w:sz w:val="26"/>
+          <w:sz w:val="24"/>
         </w:rPr>
-        <w:t xml:space="preserve">  •  Meta Ads</w:t>
+        <w:t xml:space="preserve">  •  Professional business website</w:t>
       </w:r>
     </w:p>
     <w:p>
       <w:pPr>
-        <w:spacing w:after="80"/>
+        <w:spacing w:after="60" w:before="40"/>
       </w:pPr>
       <w:r>
         <w:rPr>
           <w:rFonts w:ascii="Arial" w:hAnsi="Arial"/>
           <w:b w:val="0"/>
           <w:color w:val="000000"/>
-          <w:sz w:val="26"/>
+          <w:sz w:val="24"/>
         </w:rPr>
-        <w:t xml:space="preserve">  •  Audience targeting</w:t>
+        <w:t xml:space="preserve">  •  Up to 5 pages</w:t>
       </w:r>
     </w:p>
     <w:p>
       <w:pPr>
-        <w:spacing w:after="80"/>
+        <w:spacing w:after="60" w:before="40"/>
       </w:pPr>
       <w:r>
         <w:rPr>
           <w:rFonts w:ascii="Arial" w:hAnsi="Arial"/>
           <w:b w:val="0"/>
           <w:color w:val="000000"/>
-          <w:sz w:val="26"/>
+          <w:sz w:val="24"/>
         </w:rPr>
-        <w:t xml:space="preserve">  •  Optimization</w:t>
+        <w:t xml:space="preserve">  •  Responsive mobile design</w:t>
       </w:r>
     </w:p>
     <w:p>
       <w:pPr>
-        <w:spacing w:after="80"/>
+        <w:spacing w:after="60" w:before="40"/>
       </w:pPr>
       <w:r>
         <w:rPr>
           <w:rFonts w:ascii="Arial" w:hAnsi="Arial"/>
           <w:b w:val="0"/>
           <w:color w:val="000000"/>
-          <w:sz w:val="26"/>
+          <w:sz w:val="24"/>
         </w:rPr>
-        <w:t xml:space="preserve">  •  Monthly report</w:t>
+        <w:t xml:space="preserve">  •  WordPress CMS</w:t>
       </w:r>
     </w:p>
     <w:p>
       <w:pPr>
-        <w:spacing w:after="200"/>
+        <w:spacing w:after="60" w:before="40"/>
       </w:pPr>
+      <w:r>
+        <w:rPr>
+          <w:rFonts w:ascii="Arial" w:hAnsi="Arial"/>
+          <w:b w:val="0"/>
+          <w:color w:val="000000"/>
+          <w:sz w:val="24"/>
+        </w:rPr>
+        <w:t xml:space="preserve">  •  Custom UI</w:t>
+      </w:r>
     </w:p>
     <w:p>
       <w:pPr>
-        <w:spacing w:after="200"/>
+        <w:spacing w:after="60" w:before="40"/>
+      </w:pPr>
+      <w:r>
+        <w:rPr>
+          <w:rFonts w:ascii="Arial" w:hAnsi="Arial"/>
+          <w:b w:val="0"/>
+          <w:color w:val="000000"/>
+          <w:sz w:val="24"/>
+        </w:rPr>
+        <w:t xml:space="preserve">  •  Contact form</w:t>
+      </w:r>
+    </w:p>
+    <w:p>
+      <w:pPr>
+        <w:spacing w:after="60" w:before="40"/>
+      </w:pPr>
+      <w:r>
+        <w:rPr>
+          <w:rFonts w:ascii="Arial" w:hAnsi="Arial"/>
+          <w:b w:val="0"/>
+          <w:color w:val="000000"/>
+          <w:sz w:val="24"/>
+        </w:rPr>
+        <w:t xml:space="preserve">  •  WhatsApp integration</w:t>
+      </w:r>
+    </w:p>
+    <w:p>
+      <w:pPr>
+        <w:spacing w:after="60" w:before="40"/>
+      </w:pPr>
+      <w:r>
+        <w:rPr>
+          <w:rFonts w:ascii="Arial" w:hAnsi="Arial"/>
+          <w:b w:val="0"/>
+          <w:color w:val="000000"/>
+          <w:sz w:val="24"/>
+        </w:rPr>
+        <w:t xml:space="preserve">  •  Social media profile links</w:t>
+      </w:r>
+    </w:p>
+    <w:p>
+      <w:pPr>
+        <w:spacing w:after="60" w:before="40"/>
+      </w:pPr>
+      <w:r>
+        <w:rPr>
+          <w:rFonts w:ascii="Arial" w:hAnsi="Arial"/>
+          <w:b w:val="0"/>
+          <w:color w:val="000000"/>
+          <w:sz w:val="24"/>
+        </w:rPr>
+        <w:t xml:space="preserve">  •  Google Analytics setup</w:t>
+      </w:r>
+    </w:p>
+    <w:p>
+      <w:pPr>
+        <w:spacing w:after="60" w:before="40"/>
+      </w:pPr>
+      <w:r>
+        <w:rPr>
+          <w:rFonts w:ascii="Arial" w:hAnsi="Arial"/>
+          <w:b w:val="0"/>
+          <w:color w:val="000000"/>
+          <w:sz w:val="24"/>
+        </w:rPr>
+        <w:t xml:space="preserve">  •  SSL configuration</w:t>
+      </w:r>
+    </w:p>
+    <w:p>
+      <w:pPr>
+        <w:spacing w:after="60" w:before="40"/>
+      </w:pPr>
+      <w:r>
+        <w:rPr>
+          <w:rFonts w:ascii="Arial" w:hAnsi="Arial"/>
+          <w:b w:val="0"/>
+          <w:color w:val="000000"/>
+          <w:sz w:val="24"/>
+        </w:rPr>
+        <w:t xml:space="preserve">  •  30 days support</w:t>
+      </w:r>
+    </w:p>
+    <w:p>
+      <w:pPr>
+        <w:spacing w:after="200" w:before="40"/>
+      </w:pPr>
+      <w:r>
+        <w:rPr>
+          <w:rFonts w:ascii="Arial" w:hAnsi="Arial"/>
+          <w:b/>
+          <w:color w:val="04243C"/>
+          <w:sz w:val="24"/>
+        </w:rPr>
+        <w:t>IMPORTANT: SEO and e-commerce are NOT included in this package.</w:t>
+      </w:r>
+    </w:p>
+    <w:p>
+      <w:r>
+        <w:br w:type="page"/>
+      </w:r>
+    </w:p>
+    <w:tbl>
+      <w:tblPr>
+        <w:tblW w:type="auto" w:w="0"/>
+        <w:jc w:val="left"/>
+        <w:tblLook w:firstColumn="1" w:firstRow="1" w:lastColumn="0" w:lastRow="0" w:noHBand="0" w:noVBand="1" w:val="04A0"/>
+      </w:tblPr>
+      <w:tblGrid>
+        <w:gridCol w:w="907"/>
+        <w:gridCol w:w="8504"/>
+      </w:tblGrid>
+      <w:tr>
+        <w:tc>
+          <w:tcPr>
+            <w:tcW w:type="dxa" w:w="4873"/>
+          </w:tcPr>
+          <w:p>
+            <w:pPr>
+              <w:jc w:val="center"/>
+            </w:pPr>
+            <w:r>
+              <w:drawing>
+                <wp:inline xmlns:a="http://schemas.openxmlformats.org/drawingml/2006/main" xmlns:pic="http://schemas.openxmlformats.org/drawingml/2006/picture">
+                  <wp:extent cx="502920" cy="502920"/>
+                  <wp:docPr id="5" name="Picture 5"/>
+                  <wp:cNvGraphicFramePr>
+                    <a:graphicFrameLocks noChangeAspect="1"/>
+                  </wp:cNvGraphicFramePr>
+                  <a:graphic>
+                    <a:graphicData uri="http://schemas.openxmlformats.org/drawingml/2006/picture">
+                      <pic:pic>
+                        <pic:nvPicPr>
+                          <pic:cNvPr id="0" name="standard.png"/>
+                          <pic:cNvPicPr/>
+                        </pic:nvPicPr>
+                        <pic:blipFill>
+                          <a:blip r:embed="rId13"/>
+                          <a:stretch>
+                            <a:fillRect/>
+                          </a:stretch>
+                        </pic:blipFill>
+                        <pic:spPr>
+                          <a:xfrm>
+                            <a:off x="0" y="0"/>
+                            <a:ext cx="502920" cy="502920"/>
+                          </a:xfrm>
+                          <a:prstGeom prst="rect"/>
+                        </pic:spPr>
+                      </pic:pic>
+                    </a:graphicData>
+                  </a:graphic>
+                </wp:inline>
+              </w:drawing>
+            </w:r>
+          </w:p>
+        </w:tc>
+        <w:tc>
+          <w:tcPr>
+            <w:tcW w:type="dxa" w:w="4873"/>
+          </w:tcPr>
+          <w:p>
+            <w:r>
+              <w:rPr>
+                <w:rFonts w:ascii="Arial" w:hAnsi="Arial"/>
+                <w:b/>
+                <w:color w:val="000000"/>
+                <w:sz w:val="36"/>
+              </w:rPr>
+              <w:t>STANDARD WEBSITE — PKR 80,000</w:t>
+            </w:r>
+          </w:p>
+          <w:p>
+            <w:r>
+              <w:rPr>
+                <w:rFonts w:ascii="Arial" w:hAnsi="Arial"/>
+                <w:b w:val="0"/>
+                <w:color w:val="04243C"/>
+                <w:sz w:val="22"/>
+              </w:rPr>
+              <w:t>Package Price: PKR 80,000</w:t>
+            </w:r>
+          </w:p>
+        </w:tc>
+      </w:tr>
+    </w:tbl>
+    <w:p/>
+    <w:p>
+      <w:pPr>
+        <w:spacing w:after="160" w:before="40"/>
       </w:pPr>
       <w:r>
         <w:rPr>
           <w:rFonts w:ascii="Arial" w:hAnsi="Arial"/>
           <w:b/>
           <w:color w:val="000000"/>
-          <w:sz w:val="30"/>
+          <w:sz w:val="24"/>
         </w:rPr>
-        <w:t>STANDARD — PKR 30,000 / month</w:t>
+        <w:t>Best for: Growing brands and online sellers</w:t>
       </w:r>
     </w:p>
     <w:p>
       <w:pPr>
-        <w:spacing w:after="200"/>
+        <w:spacing w:after="120" w:before="40"/>
       </w:pPr>
       <w:r>
         <w:rPr>
@@ -904,87 +755,284 @@
           <w:color w:val="06ACBA"/>
           <w:sz w:val="26"/>
         </w:rPr>
-        <w:t>What is included:</w:t>
+        <w:t>WHAT IS INCLUDED IN THIS PRICE:</w:t>
       </w:r>
     </w:p>
     <w:p>
       <w:pPr>
-        <w:spacing w:after="80"/>
+        <w:spacing w:after="60" w:before="40"/>
       </w:pPr>
       <w:r>
         <w:rPr>
           <w:rFonts w:ascii="Arial" w:hAnsi="Arial"/>
           <w:b w:val="0"/>
           <w:color w:val="000000"/>
-          <w:sz w:val="26"/>
+          <w:sz w:val="24"/>
         </w:rPr>
-        <w:t xml:space="preserve">  •  Google + Meta Ads</w:t>
+        <w:t xml:space="preserve">  •  Everything in Basic Website, plus:</w:t>
       </w:r>
     </w:p>
     <w:p>
       <w:pPr>
-        <w:spacing w:after="80"/>
+        <w:spacing w:after="60" w:before="40"/>
       </w:pPr>
       <w:r>
         <w:rPr>
           <w:rFonts w:ascii="Arial" w:hAnsi="Arial"/>
           <w:b w:val="0"/>
           <w:color w:val="000000"/>
-          <w:sz w:val="26"/>
+          <w:sz w:val="24"/>
         </w:rPr>
-        <w:t xml:space="preserve">  •  Lead generation</w:t>
+        <w:t xml:space="preserve">  •  Up to 10 pages</w:t>
       </w:r>
     </w:p>
     <w:p>
       <w:pPr>
-        <w:spacing w:after="80"/>
+        <w:spacing w:after="60" w:before="40"/>
       </w:pPr>
       <w:r>
         <w:rPr>
           <w:rFonts w:ascii="Arial" w:hAnsi="Arial"/>
           <w:b w:val="0"/>
           <w:color w:val="000000"/>
-          <w:sz w:val="26"/>
+          <w:sz w:val="24"/>
         </w:rPr>
-        <w:t xml:space="preserve">  •  Conversion tracking</w:t>
+        <w:t xml:space="preserve">  •  Premium UI/UX design</w:t>
       </w:r>
     </w:p>
     <w:p>
       <w:pPr>
-        <w:spacing w:after="80"/>
+        <w:spacing w:after="60" w:before="40"/>
       </w:pPr>
       <w:r>
         <w:rPr>
           <w:rFonts w:ascii="Arial" w:hAnsi="Arial"/>
           <w:b w:val="0"/>
           <w:color w:val="000000"/>
-          <w:sz w:val="26"/>
+          <w:sz w:val="24"/>
         </w:rPr>
-        <w:t xml:space="preserve">  •  Monthly reports</w:t>
+        <w:t xml:space="preserve">  •  Blog section</w:t>
       </w:r>
     </w:p>
     <w:p>
       <w:pPr>
-        <w:spacing w:after="200"/>
+        <w:spacing w:after="60" w:before="40"/>
       </w:pPr>
+      <w:r>
+        <w:rPr>
+          <w:rFonts w:ascii="Arial" w:hAnsi="Arial"/>
+          <w:b w:val="0"/>
+          <w:color w:val="000000"/>
+          <w:sz w:val="24"/>
+        </w:rPr>
+        <w:t xml:space="preserve">  •  WooCommerce online store</w:t>
+      </w:r>
     </w:p>
     <w:p>
       <w:pPr>
-        <w:spacing w:after="200"/>
+        <w:spacing w:after="60" w:before="40"/>
+      </w:pPr>
+      <w:r>
+        <w:rPr>
+          <w:rFonts w:ascii="Arial" w:hAnsi="Arial"/>
+          <w:b w:val="0"/>
+          <w:color w:val="000000"/>
+          <w:sz w:val="24"/>
+        </w:rPr>
+        <w:t xml:space="preserve">  •  Product upload (initial batch)</w:t>
+      </w:r>
+    </w:p>
+    <w:p>
+      <w:pPr>
+        <w:spacing w:after="60" w:before="40"/>
+      </w:pPr>
+      <w:r>
+        <w:rPr>
+          <w:rFonts w:ascii="Arial" w:hAnsi="Arial"/>
+          <w:b w:val="0"/>
+          <w:color w:val="000000"/>
+          <w:sz w:val="24"/>
+        </w:rPr>
+        <w:t xml:space="preserve">  •  Payment gateway integration</w:t>
+      </w:r>
+    </w:p>
+    <w:p>
+      <w:pPr>
+        <w:spacing w:after="60" w:before="40"/>
+      </w:pPr>
+      <w:r>
+        <w:rPr>
+          <w:rFonts w:ascii="Arial" w:hAnsi="Arial"/>
+          <w:b w:val="0"/>
+          <w:color w:val="000000"/>
+          <w:sz w:val="24"/>
+        </w:rPr>
+        <w:t xml:space="preserve">  •  Google Search Console setup</w:t>
+      </w:r>
+    </w:p>
+    <w:p>
+      <w:pPr>
+        <w:spacing w:after="60" w:before="40"/>
+      </w:pPr>
+      <w:r>
+        <w:rPr>
+          <w:rFonts w:ascii="Arial" w:hAnsi="Arial"/>
+          <w:b w:val="0"/>
+          <w:color w:val="000000"/>
+          <w:sz w:val="24"/>
+        </w:rPr>
+        <w:t xml:space="preserve">  •  Facebook Pixel</w:t>
+      </w:r>
+    </w:p>
+    <w:p>
+      <w:pPr>
+        <w:spacing w:after="60" w:before="40"/>
+      </w:pPr>
+      <w:r>
+        <w:rPr>
+          <w:rFonts w:ascii="Arial" w:hAnsi="Arial"/>
+          <w:b w:val="0"/>
+          <w:color w:val="000000"/>
+          <w:sz w:val="24"/>
+        </w:rPr>
+        <w:t xml:space="preserve">  •  Advanced SEO</w:t>
+      </w:r>
+    </w:p>
+    <w:p>
+      <w:pPr>
+        <w:spacing w:after="60" w:before="40"/>
+      </w:pPr>
+      <w:r>
+        <w:rPr>
+          <w:rFonts w:ascii="Arial" w:hAnsi="Arial"/>
+          <w:b w:val="0"/>
+          <w:color w:val="000000"/>
+          <w:sz w:val="24"/>
+        </w:rPr>
+        <w:t xml:space="preserve">  •  Speed optimization</w:t>
+      </w:r>
+    </w:p>
+    <w:p>
+      <w:pPr>
+        <w:spacing w:after="60" w:before="40"/>
+      </w:pPr>
+      <w:r>
+        <w:rPr>
+          <w:rFonts w:ascii="Arial" w:hAnsi="Arial"/>
+          <w:b w:val="0"/>
+          <w:color w:val="000000"/>
+          <w:sz w:val="24"/>
+        </w:rPr>
+        <w:t xml:space="preserve">  •  60 days support</w:t>
+      </w:r>
+    </w:p>
+    <w:p>
+      <w:r>
+        <w:br w:type="page"/>
+      </w:r>
+    </w:p>
+    <w:tbl>
+      <w:tblPr>
+        <w:tblW w:type="auto" w:w="0"/>
+        <w:jc w:val="left"/>
+        <w:tblLook w:firstColumn="1" w:firstRow="1" w:lastColumn="0" w:lastRow="0" w:noHBand="0" w:noVBand="1" w:val="04A0"/>
+      </w:tblPr>
+      <w:tblGrid>
+        <w:gridCol w:w="907"/>
+        <w:gridCol w:w="8504"/>
+      </w:tblGrid>
+      <w:tr>
+        <w:tc>
+          <w:tcPr>
+            <w:tcW w:type="dxa" w:w="4873"/>
+          </w:tcPr>
+          <w:p>
+            <w:pPr>
+              <w:jc w:val="center"/>
+            </w:pPr>
+            <w:r>
+              <w:drawing>
+                <wp:inline xmlns:a="http://schemas.openxmlformats.org/drawingml/2006/main" xmlns:pic="http://schemas.openxmlformats.org/drawingml/2006/picture">
+                  <wp:extent cx="502920" cy="502920"/>
+                  <wp:docPr id="6" name="Picture 6"/>
+                  <wp:cNvGraphicFramePr>
+                    <a:graphicFrameLocks noChangeAspect="1"/>
+                  </wp:cNvGraphicFramePr>
+                  <a:graphic>
+                    <a:graphicData uri="http://schemas.openxmlformats.org/drawingml/2006/picture">
+                      <pic:pic>
+                        <pic:nvPicPr>
+                          <pic:cNvPr id="0" name="premium.png"/>
+                          <pic:cNvPicPr/>
+                        </pic:nvPicPr>
+                        <pic:blipFill>
+                          <a:blip r:embed="rId14"/>
+                          <a:stretch>
+                            <a:fillRect/>
+                          </a:stretch>
+                        </pic:blipFill>
+                        <pic:spPr>
+                          <a:xfrm>
+                            <a:off x="0" y="0"/>
+                            <a:ext cx="502920" cy="502920"/>
+                          </a:xfrm>
+                          <a:prstGeom prst="rect"/>
+                        </pic:spPr>
+                      </pic:pic>
+                    </a:graphicData>
+                  </a:graphic>
+                </wp:inline>
+              </w:drawing>
+            </w:r>
+          </w:p>
+        </w:tc>
+        <w:tc>
+          <w:tcPr>
+            <w:tcW w:type="dxa" w:w="4873"/>
+          </w:tcPr>
+          <w:p>
+            <w:r>
+              <w:rPr>
+                <w:rFonts w:ascii="Arial" w:hAnsi="Arial"/>
+                <w:b/>
+                <w:color w:val="000000"/>
+                <w:sz w:val="36"/>
+              </w:rPr>
+              <w:t>PREMIUM WEBSITE — PKR 120,000</w:t>
+            </w:r>
+          </w:p>
+          <w:p>
+            <w:r>
+              <w:rPr>
+                <w:rFonts w:ascii="Arial" w:hAnsi="Arial"/>
+                <w:b w:val="0"/>
+                <w:color w:val="04243C"/>
+                <w:sz w:val="22"/>
+              </w:rPr>
+              <w:t>Package Price: PKR 120,000</w:t>
+            </w:r>
+          </w:p>
+        </w:tc>
+      </w:tr>
+    </w:tbl>
+    <w:p/>
+    <w:p>
+      <w:pPr>
+        <w:spacing w:after="160" w:before="40"/>
       </w:pPr>
       <w:r>
         <w:rPr>
           <w:rFonts w:ascii="Arial" w:hAnsi="Arial"/>
           <w:b/>
           <w:color w:val="000000"/>
-          <w:sz w:val="30"/>
+          <w:sz w:val="24"/>
         </w:rPr>
-        <w:t>PREMIUM — PKR 50,000 / month</w:t>
+        <w:t>Best for: Established businesses and enterprises</w:t>
       </w:r>
     </w:p>
     <w:p>
       <w:pPr>
-        <w:spacing w:after="200"/>
+        <w:spacing w:after="120" w:before="40"/>
       </w:pPr>
       <w:r>
         <w:rPr>
@@ -993,82 +1041,574 @@
           <w:color w:val="06ACBA"/>
           <w:sz w:val="26"/>
         </w:rPr>
-        <w:t>What is included:</w:t>
+        <w:t>WHAT IS INCLUDED IN THIS PRICE:</w:t>
       </w:r>
     </w:p>
     <w:p>
       <w:pPr>
-        <w:spacing w:after="80"/>
+        <w:spacing w:after="60" w:before="40"/>
       </w:pPr>
       <w:r>
         <w:rPr>
           <w:rFonts w:ascii="Arial" w:hAnsi="Arial"/>
           <w:b w:val="0"/>
           <w:color w:val="000000"/>
-          <w:sz w:val="26"/>
+          <w:sz w:val="24"/>
         </w:rPr>
-        <w:t xml:space="preserve">  •  Google + Meta Ads</w:t>
+        <w:t xml:space="preserve">  •  Everything in Standard Website, plus:</w:t>
       </w:r>
     </w:p>
     <w:p>
       <w:pPr>
-        <w:spacing w:after="80"/>
+        <w:spacing w:after="60" w:before="40"/>
       </w:pPr>
       <w:r>
         <w:rPr>
           <w:rFonts w:ascii="Arial" w:hAnsi="Arial"/>
           <w:b w:val="0"/>
           <w:color w:val="000000"/>
-          <w:sz w:val="26"/>
+          <w:sz w:val="24"/>
+        </w:rPr>
+        <w:t xml:space="preserve">  •  Unlimited pages (agreed scope)</w:t>
+      </w:r>
+    </w:p>
+    <w:p>
+      <w:pPr>
+        <w:spacing w:after="60" w:before="40"/>
+      </w:pPr>
+      <w:r>
+        <w:rPr>
+          <w:rFonts w:ascii="Arial" w:hAnsi="Arial"/>
+          <w:b w:val="0"/>
+          <w:color w:val="000000"/>
+          <w:sz w:val="24"/>
+        </w:rPr>
+        <w:t xml:space="preserve">  •  Fully custom design</w:t>
+      </w:r>
+    </w:p>
+    <w:p>
+      <w:pPr>
+        <w:spacing w:after="60" w:before="40"/>
+      </w:pPr>
+      <w:r>
+        <w:rPr>
+          <w:rFonts w:ascii="Arial" w:hAnsi="Arial"/>
+          <w:b w:val="0"/>
+          <w:color w:val="000000"/>
+          <w:sz w:val="24"/>
+        </w:rPr>
+        <w:t xml:space="preserve">  •  Advanced WooCommerce setup</w:t>
+      </w:r>
+    </w:p>
+    <w:p>
+      <w:pPr>
+        <w:spacing w:after="60" w:before="40"/>
+      </w:pPr>
+      <w:r>
+        <w:rPr>
+          <w:rFonts w:ascii="Arial" w:hAnsi="Arial"/>
+          <w:b w:val="0"/>
+          <w:color w:val="000000"/>
+          <w:sz w:val="24"/>
+        </w:rPr>
+        <w:t xml:space="preserve">  •  Unlimited product catalog setup</w:t>
+      </w:r>
+    </w:p>
+    <w:p>
+      <w:pPr>
+        <w:spacing w:after="60" w:before="40"/>
+      </w:pPr>
+      <w:r>
+        <w:rPr>
+          <w:rFonts w:ascii="Arial" w:hAnsi="Arial"/>
+          <w:b w:val="0"/>
+          <w:color w:val="000000"/>
+          <w:sz w:val="24"/>
+        </w:rPr>
+        <w:t xml:space="preserve">  •  CRM integration</w:t>
+      </w:r>
+    </w:p>
+    <w:p>
+      <w:pPr>
+        <w:spacing w:after="60" w:before="40"/>
+      </w:pPr>
+      <w:r>
+        <w:rPr>
+          <w:rFonts w:ascii="Arial" w:hAnsi="Arial"/>
+          <w:b w:val="0"/>
+          <w:color w:val="000000"/>
+          <w:sz w:val="24"/>
+        </w:rPr>
+        <w:t xml:space="preserve">  •  Booking / appointment system</w:t>
+      </w:r>
+    </w:p>
+    <w:p>
+      <w:pPr>
+        <w:spacing w:after="60" w:before="40"/>
+      </w:pPr>
+      <w:r>
+        <w:rPr>
+          <w:rFonts w:ascii="Arial" w:hAnsi="Arial"/>
+          <w:b w:val="0"/>
+          <w:color w:val="000000"/>
+          <w:sz w:val="24"/>
+        </w:rPr>
+        <w:t xml:space="preserve">  •  API integrations</w:t>
+      </w:r>
+    </w:p>
+    <w:p>
+      <w:pPr>
+        <w:spacing w:after="60" w:before="40"/>
+      </w:pPr>
+      <w:r>
+        <w:rPr>
+          <w:rFonts w:ascii="Arial" w:hAnsi="Arial"/>
+          <w:b w:val="0"/>
+          <w:color w:val="000000"/>
+          <w:sz w:val="24"/>
+        </w:rPr>
+        <w:t xml:space="preserve">  •  Premium security and performance optimization</w:t>
+      </w:r>
+    </w:p>
+    <w:p>
+      <w:pPr>
+        <w:spacing w:after="60" w:before="40"/>
+      </w:pPr>
+      <w:r>
+        <w:rPr>
+          <w:rFonts w:ascii="Arial" w:hAnsi="Arial"/>
+          <w:b w:val="0"/>
+          <w:color w:val="000000"/>
+          <w:sz w:val="24"/>
+        </w:rPr>
+        <w:t xml:space="preserve">  •  Admin training</w:t>
+      </w:r>
+    </w:p>
+    <w:p>
+      <w:pPr>
+        <w:spacing w:after="60" w:before="40"/>
+      </w:pPr>
+      <w:r>
+        <w:rPr>
+          <w:rFonts w:ascii="Arial" w:hAnsi="Arial"/>
+          <w:b w:val="0"/>
+          <w:color w:val="000000"/>
+          <w:sz w:val="24"/>
+        </w:rPr>
+        <w:t xml:space="preserve">  •  90 days priority support</w:t>
+      </w:r>
+    </w:p>
+    <w:p>
+      <w:r>
+        <w:br w:type="page"/>
+      </w:r>
+    </w:p>
+    <w:tbl>
+      <w:tblPr>
+        <w:tblW w:type="auto" w:w="0"/>
+        <w:jc w:val="left"/>
+        <w:tblLook w:firstColumn="1" w:firstRow="1" w:lastColumn="0" w:lastRow="0" w:noHBand="0" w:noVBand="1" w:val="04A0"/>
+      </w:tblPr>
+      <w:tblGrid>
+        <w:gridCol w:w="907"/>
+        <w:gridCol w:w="8504"/>
+      </w:tblGrid>
+      <w:tr>
+        <w:tc>
+          <w:tcPr>
+            <w:tcW w:type="dxa" w:w="4873"/>
+          </w:tcPr>
+          <w:p>
+            <w:pPr>
+              <w:jc w:val="center"/>
+            </w:pPr>
+            <w:r>
+              <w:drawing>
+                <wp:inline xmlns:a="http://schemas.openxmlformats.org/drawingml/2006/main" xmlns:pic="http://schemas.openxmlformats.org/drawingml/2006/picture">
+                  <wp:extent cx="502920" cy="502920"/>
+                  <wp:docPr id="7" name="Picture 7"/>
+                  <wp:cNvGraphicFramePr>
+                    <a:graphicFrameLocks noChangeAspect="1"/>
+                  </wp:cNvGraphicFramePr>
+                  <a:graphic>
+                    <a:graphicData uri="http://schemas.openxmlformats.org/drawingml/2006/picture">
+                      <pic:pic>
+                        <pic:nvPicPr>
+                          <pic:cNvPr id="0" name="marketing.png"/>
+                          <pic:cNvPicPr/>
+                        </pic:nvPicPr>
+                        <pic:blipFill>
+                          <a:blip r:embed="rId15"/>
+                          <a:stretch>
+                            <a:fillRect/>
+                          </a:stretch>
+                        </pic:blipFill>
+                        <pic:spPr>
+                          <a:xfrm>
+                            <a:off x="0" y="0"/>
+                            <a:ext cx="502920" cy="502920"/>
+                          </a:xfrm>
+                          <a:prstGeom prst="rect"/>
+                        </pic:spPr>
+                      </pic:pic>
+                    </a:graphicData>
+                  </a:graphic>
+                </wp:inline>
+              </w:drawing>
+            </w:r>
+          </w:p>
+        </w:tc>
+        <w:tc>
+          <w:tcPr>
+            <w:tcW w:type="dxa" w:w="4873"/>
+          </w:tcPr>
+          <w:p>
+            <w:r>
+              <w:rPr>
+                <w:rFonts w:ascii="Arial" w:hAnsi="Arial"/>
+                <w:b/>
+                <w:color w:val="000000"/>
+                <w:sz w:val="36"/>
+              </w:rPr>
+              <w:t>Digital Marketing</w:t>
+            </w:r>
+          </w:p>
+          <w:p>
+            <w:r>
+              <w:rPr>
+                <w:rFonts w:ascii="Arial" w:hAnsi="Arial"/>
+                <w:b w:val="0"/>
+                <w:color w:val="04243C"/>
+                <w:sz w:val="22"/>
+              </w:rPr>
+              <w:t>Monthly packages</w:t>
+            </w:r>
+          </w:p>
+        </w:tc>
+      </w:tr>
+    </w:tbl>
+    <w:p/>
+    <w:p>
+      <w:pPr>
+        <w:spacing w:after="160" w:before="40"/>
+      </w:pPr>
+      <w:r>
+        <w:rPr>
+          <w:rFonts w:ascii="Arial" w:hAnsi="Arial"/>
+          <w:b/>
+          <w:color w:val="000000"/>
+          <w:sz w:val="28"/>
+        </w:rPr>
+        <w:t>BASIC — PKR 15,000 / month</w:t>
+      </w:r>
+    </w:p>
+    <w:p>
+      <w:pPr>
+        <w:spacing w:after="80" w:before="40"/>
+      </w:pPr>
+      <w:r>
+        <w:rPr>
+          <w:rFonts w:ascii="Arial" w:hAnsi="Arial"/>
+          <w:b/>
+          <w:color w:val="06ACBA"/>
+          <w:sz w:val="24"/>
+        </w:rPr>
+        <w:t>What is included:</w:t>
+      </w:r>
+    </w:p>
+    <w:p>
+      <w:pPr>
+        <w:spacing w:after="60" w:before="40"/>
+      </w:pPr>
+      <w:r>
+        <w:rPr>
+          <w:rFonts w:ascii="Arial" w:hAnsi="Arial"/>
+          <w:b w:val="0"/>
+          <w:color w:val="000000"/>
+          <w:sz w:val="24"/>
+        </w:rPr>
+        <w:t xml:space="preserve">  •  Meta Ads</w:t>
+      </w:r>
+    </w:p>
+    <w:p>
+      <w:pPr>
+        <w:spacing w:after="60" w:before="40"/>
+      </w:pPr>
+      <w:r>
+        <w:rPr>
+          <w:rFonts w:ascii="Arial" w:hAnsi="Arial"/>
+          <w:b w:val="0"/>
+          <w:color w:val="000000"/>
+          <w:sz w:val="24"/>
+        </w:rPr>
+        <w:t xml:space="preserve">  •  Audience targeting</w:t>
+      </w:r>
+    </w:p>
+    <w:p>
+      <w:pPr>
+        <w:spacing w:after="60" w:before="40"/>
+      </w:pPr>
+      <w:r>
+        <w:rPr>
+          <w:rFonts w:ascii="Arial" w:hAnsi="Arial"/>
+          <w:b w:val="0"/>
+          <w:color w:val="000000"/>
+          <w:sz w:val="24"/>
+        </w:rPr>
+        <w:t xml:space="preserve">  •  Campaign optimization</w:t>
+      </w:r>
+    </w:p>
+    <w:p>
+      <w:pPr>
+        <w:spacing w:after="60" w:before="40"/>
+      </w:pPr>
+      <w:r>
+        <w:rPr>
+          <w:rFonts w:ascii="Arial" w:hAnsi="Arial"/>
+          <w:b w:val="0"/>
+          <w:color w:val="000000"/>
+          <w:sz w:val="24"/>
+        </w:rPr>
+        <w:t xml:space="preserve">  •  Monthly reporting</w:t>
+      </w:r>
+    </w:p>
+    <w:p>
+      <w:pPr>
+        <w:spacing w:after="120" w:before="40"/>
+      </w:pPr>
+    </w:p>
+    <w:p>
+      <w:pPr>
+        <w:spacing w:after="160" w:before="40"/>
+      </w:pPr>
+      <w:r>
+        <w:rPr>
+          <w:rFonts w:ascii="Arial" w:hAnsi="Arial"/>
+          <w:b/>
+          <w:color w:val="000000"/>
+          <w:sz w:val="28"/>
+        </w:rPr>
+        <w:t>STANDARD — PKR 30,000 / month</w:t>
+      </w:r>
+    </w:p>
+    <w:p>
+      <w:pPr>
+        <w:spacing w:after="80" w:before="40"/>
+      </w:pPr>
+      <w:r>
+        <w:rPr>
+          <w:rFonts w:ascii="Arial" w:hAnsi="Arial"/>
+          <w:b/>
+          <w:color w:val="06ACBA"/>
+          <w:sz w:val="24"/>
+        </w:rPr>
+        <w:t>What is included:</w:t>
+      </w:r>
+    </w:p>
+    <w:p>
+      <w:pPr>
+        <w:spacing w:after="60" w:before="40"/>
+      </w:pPr>
+      <w:r>
+        <w:rPr>
+          <w:rFonts w:ascii="Arial" w:hAnsi="Arial"/>
+          <w:b w:val="0"/>
+          <w:color w:val="000000"/>
+          <w:sz w:val="24"/>
+        </w:rPr>
+        <w:t xml:space="preserve">  •  Google Ads + Meta Ads</w:t>
+      </w:r>
+    </w:p>
+    <w:p>
+      <w:pPr>
+        <w:spacing w:after="60" w:before="40"/>
+      </w:pPr>
+      <w:r>
+        <w:rPr>
+          <w:rFonts w:ascii="Arial" w:hAnsi="Arial"/>
+          <w:b w:val="0"/>
+          <w:color w:val="000000"/>
+          <w:sz w:val="24"/>
+        </w:rPr>
+        <w:t xml:space="preserve">  •  Lead generation</w:t>
+      </w:r>
+    </w:p>
+    <w:p>
+      <w:pPr>
+        <w:spacing w:after="60" w:before="40"/>
+      </w:pPr>
+      <w:r>
+        <w:rPr>
+          <w:rFonts w:ascii="Arial" w:hAnsi="Arial"/>
+          <w:b w:val="0"/>
+          <w:color w:val="000000"/>
+          <w:sz w:val="24"/>
+        </w:rPr>
+        <w:t xml:space="preserve">  •  Conversion tracking</w:t>
+      </w:r>
+    </w:p>
+    <w:p>
+      <w:pPr>
+        <w:spacing w:after="60" w:before="40"/>
+      </w:pPr>
+      <w:r>
+        <w:rPr>
+          <w:rFonts w:ascii="Arial" w:hAnsi="Arial"/>
+          <w:b w:val="0"/>
+          <w:color w:val="000000"/>
+          <w:sz w:val="24"/>
+        </w:rPr>
+        <w:t xml:space="preserve">  •  Landing page recommendations</w:t>
+      </w:r>
+    </w:p>
+    <w:p>
+      <w:pPr>
+        <w:spacing w:after="60" w:before="40"/>
+      </w:pPr>
+      <w:r>
+        <w:rPr>
+          <w:rFonts w:ascii="Arial" w:hAnsi="Arial"/>
+          <w:b w:val="0"/>
+          <w:color w:val="000000"/>
+          <w:sz w:val="24"/>
+        </w:rPr>
+        <w:t xml:space="preserve">  •  Monthly reports</w:t>
+      </w:r>
+    </w:p>
+    <w:p>
+      <w:pPr>
+        <w:spacing w:after="120" w:before="40"/>
+      </w:pPr>
+    </w:p>
+    <w:p>
+      <w:pPr>
+        <w:spacing w:after="160" w:before="40"/>
+      </w:pPr>
+      <w:r>
+        <w:rPr>
+          <w:rFonts w:ascii="Arial" w:hAnsi="Arial"/>
+          <w:b/>
+          <w:color w:val="000000"/>
+          <w:sz w:val="28"/>
+        </w:rPr>
+        <w:t>PREMIUM — PKR 50,000 / month</w:t>
+      </w:r>
+    </w:p>
+    <w:p>
+      <w:pPr>
+        <w:spacing w:after="80" w:before="40"/>
+      </w:pPr>
+      <w:r>
+        <w:rPr>
+          <w:rFonts w:ascii="Arial" w:hAnsi="Arial"/>
+          <w:b/>
+          <w:color w:val="06ACBA"/>
+          <w:sz w:val="24"/>
+        </w:rPr>
+        <w:t>What is included:</w:t>
+      </w:r>
+    </w:p>
+    <w:p>
+      <w:pPr>
+        <w:spacing w:after="60" w:before="40"/>
+      </w:pPr>
+      <w:r>
+        <w:rPr>
+          <w:rFonts w:ascii="Arial" w:hAnsi="Arial"/>
+          <w:b w:val="0"/>
+          <w:color w:val="000000"/>
+          <w:sz w:val="24"/>
+        </w:rPr>
+        <w:t xml:space="preserve">  •  Google Ads + Meta Ads</w:t>
+      </w:r>
+    </w:p>
+    <w:p>
+      <w:pPr>
+        <w:spacing w:after="60" w:before="40"/>
+      </w:pPr>
+      <w:r>
+        <w:rPr>
+          <w:rFonts w:ascii="Arial" w:hAnsi="Arial"/>
+          <w:b w:val="0"/>
+          <w:color w:val="000000"/>
+          <w:sz w:val="24"/>
         </w:rPr>
         <w:t xml:space="preserve">  •  SEO</w:t>
       </w:r>
     </w:p>
     <w:p>
       <w:pPr>
-        <w:spacing w:after="80"/>
+        <w:spacing w:after="60" w:before="40"/>
       </w:pPr>
       <w:r>
         <w:rPr>
           <w:rFonts w:ascii="Arial" w:hAnsi="Arial"/>
           <w:b w:val="0"/>
           <w:color w:val="000000"/>
-          <w:sz w:val="26"/>
+          <w:sz w:val="24"/>
         </w:rPr>
         <w:t xml:space="preserve">  •  Remarketing</w:t>
       </w:r>
     </w:p>
     <w:p>
       <w:pPr>
-        <w:spacing w:after="80"/>
+        <w:spacing w:after="60" w:before="40"/>
       </w:pPr>
       <w:r>
         <w:rPr>
           <w:rFonts w:ascii="Arial" w:hAnsi="Arial"/>
           <w:b w:val="0"/>
           <w:color w:val="000000"/>
-          <w:sz w:val="26"/>
+          <w:sz w:val="24"/>
+        </w:rPr>
+        <w:t xml:space="preserve">  •  Conversion optimization</w:t>
+      </w:r>
+    </w:p>
+    <w:p>
+      <w:pPr>
+        <w:spacing w:after="60" w:before="40"/>
+      </w:pPr>
+      <w:r>
+        <w:rPr>
+          <w:rFonts w:ascii="Arial" w:hAnsi="Arial"/>
+          <w:b w:val="0"/>
+          <w:color w:val="000000"/>
+          <w:sz w:val="24"/>
+        </w:rPr>
+        <w:t xml:space="preserve">  •  Marketing strategy</w:t>
+      </w:r>
+    </w:p>
+    <w:p>
+      <w:pPr>
+        <w:spacing w:after="60" w:before="40"/>
+      </w:pPr>
+      <w:r>
+        <w:rPr>
+          <w:rFonts w:ascii="Arial" w:hAnsi="Arial"/>
+          <w:b w:val="0"/>
+          <w:color w:val="000000"/>
+          <w:sz w:val="24"/>
         </w:rPr>
         <w:t xml:space="preserve">  •  Weekly meetings</w:t>
       </w:r>
     </w:p>
     <w:p>
       <w:pPr>
-        <w:spacing w:after="80"/>
+        <w:spacing w:after="60" w:before="40"/>
       </w:pPr>
       <w:r>
         <w:rPr>
           <w:rFonts w:ascii="Arial" w:hAnsi="Arial"/>
           <w:b w:val="0"/>
           <w:color w:val="000000"/>
-          <w:sz w:val="26"/>
+          <w:sz w:val="24"/>
         </w:rPr>
         <w:t xml:space="preserve">  •  Detailed reports</w:t>
       </w:r>
     </w:p>
     <w:p>
       <w:pPr>
-        <w:spacing w:after="200"/>
+        <w:spacing w:after="120" w:before="40"/>
       </w:pPr>
     </w:p>
     <w:p>
@@ -1076,138 +1616,179 @@
         <w:br w:type="page"/>
       </w:r>
     </w:p>
+    <w:tbl>
+      <w:tblPr>
+        <w:tblW w:type="auto" w:w="0"/>
+        <w:jc w:val="left"/>
+        <w:tblLook w:firstColumn="1" w:firstRow="1" w:lastColumn="0" w:lastRow="0" w:noHBand="0" w:noVBand="1" w:val="04A0"/>
+      </w:tblPr>
+      <w:tblGrid>
+        <w:gridCol w:w="907"/>
+        <w:gridCol w:w="8504"/>
+      </w:tblGrid>
+      <w:tr>
+        <w:tc>
+          <w:tcPr>
+            <w:tcW w:type="dxa" w:w="4873"/>
+          </w:tcPr>
+          <w:p>
+            <w:pPr>
+              <w:jc w:val="center"/>
+            </w:pPr>
+            <w:r>
+              <w:drawing>
+                <wp:inline xmlns:a="http://schemas.openxmlformats.org/drawingml/2006/main" xmlns:pic="http://schemas.openxmlformats.org/drawingml/2006/picture">
+                  <wp:extent cx="502920" cy="502920"/>
+                  <wp:docPr id="8" name="Picture 8"/>
+                  <wp:cNvGraphicFramePr>
+                    <a:graphicFrameLocks noChangeAspect="1"/>
+                  </wp:cNvGraphicFramePr>
+                  <a:graphic>
+                    <a:graphicData uri="http://schemas.openxmlformats.org/drawingml/2006/picture">
+                      <pic:pic>
+                        <pic:nvPicPr>
+                          <pic:cNvPr id="0" name="contact.png"/>
+                          <pic:cNvPicPr/>
+                        </pic:nvPicPr>
+                        <pic:blipFill>
+                          <a:blip r:embed="rId16"/>
+                          <a:stretch>
+                            <a:fillRect/>
+                          </a:stretch>
+                        </pic:blipFill>
+                        <pic:spPr>
+                          <a:xfrm>
+                            <a:off x="0" y="0"/>
+                            <a:ext cx="502920" cy="502920"/>
+                          </a:xfrm>
+                          <a:prstGeom prst="rect"/>
+                        </pic:spPr>
+                      </pic:pic>
+                    </a:graphicData>
+                  </a:graphic>
+                </wp:inline>
+              </w:drawing>
+            </w:r>
+          </w:p>
+        </w:tc>
+        <w:tc>
+          <w:tcPr>
+            <w:tcW w:type="dxa" w:w="4873"/>
+          </w:tcPr>
+          <w:p>
+            <w:r>
+              <w:rPr>
+                <w:rFonts w:ascii="Arial" w:hAnsi="Arial"/>
+                <w:b/>
+                <w:color w:val="000000"/>
+                <w:sz w:val="36"/>
+              </w:rPr>
+              <w:t>Contact</w:t>
+            </w:r>
+          </w:p>
+        </w:tc>
+      </w:tr>
+    </w:tbl>
+    <w:p/>
     <w:p>
       <w:pPr>
-        <w:spacing w:before="280" w:after="120"/>
-      </w:pPr>
-      <w:r>
-        <w:rPr>
-          <w:rFonts w:ascii="Arial" w:hAnsi="Arial"/>
-          <w:b/>
-          <w:color w:val="000000"/>
-          <w:sz w:val="40"/>
-        </w:rPr>
-        <w:t>Contact</w:t>
-      </w:r>
-    </w:p>
-    <w:p>
-      <w:pPr>
-        <w:spacing w:before="160" w:after="240"/>
-        <w:jc w:val="center"/>
-      </w:pPr>
-      <w:r>
-        <w:drawing>
-          <wp:inline xmlns:a="http://schemas.openxmlformats.org/drawingml/2006/main" xmlns:pic="http://schemas.openxmlformats.org/drawingml/2006/picture">
-            <wp:extent cx="5029200" cy="3352800"/>
-            <wp:docPr id="9" name="Picture 9"/>
-            <wp:cNvGraphicFramePr>
-              <a:graphicFrameLocks noChangeAspect="1"/>
-            </wp:cNvGraphicFramePr>
-            <a:graphic>
-              <a:graphicData uri="http://schemas.openxmlformats.org/drawingml/2006/picture">
-                <pic:pic>
-                  <pic:nvPicPr>
-                    <pic:cNvPr id="0" name="contact.png"/>
-                    <pic:cNvPicPr/>
-                  </pic:nvPicPr>
-                  <pic:blipFill>
-                    <a:blip r:embed="rId16"/>
-                    <a:stretch>
-                      <a:fillRect/>
-                    </a:stretch>
-                  </pic:blipFill>
-                  <pic:spPr>
-                    <a:xfrm>
-                      <a:off x="0" y="0"/>
-                      <a:ext cx="5029200" cy="3352800"/>
-                    </a:xfrm>
-                    <a:prstGeom prst="rect"/>
-                  </pic:spPr>
-                </pic:pic>
-              </a:graphicData>
-            </a:graphic>
-          </wp:inline>
-        </w:drawing>
-      </w:r>
-    </w:p>
-    <w:p>
-      <w:pPr>
-        <w:spacing w:after="200"/>
+        <w:spacing w:after="80" w:before="40"/>
       </w:pPr>
       <w:r>
         <w:rPr>
           <w:rFonts w:ascii="Arial" w:hAnsi="Arial"/>
           <w:b w:val="0"/>
           <w:color w:val="000000"/>
-          <w:sz w:val="28"/>
+          <w:sz w:val="24"/>
         </w:rPr>
         <w:t>Company: CoLab Space Point</w:t>
       </w:r>
     </w:p>
     <w:p>
       <w:pPr>
-        <w:spacing w:after="200"/>
+        <w:spacing w:after="80" w:before="40"/>
       </w:pPr>
       <w:r>
         <w:rPr>
           <w:rFonts w:ascii="Arial" w:hAnsi="Arial"/>
           <w:b w:val="0"/>
           <w:color w:val="000000"/>
-          <w:sz w:val="28"/>
+          <w:sz w:val="24"/>
         </w:rPr>
         <w:t>Website: www.colabpoint.com</w:t>
       </w:r>
     </w:p>
     <w:p>
       <w:pPr>
-        <w:spacing w:after="200"/>
+        <w:spacing w:after="80" w:before="40"/>
       </w:pPr>
       <w:r>
         <w:rPr>
           <w:rFonts w:ascii="Arial" w:hAnsi="Arial"/>
           <w:b w:val="0"/>
           <w:color w:val="000000"/>
-          <w:sz w:val="28"/>
+          <w:sz w:val="24"/>
         </w:rPr>
         <w:t>Phone: +92 349 7684322  |  +92 478 986460</w:t>
       </w:r>
     </w:p>
     <w:p>
       <w:pPr>
-        <w:spacing w:after="200"/>
+        <w:spacing w:after="80" w:before="40"/>
       </w:pPr>
       <w:r>
         <w:rPr>
           <w:rFonts w:ascii="Arial" w:hAnsi="Arial"/>
           <w:b w:val="0"/>
           <w:color w:val="000000"/>
-          <w:sz w:val="28"/>
+          <w:sz w:val="24"/>
         </w:rPr>
         <w:t>Email: colabpoint@gmail.com  |  hello@colabpoint.com</w:t>
       </w:r>
     </w:p>
     <w:p>
       <w:pPr>
-        <w:spacing w:after="200"/>
+        <w:spacing w:after="80" w:before="40"/>
       </w:pPr>
       <w:r>
         <w:rPr>
           <w:rFonts w:ascii="Arial" w:hAnsi="Arial"/>
           <w:b w:val="0"/>
           <w:color w:val="000000"/>
-          <w:sz w:val="28"/>
+          <w:sz w:val="24"/>
         </w:rPr>
         <w:t>Address: 2nd Floor Anwar Center, Madina Road Near Gymkhana, Gujrat, Pakistan</w:t>
       </w:r>
     </w:p>
     <w:sectPr>
+      <w:footerReference w:type="default" r:id="rId17"/>
       <w:pgSz w:w="12240" w:h="15840"/>
-      <w:pgMar w:top="1134" w:right="1134" w:bottom="1134" w:left="1134" w:header="720" w:footer="720" w:gutter="0"/>
+      <w:pgMar w:top="1134" w:right="1247" w:bottom="1134" w:left="1247" w:header="720" w:footer="720" w:gutter="0"/>
       <w:cols w:space="720"/>
       <w:docGrid w:linePitch="360"/>
     </w:sectPr>
   </w:body>
 </w:document>
+</file>
+
+<file path=word/footer1.xml><?xml version="1.0" encoding="utf-8"?>
+<w:ftr xmlns:m="http://schemas.openxmlformats.org/officeDocument/2006/math" xmlns:mc="http://schemas.openxmlformats.org/markup-compatibility/2006" xmlns:mo="http://schemas.microsoft.com/office/mac/office/2008/main" xmlns:mv="urn:schemas-microsoft-com:mac:vml" xmlns:o="urn:schemas-microsoft-com:office:office" xmlns:r="http://schemas.openxmlformats.org/officeDocument/2006/relationships" xmlns:v="urn:schemas-microsoft-com:vml" xmlns:w10="urn:schemas-microsoft-com:office:word" xmlns:w14="http://schemas.microsoft.com/office/word/2010/wordml" xmlns:w="http://schemas.openxmlformats.org/wordprocessingml/2006/main" xmlns:wne="http://schemas.microsoft.com/office/word/2006/wordml" xmlns:wp14="http://schemas.microsoft.com/office/word/2010/wordprocessingDrawing" xmlns:wp="http://schemas.openxmlformats.org/drawingml/2006/wordprocessingDrawing" xmlns:wpc="http://schemas.microsoft.com/office/word/2010/wordprocessingCanvas" xmlns:wpg="http://schemas.microsoft.com/office/word/2010/wordprocessingGroup" xmlns:wpi="http://schemas.microsoft.com/office/word/2010/wordprocessingInk" xmlns:wps="http://schemas.microsoft.com/office/word/2010/wordprocessingShape" mc:Ignorable="w14 wp14">
+  <w:p>
+    <w:pPr>
+      <w:pStyle w:val="Footer"/>
+      <w:jc w:val="center"/>
+    </w:pPr>
+    <w:r>
+      <w:rPr>
+        <w:rFonts w:ascii="Arial" w:hAnsi="Arial"/>
+        <w:b w:val="0"/>
+        <w:color w:val="000000"/>
+        <w:sz w:val="18"/>
+      </w:rPr>
+      <w:t>CoLab Space Point | www.colabpoint.com</w:t>
+    </w:r>
+  </w:p>
+</w:ftr>
 </file>
 
 <file path=word/numbering.xml><?xml version="1.0" encoding="utf-8"?>
@@ -1573,6 +2154,11 @@
     <w:name w:val="Normal"/>
     <w:qFormat/>
     <w:rsid w:val="00FC693F"/>
+    <w:rPr>
+      <w:rFonts w:ascii="Arial" w:hAnsi="Arial"/>
+      <w:color w:val="000000"/>
+      <w:sz w:val="24"/>
+    </w:rPr>
   </w:style>
   <w:style w:type="paragraph" w:styleId="Header">
     <w:name w:val="header"/>

</xml_diff>

<commit_message>
Fix PDF layout: premium cover and full-width package pages
- Remove stock banner photo and low-contrast navy text box from cover
- Add clean navy top band, centered logo, and structured contact table
- Fix broken two-column package layout (cut-off CE: text, empty left side)
- Use full-width package headers with price aligned right
- Fix TA_RIGHT import error in ReportLab generator

Co-authored-by: fullstackwebdeveloper1000-coder <fullstackwebdeveloper1000-coder@users.noreply.github.com>
</commit_message>
<xml_diff>
--- a/CoLab_Space_Point_Digital_Agency_Proposal.docx
+++ b/CoLab_Space_Point_Digital_Agency_Proposal.docx
@@ -170,12 +170,57 @@
     <w:tbl>
       <w:tblPr>
         <w:tblW w:type="auto" w:w="0"/>
-        <w:jc w:val="left"/>
         <w:tblLook w:firstColumn="1" w:firstRow="1" w:lastColumn="0" w:lastRow="0" w:noHBand="0" w:noVBand="1" w:val="04A0"/>
       </w:tblPr>
       <w:tblGrid>
-        <w:gridCol w:w="907"/>
-        <w:gridCol w:w="8504"/>
+        <w:gridCol w:w="9746"/>
+      </w:tblGrid>
+      <w:tr>
+        <w:tc>
+          <w:tcPr>
+            <w:tcW w:type="dxa" w:w="9746"/>
+            <w:shd w:val="clear" w:fill="04243C"/>
+          </w:tcPr>
+          <w:p>
+            <w:pPr>
+              <w:jc w:val="center"/>
+            </w:pPr>
+            <w:r>
+              <w:rPr>
+                <w:rFonts w:ascii="Arial" w:hAnsi="Arial"/>
+                <w:b/>
+                <w:color w:val="FFFFFF"/>
+                <w:sz w:val="40"/>
+              </w:rPr>
+              <w:t>COMPANY PROFILE</w:t>
+            </w:r>
+          </w:p>
+          <w:p>
+            <w:pPr>
+              <w:jc w:val="center"/>
+            </w:pPr>
+            <w:r>
+              <w:rPr>
+                <w:rFonts w:ascii="Arial" w:hAnsi="Arial"/>
+                <w:b w:val="0"/>
+                <w:color w:val="06ACBA"/>
+                <w:sz w:val="22"/>
+              </w:rPr>
+              <w:t>CoLab Space Point  |  Digital Agency  |  Gujrat</w:t>
+            </w:r>
+          </w:p>
+        </w:tc>
+      </w:tr>
+    </w:tbl>
+    <w:p/>
+    <w:tbl>
+      <w:tblPr>
+        <w:tblW w:type="auto" w:w="0"/>
+        <w:tblLook w:firstColumn="1" w:firstRow="1" w:lastColumn="0" w:lastRow="0" w:noHBand="0" w:noVBand="1" w:val="04A0"/>
+      </w:tblPr>
+      <w:tblGrid>
+        <w:gridCol w:w="1247"/>
+        <w:gridCol w:w="7937"/>
       </w:tblGrid>
       <w:tr>
         <w:tc>
@@ -189,7 +234,7 @@
             <w:r>
               <w:drawing>
                 <wp:inline xmlns:a="http://schemas.openxmlformats.org/drawingml/2006/main" xmlns:pic="http://schemas.openxmlformats.org/drawingml/2006/picture">
-                  <wp:extent cx="502920" cy="502920"/>
+                  <wp:extent cx="822960" cy="198882"/>
                   <wp:docPr id="2" name="Picture 2"/>
                   <wp:cNvGraphicFramePr>
                     <a:graphicFrameLocks noChangeAspect="1"/>
@@ -198,11 +243,11 @@
                     <a:graphicData uri="http://schemas.openxmlformats.org/drawingml/2006/picture">
                       <pic:pic>
                         <pic:nvPicPr>
-                          <pic:cNvPr id="0" name="company.png"/>
+                          <pic:cNvPr id="0" name="logo.png"/>
                           <pic:cNvPicPr/>
                         </pic:nvPicPr>
                         <pic:blipFill>
-                          <a:blip r:embed="rId10"/>
+                          <a:blip r:embed="rId9"/>
                           <a:stretch>
                             <a:fillRect/>
                           </a:stretch>
@@ -210,7 +255,7 @@
                         <pic:spPr>
                           <a:xfrm>
                             <a:off x="0" y="0"/>
-                            <a:ext cx="502920" cy="502920"/>
+                            <a:ext cx="822960" cy="198882"/>
                           </a:xfrm>
                           <a:prstGeom prst="rect"/>
                         </pic:spPr>
@@ -225,16 +270,17 @@
         <w:tc>
           <w:tcPr>
             <w:tcW w:type="dxa" w:w="4873"/>
+            <w:shd w:val="clear" w:fill="E8F7F9"/>
           </w:tcPr>
           <w:p>
             <w:r>
               <w:rPr>
                 <w:rFonts w:ascii="Arial" w:hAnsi="Arial"/>
                 <w:b/>
-                <w:color w:val="000000"/>
-                <w:sz w:val="36"/>
+                <w:color w:val="04243C"/>
+                <w:sz w:val="28"/>
               </w:rPr>
-              <w:t>Company Profile</w:t>
+              <w:t>About Us</w:t>
             </w:r>
           </w:p>
           <w:p>
@@ -242,10 +288,508 @@
               <w:rPr>
                 <w:rFonts w:ascii="Arial" w:hAnsi="Arial"/>
                 <w:b w:val="0"/>
-                <w:color w:val="04243C"/>
+                <w:color w:val="000000"/>
                 <w:sz w:val="22"/>
               </w:rPr>
-              <w:t>Digital services from CoLab Point, Gujrat</w:t>
+              <w:t>CoLab Space Point is the digital services division of CoLab Point — a trusted innovation and coworking hub in Gujrat since 2021. We help businesses establish a strong online presence, sell through e-commerce, and acquire customers through data-driven marketing.</w:t>
+            </w:r>
+          </w:p>
+          <w:p>
+            <w:r>
+              <w:rPr>
+                <w:rFonts w:ascii="Arial" w:hAnsi="Arial"/>
+                <w:b w:val="0"/>
+                <w:color w:val="000000"/>
+                <w:sz w:val="22"/>
+              </w:rPr>
+              <w:t>Our mission is to deliver premium digital experiences that convert visitors into customers — with transparent pricing, professional delivery, and ongoing support after every launch.</w:t>
+            </w:r>
+          </w:p>
+        </w:tc>
+      </w:tr>
+    </w:tbl>
+    <w:p/>
+    <w:tbl>
+      <w:tblPr>
+        <w:tblW w:type="auto" w:w="0"/>
+        <w:jc w:val="center"/>
+        <w:tblLook w:firstColumn="1" w:firstRow="1" w:lastColumn="0" w:lastRow="0" w:noHBand="0" w:noVBand="1" w:val="04A0"/>
+      </w:tblPr>
+      <w:tblGrid>
+        <w:gridCol w:w="2436"/>
+        <w:gridCol w:w="2436"/>
+        <w:gridCol w:w="2436"/>
+        <w:gridCol w:w="2436"/>
+      </w:tblGrid>
+      <w:tr>
+        <w:tc>
+          <w:tcPr>
+            <w:tcW w:type="dxa" w:w="2436"/>
+            <w:shd w:val="clear" w:fill="06ACBA"/>
+          </w:tcPr>
+          <w:p>
+            <w:pPr>
+              <w:jc w:val="center"/>
+            </w:pPr>
+            <w:r/>
+            <w:r>
+              <w:rPr>
+                <w:rFonts w:ascii="Arial" w:hAnsi="Arial"/>
+                <w:b/>
+                <w:color w:val="FFFFFF"/>
+                <w:sz w:val="22"/>
+              </w:rPr>
+              <w:t>Est. 2021</w:t>
+            </w:r>
+          </w:p>
+        </w:tc>
+        <w:tc>
+          <w:tcPr>
+            <w:tcW w:type="dxa" w:w="2436"/>
+            <w:shd w:val="clear" w:fill="06ACBA"/>
+          </w:tcPr>
+          <w:p>
+            <w:pPr>
+              <w:jc w:val="center"/>
+            </w:pPr>
+            <w:r/>
+            <w:r>
+              <w:rPr>
+                <w:rFonts w:ascii="Arial" w:hAnsi="Arial"/>
+                <w:b/>
+                <w:color w:val="FFFFFF"/>
+                <w:sz w:val="22"/>
+              </w:rPr>
+              <w:t>Location</w:t>
+            </w:r>
+          </w:p>
+        </w:tc>
+        <w:tc>
+          <w:tcPr>
+            <w:tcW w:type="dxa" w:w="2436"/>
+            <w:shd w:val="clear" w:fill="06ACBA"/>
+          </w:tcPr>
+          <w:p>
+            <w:pPr>
+              <w:jc w:val="center"/>
+            </w:pPr>
+            <w:r/>
+            <w:r>
+              <w:rPr>
+                <w:rFonts w:ascii="Arial" w:hAnsi="Arial"/>
+                <w:b/>
+                <w:color w:val="FFFFFF"/>
+                <w:sz w:val="22"/>
+              </w:rPr>
+              <w:t>Platform</w:t>
+            </w:r>
+          </w:p>
+        </w:tc>
+        <w:tc>
+          <w:tcPr>
+            <w:tcW w:type="dxa" w:w="2436"/>
+            <w:shd w:val="clear" w:fill="06ACBA"/>
+          </w:tcPr>
+          <w:p>
+            <w:pPr>
+              <w:jc w:val="center"/>
+            </w:pPr>
+            <w:r/>
+            <w:r>
+              <w:rPr>
+                <w:rFonts w:ascii="Arial" w:hAnsi="Arial"/>
+                <w:b/>
+                <w:color w:val="FFFFFF"/>
+                <w:sz w:val="22"/>
+              </w:rPr>
+              <w:t>Focus</w:t>
+            </w:r>
+          </w:p>
+        </w:tc>
+      </w:tr>
+      <w:tr>
+        <w:tc>
+          <w:tcPr>
+            <w:tcW w:type="dxa" w:w="2436"/>
+            <w:shd w:val="clear" w:fill="F4FBFC"/>
+          </w:tcPr>
+          <w:p>
+            <w:pPr>
+              <w:jc w:val="center"/>
+            </w:pPr>
+            <w:r/>
+            <w:r>
+              <w:rPr>
+                <w:rFonts w:ascii="Arial" w:hAnsi="Arial"/>
+                <w:b w:val="0"/>
+                <w:color w:val="000000"/>
+                <w:sz w:val="20"/>
+              </w:rPr>
+              <w:t>CoLab Point ecosystem</w:t>
+            </w:r>
+          </w:p>
+        </w:tc>
+        <w:tc>
+          <w:tcPr>
+            <w:tcW w:type="dxa" w:w="2436"/>
+            <w:shd w:val="clear" w:fill="F4FBFC"/>
+          </w:tcPr>
+          <w:p>
+            <w:pPr>
+              <w:jc w:val="center"/>
+            </w:pPr>
+            <w:r/>
+            <w:r>
+              <w:rPr>
+                <w:rFonts w:ascii="Arial" w:hAnsi="Arial"/>
+                <w:b w:val="0"/>
+                <w:color w:val="000000"/>
+                <w:sz w:val="20"/>
+              </w:rPr>
+              <w:t>Gujrat, Pakistan</w:t>
+            </w:r>
+          </w:p>
+        </w:tc>
+        <w:tc>
+          <w:tcPr>
+            <w:tcW w:type="dxa" w:w="2436"/>
+            <w:shd w:val="clear" w:fill="F4FBFC"/>
+          </w:tcPr>
+          <w:p>
+            <w:pPr>
+              <w:jc w:val="center"/>
+            </w:pPr>
+            <w:r/>
+            <w:r>
+              <w:rPr>
+                <w:rFonts w:ascii="Arial" w:hAnsi="Arial"/>
+                <w:b w:val="0"/>
+                <w:color w:val="000000"/>
+                <w:sz w:val="20"/>
+              </w:rPr>
+              <w:t>WordPress &amp; WooCommerce</w:t>
+            </w:r>
+          </w:p>
+        </w:tc>
+        <w:tc>
+          <w:tcPr>
+            <w:tcW w:type="dxa" w:w="2436"/>
+            <w:shd w:val="clear" w:fill="F4FBFC"/>
+          </w:tcPr>
+          <w:p>
+            <w:pPr>
+              <w:jc w:val="center"/>
+            </w:pPr>
+            <w:r/>
+            <w:r>
+              <w:rPr>
+                <w:rFonts w:ascii="Arial" w:hAnsi="Arial"/>
+                <w:b w:val="0"/>
+                <w:color w:val="000000"/>
+                <w:sz w:val="20"/>
+              </w:rPr>
+              <w:t>Websites + Digital Marketing</w:t>
+            </w:r>
+          </w:p>
+        </w:tc>
+      </w:tr>
+    </w:tbl>
+    <w:p/>
+    <w:p>
+      <w:pPr>
+        <w:spacing w:after="160" w:before="40"/>
+      </w:pPr>
+      <w:r>
+        <w:rPr>
+          <w:rFonts w:ascii="Arial" w:hAnsi="Arial"/>
+          <w:b/>
+          <w:color w:val="04243C"/>
+          <w:sz w:val="28"/>
+        </w:rPr>
+        <w:t>Our Core Services</w:t>
+      </w:r>
+    </w:p>
+    <w:tbl>
+      <w:tblPr>
+        <w:tblW w:type="auto" w:w="0"/>
+        <w:tblLook w:firstColumn="1" w:firstRow="1" w:lastColumn="0" w:lastRow="0" w:noHBand="0" w:noVBand="1" w:val="04A0"/>
+      </w:tblPr>
+      <w:tblGrid>
+        <w:gridCol w:w="4873"/>
+        <w:gridCol w:w="4873"/>
+      </w:tblGrid>
+      <w:tr>
+        <w:tc>
+          <w:tcPr>
+            <w:tcW w:type="dxa" w:w="4873"/>
+            <w:shd w:val="clear" w:fill="FFFFFF"/>
+          </w:tcPr>
+          <w:p>
+            <w:r/>
+            <w:r>
+              <w:rPr>
+                <w:rFonts w:ascii="Arial" w:hAnsi="Arial"/>
+                <w:b w:val="0"/>
+                <w:color w:val="000000"/>
+                <w:sz w:val="22"/>
+              </w:rPr>
+              <w:t xml:space="preserve">  ✓  Website Designing &amp; Development</w:t>
+            </w:r>
+          </w:p>
+        </w:tc>
+        <w:tc>
+          <w:tcPr>
+            <w:tcW w:type="dxa" w:w="4873"/>
+            <w:shd w:val="clear" w:fill="FFFFFF"/>
+          </w:tcPr>
+          <w:p>
+            <w:r/>
+            <w:r>
+              <w:rPr>
+                <w:rFonts w:ascii="Arial" w:hAnsi="Arial"/>
+                <w:b w:val="0"/>
+                <w:color w:val="000000"/>
+                <w:sz w:val="22"/>
+              </w:rPr>
+              <w:t xml:space="preserve">  ✓  SEO (Search Engine Optimization)</w:t>
+            </w:r>
+          </w:p>
+        </w:tc>
+      </w:tr>
+      <w:tr>
+        <w:tc>
+          <w:tcPr>
+            <w:tcW w:type="dxa" w:w="4873"/>
+            <w:shd w:val="clear" w:fill="FFFFFF"/>
+          </w:tcPr>
+          <w:p>
+            <w:r/>
+            <w:r>
+              <w:rPr>
+                <w:rFonts w:ascii="Arial" w:hAnsi="Arial"/>
+                <w:b w:val="0"/>
+                <w:color w:val="000000"/>
+                <w:sz w:val="22"/>
+              </w:rPr>
+              <w:t xml:space="preserve">  ✓  WordPress Development</w:t>
+            </w:r>
+          </w:p>
+        </w:tc>
+        <w:tc>
+          <w:tcPr>
+            <w:tcW w:type="dxa" w:w="4873"/>
+            <w:shd w:val="clear" w:fill="FFFFFF"/>
+          </w:tcPr>
+          <w:p>
+            <w:r/>
+            <w:r>
+              <w:rPr>
+                <w:rFonts w:ascii="Arial" w:hAnsi="Arial"/>
+                <w:b w:val="0"/>
+                <w:color w:val="000000"/>
+                <w:sz w:val="22"/>
+              </w:rPr>
+              <w:t xml:space="preserve">  ✓  Google Ads</w:t>
+            </w:r>
+          </w:p>
+        </w:tc>
+      </w:tr>
+      <w:tr>
+        <w:tc>
+          <w:tcPr>
+            <w:tcW w:type="dxa" w:w="4873"/>
+            <w:shd w:val="clear" w:fill="FFFFFF"/>
+          </w:tcPr>
+          <w:p>
+            <w:r/>
+            <w:r>
+              <w:rPr>
+                <w:rFonts w:ascii="Arial" w:hAnsi="Arial"/>
+                <w:b w:val="0"/>
+                <w:color w:val="000000"/>
+                <w:sz w:val="22"/>
+              </w:rPr>
+              <w:t xml:space="preserve">  ✓  E-commerce Solutions</w:t>
+            </w:r>
+          </w:p>
+        </w:tc>
+        <w:tc>
+          <w:tcPr>
+            <w:tcW w:type="dxa" w:w="4873"/>
+            <w:shd w:val="clear" w:fill="FFFFFF"/>
+          </w:tcPr>
+          <w:p>
+            <w:r/>
+            <w:r>
+              <w:rPr>
+                <w:rFonts w:ascii="Arial" w:hAnsi="Arial"/>
+                <w:b w:val="0"/>
+                <w:color w:val="000000"/>
+                <w:sz w:val="22"/>
+              </w:rPr>
+              <w:t xml:space="preserve">  ✓  Meta Ads (Facebook &amp; Instagram)</w:t>
+            </w:r>
+          </w:p>
+        </w:tc>
+      </w:tr>
+      <w:tr>
+        <w:tc>
+          <w:tcPr>
+            <w:tcW w:type="dxa" w:w="4873"/>
+            <w:shd w:val="clear" w:fill="FFFFFF"/>
+          </w:tcPr>
+          <w:p>
+            <w:r/>
+            <w:r>
+              <w:rPr>
+                <w:rFonts w:ascii="Arial" w:hAnsi="Arial"/>
+                <w:b w:val="0"/>
+                <w:color w:val="000000"/>
+                <w:sz w:val="22"/>
+              </w:rPr>
+              <w:t xml:space="preserve">  ✓  Branding &amp; Visual Identity</w:t>
+            </w:r>
+          </w:p>
+        </w:tc>
+        <w:tc>
+          <w:tcPr>
+            <w:tcW w:type="dxa" w:w="4873"/>
+            <w:shd w:val="clear" w:fill="FFFFFF"/>
+          </w:tcPr>
+          <w:p>
+            <w:r/>
+            <w:r>
+              <w:rPr>
+                <w:rFonts w:ascii="Arial" w:hAnsi="Arial"/>
+                <w:b w:val="0"/>
+                <w:color w:val="000000"/>
+                <w:sz w:val="22"/>
+              </w:rPr>
+              <w:t xml:space="preserve">  ✓  Business Growth Strategy</w:t>
+            </w:r>
+          </w:p>
+        </w:tc>
+      </w:tr>
+      <w:tr>
+        <w:tc>
+          <w:tcPr>
+            <w:tcW w:type="dxa" w:w="4873"/>
+            <w:shd w:val="clear" w:fill="FFFFFF"/>
+          </w:tcPr>
+          <w:p>
+            <w:r/>
+            <w:r>
+              <w:rPr>
+                <w:rFonts w:ascii="Arial" w:hAnsi="Arial"/>
+                <w:b w:val="0"/>
+                <w:color w:val="000000"/>
+                <w:sz w:val="22"/>
+              </w:rPr>
+              <w:t xml:space="preserve">  ✓  Digital Marketing</w:t>
+            </w:r>
+          </w:p>
+        </w:tc>
+        <w:tc>
+          <w:tcPr>
+            <w:tcW w:type="dxa" w:w="4873"/>
+            <w:shd w:val="clear" w:fill="FFFFFF"/>
+          </w:tcPr>
+          <w:p>
+            <w:r/>
+          </w:p>
+        </w:tc>
+      </w:tr>
+    </w:tbl>
+    <w:p/>
+    <w:tbl>
+      <w:tblPr>
+        <w:tblW w:type="auto" w:w="0"/>
+        <w:tblLook w:firstColumn="1" w:firstRow="1" w:lastColumn="0" w:lastRow="0" w:noHBand="0" w:noVBand="1" w:val="04A0"/>
+      </w:tblPr>
+      <w:tblGrid>
+        <w:gridCol w:w="9746"/>
+      </w:tblGrid>
+      <w:tr>
+        <w:tc>
+          <w:tcPr>
+            <w:tcW w:type="dxa" w:w="9746"/>
+            <w:shd w:val="clear" w:fill="E8F7F9"/>
+          </w:tcPr>
+          <w:p>
+            <w:r>
+              <w:rPr>
+                <w:rFonts w:ascii="Arial" w:hAnsi="Arial"/>
+                <w:b/>
+                <w:color w:val="04243C"/>
+                <w:sz w:val="26"/>
+              </w:rPr>
+              <w:t>Why Choose CoLab Space Point</w:t>
+            </w:r>
+          </w:p>
+          <w:p>
+            <w:r>
+              <w:rPr>
+                <w:rFonts w:ascii="Arial" w:hAnsi="Arial"/>
+                <w:b w:val="0"/>
+                <w:color w:val="000000"/>
+                <w:sz w:val="22"/>
+              </w:rPr>
+              <w:t xml:space="preserve">  •  Experienced multidisciplinary team</w:t>
+            </w:r>
+          </w:p>
+          <w:p>
+            <w:r>
+              <w:rPr>
+                <w:rFonts w:ascii="Arial" w:hAnsi="Arial"/>
+                <w:b w:val="0"/>
+                <w:color w:val="000000"/>
+                <w:sz w:val="22"/>
+              </w:rPr>
+              <w:t xml:space="preserve">  •  Professional support and clear communication</w:t>
+            </w:r>
+          </w:p>
+          <w:p>
+            <w:r>
+              <w:rPr>
+                <w:rFonts w:ascii="Arial" w:hAnsi="Arial"/>
+                <w:b w:val="0"/>
+                <w:color w:val="000000"/>
+                <w:sz w:val="22"/>
+              </w:rPr>
+              <w:t xml:space="preserve">  •  Business-focused, results-driven solutions</w:t>
+            </w:r>
+          </w:p>
+          <w:p>
+            <w:r>
+              <w:rPr>
+                <w:rFonts w:ascii="Arial" w:hAnsi="Arial"/>
+                <w:b w:val="0"/>
+                <w:color w:val="000000"/>
+                <w:sz w:val="22"/>
+              </w:rPr>
+              <w:t xml:space="preserve">  •  Modern technology stack</w:t>
+            </w:r>
+          </w:p>
+          <w:p>
+            <w:r>
+              <w:rPr>
+                <w:rFonts w:ascii="Arial" w:hAnsi="Arial"/>
+                <w:b w:val="0"/>
+                <w:color w:val="000000"/>
+                <w:sz w:val="22"/>
+              </w:rPr>
+              <w:t xml:space="preserve">  •  Creative design and performance marketing</w:t>
+            </w:r>
+          </w:p>
+          <w:p>
+            <w:r>
+              <w:rPr>
+                <w:rFonts w:ascii="Arial" w:hAnsi="Arial"/>
+                <w:b w:val="0"/>
+                <w:color w:val="000000"/>
+                <w:sz w:val="22"/>
+              </w:rPr>
+              <w:t xml:space="preserve">  •  Transparent pricing and long-term partnership</w:t>
             </w:r>
           </w:p>
         </w:tc>
@@ -261,23 +805,9 @@
           <w:rFonts w:ascii="Arial" w:hAnsi="Arial"/>
           <w:b w:val="0"/>
           <w:color w:val="000000"/>
-          <w:sz w:val="24"/>
+          <w:sz w:val="22"/>
         </w:rPr>
-        <w:t>CoLab Space Point is the digital services arm of CoLab Point, Gujrat. We build websites, e-commerce stores, and run performance marketing campaigns.</w:t>
-      </w:r>
-    </w:p>
-    <w:p>
-      <w:pPr>
-        <w:spacing w:after="200" w:before="40"/>
-      </w:pPr>
-      <w:r>
-        <w:rPr>
-          <w:rFonts w:ascii="Arial" w:hAnsi="Arial"/>
-          <w:b w:val="0"/>
-          <w:color w:val="000000"/>
-          <w:sz w:val="24"/>
-        </w:rPr>
-        <w:t>WordPress is our primary development platform. Custom solutions are available on request.</w:t>
+        <w:t>WordPress is our primary development platform. Fully custom solutions are available on request.</w:t>
       </w:r>
     </w:p>
     <w:tbl>
@@ -315,7 +845,7 @@
                           <pic:cNvPicPr/>
                         </pic:nvPicPr>
                         <pic:blipFill>
-                          <a:blip r:embed="rId11"/>
+                          <a:blip r:embed="rId10"/>
                           <a:stretch>
                             <a:fillRect/>
                           </a:stretch>
@@ -394,7 +924,7 @@
                           <pic:cNvPicPr/>
                         </pic:nvPicPr>
                         <pic:blipFill>
-                          <a:blip r:embed="rId12"/>
+                          <a:blip r:embed="rId11"/>
                           <a:stretch>
                             <a:fillRect/>
                           </a:stretch>
@@ -680,7 +1210,7 @@
                           <pic:cNvPicPr/>
                         </pic:nvPicPr>
                         <pic:blipFill>
-                          <a:blip r:embed="rId13"/>
+                          <a:blip r:embed="rId12"/>
                           <a:stretch>
                             <a:fillRect/>
                           </a:stretch>
@@ -966,7 +1496,7 @@
                           <pic:cNvPicPr/>
                         </pic:nvPicPr>
                         <pic:blipFill>
-                          <a:blip r:embed="rId14"/>
+                          <a:blip r:embed="rId13"/>
                           <a:stretch>
                             <a:fillRect/>
                           </a:stretch>
@@ -1238,7 +1768,7 @@
                           <pic:cNvPicPr/>
                         </pic:nvPicPr>
                         <pic:blipFill>
-                          <a:blip r:embed="rId15"/>
+                          <a:blip r:embed="rId14"/>
                           <a:stretch>
                             <a:fillRect/>
                           </a:stretch>
@@ -1651,7 +2181,7 @@
                           <pic:cNvPicPr/>
                         </pic:nvPicPr>
                         <pic:blipFill>
-                          <a:blip r:embed="rId16"/>
+                          <a:blip r:embed="rId15"/>
                           <a:stretch>
                             <a:fillRect/>
                           </a:stretch>
@@ -1761,7 +2291,7 @@
       </w:r>
     </w:p>
     <w:sectPr>
-      <w:footerReference w:type="default" r:id="rId17"/>
+      <w:footerReference w:type="default" r:id="rId16"/>
       <w:pgSz w:w="12240" w:h="15840"/>
       <w:pgMar w:top="1134" w:right="1247" w:bottom="1134" w:left="1247" w:header="720" w:footer="720" w:gutter="0"/>
       <w:cols w:space="720"/>

</xml_diff>

<commit_message>
Fix cover logo: navy band, proper size, no wash-out on white
- Web-Logo-II is light grey — invisible on white PDF background
- Generate logo_cover.png composited on navy #04243C
- Draw full-bleed navy header band with logo at ~13.5cm width
- Match Word cover with same navy logo band treatment

Co-authored-by: fullstackwebdeveloper1000-coder <fullstackwebdeveloper1000-coder@users.noreply.github.com>
</commit_message>
<xml_diff>
--- a/CoLab_Space_Point_Digital_Agency_Proposal.docx
+++ b/CoLab_Space_Point_Digital_Agency_Proposal.docx
@@ -3,59 +3,80 @@
 <w:document xmlns:wpc="http://schemas.microsoft.com/office/word/2010/wordprocessingCanvas" xmlns:mo="http://schemas.microsoft.com/office/mac/office/2008/main" xmlns:mc="http://schemas.openxmlformats.org/markup-compatibility/2006" xmlns:mv="urn:schemas-microsoft-com:mac:vml" xmlns:o="urn:schemas-microsoft-com:office:office" xmlns:r="http://schemas.openxmlformats.org/officeDocument/2006/relationships" xmlns:m="http://schemas.openxmlformats.org/officeDocument/2006/math" xmlns:v="urn:schemas-microsoft-com:vml" xmlns:wp14="http://schemas.microsoft.com/office/word/2010/wordprocessingDrawing" xmlns:wp="http://schemas.openxmlformats.org/drawingml/2006/wordprocessingDrawing" xmlns:w10="urn:schemas-microsoft-com:office:word" xmlns:w="http://schemas.openxmlformats.org/wordprocessingml/2006/main" xmlns:w14="http://schemas.microsoft.com/office/word/2010/wordml" xmlns:wpg="http://schemas.microsoft.com/office/word/2010/wordprocessingGroup" xmlns:wpi="http://schemas.microsoft.com/office/word/2010/wordprocessingInk" xmlns:wne="http://schemas.microsoft.com/office/word/2006/wordml" xmlns:wps="http://schemas.microsoft.com/office/word/2010/wordprocessingShape" mc:Ignorable="w14 wp14">
   <w:background w:color="FFFFFF"/>
   <w:body>
+    <w:tbl>
+      <w:tblPr>
+        <w:tblW w:type="auto" w:w="0"/>
+        <w:tblLook w:firstColumn="1" w:firstRow="1" w:lastColumn="0" w:lastRow="0" w:noHBand="0" w:noVBand="1" w:val="04A0"/>
+      </w:tblPr>
+      <w:tblGrid>
+        <w:gridCol w:w="9746"/>
+      </w:tblGrid>
+      <w:tr>
+        <w:tc>
+          <w:tcPr>
+            <w:tcW w:type="dxa" w:w="9746"/>
+            <w:shd w:val="clear" w:fill="04243C"/>
+          </w:tcPr>
+          <w:p>
+            <w:pPr>
+              <w:jc w:val="center"/>
+            </w:pPr>
+            <w:r>
+              <w:drawing>
+                <wp:inline xmlns:a="http://schemas.openxmlformats.org/drawingml/2006/main" xmlns:pic="http://schemas.openxmlformats.org/drawingml/2006/picture">
+                  <wp:extent cx="5303520" cy="1616382"/>
+                  <wp:docPr id="1" name="Picture 1"/>
+                  <wp:cNvGraphicFramePr>
+                    <a:graphicFrameLocks noChangeAspect="1"/>
+                  </wp:cNvGraphicFramePr>
+                  <a:graphic>
+                    <a:graphicData uri="http://schemas.openxmlformats.org/drawingml/2006/picture">
+                      <pic:pic>
+                        <pic:nvPicPr>
+                          <pic:cNvPr id="0" name="logo_cover.png"/>
+                          <pic:cNvPicPr/>
+                        </pic:nvPicPr>
+                        <pic:blipFill>
+                          <a:blip r:embed="rId9"/>
+                          <a:stretch>
+                            <a:fillRect/>
+                          </a:stretch>
+                        </pic:blipFill>
+                        <pic:spPr>
+                          <a:xfrm>
+                            <a:off x="0" y="0"/>
+                            <a:ext cx="5303520" cy="1616382"/>
+                          </a:xfrm>
+                          <a:prstGeom prst="rect"/>
+                        </pic:spPr>
+                      </pic:pic>
+                    </a:graphicData>
+                  </a:graphic>
+                </wp:inline>
+              </w:drawing>
+            </w:r>
+          </w:p>
+          <w:p>
+            <w:pPr>
+              <w:jc w:val="center"/>
+            </w:pPr>
+            <w:r>
+              <w:rPr>
+                <w:rFonts w:ascii="Arial" w:hAnsi="Arial"/>
+                <w:b w:val="0"/>
+                <w:color w:val="06ACBA"/>
+                <w:sz w:val="20"/>
+              </w:rPr>
+              <w:t>CoLab Point  |  Digital Agency  |  Gujrat, Pakistan</w:t>
+            </w:r>
+          </w:p>
+        </w:tc>
+      </w:tr>
+    </w:tbl>
     <w:p>
       <w:pPr>
-        <w:jc w:val="center"/>
+        <w:spacing w:after="160" w:before="40"/>
       </w:pPr>
-      <w:r>
-        <w:drawing>
-          <wp:inline xmlns:a="http://schemas.openxmlformats.org/drawingml/2006/main" xmlns:pic="http://schemas.openxmlformats.org/drawingml/2006/picture">
-            <wp:extent cx="1280160" cy="309372"/>
-            <wp:docPr id="1" name="Picture 1"/>
-            <wp:cNvGraphicFramePr>
-              <a:graphicFrameLocks noChangeAspect="1"/>
-            </wp:cNvGraphicFramePr>
-            <a:graphic>
-              <a:graphicData uri="http://schemas.openxmlformats.org/drawingml/2006/picture">
-                <pic:pic>
-                  <pic:nvPicPr>
-                    <pic:cNvPr id="0" name="logo.png"/>
-                    <pic:cNvPicPr/>
-                  </pic:nvPicPr>
-                  <pic:blipFill>
-                    <a:blip r:embed="rId9"/>
-                    <a:stretch>
-                      <a:fillRect/>
-                    </a:stretch>
-                  </pic:blipFill>
-                  <pic:spPr>
-                    <a:xfrm>
-                      <a:off x="0" y="0"/>
-                      <a:ext cx="1280160" cy="309372"/>
-                    </a:xfrm>
-                    <a:prstGeom prst="rect"/>
-                  </pic:spPr>
-                </pic:pic>
-              </a:graphicData>
-            </a:graphic>
-          </wp:inline>
-        </w:drawing>
-      </w:r>
-    </w:p>
-    <w:p>
-      <w:pPr>
-        <w:spacing w:after="80" w:before="40"/>
-        <w:jc w:val="center"/>
-      </w:pPr>
-      <w:r>
-        <w:rPr>
-          <w:rFonts w:ascii="Arial" w:hAnsi="Arial"/>
-          <w:b/>
-          <w:color w:val="06ACBA"/>
-          <w:sz w:val="28"/>
-        </w:rPr>
-        <w:t>CoLab Point</w:t>
-      </w:r>
     </w:p>
     <w:p>
       <w:pPr>
@@ -247,7 +268,7 @@
                           <pic:cNvPicPr/>
                         </pic:nvPicPr>
                         <pic:blipFill>
-                          <a:blip r:embed="rId9"/>
+                          <a:blip r:embed="rId10"/>
                           <a:stretch>
                             <a:fillRect/>
                           </a:stretch>
@@ -845,7 +866,7 @@
                           <pic:cNvPicPr/>
                         </pic:nvPicPr>
                         <pic:blipFill>
-                          <a:blip r:embed="rId10"/>
+                          <a:blip r:embed="rId11"/>
                           <a:stretch>
                             <a:fillRect/>
                           </a:stretch>
@@ -924,7 +945,7 @@
                           <pic:cNvPicPr/>
                         </pic:nvPicPr>
                         <pic:blipFill>
-                          <a:blip r:embed="rId11"/>
+                          <a:blip r:embed="rId12"/>
                           <a:stretch>
                             <a:fillRect/>
                           </a:stretch>
@@ -1210,7 +1231,7 @@
                           <pic:cNvPicPr/>
                         </pic:nvPicPr>
                         <pic:blipFill>
-                          <a:blip r:embed="rId12"/>
+                          <a:blip r:embed="rId13"/>
                           <a:stretch>
                             <a:fillRect/>
                           </a:stretch>
@@ -1496,7 +1517,7 @@
                           <pic:cNvPicPr/>
                         </pic:nvPicPr>
                         <pic:blipFill>
-                          <a:blip r:embed="rId13"/>
+                          <a:blip r:embed="rId14"/>
                           <a:stretch>
                             <a:fillRect/>
                           </a:stretch>
@@ -1768,7 +1789,7 @@
                           <pic:cNvPicPr/>
                         </pic:nvPicPr>
                         <pic:blipFill>
-                          <a:blip r:embed="rId14"/>
+                          <a:blip r:embed="rId15"/>
                           <a:stretch>
                             <a:fillRect/>
                           </a:stretch>
@@ -2181,7 +2202,7 @@
                           <pic:cNvPicPr/>
                         </pic:nvPicPr>
                         <pic:blipFill>
-                          <a:blip r:embed="rId15"/>
+                          <a:blip r:embed="rId16"/>
                           <a:stretch>
                             <a:fillRect/>
                           </a:stretch>
@@ -2291,7 +2312,7 @@
       </w:r>
     </w:p>
     <w:sectPr>
-      <w:footerReference w:type="default" r:id="rId16"/>
+      <w:footerReference w:type="default" r:id="rId17"/>
       <w:pgSz w:w="12240" w:h="15840"/>
       <w:pgMar w:top="1134" w:right="1247" w:bottom="1134" w:left="1247" w:header="720" w:footer="720" w:gutter="0"/>
       <w:cols w:space="720"/>

</xml_diff>

<commit_message>
Update package inclusions and fix phone number
- Basic: remove Custom UI and Google Analytics setup
- Standard: Basic SEO instead of Advanced SEO
- Premium: Up to 15 pages instead of unlimited
- Fix second phone to +92 347 8986460

Co-authored-by: fullstackwebdeveloper1000-coder <fullstackwebdeveloper1000-coder@users.noreply.github.com>
</commit_message>
<xml_diff>
--- a/CoLab_Space_Point_Digital_Agency_Proposal.docx
+++ b/CoLab_Space_Point_Digital_Agency_Proposal.docx
@@ -150,7 +150,7 @@
           <w:color w:val="000000"/>
           <w:sz w:val="22"/>
         </w:rPr>
-        <w:t>+92 349 7684322  |  +92 478 986460</w:t>
+        <w:t>+92 349 7684322  |  +92 347 8986460</w:t>
       </w:r>
     </w:p>
     <w:p>
@@ -1090,20 +1090,6 @@
           <w:color w:val="000000"/>
           <w:sz w:val="24"/>
         </w:rPr>
-        <w:t xml:space="preserve">  •  Custom UI</w:t>
-      </w:r>
-    </w:p>
-    <w:p>
-      <w:pPr>
-        <w:spacing w:after="60" w:before="40"/>
-      </w:pPr>
-      <w:r>
-        <w:rPr>
-          <w:rFonts w:ascii="Arial" w:hAnsi="Arial"/>
-          <w:b w:val="0"/>
-          <w:color w:val="000000"/>
-          <w:sz w:val="24"/>
-        </w:rPr>
         <w:t xml:space="preserve">  •  Contact form</w:t>
       </w:r>
     </w:p>
@@ -1133,20 +1119,6 @@
           <w:sz w:val="24"/>
         </w:rPr>
         <w:t xml:space="preserve">  •  Social media profile links</w:t>
-      </w:r>
-    </w:p>
-    <w:p>
-      <w:pPr>
-        <w:spacing w:after="60" w:before="40"/>
-      </w:pPr>
-      <w:r>
-        <w:rPr>
-          <w:rFonts w:ascii="Arial" w:hAnsi="Arial"/>
-          <w:b w:val="0"/>
-          <w:color w:val="000000"/>
-          <w:sz w:val="24"/>
-        </w:rPr>
-        <w:t xml:space="preserve">  •  Google Analytics setup</w:t>
       </w:r>
     </w:p>
     <w:p>
@@ -1446,7 +1418,7 @@
           <w:color w:val="000000"/>
           <w:sz w:val="24"/>
         </w:rPr>
-        <w:t xml:space="preserve">  •  Advanced SEO</w:t>
+        <w:t xml:space="preserve">  •  Basic SEO</w:t>
       </w:r>
     </w:p>
     <w:p>
@@ -1620,7 +1592,7 @@
           <w:color w:val="000000"/>
           <w:sz w:val="24"/>
         </w:rPr>
-        <w:t xml:space="preserve">  •  Unlimited pages (agreed scope)</w:t>
+        <w:t xml:space="preserve">  •  Up to 15 pages</w:t>
       </w:r>
     </w:p>
     <w:p>
@@ -2280,7 +2252,7 @@
           <w:color w:val="000000"/>
           <w:sz w:val="24"/>
         </w:rPr>
-        <w:t>Phone: +92 349 7684322  |  +92 478 986460</w:t>
+        <w:t>Phone: +92 349 7684322  |  +92 347 8986460</w:t>
       </w:r>
     </w:p>
     <w:p>

</xml_diff>

<commit_message>
Add tiered Social Media Management to website packages
- Basic: account creation and basic page setup
- Standard: profile branding, launch posts, monthly posting
- Premium: full management with content calendar and reports
- Included in website package price (no separate charge)

Co-authored-by: fullstackwebdeveloper1000-coder <fullstackwebdeveloper1000-coder@users.noreply.github.com>
</commit_message>
<xml_diff>
--- a/CoLab_Space_Point_Digital_Agency_Proposal.docx
+++ b/CoLab_Space_Point_Digital_Agency_Proposal.docx
@@ -1132,6 +1132,34 @@
           <w:color w:val="000000"/>
           <w:sz w:val="24"/>
         </w:rPr>
+        <w:t xml:space="preserve">  •  Social Media Management — account creation (Facebook &amp; Instagram)</w:t>
+      </w:r>
+    </w:p>
+    <w:p>
+      <w:pPr>
+        <w:spacing w:after="60" w:before="40"/>
+      </w:pPr>
+      <w:r>
+        <w:rPr>
+          <w:rFonts w:ascii="Arial" w:hAnsi="Arial"/>
+          <w:b w:val="0"/>
+          <w:color w:val="000000"/>
+          <w:sz w:val="24"/>
+        </w:rPr>
+        <w:t xml:space="preserve">  •  Basic business page setup</w:t>
+      </w:r>
+    </w:p>
+    <w:p>
+      <w:pPr>
+        <w:spacing w:after="60" w:before="40"/>
+      </w:pPr>
+      <w:r>
+        <w:rPr>
+          <w:rFonts w:ascii="Arial" w:hAnsi="Arial"/>
+          <w:b w:val="0"/>
+          <w:color w:val="000000"/>
+          <w:sz w:val="24"/>
+        </w:rPr>
         <w:t xml:space="preserve">  •  SSL configuration</w:t>
       </w:r>
     </w:p>
@@ -1446,6 +1474,34 @@
           <w:color w:val="000000"/>
           <w:sz w:val="24"/>
         </w:rPr>
+        <w:t xml:space="preserve">  •  Social Media Management — profile setup, branding &amp; cover design</w:t>
+      </w:r>
+    </w:p>
+    <w:p>
+      <w:pPr>
+        <w:spacing w:after="60" w:before="40"/>
+      </w:pPr>
+      <w:r>
+        <w:rPr>
+          <w:rFonts w:ascii="Arial" w:hAnsi="Arial"/>
+          <w:b w:val="0"/>
+          <w:color w:val="000000"/>
+          <w:sz w:val="24"/>
+        </w:rPr>
+        <w:t xml:space="preserve">  •  Initial launch posts &amp; monthly posting</w:t>
+      </w:r>
+    </w:p>
+    <w:p>
+      <w:pPr>
+        <w:spacing w:after="60" w:before="40"/>
+      </w:pPr>
+      <w:r>
+        <w:rPr>
+          <w:rFonts w:ascii="Arial" w:hAnsi="Arial"/>
+          <w:b w:val="0"/>
+          <w:color w:val="000000"/>
+          <w:sz w:val="24"/>
+        </w:rPr>
         <w:t xml:space="preserve">  •  60 days support</w:t>
       </w:r>
     </w:p>
@@ -1705,6 +1761,34 @@
           <w:sz w:val="24"/>
         </w:rPr>
         <w:t xml:space="preserve">  •  Admin training</w:t>
+      </w:r>
+    </w:p>
+    <w:p>
+      <w:pPr>
+        <w:spacing w:after="60" w:before="40"/>
+      </w:pPr>
+      <w:r>
+        <w:rPr>
+          <w:rFonts w:ascii="Arial" w:hAnsi="Arial"/>
+          <w:b w:val="0"/>
+          <w:color w:val="000000"/>
+          <w:sz w:val="24"/>
+        </w:rPr>
+        <w:t xml:space="preserve">  •  Social Media Management — full management (content, posting &amp; engagement)</w:t>
+      </w:r>
+    </w:p>
+    <w:p>
+      <w:pPr>
+        <w:spacing w:after="60" w:before="40"/>
+      </w:pPr>
+      <w:r>
+        <w:rPr>
+          <w:rFonts w:ascii="Arial" w:hAnsi="Arial"/>
+          <w:b w:val="0"/>
+          <w:color w:val="000000"/>
+          <w:sz w:val="24"/>
+        </w:rPr>
+        <w:t xml:space="preserve">  •  Content calendar, stories/reels &amp; monthly performance report</w:t>
       </w:r>
     </w:p>
     <w:p>

</xml_diff>

<commit_message>
Clarify social media apps work per website package tier
- Basic: Facebook & Instagram account creation
- Standard: Facebook/Instagram setup + posting, WhatsApp Business profile
- Premium: Facebook, Instagram, TikTok, LinkedIn full management

Co-authored-by: fullstackwebdeveloper1000-coder <fullstackwebdeveloper1000-coder@users.noreply.github.com>
</commit_message>
<xml_diff>
--- a/CoLab_Space_Point_Digital_Agency_Proposal.docx
+++ b/CoLab_Space_Point_Digital_Agency_Proposal.docx
@@ -1132,21 +1132,7 @@
           <w:color w:val="000000"/>
           <w:sz w:val="24"/>
         </w:rPr>
-        <w:t xml:space="preserve">  •  Social Media Management — account creation (Facebook &amp; Instagram)</w:t>
-      </w:r>
-    </w:p>
-    <w:p>
-      <w:pPr>
-        <w:spacing w:after="60" w:before="40"/>
-      </w:pPr>
-      <w:r>
-        <w:rPr>
-          <w:rFonts w:ascii="Arial" w:hAnsi="Arial"/>
-          <w:b w:val="0"/>
-          <w:color w:val="000000"/>
-          <w:sz w:val="24"/>
-        </w:rPr>
-        <w:t xml:space="preserve">  •  Basic business page setup</w:t>
+        <w:t xml:space="preserve">  •  Facebook &amp; Instagram — account creation &amp; basic business page setup</w:t>
       </w:r>
     </w:p>
     <w:p>
@@ -1474,7 +1460,7 @@
           <w:color w:val="000000"/>
           <w:sz w:val="24"/>
         </w:rPr>
-        <w:t xml:space="preserve">  •  Social Media Management — profile setup, branding &amp; cover design</w:t>
+        <w:t xml:space="preserve">  •  Facebook &amp; Instagram — profile setup, branding &amp; cover/banner design</w:t>
       </w:r>
     </w:p>
     <w:p>
@@ -1488,7 +1474,21 @@
           <w:color w:val="000000"/>
           <w:sz w:val="24"/>
         </w:rPr>
-        <w:t xml:space="preserve">  •  Initial launch posts &amp; monthly posting</w:t>
+        <w:t xml:space="preserve">  •  Facebook &amp; Instagram — initial launch posts &amp; monthly posting</w:t>
+      </w:r>
+    </w:p>
+    <w:p>
+      <w:pPr>
+        <w:spacing w:after="60" w:before="40"/>
+      </w:pPr>
+      <w:r>
+        <w:rPr>
+          <w:rFonts w:ascii="Arial" w:hAnsi="Arial"/>
+          <w:b w:val="0"/>
+          <w:color w:val="000000"/>
+          <w:sz w:val="24"/>
+        </w:rPr>
+        <w:t xml:space="preserve">  •  WhatsApp Business — profile setup &amp; website linking</w:t>
       </w:r>
     </w:p>
     <w:p>
@@ -1774,7 +1774,7 @@
           <w:color w:val="000000"/>
           <w:sz w:val="24"/>
         </w:rPr>
-        <w:t xml:space="preserve">  •  Social Media Management — full management (content, posting &amp; engagement)</w:t>
+        <w:t xml:space="preserve">  •  Facebook, Instagram, TikTok &amp; LinkedIn — full profile optimization &amp; branding</w:t>
       </w:r>
     </w:p>
     <w:p>
@@ -1788,7 +1788,21 @@
           <w:color w:val="000000"/>
           <w:sz w:val="24"/>
         </w:rPr>
-        <w:t xml:space="preserve">  •  Content calendar, stories/reels &amp; monthly performance report</w:t>
+        <w:t xml:space="preserve">  •  All social apps — content calendar, regular posts, stories &amp; reels</w:t>
+      </w:r>
+    </w:p>
+    <w:p>
+      <w:pPr>
+        <w:spacing w:after="60" w:before="40"/>
+      </w:pPr>
+      <w:r>
+        <w:rPr>
+          <w:rFonts w:ascii="Arial" w:hAnsi="Arial"/>
+          <w:b w:val="0"/>
+          <w:color w:val="000000"/>
+          <w:sz w:val="24"/>
+        </w:rPr>
+        <w:t xml:space="preserve">  •  All social apps — engagement, community management &amp; monthly performance report</w:t>
       </w:r>
     </w:p>
     <w:p>

</xml_diff>

<commit_message>
Replace proposal logo with new CoLab brand logo
- Extract logo from uploaded PDF and save as assets/proposal-icons/logo.png
- Stop fetching old Web-Logo-II from website
- Update logo_cover white backing for dark-text logo on navy cover band
- Regenerate Word and PDF outputs

Co-authored-by: fullstackwebdeveloper1000-coder <fullstackwebdeveloper1000-coder@users.noreply.github.com>
</commit_message>
<xml_diff>
--- a/CoLab_Space_Point_Digital_Agency_Proposal.docx
+++ b/CoLab_Space_Point_Digital_Agency_Proposal.docx
@@ -24,7 +24,7 @@
             <w:r>
               <w:drawing>
                 <wp:inline xmlns:a="http://schemas.openxmlformats.org/drawingml/2006/main" xmlns:pic="http://schemas.openxmlformats.org/drawingml/2006/picture">
-                  <wp:extent cx="5303520" cy="1616382"/>
+                  <wp:extent cx="5303520" cy="1241367"/>
                   <wp:docPr id="1" name="Picture 1"/>
                   <wp:cNvGraphicFramePr>
                     <a:graphicFrameLocks noChangeAspect="1"/>
@@ -45,7 +45,7 @@
                         <pic:spPr>
                           <a:xfrm>
                             <a:off x="0" y="0"/>
-                            <a:ext cx="5303520" cy="1616382"/>
+                            <a:ext cx="5303520" cy="1241367"/>
                           </a:xfrm>
                           <a:prstGeom prst="rect"/>
                         </pic:spPr>
@@ -255,7 +255,7 @@
             <w:r>
               <w:drawing>
                 <wp:inline xmlns:a="http://schemas.openxmlformats.org/drawingml/2006/main" xmlns:pic="http://schemas.openxmlformats.org/drawingml/2006/picture">
-                  <wp:extent cx="822960" cy="198882"/>
+                  <wp:extent cx="822960" cy="184644"/>
                   <wp:docPr id="2" name="Picture 2"/>
                   <wp:cNvGraphicFramePr>
                     <a:graphicFrameLocks noChangeAspect="1"/>
@@ -276,7 +276,7 @@
                         <pic:spPr>
                           <a:xfrm>
                             <a:off x="0" y="0"/>
-                            <a:ext cx="822960" cy="198882"/>
+                            <a:ext cx="822960" cy="184644"/>
                           </a:xfrm>
                           <a:prstGeom prst="rect"/>
                         </pic:spPr>

</xml_diff>

<commit_message>
Fix cover logo display: transparent PNG on white background
- Re-render logo from PDF on white with transparency (no black box)
- Move logo out of navy band to white cover area at 14.5cm width
- Thin navy top strip with tagline only
- Remove white-bordered logo_cover composite

Co-authored-by: fullstackwebdeveloper1000-coder <fullstackwebdeveloper1000-coder@users.noreply.github.com>
</commit_message>
<xml_diff>
--- a/CoLab_Space_Point_Digital_Agency_Proposal.docx
+++ b/CoLab_Space_Point_Digital_Agency_Proposal.docx
@@ -3,79 +3,62 @@
 <w:document xmlns:wpc="http://schemas.microsoft.com/office/word/2010/wordprocessingCanvas" xmlns:mo="http://schemas.microsoft.com/office/mac/office/2008/main" xmlns:mc="http://schemas.openxmlformats.org/markup-compatibility/2006" xmlns:mv="urn:schemas-microsoft-com:mac:vml" xmlns:o="urn:schemas-microsoft-com:office:office" xmlns:r="http://schemas.openxmlformats.org/officeDocument/2006/relationships" xmlns:m="http://schemas.openxmlformats.org/officeDocument/2006/math" xmlns:v="urn:schemas-microsoft-com:vml" xmlns:wp14="http://schemas.microsoft.com/office/word/2010/wordprocessingDrawing" xmlns:wp="http://schemas.openxmlformats.org/drawingml/2006/wordprocessingDrawing" xmlns:w10="urn:schemas-microsoft-com:office:word" xmlns:w="http://schemas.openxmlformats.org/wordprocessingml/2006/main" xmlns:w14="http://schemas.microsoft.com/office/word/2010/wordml" xmlns:wpg="http://schemas.microsoft.com/office/word/2010/wordprocessingGroup" xmlns:wpi="http://schemas.microsoft.com/office/word/2010/wordprocessingInk" xmlns:wne="http://schemas.microsoft.com/office/word/2006/wordml" xmlns:wps="http://schemas.microsoft.com/office/word/2010/wordprocessingShape" mc:Ignorable="w14 wp14">
   <w:background w:color="FFFFFF"/>
   <w:body>
-    <w:tbl>
-      <w:tblPr>
-        <w:tblW w:type="auto" w:w="0"/>
-        <w:tblLook w:firstColumn="1" w:firstRow="1" w:lastColumn="0" w:lastRow="0" w:noHBand="0" w:noVBand="1" w:val="04A0"/>
-      </w:tblPr>
-      <w:tblGrid>
-        <w:gridCol w:w="9746"/>
-      </w:tblGrid>
-      <w:tr>
-        <w:tc>
-          <w:tcPr>
-            <w:tcW w:type="dxa" w:w="9746"/>
-            <w:shd w:val="clear" w:fill="04243C"/>
-          </w:tcPr>
-          <w:p>
-            <w:pPr>
-              <w:jc w:val="center"/>
-            </w:pPr>
-            <w:r>
-              <w:drawing>
-                <wp:inline xmlns:a="http://schemas.openxmlformats.org/drawingml/2006/main" xmlns:pic="http://schemas.openxmlformats.org/drawingml/2006/picture">
-                  <wp:extent cx="5303520" cy="1241367"/>
-                  <wp:docPr id="1" name="Picture 1"/>
-                  <wp:cNvGraphicFramePr>
-                    <a:graphicFrameLocks noChangeAspect="1"/>
-                  </wp:cNvGraphicFramePr>
-                  <a:graphic>
-                    <a:graphicData uri="http://schemas.openxmlformats.org/drawingml/2006/picture">
-                      <pic:pic>
-                        <pic:nvPicPr>
-                          <pic:cNvPr id="0" name="logo_cover.png"/>
-                          <pic:cNvPicPr/>
-                        </pic:nvPicPr>
-                        <pic:blipFill>
-                          <a:blip r:embed="rId9"/>
-                          <a:stretch>
-                            <a:fillRect/>
-                          </a:stretch>
-                        </pic:blipFill>
-                        <pic:spPr>
-                          <a:xfrm>
-                            <a:off x="0" y="0"/>
-                            <a:ext cx="5303520" cy="1241367"/>
-                          </a:xfrm>
-                          <a:prstGeom prst="rect"/>
-                        </pic:spPr>
-                      </pic:pic>
-                    </a:graphicData>
-                  </a:graphic>
-                </wp:inline>
-              </w:drawing>
-            </w:r>
-          </w:p>
-          <w:p>
-            <w:pPr>
-              <w:jc w:val="center"/>
-            </w:pPr>
-            <w:r>
-              <w:rPr>
-                <w:rFonts w:ascii="Arial" w:hAnsi="Arial"/>
-                <w:b w:val="0"/>
-                <w:color w:val="06ACBA"/>
-                <w:sz w:val="20"/>
-              </w:rPr>
-              <w:t>CoLab Point  |  Digital Agency  |  Gujrat, Pakistan</w:t>
-            </w:r>
-          </w:p>
-        </w:tc>
-      </w:tr>
-    </w:tbl>
     <w:p>
       <w:pPr>
-        <w:spacing w:after="160" w:before="40"/>
+        <w:jc w:val="center"/>
+      </w:pPr>
+      <w:r>
+        <w:drawing>
+          <wp:inline xmlns:a="http://schemas.openxmlformats.org/drawingml/2006/main" xmlns:pic="http://schemas.openxmlformats.org/drawingml/2006/picture">
+            <wp:extent cx="5669280" cy="1335086"/>
+            <wp:docPr id="1" name="Picture 1"/>
+            <wp:cNvGraphicFramePr>
+              <a:graphicFrameLocks noChangeAspect="1"/>
+            </wp:cNvGraphicFramePr>
+            <a:graphic>
+              <a:graphicData uri="http://schemas.openxmlformats.org/drawingml/2006/picture">
+                <pic:pic>
+                  <pic:nvPicPr>
+                    <pic:cNvPr id="0" name="logo.png"/>
+                    <pic:cNvPicPr/>
+                  </pic:nvPicPr>
+                  <pic:blipFill>
+                    <a:blip r:embed="rId9"/>
+                    <a:stretch>
+                      <a:fillRect/>
+                    </a:stretch>
+                  </pic:blipFill>
+                  <pic:spPr>
+                    <a:xfrm>
+                      <a:off x="0" y="0"/>
+                      <a:ext cx="5669280" cy="1335086"/>
+                    </a:xfrm>
+                    <a:prstGeom prst="rect"/>
+                  </pic:spPr>
+                </pic:pic>
+              </a:graphicData>
+            </a:graphic>
+          </wp:inline>
+        </w:drawing>
+      </w:r>
+    </w:p>
+    <w:p>
+      <w:pPr>
+        <w:jc w:val="center"/>
+      </w:pPr>
+      <w:r>
+        <w:rPr>
+          <w:rFonts w:ascii="Arial" w:hAnsi="Arial"/>
+          <w:b w:val="0"/>
+          <w:color w:val="06ACBA"/>
+          <w:sz w:val="20"/>
+        </w:rPr>
+        <w:t>CoLab Point  |  Digital Agency  |  Gujrat, Pakistan</w:t>
+      </w:r>
+    </w:p>
+    <w:p>
+      <w:pPr>
+        <w:spacing w:after="120" w:before="40"/>
       </w:pPr>
     </w:p>
     <w:p>
@@ -255,7 +238,7 @@
             <w:r>
               <w:drawing>
                 <wp:inline xmlns:a="http://schemas.openxmlformats.org/drawingml/2006/main" xmlns:pic="http://schemas.openxmlformats.org/drawingml/2006/picture">
-                  <wp:extent cx="822960" cy="184644"/>
+                  <wp:extent cx="822960" cy="193803"/>
                   <wp:docPr id="2" name="Picture 2"/>
                   <wp:cNvGraphicFramePr>
                     <a:graphicFrameLocks noChangeAspect="1"/>
@@ -268,7 +251,7 @@
                           <pic:cNvPicPr/>
                         </pic:nvPicPr>
                         <pic:blipFill>
-                          <a:blip r:embed="rId10"/>
+                          <a:blip r:embed="rId9"/>
                           <a:stretch>
                             <a:fillRect/>
                           </a:stretch>
@@ -276,7 +259,7 @@
                         <pic:spPr>
                           <a:xfrm>
                             <a:off x="0" y="0"/>
-                            <a:ext cx="822960" cy="184644"/>
+                            <a:ext cx="822960" cy="193803"/>
                           </a:xfrm>
                           <a:prstGeom prst="rect"/>
                         </pic:spPr>
@@ -866,7 +849,7 @@
                           <pic:cNvPicPr/>
                         </pic:nvPicPr>
                         <pic:blipFill>
-                          <a:blip r:embed="rId11"/>
+                          <a:blip r:embed="rId10"/>
                           <a:stretch>
                             <a:fillRect/>
                           </a:stretch>
@@ -945,7 +928,7 @@
                           <pic:cNvPicPr/>
                         </pic:nvPicPr>
                         <pic:blipFill>
-                          <a:blip r:embed="rId12"/>
+                          <a:blip r:embed="rId11"/>
                           <a:stretch>
                             <a:fillRect/>
                           </a:stretch>
@@ -1217,7 +1200,7 @@
                           <pic:cNvPicPr/>
                         </pic:nvPicPr>
                         <pic:blipFill>
-                          <a:blip r:embed="rId13"/>
+                          <a:blip r:embed="rId12"/>
                           <a:stretch>
                             <a:fillRect/>
                           </a:stretch>
@@ -1545,7 +1528,7 @@
                           <pic:cNvPicPr/>
                         </pic:nvPicPr>
                         <pic:blipFill>
-                          <a:blip r:embed="rId14"/>
+                          <a:blip r:embed="rId13"/>
                           <a:stretch>
                             <a:fillRect/>
                           </a:stretch>
@@ -1859,7 +1842,7 @@
                           <pic:cNvPicPr/>
                         </pic:nvPicPr>
                         <pic:blipFill>
-                          <a:blip r:embed="rId15"/>
+                          <a:blip r:embed="rId14"/>
                           <a:stretch>
                             <a:fillRect/>
                           </a:stretch>
@@ -2272,7 +2255,7 @@
                           <pic:cNvPicPr/>
                         </pic:nvPicPr>
                         <pic:blipFill>
-                          <a:blip r:embed="rId16"/>
+                          <a:blip r:embed="rId15"/>
                           <a:stretch>
                             <a:fillRect/>
                           </a:stretch>
@@ -2382,7 +2365,7 @@
       </w:r>
     </w:p>
     <w:sectPr>
-      <w:footerReference w:type="default" r:id="rId17"/>
+      <w:footerReference w:type="default" r:id="rId16"/>
       <w:pgSz w:w="12240" w:h="15840"/>
       <w:pgMar w:top="1134" w:right="1247" w:bottom="1134" w:left="1247" w:header="720" w:footer="720" w:gutter="0"/>
       <w:cols w:space="720"/>

</xml_diff>